<commit_message>
Add tests for paragraph markers and document processing diagnostics
- Enhance `test_config.py` to assert default and environment variable settings for `enable_paragraph_markers`.
- Introduce new tests in `test_document.py` to validate paragraph ID preservation and marker wrapping in document text.
- Implement diagnostics artifact checks in `test_document_pipeline.py` for formatting issues and marker validation failures.
- Create `test_real_document_pipeline_validation.py` to evaluate acceptance criteria for caption and heading promotions in document outputs.
</commit_message>
<xml_diff>
--- a/tests/artifacts/real_document_pipeline/Лиетर глава1_validated.docx
+++ b/tests/artifacts/real_document_pipeline/Лиетर глава1_validated.docx
@@ -5,7 +5,15 @@
     <w:bookmarkStart w:id="25" w:name="глава-1"/>
     <w:p>
       <w:pPr>
-        <w:pStyle w:val="Heading1"/>
+        <w:pStyle xmlns:wps="http://schemas.microsoft.com/office/word/2010/wordprocessingShape" xmlns:wpg="http://schemas.microsoft.com/office/word/2010/wordprocessingGroup" xmlns:mc="http://schemas.openxmlformats.org/markup-compatibility/2006" xmlns:wp14="http://schemas.microsoft.com/office/word/2010/wordprocessingDrawing" xmlns:w14="http://schemas.microsoft.com/office/word/2010/wordml" xmlns:w15="http://schemas.microsoft.com/office/word/2012/wordml" w:val="Heading2"/>
+        <w:bidi xmlns:wps="http://schemas.microsoft.com/office/word/2010/wordprocessingShape" xmlns:wpg="http://schemas.microsoft.com/office/word/2010/wordprocessingGroup" xmlns:mc="http://schemas.openxmlformats.org/markup-compatibility/2006" xmlns:wp14="http://schemas.microsoft.com/office/word/2010/wordprocessingDrawing" xmlns:w14="http://schemas.microsoft.com/office/word/2010/wordml" xmlns:w15="http://schemas.microsoft.com/office/word/2012/wordml" w:val="0"/>
+        <w:spacing xmlns:wps="http://schemas.microsoft.com/office/word/2010/wordprocessingShape" xmlns:wpg="http://schemas.microsoft.com/office/word/2010/wordprocessingGroup" xmlns:mc="http://schemas.openxmlformats.org/markup-compatibility/2006" xmlns:wp14="http://schemas.microsoft.com/office/word/2010/wordprocessingDrawing" xmlns:w14="http://schemas.microsoft.com/office/word/2010/wordml" xmlns:w15="http://schemas.microsoft.com/office/word/2012/wordml" w:before="80" w:after="0"/>
+        <w:ind xmlns:wps="http://schemas.microsoft.com/office/word/2010/wordprocessingShape" xmlns:wpg="http://schemas.microsoft.com/office/word/2010/wordprocessingGroup" xmlns:mc="http://schemas.openxmlformats.org/markup-compatibility/2006" xmlns:wp14="http://schemas.microsoft.com/office/word/2010/wordprocessingDrawing" xmlns:w14="http://schemas.microsoft.com/office/word/2010/wordml" xmlns:w15="http://schemas.microsoft.com/office/word/2012/wordml" w:hanging="0" w:start="0" w:end="0"/>
+        <w:jc xmlns:wps="http://schemas.microsoft.com/office/word/2010/wordprocessingShape" xmlns:wpg="http://schemas.microsoft.com/office/word/2010/wordprocessingGroup" xmlns:mc="http://schemas.openxmlformats.org/markup-compatibility/2006" xmlns:wp14="http://schemas.microsoft.com/office/word/2010/wordprocessingDrawing" xmlns:w14="http://schemas.microsoft.com/office/word/2010/wordml" xmlns:w15="http://schemas.microsoft.com/office/word/2012/wordml" w:val="center"/>
+        <w:rPr xmlns:wps="http://schemas.microsoft.com/office/word/2010/wordprocessingShape" xmlns:wpg="http://schemas.microsoft.com/office/word/2010/wordprocessingGroup" xmlns:mc="http://schemas.openxmlformats.org/markup-compatibility/2006" xmlns:wp14="http://schemas.microsoft.com/office/word/2010/wordprocessingDrawing" xmlns:w14="http://schemas.microsoft.com/office/word/2010/wordml" xmlns:w15="http://schemas.microsoft.com/office/word/2012/wordml">
+          <w:b/>
+          <w:sz w:val="28"/>
+        </w:rPr>
       </w:pPr>
       <w:r>
         <w:t xml:space="preserve">Глава 1</w:t>
@@ -14,7 +22,12 @@
     <w:bookmarkStart w:id="20" w:name="что-такое-богатство"/>
     <w:p>
       <w:pPr>
-        <w:pStyle w:val="Heading2"/>
+        <w:pStyle xmlns:wps="http://schemas.microsoft.com/office/word/2010/wordprocessingShape" xmlns:wpg="http://schemas.microsoft.com/office/word/2010/wordprocessingGroup" xmlns:mc="http://schemas.openxmlformats.org/markup-compatibility/2006" xmlns:wp14="http://schemas.microsoft.com/office/word/2010/wordprocessingDrawing" xmlns:w14="http://schemas.microsoft.com/office/word/2010/wordml" xmlns:w15="http://schemas.microsoft.com/office/word/2012/wordml" w:val="Heading2"/>
+        <w:bidi xmlns:wps="http://schemas.microsoft.com/office/word/2010/wordprocessingShape" xmlns:wpg="http://schemas.microsoft.com/office/word/2010/wordprocessingGroup" xmlns:mc="http://schemas.openxmlformats.org/markup-compatibility/2006" xmlns:wp14="http://schemas.microsoft.com/office/word/2010/wordprocessingDrawing" xmlns:w14="http://schemas.microsoft.com/office/word/2010/wordml" xmlns:w15="http://schemas.microsoft.com/office/word/2012/wordml" w:val="0"/>
+        <w:ind xmlns:wps="http://schemas.microsoft.com/office/word/2010/wordprocessingShape" xmlns:wpg="http://schemas.microsoft.com/office/word/2010/wordprocessingGroup" xmlns:mc="http://schemas.openxmlformats.org/markup-compatibility/2006" xmlns:wp14="http://schemas.microsoft.com/office/word/2010/wordprocessingDrawing" xmlns:w14="http://schemas.microsoft.com/office/word/2010/wordml" xmlns:w15="http://schemas.microsoft.com/office/word/2012/wordml" w:start="0" w:end="6"/>
+        <w:rPr xmlns:wps="http://schemas.microsoft.com/office/word/2010/wordprocessingShape" xmlns:wpg="http://schemas.microsoft.com/office/word/2010/wordprocessingGroup" xmlns:mc="http://schemas.openxmlformats.org/markup-compatibility/2006" xmlns:wp14="http://schemas.microsoft.com/office/word/2010/wordprocessingDrawing" xmlns:w14="http://schemas.microsoft.com/office/word/2010/wordml" xmlns:w15="http://schemas.microsoft.com/office/word/2012/wordml">
+          <w:u w:val="none" w:color="000000"/>
+        </w:rPr>
       </w:pPr>
       <w:r>
         <w:t xml:space="preserve">Что такое богатство?</w:t>
@@ -22,7 +35,13 @@
     </w:p>
     <w:p>
       <w:pPr>
-        <w:pStyle w:val="FirstParagraph"/>
+        <w:bidi xmlns:wps="http://schemas.microsoft.com/office/word/2010/wordprocessingShape" xmlns:wpg="http://schemas.microsoft.com/office/word/2010/wordprocessingGroup" xmlns:mc="http://schemas.openxmlformats.org/markup-compatibility/2006" xmlns:wp14="http://schemas.microsoft.com/office/word/2010/wordprocessingDrawing" xmlns:w14="http://schemas.microsoft.com/office/word/2010/wordml" xmlns:w15="http://schemas.microsoft.com/office/word/2012/wordml" w:val="0"/>
+        <w:spacing xmlns:wps="http://schemas.microsoft.com/office/word/2010/wordprocessingShape" xmlns:wpg="http://schemas.microsoft.com/office/word/2010/wordprocessingGroup" xmlns:mc="http://schemas.openxmlformats.org/markup-compatibility/2006" xmlns:wp14="http://schemas.microsoft.com/office/word/2010/wordprocessingDrawing" xmlns:w14="http://schemas.microsoft.com/office/word/2010/wordml" xmlns:w15="http://schemas.microsoft.com/office/word/2012/wordml" w:before="48" w:after="0"/>
+        <w:ind xmlns:wps="http://schemas.microsoft.com/office/word/2010/wordprocessingShape" xmlns:wpg="http://schemas.microsoft.com/office/word/2010/wordprocessingGroup" xmlns:mc="http://schemas.openxmlformats.org/markup-compatibility/2006" xmlns:wp14="http://schemas.microsoft.com/office/word/2010/wordprocessingDrawing" xmlns:w14="http://schemas.microsoft.com/office/word/2010/wordml" xmlns:w15="http://schemas.microsoft.com/office/word/2012/wordml" w:start="0" w:end="0"/>
+        <w:jc xmlns:wps="http://schemas.microsoft.com/office/word/2010/wordprocessingShape" xmlns:wpg="http://schemas.microsoft.com/office/word/2010/wordprocessingGroup" xmlns:mc="http://schemas.openxmlformats.org/markup-compatibility/2006" xmlns:wp14="http://schemas.microsoft.com/office/word/2010/wordprocessingDrawing" xmlns:w14="http://schemas.microsoft.com/office/word/2010/wordml" xmlns:w15="http://schemas.microsoft.com/office/word/2012/wordml" w:val="center"/>
+        <w:rPr xmlns:wps="http://schemas.microsoft.com/office/word/2010/wordprocessingShape" xmlns:wpg="http://schemas.microsoft.com/office/word/2010/wordprocessingGroup" xmlns:mc="http://schemas.openxmlformats.org/markup-compatibility/2006" xmlns:wp14="http://schemas.microsoft.com/office/word/2010/wordprocessingDrawing" xmlns:w14="http://schemas.microsoft.com/office/word/2010/wordml" xmlns:w15="http://schemas.microsoft.com/office/word/2012/wordml">
+          <w:sz w:val="20"/>
+        </w:rPr>
       </w:pPr>
       <w:r>
         <w:drawing>
@@ -59,25 +78,30 @@
         </w:drawing>
       </w:r>
     </w:p>
-    <w:bookmarkEnd w:id="20"/>
-    <w:bookmarkStart w:id="21" w:name="X433bc4b4a30d09f2d0073fbcf2c4c784b17868a"/>
     <w:p>
       <w:pPr>
-        <w:pStyle w:val="Heading2"/>
+        <w:pStyle w:val="BodyText"/>
       </w:pPr>
       <w:r>
         <w:rPr>
           <w:i/>
           <w:iCs/>
         </w:rPr>
-        <w:t xml:space="preserve">Богатство заключается не в том, чтобы иметь много имущества, а в том, чтобы иметь мало желаний.</w:t>
+        <w:t xml:space="preserve">Богатство — не в обилии имущества, а в скромности желаний.</w:t>
       </w:r>
     </w:p>
-    <w:bookmarkEnd w:id="21"/>
-    <w:bookmarkStart w:id="22" w:name="эпиктет"/>
+    <w:bookmarkEnd w:id="20"/>
+    <w:bookmarkStart w:id="23" w:name="эпиктет"/>
     <w:p>
       <w:pPr>
-        <w:pStyle w:val="Heading2"/>
+        <w:pStyle xmlns:wps="http://schemas.microsoft.com/office/word/2010/wordprocessingShape" xmlns:wpg="http://schemas.microsoft.com/office/word/2010/wordprocessingGroup" xmlns:mc="http://schemas.openxmlformats.org/markup-compatibility/2006" xmlns:wp14="http://schemas.microsoft.com/office/word/2010/wordprocessingDrawing" xmlns:w14="http://schemas.microsoft.com/office/word/2010/wordml" xmlns:w15="http://schemas.microsoft.com/office/word/2012/wordml" w:val="Heading2"/>
+        <w:bidi xmlns:wps="http://schemas.microsoft.com/office/word/2010/wordprocessingShape" xmlns:wpg="http://schemas.microsoft.com/office/word/2010/wordprocessingGroup" xmlns:mc="http://schemas.openxmlformats.org/markup-compatibility/2006" xmlns:wp14="http://schemas.microsoft.com/office/word/2010/wordprocessingDrawing" xmlns:w14="http://schemas.microsoft.com/office/word/2010/wordml" xmlns:w15="http://schemas.microsoft.com/office/word/2012/wordml" w:val="0"/>
+        <w:spacing xmlns:wps="http://schemas.microsoft.com/office/word/2010/wordprocessingShape" xmlns:wpg="http://schemas.microsoft.com/office/word/2010/wordprocessingGroup" xmlns:mc="http://schemas.openxmlformats.org/markup-compatibility/2006" xmlns:wp14="http://schemas.microsoft.com/office/word/2010/wordprocessingDrawing" xmlns:w14="http://schemas.microsoft.com/office/word/2010/wordml" xmlns:w15="http://schemas.microsoft.com/office/word/2012/wordml" w:before="0" w:after="0"/>
+        <w:ind xmlns:wps="http://schemas.microsoft.com/office/word/2010/wordprocessingShape" xmlns:wpg="http://schemas.microsoft.com/office/word/2010/wordprocessingGroup" xmlns:mc="http://schemas.openxmlformats.org/markup-compatibility/2006" xmlns:wp14="http://schemas.microsoft.com/office/word/2010/wordprocessingDrawing" xmlns:w14="http://schemas.microsoft.com/office/word/2010/wordml" xmlns:w15="http://schemas.microsoft.com/office/word/2012/wordml" w:hanging="0" w:start="4" w:end="0"/>
+        <w:jc xmlns:wps="http://schemas.microsoft.com/office/word/2010/wordprocessingShape" xmlns:wpg="http://schemas.microsoft.com/office/word/2010/wordprocessingGroup" xmlns:mc="http://schemas.openxmlformats.org/markup-compatibility/2006" xmlns:wp14="http://schemas.microsoft.com/office/word/2010/wordprocessingDrawing" xmlns:w14="http://schemas.microsoft.com/office/word/2010/wordml" xmlns:w15="http://schemas.microsoft.com/office/word/2012/wordml" w:val="center"/>
+        <w:rPr xmlns:wps="http://schemas.microsoft.com/office/word/2010/wordprocessingShape" xmlns:wpg="http://schemas.microsoft.com/office/word/2010/wordprocessingGroup" xmlns:mc="http://schemas.openxmlformats.org/markup-compatibility/2006" xmlns:wp14="http://schemas.microsoft.com/office/word/2010/wordprocessingDrawing" xmlns:w14="http://schemas.microsoft.com/office/word/2010/wordml" xmlns:w15="http://schemas.microsoft.com/office/word/2012/wordml">
+          <w:sz w:val="21"/>
+        </w:rPr>
       </w:pPr>
       <w:r>
         <w:t xml:space="preserve">ЭПИКТЕТ</w:t>
@@ -88,7 +112,7 @@
         <w:pStyle w:val="FirstParagraph"/>
       </w:pPr>
       <w:r>
-        <w:t xml:space="preserve">Привлекательность лотерейных билетов с крупными призами отчасти объясняется фантазиями, которые они вызывают. Мы представляем себе все, что могли бы сделать: благотворительные проекты, реальные изменения, которые могли бы помочь осуществить. Нельзя отрицать притягательность огромных сумм. В наших мечтах деньги решают все проблемы, дают ресурсы для удовлетворения потребностей, о которых мы даже не подозревали. Но разве это и есть богатство?</w:t>
+        <w:t xml:space="preserve">Привлекательность лотерейных билетов с большими призами отчасти объясняется фантазиями, которые они пробуждают. Мы представляем всё, что могли бы сделать: благотворительные проекты, реальные перемены, которые смогли бы осуществить. Нельзя отрицать притягательность огромных сумм. В мечтах деньги решают все наши проблемы и дают ресурсы для удовлетворения потребностей, о которых мы даже не подозревали. Но является ли это богатством?</w:t>
       </w:r>
     </w:p>
     <w:p>
@@ -96,7 +120,7 @@
         <w:pStyle w:val="BodyText"/>
       </w:pPr>
       <w:r>
-        <w:t xml:space="preserve">Возможно, вы взяли эту книгу, потому что думали, что она расскажет, как приумножить личное состояние — и она действительно это сделает. Но</w:t>
+        <w:t xml:space="preserve">Возможно, вы взяли эту книгу в надежде узнать, как приумножить собственное состояние — и во многом она именно об этом. Но</w:t>
       </w:r>
       <w:r>
         <w:t xml:space="preserve"> </w:t>
@@ -115,9 +139,15 @@
         <w:t xml:space="preserve">— не очередная схема быстрого обогащения. Эта книга поможет вам найти и создать богатство там, где вы его не ожидаете. Она также может показать, насколько вы уже богаты.</w:t>
       </w:r>
     </w:p>
+    <w:bookmarkStart w:id="21" w:name="переосмысление-богатства"/>
     <w:p>
       <w:pPr>
-        <w:pStyle w:val="BodyText"/>
+        <w:pStyle xmlns:wps="http://schemas.microsoft.com/office/word/2010/wordprocessingShape" xmlns:wpg="http://schemas.microsoft.com/office/word/2010/wordprocessingGroup" xmlns:mc="http://schemas.openxmlformats.org/markup-compatibility/2006" xmlns:wp14="http://schemas.microsoft.com/office/word/2010/wordprocessingDrawing" xmlns:w14="http://schemas.microsoft.com/office/word/2010/wordml" xmlns:w15="http://schemas.microsoft.com/office/word/2012/wordml" w:val="BodyText"/>
+        <w:bidi xmlns:wps="http://schemas.microsoft.com/office/word/2010/wordprocessingShape" xmlns:wpg="http://schemas.microsoft.com/office/word/2010/wordprocessingGroup" xmlns:mc="http://schemas.openxmlformats.org/markup-compatibility/2006" xmlns:wp14="http://schemas.microsoft.com/office/word/2010/wordprocessingDrawing" xmlns:w14="http://schemas.microsoft.com/office/word/2010/wordml" xmlns:w15="http://schemas.microsoft.com/office/word/2012/wordml" w:val="0"/>
+        <w:spacing xmlns:wps="http://schemas.microsoft.com/office/word/2010/wordprocessingShape" xmlns:wpg="http://schemas.microsoft.com/office/word/2010/wordprocessingGroup" xmlns:mc="http://schemas.openxmlformats.org/markup-compatibility/2006" xmlns:wp14="http://schemas.microsoft.com/office/word/2010/wordprocessingDrawing" xmlns:w14="http://schemas.microsoft.com/office/word/2010/wordml" xmlns:w15="http://schemas.microsoft.com/office/word/2012/wordml" w:before="285" w:after="0"/>
+        <w:ind xmlns:wps="http://schemas.microsoft.com/office/word/2010/wordprocessingShape" xmlns:wpg="http://schemas.microsoft.com/office/word/2010/wordprocessingGroup" xmlns:mc="http://schemas.openxmlformats.org/markup-compatibility/2006" xmlns:wp14="http://schemas.microsoft.com/office/word/2010/wordprocessingDrawing" xmlns:w14="http://schemas.microsoft.com/office/word/2010/wordml" xmlns:w15="http://schemas.microsoft.com/office/word/2012/wordml" w:start="5025" w:end="0"/>
+        <w:jc xmlns:wps="http://schemas.microsoft.com/office/word/2010/wordprocessingShape" xmlns:wpg="http://schemas.microsoft.com/office/word/2010/wordprocessingGroup" xmlns:mc="http://schemas.openxmlformats.org/markup-compatibility/2006" xmlns:wp14="http://schemas.microsoft.com/office/word/2010/wordprocessingDrawing" xmlns:w14="http://schemas.microsoft.com/office/word/2010/wordml" xmlns:w15="http://schemas.microsoft.com/office/word/2012/wordml" w:val="start"/>
+        <w:rPr xmlns:wps="http://schemas.microsoft.com/office/word/2010/wordprocessingShape" xmlns:wpg="http://schemas.microsoft.com/office/word/2010/wordprocessingGroup" xmlns:mc="http://schemas.openxmlformats.org/markup-compatibility/2006" xmlns:wp14="http://schemas.microsoft.com/office/word/2010/wordprocessingDrawing" xmlns:w14="http://schemas.microsoft.com/office/word/2010/wordml" xmlns:w15="http://schemas.microsoft.com/office/word/2012/wordml"/>
       </w:pPr>
       <w:r>
         <w:t xml:space="preserve">Переосмысление богатства</w:t>
@@ -125,16 +155,45 @@
     </w:p>
     <w:p>
       <w:pPr>
-        <w:pStyle w:val="BodyText"/>
-      </w:pPr>
-      <w:r>
-        <w:t xml:space="preserve">Богатство — то, чего мы все хотим. Но богатый чем? Вещами, деньгами, доходами? Всё зависит от того, как вы понимаете это слово. Его первоначальное значение, от староанглийского weal (как в commonweal), — просто «процветание» или «благополучие»</w:t>
+        <w:pStyle w:val="FirstParagraph"/>
+      </w:pPr>
+      <w:r>
+        <w:t xml:space="preserve">Богатство — то, чего мы все хотим. Кто такой «богатый человек» — богат чем? Вещами, деньгами, доходами? Всё зависит от того, как вы определяете это слово. Его первоначальное значение — от староанглийского</w:t>
+      </w:r>
+      <w:r>
+        <w:t xml:space="preserve"> </w:t>
+      </w:r>
+      <w:r>
+        <w:rPr>
+          <w:i/>
+          <w:iCs/>
+        </w:rPr>
+        <w:t xml:space="preserve">weal</w:t>
+      </w:r>
+      <w:r>
+        <w:t xml:space="preserve"> </w:t>
+      </w:r>
+      <w:r>
+        <w:t xml:space="preserve">(как в</w:t>
+      </w:r>
+      <w:r>
+        <w:t xml:space="preserve"> </w:t>
+      </w:r>
+      <w:r>
+        <w:rPr>
+          <w:i/>
+          <w:iCs/>
+        </w:rPr>
+        <w:t xml:space="preserve">commonweal</w:t>
+      </w:r>
+      <w:r>
+        <w:t xml:space="preserve">) — было просто «процветание» или «благополучие»</w:t>
       </w:r>
       <w:r>
         <w:t xml:space="preserve">(1)</w:t>
       </w:r>
       <w:r>
-        <w:t xml:space="preserve">. Какая идея! Как далеко это от значения, которое многие из нас стали с ним ассоциировать. Богатство — это больше, чем накопление денег и ресурсов, и его можно создать не только традиционными финансовыми средствами. Чтобы по‑настоящему понять богатство наших обществ, культур и окружающей среды, стоит вернуться к старому смыслу — богатству как благополучию. Мы можем думать, что выигрыш в лотерею сделает нас богаче, а богатство — счастливее, но знаем: это не всегда так. Хотя бедность действительно приносит несчастье, много денег не всегда покупают счастье.</w:t>
+        <w:t xml:space="preserve">. Какая идея! Как далеко это от того значения, с которым многие из нас теперь ассоциируют это слово. Богатство — больше, чем накопление денег и ресурсов, и его можно создать не только традиционными финансовыми средствами. Чтобы по‑настоящему понять богатство обществ, культур и окружающей среды, нужно вернуться к старому представлению о богатстве как о благополучии. Мы можем думать, что выигрыш в лотерею сделает нас богатыми, а богатство сделает нас счастливыми, но это не всегда так. Хотя бедность действительно ведёт к несчастью, много денег не всегда покупают счастье.</w:t>
       </w:r>
     </w:p>
     <w:p>
@@ -142,7 +201,7 @@
         <w:pStyle w:val="BodyText"/>
       </w:pPr>
       <w:r>
-        <w:t xml:space="preserve">Возможно, мы видели, как человек с очень низким доходом выигрывал в лотерею или получал большую компенсацию по суду, но эти деньги зачастую не приносили значительного улучшения в его жизни. Во многих таких случаях положение даже ухудшается: стресс от обладания деньгами и связанных с ними новых проблем сказывается на человеке — как сохранить средства, внезапное внимание родственников и «друзей», о существовании которых он не подозревал, мошенники и целая армия «инвестиционных консультантов».</w:t>
+        <w:t xml:space="preserve">Возможно, вы видели случаи, когда человек с очень низким доходом выигрывал в лотерею или получал крупную компенсацию по суду, но эти деньги зачастую не приносили значительного улучшения в его жизни. Во многих таких случаях ситуация даже ухудшается. Стресс от наличия денег и всех новых проблем — как их сохранить, внезапно появившиеся родственники и друзья, о которых вы даже не подозревали, мошенники и целая армия «инвестиционных консультантов» — подрывает спокойствие.</w:t>
       </w:r>
     </w:p>
     <w:p>
@@ -150,7 +209,7 @@
         <w:pStyle w:val="BodyText"/>
       </w:pPr>
       <w:r>
-        <w:t xml:space="preserve">Как достичь благополучия, если оно не связано с большими деньгами? Когда мы счастливы? Ответ прост: мы чувствуем себя счастливыми, когда удовлетворены все наши потребности. И это не только еда, одежда и крыша над головой. Речь также о потребности быть творческим участником сообщества, иметь право голоса в судьбе, стремиться к духовному развитию без социальных ограничений, иметь время для отдыха, развлечений и для семьи. Наши потребности многообразны.</w:t>
+        <w:t xml:space="preserve">Как достичь благополучия, если это не связано с приобретением больших сумм? Когда мы счастливы? Ответ прост: мы чувствуем себя счастливыми, когда наши потребности удовлетворены. Не только базовые — в еде, одежде и жилье — но и потребность быть творчески вовлечёнными в жизнь сообщества, иметь право голоса в решении собственной судьбы, стремиться к духовному развитию без социальных ограничений, иметь время на отдых, развлечения и общение с семьёй. Наши потребности разнообразны…</w:t>
       </w:r>
     </w:p>
     <w:p>
@@ -158,12 +217,17 @@
         <w:pStyle w:val="BodyText"/>
       </w:pPr>
       <w:r>
-        <w:t xml:space="preserve">Однако в современной потребительской экономике, с доминирующим акцентом на потребление, основные экономические игроки — предприятия и корпорации — постоянно рекламируют свои товары, убеждая нас, что покупки принесут удовлетворение.</w:t>
+        <w:t xml:space="preserve">Они многогранны, но в доминирующей потребительской экономике основные игроки — фирмы и корпорации — постоянно рекламируют свои товары, пытаясь убедить нас, что покупки принесут удовлетворение.</w:t>
       </w:r>
     </w:p>
     <w:p>
       <w:pPr>
-        <w:pStyle w:val="BodyText"/>
+        <w:pStyle xmlns:wps="http://schemas.microsoft.com/office/word/2010/wordprocessingShape" xmlns:wpg="http://schemas.microsoft.com/office/word/2010/wordprocessingGroup" xmlns:mc="http://schemas.openxmlformats.org/markup-compatibility/2006" xmlns:wp14="http://schemas.microsoft.com/office/word/2010/wordprocessingDrawing" xmlns:w14="http://schemas.microsoft.com/office/word/2010/wordml" xmlns:w15="http://schemas.microsoft.com/office/word/2012/wordml" w:val="BodyText"/>
+        <w:bidi xmlns:wps="http://schemas.microsoft.com/office/word/2010/wordprocessingShape" xmlns:wpg="http://schemas.microsoft.com/office/word/2010/wordprocessingGroup" xmlns:mc="http://schemas.openxmlformats.org/markup-compatibility/2006" xmlns:wp14="http://schemas.microsoft.com/office/word/2010/wordprocessingDrawing" xmlns:w14="http://schemas.microsoft.com/office/word/2010/wordml" xmlns:w15="http://schemas.microsoft.com/office/word/2012/wordml" w:val="0"/>
+        <w:spacing xmlns:wps="http://schemas.microsoft.com/office/word/2010/wordprocessingShape" xmlns:wpg="http://schemas.microsoft.com/office/word/2010/wordprocessingGroup" xmlns:mc="http://schemas.openxmlformats.org/markup-compatibility/2006" xmlns:wp14="http://schemas.microsoft.com/office/word/2010/wordprocessingDrawing" xmlns:w14="http://schemas.microsoft.com/office/word/2010/wordml" xmlns:w15="http://schemas.microsoft.com/office/word/2012/wordml" w:before="287" w:after="0"/>
+        <w:ind xmlns:wps="http://schemas.microsoft.com/office/word/2010/wordprocessingShape" xmlns:wpg="http://schemas.microsoft.com/office/word/2010/wordprocessingGroup" xmlns:mc="http://schemas.openxmlformats.org/markup-compatibility/2006" xmlns:wp14="http://schemas.microsoft.com/office/word/2010/wordprocessingDrawing" xmlns:w14="http://schemas.microsoft.com/office/word/2010/wordml" xmlns:w15="http://schemas.microsoft.com/office/word/2012/wordml" w:start="1252" w:end="0"/>
+        <w:jc xmlns:wps="http://schemas.microsoft.com/office/word/2010/wordprocessingShape" xmlns:wpg="http://schemas.microsoft.com/office/word/2010/wordprocessingGroup" xmlns:mc="http://schemas.openxmlformats.org/markup-compatibility/2006" xmlns:wp14="http://schemas.microsoft.com/office/word/2010/wordprocessingDrawing" xmlns:w14="http://schemas.microsoft.com/office/word/2010/wordml" xmlns:w15="http://schemas.microsoft.com/office/word/2012/wordml" w:val="start"/>
+        <w:rPr xmlns:wps="http://schemas.microsoft.com/office/word/2010/wordprocessingShape" xmlns:wpg="http://schemas.microsoft.com/office/word/2010/wordprocessingGroup" xmlns:mc="http://schemas.openxmlformats.org/markup-compatibility/2006" xmlns:wp14="http://schemas.microsoft.com/office/word/2010/wordprocessingDrawing" xmlns:w14="http://schemas.microsoft.com/office/word/2010/wordml" xmlns:w15="http://schemas.microsoft.com/office/word/2012/wordml"/>
       </w:pPr>
       <w:r>
         <w:t xml:space="preserve">Нам не нужны деньги. Нам нужны вещи, которые можно купить за деньги.</w:t>
@@ -174,12 +238,17 @@
         <w:pStyle w:val="BodyText"/>
       </w:pPr>
       <w:r>
-        <w:t xml:space="preserve">Избыточный вес? Купите диетический план и тренажер. Несчастны? Существует множество программ самосовершенствования, которые можно приобрести. Потеряли духовную опору? Купите книгу, видеокассету, присоединитесь к успешной мегацеркви или отправьтесь на курорт. Наша потребность в самовыражении всё чаще удовлетворяется одеждой, которую мы носим, и машинами, на которых ездим. Искусство и музыка остались уделом профессионалов, предлагающих свои товары и услуги. И всё же после этого мы обнаруживаем: потребительские решения не работают — временное удовлетворение от новых покупок только усугубляет основную потребность. Если счастье не купить, значит, есть другой путь.</w:t>
+        <w:t xml:space="preserve">Избыточный вес? Купите диетический план и тренажёр. Несчастны? Существует много программ самосовершенствования, которые можно купить. Духовно потеряны? Купите книгу, видеокассету, присоединитесь к успешной мегацеркви или отправьтесь в отпуск на курорт. Наша потребность в самовыражении всё чаще удовлетворяется через одежду, которую мы носим, и машины, на которых мы ездим. Искусство и музыка часто остаются делом профессионалов, которые предлагают свои товары и услуги. И всё же в конце концов мы обнаруживаем, что потребительские решения не работают — временное удовлетворение от новых вещей лишь усиливает нашу глубинную потребность. Если счастье не купить, значит, должен быть другой путь.</w:t>
       </w:r>
     </w:p>
     <w:p>
       <w:pPr>
-        <w:pStyle w:val="BodyText"/>
+        <w:pStyle xmlns:wps="http://schemas.microsoft.com/office/word/2010/wordprocessingShape" xmlns:wpg="http://schemas.microsoft.com/office/word/2010/wordprocessingGroup" xmlns:mc="http://schemas.openxmlformats.org/markup-compatibility/2006" xmlns:wp14="http://schemas.microsoft.com/office/word/2010/wordprocessingDrawing" xmlns:w14="http://schemas.microsoft.com/office/word/2010/wordml" xmlns:w15="http://schemas.microsoft.com/office/word/2012/wordml" w:val="BodyText"/>
+        <w:bidi xmlns:wps="http://schemas.microsoft.com/office/word/2010/wordprocessingShape" xmlns:wpg="http://schemas.microsoft.com/office/word/2010/wordprocessingGroup" xmlns:mc="http://schemas.openxmlformats.org/markup-compatibility/2006" xmlns:wp14="http://schemas.microsoft.com/office/word/2010/wordprocessingDrawing" xmlns:w14="http://schemas.microsoft.com/office/word/2010/wordml" xmlns:w15="http://schemas.microsoft.com/office/word/2012/wordml" w:val="0"/>
+        <w:spacing xmlns:wps="http://schemas.microsoft.com/office/word/2010/wordprocessingShape" xmlns:wpg="http://schemas.microsoft.com/office/word/2010/wordprocessingGroup" xmlns:mc="http://schemas.openxmlformats.org/markup-compatibility/2006" xmlns:wp14="http://schemas.microsoft.com/office/word/2010/wordprocessingDrawing" xmlns:w14="http://schemas.microsoft.com/office/word/2010/wordml" xmlns:w15="http://schemas.microsoft.com/office/word/2012/wordml" w:lineRule="auto" w:line="250"/>
+        <w:ind xmlns:wps="http://schemas.microsoft.com/office/word/2010/wordprocessingShape" xmlns:wpg="http://schemas.microsoft.com/office/word/2010/wordprocessingGroup" xmlns:mc="http://schemas.openxmlformats.org/markup-compatibility/2006" xmlns:wp14="http://schemas.microsoft.com/office/word/2010/wordprocessingDrawing" xmlns:w14="http://schemas.microsoft.com/office/word/2010/wordml" xmlns:w15="http://schemas.microsoft.com/office/word/2012/wordml" w:firstLine="288" w:start="100" w:end="99"/>
+        <w:jc xmlns:wps="http://schemas.microsoft.com/office/word/2010/wordprocessingShape" xmlns:wpg="http://schemas.microsoft.com/office/word/2010/wordprocessingGroup" xmlns:mc="http://schemas.openxmlformats.org/markup-compatibility/2006" xmlns:wp14="http://schemas.microsoft.com/office/word/2010/wordprocessingDrawing" xmlns:w14="http://schemas.microsoft.com/office/word/2010/wordml" xmlns:w15="http://schemas.microsoft.com/office/word/2012/wordml" w:val="start"/>
+        <w:rPr xmlns:wps="http://schemas.microsoft.com/office/word/2010/wordprocessingShape" xmlns:wpg="http://schemas.microsoft.com/office/word/2010/wordprocessingGroup" xmlns:mc="http://schemas.openxmlformats.org/markup-compatibility/2006" xmlns:wp14="http://schemas.microsoft.com/office/word/2010/wordprocessingDrawing" xmlns:w14="http://schemas.microsoft.com/office/word/2010/wordml" xmlns:w15="http://schemas.microsoft.com/office/word/2012/wordml"/>
       </w:pPr>
       <w:r>
         <w:t xml:space="preserve">В качестве первого шага на пути к</w:t>
@@ -198,23 +267,7 @@
         <w:t xml:space="preserve"> </w:t>
       </w:r>
       <w:r>
-        <w:t xml:space="preserve">богатству нам нужно переосмыслить само понятие богатства. Что оно означает? Вспомните понятие общественного благосостояния. Создание реального богатства подразумевает принятие решений, которые позволяют всем членам общества достигать благополучия.</w:t>
-      </w:r>
-      <w:r>
-        <w:t xml:space="preserve"> </w:t>
-      </w:r>
-      <w:r>
-        <w:rPr>
-          <w:i/>
-          <w:iCs/>
-        </w:rPr>
-        <w:t xml:space="preserve">Устойчивое</w:t>
-      </w:r>
-      <w:r>
-        <w:t xml:space="preserve"> </w:t>
-      </w:r>
-      <w:r>
-        <w:t xml:space="preserve">богатство проецирует это понятие в будущее — как это сделала Всемирная комиссия по окружающей среде и развитию, определив устойчивое развитие как «удовлетворение потребностей настоящего времени без ущерба для способности будущих поколений удовлетворять свои собственные потребности»</w:t>
+        <w:t xml:space="preserve">богатству нам нужно переосмыслить само понятие богатства. Что же оно означает? Вспомните идею общественного благосостояния (общественного благополучия). Создание реального богатства подразумевает принятие решений, которые позволяют всем членам общества достичь благополучия. Устойчивое богатство проецирует эту идею в будущее — как это сделала Всемирная комиссия по окружающей среде и развитию, определив устойчивое развитие как «удовлетворение потребностей настоящего времени без ущерба для способности будущих поколений удовлетворять свои собственные потребности»</w:t>
       </w:r>
       <w:r>
         <w:t xml:space="preserve">2</w:t>
@@ -236,23 +289,30 @@
         <w:t xml:space="preserve"> </w:t>
       </w:r>
       <w:r>
-        <w:t xml:space="preserve">сообщество — сообщество, потребности которого удовлетворялись бы без заимствования богатства у будущих поколений.</w:t>
+        <w:t xml:space="preserve">сообщество — сообщество, чьи потребности удовлетворялись бы без заимствования богатства у будущих поколений.</w:t>
+      </w:r>
+    </w:p>
+    <w:bookmarkEnd w:id="21"/>
+    <w:bookmarkStart w:id="22" w:name="системный-подход"/>
+    <w:p>
+      <w:pPr>
+        <w:pStyle xmlns:wps="http://schemas.microsoft.com/office/word/2010/wordprocessingShape" xmlns:wpg="http://schemas.microsoft.com/office/word/2010/wordprocessingGroup" xmlns:mc="http://schemas.openxmlformats.org/markup-compatibility/2006" xmlns:wp14="http://schemas.microsoft.com/office/word/2010/wordprocessingDrawing" xmlns:w14="http://schemas.microsoft.com/office/word/2010/wordml" xmlns:w15="http://schemas.microsoft.com/office/word/2012/wordml" w:val="BodyText"/>
+        <w:bidi xmlns:wps="http://schemas.microsoft.com/office/word/2010/wordprocessingShape" xmlns:wpg="http://schemas.microsoft.com/office/word/2010/wordprocessingGroup" xmlns:mc="http://schemas.openxmlformats.org/markup-compatibility/2006" xmlns:wp14="http://schemas.microsoft.com/office/word/2010/wordprocessingDrawing" xmlns:w14="http://schemas.microsoft.com/office/word/2010/wordml" xmlns:w15="http://schemas.microsoft.com/office/word/2012/wordml" w:val="0"/>
+        <w:spacing xmlns:wps="http://schemas.microsoft.com/office/word/2010/wordprocessingShape" xmlns:wpg="http://schemas.microsoft.com/office/word/2010/wordprocessingGroup" xmlns:mc="http://schemas.openxmlformats.org/markup-compatibility/2006" xmlns:wp14="http://schemas.microsoft.com/office/word/2010/wordprocessingDrawing" xmlns:w14="http://schemas.microsoft.com/office/word/2010/wordml" xmlns:w15="http://schemas.microsoft.com/office/word/2012/wordml" w:before="285" w:after="0"/>
+        <w:ind xmlns:wps="http://schemas.microsoft.com/office/word/2010/wordprocessingShape" xmlns:wpg="http://schemas.microsoft.com/office/word/2010/wordprocessingGroup" xmlns:mc="http://schemas.openxmlformats.org/markup-compatibility/2006" xmlns:wp14="http://schemas.microsoft.com/office/word/2010/wordprocessingDrawing" xmlns:w14="http://schemas.microsoft.com/office/word/2010/wordml" xmlns:w15="http://schemas.microsoft.com/office/word/2012/wordml" w:start="4795" w:end="0"/>
+        <w:jc xmlns:wps="http://schemas.microsoft.com/office/word/2010/wordprocessingShape" xmlns:wpg="http://schemas.microsoft.com/office/word/2010/wordprocessingGroup" xmlns:mc="http://schemas.openxmlformats.org/markup-compatibility/2006" xmlns:wp14="http://schemas.microsoft.com/office/word/2010/wordprocessingDrawing" xmlns:w14="http://schemas.microsoft.com/office/word/2010/wordml" xmlns:w15="http://schemas.microsoft.com/office/word/2012/wordml" w:val="start"/>
+        <w:rPr xmlns:wps="http://schemas.microsoft.com/office/word/2010/wordprocessingShape" xmlns:wpg="http://schemas.microsoft.com/office/word/2010/wordprocessingGroup" xmlns:mc="http://schemas.openxmlformats.org/markup-compatibility/2006" xmlns:wp14="http://schemas.microsoft.com/office/word/2010/wordprocessingDrawing" xmlns:w14="http://schemas.microsoft.com/office/word/2010/wordml" xmlns:w15="http://schemas.microsoft.com/office/word/2012/wordml"/>
+      </w:pPr>
+      <w:r>
+        <w:t xml:space="preserve">Системный подход</w:t>
       </w:r>
     </w:p>
     <w:p>
       <w:pPr>
-        <w:pStyle w:val="BodyText"/>
-      </w:pPr>
-      <w:r>
-        <w:t xml:space="preserve">Системный подход</w:t>
-      </w:r>
-    </w:p>
-    <w:p>
-      <w:pPr>
-        <w:pStyle w:val="BodyText"/>
-      </w:pPr>
-      <w:r>
-        <w:t xml:space="preserve">Каковы наши потребности и как они удовлетворяются? Эмпирическую оценку можно провести, просто оглядевшись на различные учреждения, программы, товары и услуги в обществе. Не все из них удовлетворяют реальные потребности — некоторые существуют потому, что создано искусственное</w:t>
+        <w:pStyle w:val="FirstParagraph"/>
+      </w:pPr>
+      <w:r>
+        <w:t xml:space="preserve">Каковы наши потребности и как они удовлетворяются? Эмпирическую оценку можно получить, просто оглядевшись на разные учреждения, программы, товары и услуги, предлагаемые в обществе. Не все из них удовлетворяют реальные потребности — некоторые существуют потому, что создано искусственное</w:t>
       </w:r>
       <w:r>
         <w:t xml:space="preserve"> </w:t>
@@ -268,12 +328,19 @@
         <w:t xml:space="preserve"> </w:t>
       </w:r>
       <w:r>
-        <w:t xml:space="preserve">или потребность, — но инвентаризация имеющихся активов (под активами понимаются средства удовлетворения потребностей) даёт хорошую отправную точку.</w:t>
+        <w:t xml:space="preserve">или потребность, — но инвентаризация наших активов (под активами понимаются средства удовлетворения потребностей) даёт хорошую отправную точку.</w:t>
       </w:r>
     </w:p>
     <w:p>
       <w:pPr>
-        <w:pStyle w:val="BodyText"/>
+        <w:pStyle xmlns:wps="http://schemas.microsoft.com/office/word/2010/wordprocessingShape" xmlns:wpg="http://schemas.microsoft.com/office/word/2010/wordprocessingGroup" xmlns:mc="http://schemas.openxmlformats.org/markup-compatibility/2006" xmlns:wp14="http://schemas.microsoft.com/office/word/2010/wordprocessingDrawing" xmlns:w14="http://schemas.microsoft.com/office/word/2010/wordml" xmlns:w15="http://schemas.microsoft.com/office/word/2012/wordml" w:val="BodyText"/>
+        <w:bidi xmlns:wps="http://schemas.microsoft.com/office/word/2010/wordprocessingShape" xmlns:wpg="http://schemas.microsoft.com/office/word/2010/wordprocessingGroup" xmlns:mc="http://schemas.openxmlformats.org/markup-compatibility/2006" xmlns:wp14="http://schemas.microsoft.com/office/word/2010/wordprocessingDrawing" xmlns:w14="http://schemas.microsoft.com/office/word/2010/wordml" xmlns:w15="http://schemas.microsoft.com/office/word/2012/wordml" w:val="0"/>
+        <w:spacing xmlns:wps="http://schemas.microsoft.com/office/word/2010/wordprocessingShape" xmlns:wpg="http://schemas.microsoft.com/office/word/2010/wordprocessingGroup" xmlns:mc="http://schemas.openxmlformats.org/markup-compatibility/2006" xmlns:wp14="http://schemas.microsoft.com/office/word/2010/wordprocessingDrawing" xmlns:w14="http://schemas.microsoft.com/office/word/2010/wordml" xmlns:w15="http://schemas.microsoft.com/office/word/2012/wordml" w:lineRule="auto" w:line="338" w:before="288" w:after="0"/>
+        <w:ind xmlns:wps="http://schemas.microsoft.com/office/word/2010/wordprocessingShape" xmlns:wpg="http://schemas.microsoft.com/office/word/2010/wordprocessingGroup" xmlns:mc="http://schemas.openxmlformats.org/markup-compatibility/2006" xmlns:wp14="http://schemas.microsoft.com/office/word/2010/wordprocessingDrawing" xmlns:w14="http://schemas.microsoft.com/office/word/2010/wordml" xmlns:w15="http://schemas.microsoft.com/office/word/2012/wordml" w:hanging="0" w:start="676" w:end="2674"/>
+        <w:jc xmlns:wps="http://schemas.microsoft.com/office/word/2010/wordprocessingShape" xmlns:wpg="http://schemas.microsoft.com/office/word/2010/wordprocessingGroup" xmlns:mc="http://schemas.openxmlformats.org/markup-compatibility/2006" xmlns:wp14="http://schemas.microsoft.com/office/word/2010/wordprocessingDrawing" xmlns:w14="http://schemas.microsoft.com/office/word/2010/wordml" xmlns:w15="http://schemas.microsoft.com/office/word/2012/wordml" w:val="start"/>
+        <w:rPr xmlns:wps="http://schemas.microsoft.com/office/word/2010/wordprocessingShape" xmlns:wpg="http://schemas.microsoft.com/office/word/2010/wordprocessingGroup" xmlns:mc="http://schemas.openxmlformats.org/markup-compatibility/2006" xmlns:wp14="http://schemas.microsoft.com/office/word/2010/wordprocessingDrawing" xmlns:w14="http://schemas.microsoft.com/office/word/2010/wordml" xmlns:w15="http://schemas.microsoft.com/office/word/2012/wordml">
+          <w:sz w:val="28"/>
+        </w:rPr>
       </w:pPr>
       <w:r>
         <w:drawing>
@@ -434,7 +501,12 @@
     </w:p>
     <w:p>
       <w:pPr>
-        <w:pStyle w:val="BodyText"/>
+        <w:pStyle xmlns:wps="http://schemas.microsoft.com/office/word/2010/wordprocessingShape" xmlns:wpg="http://schemas.microsoft.com/office/word/2010/wordprocessingGroup" xmlns:mc="http://schemas.openxmlformats.org/markup-compatibility/2006" xmlns:wp14="http://schemas.microsoft.com/office/word/2010/wordprocessingDrawing" xmlns:w14="http://schemas.microsoft.com/office/word/2010/wordml" xmlns:w15="http://schemas.microsoft.com/office/word/2012/wordml" w:val="BodyText"/>
+        <w:bidi xmlns:wps="http://schemas.microsoft.com/office/word/2010/wordprocessingShape" xmlns:wpg="http://schemas.microsoft.com/office/word/2010/wordprocessingGroup" xmlns:mc="http://schemas.openxmlformats.org/markup-compatibility/2006" xmlns:wp14="http://schemas.microsoft.com/office/word/2010/wordprocessingDrawing" xmlns:w14="http://schemas.microsoft.com/office/word/2010/wordml" xmlns:w15="http://schemas.microsoft.com/office/word/2012/wordml" w:val="0"/>
+        <w:spacing xmlns:wps="http://schemas.microsoft.com/office/word/2010/wordprocessingShape" xmlns:wpg="http://schemas.microsoft.com/office/word/2010/wordprocessingGroup" xmlns:mc="http://schemas.openxmlformats.org/markup-compatibility/2006" xmlns:wp14="http://schemas.microsoft.com/office/word/2010/wordprocessingDrawing" xmlns:w14="http://schemas.microsoft.com/office/word/2010/wordml" xmlns:w15="http://schemas.microsoft.com/office/word/2012/wordml" w:lineRule="auto" w:line="242" w:before="72" w:after="0"/>
+        <w:ind xmlns:wps="http://schemas.microsoft.com/office/word/2010/wordprocessingShape" xmlns:wpg="http://schemas.microsoft.com/office/word/2010/wordprocessingGroup" xmlns:mc="http://schemas.openxmlformats.org/markup-compatibility/2006" xmlns:wp14="http://schemas.microsoft.com/office/word/2010/wordprocessingDrawing" xmlns:w14="http://schemas.microsoft.com/office/word/2010/wordml" xmlns:w15="http://schemas.microsoft.com/office/word/2012/wordml" w:hanging="1153" w:start="1828" w:end="122"/>
+        <w:jc xmlns:wps="http://schemas.microsoft.com/office/word/2010/wordprocessingShape" xmlns:wpg="http://schemas.microsoft.com/office/word/2010/wordprocessingGroup" xmlns:mc="http://schemas.openxmlformats.org/markup-compatibility/2006" xmlns:wp14="http://schemas.microsoft.com/office/word/2010/wordprocessingDrawing" xmlns:w14="http://schemas.microsoft.com/office/word/2010/wordml" xmlns:w15="http://schemas.microsoft.com/office/word/2012/wordml" w:val="start"/>
+        <w:rPr xmlns:wps="http://schemas.microsoft.com/office/word/2010/wordprocessingShape" xmlns:wpg="http://schemas.microsoft.com/office/word/2010/wordprocessingGroup" xmlns:mc="http://schemas.openxmlformats.org/markup-compatibility/2006" xmlns:wp14="http://schemas.microsoft.com/office/word/2010/wordprocessingDrawing" xmlns:w14="http://schemas.microsoft.com/office/word/2010/wordml" xmlns:w15="http://schemas.microsoft.com/office/word/2012/wordml"/>
       </w:pPr>
       <w:r>
         <w:drawing>
@@ -484,12 +556,19 @@
         <w:t xml:space="preserve"> </w:t>
       </w:r>
       <w:r>
-        <w:t xml:space="preserve">жилье, системы связи, транспорт, энергия, управление отходами, продовольствие</w:t>
+        <w:t xml:space="preserve">жильё, системы связи, транспорт, энергия, управление отходами, продовольствие</w:t>
       </w:r>
     </w:p>
     <w:p>
       <w:pPr>
-        <w:pStyle w:val="BodyText"/>
+        <w:pStyle xmlns:wps="http://schemas.microsoft.com/office/word/2010/wordprocessingShape" xmlns:wpg="http://schemas.microsoft.com/office/word/2010/wordprocessingGroup" xmlns:mc="http://schemas.openxmlformats.org/markup-compatibility/2006" xmlns:wp14="http://schemas.microsoft.com/office/word/2010/wordprocessingDrawing" xmlns:w14="http://schemas.microsoft.com/office/word/2010/wordml" xmlns:w15="http://schemas.microsoft.com/office/word/2012/wordml" w:val="BodyText"/>
+        <w:bidi xmlns:wps="http://schemas.microsoft.com/office/word/2010/wordprocessingShape" xmlns:wpg="http://schemas.microsoft.com/office/word/2010/wordprocessingGroup" xmlns:mc="http://schemas.openxmlformats.org/markup-compatibility/2006" xmlns:wp14="http://schemas.microsoft.com/office/word/2010/wordprocessingDrawing" xmlns:w14="http://schemas.microsoft.com/office/word/2010/wordml" xmlns:w15="http://schemas.microsoft.com/office/word/2012/wordml" w:val="0"/>
+        <w:spacing xmlns:wps="http://schemas.microsoft.com/office/word/2010/wordprocessingShape" xmlns:wpg="http://schemas.microsoft.com/office/word/2010/wordprocessingGroup" xmlns:mc="http://schemas.openxmlformats.org/markup-compatibility/2006" xmlns:wp14="http://schemas.microsoft.com/office/word/2010/wordprocessingDrawing" xmlns:w14="http://schemas.microsoft.com/office/word/2010/wordml" xmlns:w15="http://schemas.microsoft.com/office/word/2012/wordml" w:before="298" w:after="0"/>
+        <w:ind xmlns:wps="http://schemas.microsoft.com/office/word/2010/wordprocessingShape" xmlns:wpg="http://schemas.microsoft.com/office/word/2010/wordprocessingGroup" xmlns:mc="http://schemas.openxmlformats.org/markup-compatibility/2006" xmlns:wp14="http://schemas.microsoft.com/office/word/2010/wordprocessingDrawing" xmlns:w14="http://schemas.microsoft.com/office/word/2010/wordml" xmlns:w15="http://schemas.microsoft.com/office/word/2012/wordml" w:hanging="0" w:start="676" w:end="0"/>
+        <w:jc xmlns:wps="http://schemas.microsoft.com/office/word/2010/wordprocessingShape" xmlns:wpg="http://schemas.microsoft.com/office/word/2010/wordprocessingGroup" xmlns:mc="http://schemas.openxmlformats.org/markup-compatibility/2006" xmlns:wp14="http://schemas.microsoft.com/office/word/2010/wordprocessingDrawing" xmlns:w14="http://schemas.microsoft.com/office/word/2010/wordml" xmlns:w15="http://schemas.microsoft.com/office/word/2012/wordml" w:val="start"/>
+        <w:rPr xmlns:wps="http://schemas.microsoft.com/office/word/2010/wordprocessingShape" xmlns:wpg="http://schemas.microsoft.com/office/word/2010/wordprocessingGroup" xmlns:mc="http://schemas.openxmlformats.org/markup-compatibility/2006" xmlns:wp14="http://schemas.microsoft.com/office/word/2010/wordprocessingDrawing" xmlns:w14="http://schemas.microsoft.com/office/word/2010/wordml" xmlns:w15="http://schemas.microsoft.com/office/word/2012/wordml">
+          <w:sz w:val="28"/>
+        </w:rPr>
       </w:pPr>
       <w:r>
         <w:drawing>
@@ -544,10 +623,17 @@
     </w:p>
     <w:p>
       <w:pPr>
-        <w:pStyle w:val="BodyText"/>
-      </w:pPr>
-      <w:r>
-        <w:t xml:space="preserve">РИСУНОК 1.1. Потребности человека и системы сообщества</w:t>
+        <w:pStyle xmlns:wps="http://schemas.microsoft.com/office/word/2010/wordprocessingShape" xmlns:wpg="http://schemas.microsoft.com/office/word/2010/wordprocessingGroup" xmlns:mc="http://schemas.openxmlformats.org/markup-compatibility/2006" xmlns:wp14="http://schemas.microsoft.com/office/word/2010/wordprocessingDrawing" xmlns:w14="http://schemas.microsoft.com/office/word/2010/wordml" xmlns:w15="http://schemas.microsoft.com/office/word/2012/wordml" w:val="BodyText"/>
+        <w:bidi xmlns:wps="http://schemas.microsoft.com/office/word/2010/wordprocessingShape" xmlns:wpg="http://schemas.microsoft.com/office/word/2010/wordprocessingGroup" xmlns:mc="http://schemas.openxmlformats.org/markup-compatibility/2006" xmlns:wp14="http://schemas.microsoft.com/office/word/2010/wordprocessingDrawing" xmlns:w14="http://schemas.microsoft.com/office/word/2010/wordml" xmlns:w15="http://schemas.microsoft.com/office/word/2012/wordml" w:val="0"/>
+        <w:spacing xmlns:wps="http://schemas.microsoft.com/office/word/2010/wordprocessingShape" xmlns:wpg="http://schemas.microsoft.com/office/word/2010/wordprocessingGroup" xmlns:mc="http://schemas.openxmlformats.org/markup-compatibility/2006" xmlns:wp14="http://schemas.microsoft.com/office/word/2010/wordprocessingDrawing" xmlns:w14="http://schemas.microsoft.com/office/word/2010/wordml" xmlns:w15="http://schemas.microsoft.com/office/word/2012/wordml" w:before="291" w:after="0"/>
+        <w:ind xmlns:wps="http://schemas.microsoft.com/office/word/2010/wordprocessingShape" xmlns:wpg="http://schemas.microsoft.com/office/word/2010/wordprocessingGroup" xmlns:mc="http://schemas.openxmlformats.org/markup-compatibility/2006" xmlns:wp14="http://schemas.microsoft.com/office/word/2010/wordprocessingDrawing" xmlns:w14="http://schemas.microsoft.com/office/word/2010/wordml" xmlns:w15="http://schemas.microsoft.com/office/word/2012/wordml" w:hanging="0" w:start="0" w:end="0"/>
+        <w:jc xmlns:wps="http://schemas.microsoft.com/office/word/2010/wordprocessingShape" xmlns:wpg="http://schemas.microsoft.com/office/word/2010/wordprocessingGroup" xmlns:mc="http://schemas.openxmlformats.org/markup-compatibility/2006" xmlns:wp14="http://schemas.microsoft.com/office/word/2010/wordprocessingDrawing" xmlns:w14="http://schemas.microsoft.com/office/word/2010/wordml" xmlns:w15="http://schemas.microsoft.com/office/word/2012/wordml" w:val="center"/>
+        <w:rPr xmlns:wps="http://schemas.microsoft.com/office/word/2010/wordprocessingShape" xmlns:wpg="http://schemas.microsoft.com/office/word/2010/wordprocessingGroup" xmlns:mc="http://schemas.openxmlformats.org/markup-compatibility/2006" xmlns:wp14="http://schemas.microsoft.com/office/word/2010/wordprocessingDrawing" xmlns:w14="http://schemas.microsoft.com/office/word/2010/wordml" xmlns:w15="http://schemas.microsoft.com/office/word/2012/wordml">
+          <w:sz w:val="21"/>
+        </w:rPr>
+      </w:pPr>
+      <w:r>
+        <w:t xml:space="preserve">РИСУНОК 1.1. Потребности человека и система сообщества</w:t>
       </w:r>
     </w:p>
     <w:p>
@@ -555,7 +641,36 @@
         <w:pStyle w:val="BodyText"/>
       </w:pPr>
       <w:r>
-        <w:t xml:space="preserve">Прежде чем стать полноценными членами сообщества, нам нужно развиваться как личности. Нам необходимы образование, здравоохранение, самооценка, навыки и возможности для отдыха. В сообществах существуют ресурсы, удовлетворяющие эти потребности — школы, университеты, программы ухода за детьми, медицинские и оздоровительные услуги, больницы, спортивные и рекреационные объекты. Когда работают системы, делающие нас здоровыми, продуктивными и счастливыми, можно говорить о достаточном человеческом капитале.</w:t>
+        <w:t xml:space="preserve">Прежде чем мы сможем стать полноценными членами любого сообщества, нам необходимо</w:t>
+      </w:r>
+      <w:r>
+        <w:t xml:space="preserve"> </w:t>
+      </w:r>
+      <w:r>
+        <w:rPr>
+          <w:i/>
+          <w:iCs/>
+        </w:rPr>
+        <w:t xml:space="preserve">развиваться как личности</w:t>
+      </w:r>
+      <w:r>
+        <w:t xml:space="preserve">. Нам нужно образование, здравоохранение, самоуважение, навыки и возможности для отдыха. В сообществах есть ресурсы — школы, университеты, детские программы, оздоровительные и медицинские услуги, больницы, объекты досуга — которые удовлетворяют эти потребности. Если существуют системы, помогающие людям быть здоровыми, продуктивными и счастливыми, можно говорить о достаточном</w:t>
+      </w:r>
+      <w:r>
+        <w:t xml:space="preserve"> </w:t>
+      </w:r>
+      <w:r>
+        <w:rPr>
+          <w:i/>
+          <w:iCs/>
+        </w:rPr>
+        <w:t xml:space="preserve">человеческом капитале</w:t>
+      </w:r>
+      <w:r>
+        <w:t xml:space="preserve"> </w:t>
+      </w:r>
+      <w:r>
+        <w:t xml:space="preserve">сообщества.</w:t>
       </w:r>
       <w:r>
         <w:t xml:space="preserve"> </w:t>
@@ -571,7 +686,7 @@
         <w:t xml:space="preserve"> </w:t>
       </w:r>
       <w:r>
-        <w:t xml:space="preserve">— это способность сообщества способствовать нашему развитию как личностей и совокупность навыков, знаний и умений, которыми располагают люди и которые они поддерживают.</w:t>
+        <w:t xml:space="preserve">— это способность сообщества способствовать нашему развитию и совокупность навыков, знаний и умений его жителей, которые они могут поддерживать.</w:t>
       </w:r>
     </w:p>
     <w:p>
@@ -595,7 +710,7 @@
         <w:t xml:space="preserve"> </w:t>
       </w:r>
       <w:r>
-        <w:t xml:space="preserve">— те, что удовлетворяются только в рамках сообщества. Нам нужно чувство связи и общности, безопасность, возможность самовыражения и наслаждение красотой мира. Нам нужен смысл и цель, а смысл чаще всего рождается в отношениях — с детьми, семьёй, страной или с нашим представлением о божественном. Нам важны поддерживающие связи, сети друзей и ощущение вклада в сообщество. Когда эти потребности удовлетворены, говорят о значительных социальных активах. Системы, гарантирующие удовлетворение социальных и культурных потребностей сообщества, формируют</w:t>
+        <w:t xml:space="preserve">— те, которые можно удовлетворить только в сообществе. Нам важно ощущать связь и принадлежность, чувствовать безопасность, иметь возможность выражать себя и наслаждаться красотой мира. Нам нужны смысл и цель — а они неизменно возникают в отношениях: с детьми, семьёй, страной или с представлением о божественном. Эти человеческие и социальные потребности на протяжении веков породили многие религии и духовные традиции. Нужны поддерживающие отношения, сеть друзей и ощущение вклада в жизнь сообщества. Когда эти потребности удовлетворены, у сообщества много социальных активов. Если существуют системы, гарантирующие продолжение удовлетворения социальных и культурных потребностей, можно говорить о достаточном</w:t>
       </w:r>
       <w:r>
         <w:t xml:space="preserve"> </w:t>
@@ -605,7 +720,7 @@
           <w:i/>
           <w:iCs/>
         </w:rPr>
-        <w:t xml:space="preserve">социальный и культурный капитал</w:t>
+        <w:t xml:space="preserve">социальном и культурном капитале</w:t>
       </w:r>
       <w:r>
         <w:t xml:space="preserve">.</w:t>
@@ -616,7 +731,7 @@
         <w:pStyle w:val="BodyText"/>
       </w:pPr>
       <w:r>
-        <w:t xml:space="preserve">Для принятия решений, разрешения конфликтов и обеспечения равенства необходимо</w:t>
+        <w:t xml:space="preserve">Для принятия решений, разрешения конфликтов и обеспечения равенства требуется</w:t>
       </w:r>
       <w:r>
         <w:t xml:space="preserve"> </w:t>
@@ -629,7 +744,7 @@
         <w:t xml:space="preserve">расширение прав и возможностей</w:t>
       </w:r>
       <w:r>
-        <w:t xml:space="preserve">. Институты самоуправления, общественные программы для урегулирования споров, а также законы и правила, обеспечивающие справедливость и мир — всё это активы в этой сфере.</w:t>
+        <w:t xml:space="preserve">. Институты самоуправления, общественные программы по урегулированию споров, законы и регламенты, призванные обеспечить справедливость и мир — всё это активы в этой сфере.</w:t>
       </w:r>
       <w:r>
         <w:t xml:space="preserve"> </w:t>
@@ -645,7 +760,7 @@
         <w:t xml:space="preserve"> </w:t>
       </w:r>
       <w:r>
-        <w:t xml:space="preserve">сообщества — правовая база, традиции, структуры и другие опоры, позволяющие ему воспроизводить необходимые институты.</w:t>
+        <w:t xml:space="preserve">— правовая база, традиции, структуры и другие основы, позволяющие обществу воспроизводить нужные институты.</w:t>
       </w:r>
     </w:p>
     <w:p>
@@ -653,7 +768,7 @@
         <w:pStyle w:val="BodyText"/>
       </w:pPr>
       <w:r>
-        <w:t xml:space="preserve">Когда люди думают о потребностях, на ум обычно приходят еда, одежда и жильё. Эти</w:t>
+        <w:t xml:space="preserve">Когда люди думают о потребностях, чаще всего первыми приходят на ум еда, одежда и жильё. Эти</w:t>
       </w:r>
       <w:r>
         <w:t xml:space="preserve"> </w:t>
@@ -669,7 +784,7 @@
         <w:t xml:space="preserve"> </w:t>
       </w:r>
       <w:r>
-        <w:t xml:space="preserve">действительно важны: здания, промышленные товары, технологии и инфраструктура в сообществах служат для их удовлетворения. Наличие доступного жилья, чистой питьевой воды, эффективных систем переработки и повторного использования отходов, возобновляемых источников энергии, производства здоровой местной пищи и надёжных систем связи — всё это составляет</w:t>
+        <w:t xml:space="preserve">важны, а здания, промышленные товары, технологии и инфраструктура, создаваемые в сообществах, служат средствами их удовлетворения. Хорошее доступное жильё, чистая питьевая вода, эффективные системы переработки и повторного использования отходов, возобновляемая энергия, производство здоровой местной пищи, системы связи, соединяющие нас между собой и с миром — всё это</w:t>
       </w:r>
       <w:r>
         <w:t xml:space="preserve"> </w:t>
@@ -703,7 +818,7 @@
         <w:t xml:space="preserve">экологические потребности</w:t>
       </w:r>
       <w:r>
-        <w:t xml:space="preserve">. Нам нужен чистый воздух, разнообразные экосистемы, стабильно работающий климат, способность ассимилировать отходы, вода для поддержания жизни и для гигиены. Нам также нужны здоровые почвы и опылители — все эти элементы являются</w:t>
+        <w:t xml:space="preserve">. Нам нужен чистый воздух, разнообразные экосистемы, поддерживающие множество видов, стабильный климат, способность ассимилировать отходы, вода для поддержания жизни и для того, чтобы мы могли мыться, пить и радоваться жизни. Здоровые почвы, опылители — всё это</w:t>
       </w:r>
       <w:r>
         <w:t xml:space="preserve"> </w:t>
@@ -713,10 +828,10 @@
           <w:i/>
           <w:iCs/>
         </w:rPr>
-        <w:t xml:space="preserve">экологическими активами</w:t>
-      </w:r>
-      <w:r>
-        <w:t xml:space="preserve">, поддерживающими нашу систему жизнеобеспечения. Когда экосистема здорова и продуктивна, её способность к регенерации — это</w:t>
+        <w:t xml:space="preserve">экологические активы</w:t>
+      </w:r>
+      <w:r>
+        <w:t xml:space="preserve">, которые служат нашей системе жизнеобеспечения. Когда экосистема здорова и продуктивна, её регенеративные способности представляют собой</w:t>
       </w:r>
       <w:r>
         <w:t xml:space="preserve"> </w:t>
@@ -737,7 +852,7 @@
         <w:pStyle w:val="BodyText"/>
       </w:pPr>
       <w:r>
-        <w:t xml:space="preserve">Мы перечислили виды активов и капитала, удовлетворяющие наши потребности, но ещё не упомянули финансовые активы и капитал, которые обычно ассоциируют со словами</w:t>
+        <w:t xml:space="preserve">Мы описали несколько видов активов и капитала, которые удовлетворяют наши потребности, но пока не упомянули финансовые активы и капитал, которые обычно ассоциируются со словами</w:t>
       </w:r>
       <w:r>
         <w:t xml:space="preserve"> </w:t>
@@ -766,7 +881,7 @@
         <w:t xml:space="preserve">«инвестиции»</w:t>
       </w:r>
       <w:r>
-        <w:t xml:space="preserve">. Частично это потому, что деньги — средство, а не сама по себе потребность. В сущности нам не нужны деньги как таковые, нам нужны вещи, которые за них можно приобрести. Финансовый капитал не нужен сам по себе, если необходимые блага и услуги доступны иными способами. Способность денег служить средством обмена — и сегодня, и, вероятно, в будущем — одна из главных причин их необходимости. Деньги помогают обменивать то, что ценно для одного (время, труд), на то, что ценно для другого.</w:t>
+        <w:t xml:space="preserve">. Отчасти это потому, что деньги — скорее средство, чем сама потребность. Деньги нам на самом деле не нужны; нам нужны вещи, которые можно за них купить. Финансовый капитал сам по себе не обязателен, если можно получить необходимые блага и услуги другим способом. Обменная способность денег — одна из ключевых причин, почему они нам нужны сейчас и, надеемся, будут нужны и в будущем. Деньги позволяют обменивать то, что ценно для нас — время и труд, — на то, что ценно для других.</w:t>
       </w:r>
     </w:p>
     <w:p>
@@ -774,7 +889,7 @@
         <w:pStyle w:val="BodyText"/>
       </w:pPr>
       <w:r>
-        <w:t xml:space="preserve">Однако деньги — не единственное средство обмена. Тысячи лет люди обменивались товарами и услугами без денег. Вы помогаете соседу поставить новую крышу — он лечит вам зубы и ставит коронку. Вы отвозите детей подруги в школу — она присматривает за вашими детьми. В этих примерах деньги напрямую не переходят из рук в руки, но обмен всё равно происходит. Ценность такого обмена — ещё один актив и форма капитала —</w:t>
+        <w:t xml:space="preserve">Однако деньги — не единственное средство обмена. Тысячи лет люди обменивались товарами и услугами без денег. Вы помогаете соседу поставить новую крышу; он лечит вам зубы и ставит коронку. Вы отвозите детей подруги в школу; она присматривает за вашими детьми. В обоих случаях деньги не переходят из рук в руки, но обмен всё равно происходит. Ценность такого обмена — ещё один актив и форма капитала —</w:t>
       </w:r>
       <w:r>
         <w:t xml:space="preserve"> </w:t>
@@ -795,12 +910,18 @@
         <w:pStyle w:val="BodyText"/>
       </w:pPr>
       <w:r>
-        <w:t xml:space="preserve">Наши общественные системы развивались на протяжении веков под влиянием потребностей людей и стремления их удовлетворять. Под богатым сообществом мы понимаем сообщество, способное обеспечить широкий спектр человеческих потребностей — то есть инвестировавшее во все формы капитала: социальный, культурный, человеческий, институциональный, материальный, технологический, природный, финансовый и потенциальный обменный капитал. Создание и поддержание этих разнообразных форм капитала с течением времени — ключевая задача устойчивого развития.</w:t>
+        <w:t xml:space="preserve">Наши общественные системы развивались веками под влиянием потребностей людей и стремления их удовлетворять. Под богатым сообществом обычно понимают</w:t>
       </w:r>
     </w:p>
     <w:p>
       <w:pPr>
-        <w:pStyle w:val="BodyText"/>
+        <w:bidi xmlns:wps="http://schemas.microsoft.com/office/word/2010/wordprocessingShape" xmlns:wpg="http://schemas.microsoft.com/office/word/2010/wordprocessingGroup" xmlns:mc="http://schemas.openxmlformats.org/markup-compatibility/2006" xmlns:wp14="http://schemas.microsoft.com/office/word/2010/wordprocessingDrawing" xmlns:w14="http://schemas.microsoft.com/office/word/2010/wordml" xmlns:w15="http://schemas.microsoft.com/office/word/2012/wordml" w:val="0"/>
+        <w:spacing xmlns:wps="http://schemas.microsoft.com/office/word/2010/wordprocessingShape" xmlns:wpg="http://schemas.microsoft.com/office/word/2010/wordprocessingGroup" xmlns:mc="http://schemas.openxmlformats.org/markup-compatibility/2006" xmlns:wp14="http://schemas.microsoft.com/office/word/2010/wordprocessingDrawing" xmlns:w14="http://schemas.microsoft.com/office/word/2010/wordml" xmlns:w15="http://schemas.microsoft.com/office/word/2012/wordml" w:lineRule="auto" w:line="240"/>
+        <w:ind xmlns:wps="http://schemas.microsoft.com/office/word/2010/wordprocessingShape" xmlns:wpg="http://schemas.microsoft.com/office/word/2010/wordprocessingGroup" xmlns:mc="http://schemas.openxmlformats.org/markup-compatibility/2006" xmlns:wp14="http://schemas.microsoft.com/office/word/2010/wordprocessingDrawing" xmlns:w14="http://schemas.microsoft.com/office/word/2010/wordml" xmlns:w15="http://schemas.microsoft.com/office/word/2012/wordml" w:hanging="0" w:start="3196" w:end="0"/>
+        <w:jc xmlns:wps="http://schemas.microsoft.com/office/word/2010/wordprocessingShape" xmlns:wpg="http://schemas.microsoft.com/office/word/2010/wordprocessingGroup" xmlns:mc="http://schemas.openxmlformats.org/markup-compatibility/2006" xmlns:wp14="http://schemas.microsoft.com/office/word/2010/wordprocessingDrawing" xmlns:w14="http://schemas.microsoft.com/office/word/2010/wordml" xmlns:w15="http://schemas.microsoft.com/office/word/2012/wordml" w:val="center"/>
+        <w:rPr xmlns:wps="http://schemas.microsoft.com/office/word/2010/wordprocessingShape" xmlns:wpg="http://schemas.microsoft.com/office/word/2010/wordprocessingGroup" xmlns:mc="http://schemas.openxmlformats.org/markup-compatibility/2006" xmlns:wp14="http://schemas.microsoft.com/office/word/2010/wordprocessingDrawing" xmlns:w14="http://schemas.microsoft.com/office/word/2010/wordml" xmlns:w15="http://schemas.microsoft.com/office/word/2012/wordml">
+          <w:sz w:val="20"/>
+        </w:rPr>
       </w:pPr>
       <w:r>
         <w:drawing>
@@ -839,7 +960,14 @@
     </w:p>
     <w:p>
       <w:pPr>
-        <w:pStyle w:val="BodyText"/>
+        <w:pStyle xmlns:wps="http://schemas.microsoft.com/office/word/2010/wordprocessingShape" xmlns:wpg="http://schemas.microsoft.com/office/word/2010/wordprocessingGroup" xmlns:mc="http://schemas.openxmlformats.org/markup-compatibility/2006" xmlns:wp14="http://schemas.microsoft.com/office/word/2010/wordprocessingDrawing" xmlns:w14="http://schemas.microsoft.com/office/word/2010/wordml" xmlns:w15="http://schemas.microsoft.com/office/word/2012/wordml" w:val="Caption"/>
+        <w:bidi xmlns:wps="http://schemas.microsoft.com/office/word/2010/wordprocessingShape" xmlns:wpg="http://schemas.microsoft.com/office/word/2010/wordprocessingGroup" xmlns:mc="http://schemas.openxmlformats.org/markup-compatibility/2006" xmlns:wp14="http://schemas.microsoft.com/office/word/2010/wordprocessingDrawing" xmlns:w14="http://schemas.microsoft.com/office/word/2010/wordml" xmlns:w15="http://schemas.microsoft.com/office/word/2012/wordml" w:val="0"/>
+        <w:spacing xmlns:wps="http://schemas.microsoft.com/office/word/2010/wordprocessingShape" xmlns:wpg="http://schemas.microsoft.com/office/word/2010/wordprocessingGroup" xmlns:mc="http://schemas.openxmlformats.org/markup-compatibility/2006" xmlns:wp14="http://schemas.microsoft.com/office/word/2010/wordprocessingDrawing" xmlns:w14="http://schemas.microsoft.com/office/word/2010/wordml" xmlns:w15="http://schemas.microsoft.com/office/word/2012/wordml" w:before="277" w:after="0"/>
+        <w:ind xmlns:wps="http://schemas.microsoft.com/office/word/2010/wordprocessingShape" xmlns:wpg="http://schemas.microsoft.com/office/word/2010/wordprocessingGroup" xmlns:mc="http://schemas.openxmlformats.org/markup-compatibility/2006" xmlns:wp14="http://schemas.microsoft.com/office/word/2010/wordprocessingDrawing" xmlns:w14="http://schemas.microsoft.com/office/word/2010/wordml" xmlns:w15="http://schemas.microsoft.com/office/word/2012/wordml" w:hanging="0" w:start="0" w:end="0"/>
+        <w:jc xmlns:wps="http://schemas.microsoft.com/office/word/2010/wordprocessingShape" xmlns:wpg="http://schemas.microsoft.com/office/word/2010/wordprocessingGroup" xmlns:mc="http://schemas.openxmlformats.org/markup-compatibility/2006" xmlns:wp14="http://schemas.microsoft.com/office/word/2010/wordprocessingDrawing" xmlns:w14="http://schemas.microsoft.com/office/word/2010/wordml" xmlns:w15="http://schemas.microsoft.com/office/word/2012/wordml" w:val="center"/>
+        <w:rPr xmlns:wps="http://schemas.microsoft.com/office/word/2010/wordprocessingShape" xmlns:wpg="http://schemas.microsoft.com/office/word/2010/wordprocessingGroup" xmlns:mc="http://schemas.openxmlformats.org/markup-compatibility/2006" xmlns:wp14="http://schemas.microsoft.com/office/word/2010/wordprocessingDrawing" xmlns:w14="http://schemas.microsoft.com/office/word/2010/wordml" xmlns:w15="http://schemas.microsoft.com/office/word/2012/wordml">
+          <w:sz w:val="21"/>
+        </w:rPr>
       </w:pPr>
       <w:r>
         <w:t xml:space="preserve">Рисунок 1.2. Взаимосвязь между потребностями, активами и капиталом</w:t>
@@ -850,17 +978,202 @@
         <w:pStyle w:val="BodyText"/>
       </w:pPr>
       <w:r>
-        <w:t xml:space="preserve">Более половины человечества живёт в городах, и, как ожидается, эта тенденция продлится как минимум ещё десятилетие. Поэтому богатство общества во многом сосредоточено в городах. Города — памятники коллективных усилий человечества на протяжении тысячелетий. Они создают физические, пространственные и даже когнитивные структуры, удовлетворяющие многие наши потребности. Исходя из этого, в большинстве конкретных примеров создания богатства, которые мы обсуждаем, мы будем сосредоточены на городах.</w:t>
+        <w:t xml:space="preserve">Более половины человечества сейчас живёт в городах, и эта тенденция, по прогнозам, сохранится как минимум ещё на десятилетие. Поэтому богатство нашего общества во многом сосредоточено в городах. Города — памятники коллективных усилий человечества на протяжении тысячелетий. Они формируют физические, пространственные и когнитивные структуры, которые удовлетворяют многие наши потребности. Учитывая это, в большинстве конкретных примеров создания богатства, которые мы обсуждаем, мы сосредоточимся на городах.</w:t>
+      </w:r>
+    </w:p>
+    <w:p>
+      <w:pPr>
+        <w:pStyle xmlns:wps="http://schemas.microsoft.com/office/word/2010/wordprocessingShape" xmlns:wpg="http://schemas.microsoft.com/office/word/2010/wordprocessingGroup" xmlns:mc="http://schemas.openxmlformats.org/markup-compatibility/2006" xmlns:wp14="http://schemas.microsoft.com/office/word/2010/wordprocessingDrawing" xmlns:w14="http://schemas.microsoft.com/office/word/2010/wordml" xmlns:w15="http://schemas.microsoft.com/office/word/2012/wordml" w:val="BodyText"/>
+        <w:bidi xmlns:wps="http://schemas.microsoft.com/office/word/2010/wordprocessingShape" xmlns:wpg="http://schemas.microsoft.com/office/word/2010/wordprocessingGroup" xmlns:mc="http://schemas.openxmlformats.org/markup-compatibility/2006" xmlns:wp14="http://schemas.microsoft.com/office/word/2010/wordprocessingDrawing" xmlns:w14="http://schemas.microsoft.com/office/word/2010/wordml" xmlns:w15="http://schemas.microsoft.com/office/word/2012/wordml" w:val="0"/>
+        <w:spacing xmlns:wps="http://schemas.microsoft.com/office/word/2010/wordprocessingShape" xmlns:wpg="http://schemas.microsoft.com/office/word/2010/wordprocessingGroup" xmlns:mc="http://schemas.openxmlformats.org/markup-compatibility/2006" xmlns:wp14="http://schemas.microsoft.com/office/word/2010/wordprocessingDrawing" xmlns:w14="http://schemas.microsoft.com/office/word/2010/wordml" xmlns:w15="http://schemas.microsoft.com/office/word/2012/wordml" w:before="285" w:after="0"/>
+        <w:ind xmlns:wps="http://schemas.microsoft.com/office/word/2010/wordprocessingShape" xmlns:wpg="http://schemas.microsoft.com/office/word/2010/wordprocessingGroup" xmlns:mc="http://schemas.openxmlformats.org/markup-compatibility/2006" xmlns:wp14="http://schemas.microsoft.com/office/word/2010/wordprocessingDrawing" xmlns:w14="http://schemas.microsoft.com/office/word/2010/wordml" xmlns:w15="http://schemas.microsoft.com/office/word/2012/wordml" w:start="4910" w:end="0"/>
+        <w:jc xmlns:wps="http://schemas.microsoft.com/office/word/2010/wordprocessingShape" xmlns:wpg="http://schemas.microsoft.com/office/word/2010/wordprocessingGroup" xmlns:mc="http://schemas.openxmlformats.org/markup-compatibility/2006" xmlns:wp14="http://schemas.microsoft.com/office/word/2010/wordprocessingDrawing" xmlns:w14="http://schemas.microsoft.com/office/word/2010/wordml" xmlns:w15="http://schemas.microsoft.com/office/word/2012/wordml" w:val="start"/>
+        <w:rPr xmlns:wps="http://schemas.microsoft.com/office/word/2010/wordprocessingShape" xmlns:wpg="http://schemas.microsoft.com/office/word/2010/wordprocessingGroup" xmlns:mc="http://schemas.openxmlformats.org/markup-compatibility/2006" xmlns:wp14="http://schemas.microsoft.com/office/word/2010/wordprocessingDrawing" xmlns:w14="http://schemas.microsoft.com/office/word/2010/wordml" xmlns:w15="http://schemas.microsoft.com/office/word/2012/wordml"/>
+      </w:pPr>
+      <w:r>
+        <w:t xml:space="preserve">Богатство городов</w:t>
+      </w:r>
+    </w:p>
+    <w:p>
+      <w:pPr>
+        <w:pStyle w:val="BodyText"/>
+      </w:pPr>
+      <w:r>
+        <w:t xml:space="preserve">Чтобы понять альтернативные пути достижения индивидуального, общественного и экономического благополучия в городском контексте, нужно изучить, как функционируют города, и требуются активные действия городского руководства по решению ключевых вопросов устойчивой экономики. В книге «Города и богатство наций» Джейн Джейкобс городские регионы определены как главный двигатель экономического роста на протяжении истории. Она показала, что города и регионы обладали экономической мощью, позволяющей импортировать товары из других областей и одновременно разрабатывать местные замены этим импортам. Замещение импорта стало ключевым источником экономического роста городов</w:t>
+      </w:r>
+      <w:r>
+        <w:t xml:space="preserve"> </w:t>
+      </w:r>
+      <w:r>
+        <w:t xml:space="preserve">3</w:t>
+      </w:r>
+      <w:r>
+        <w:t xml:space="preserve">.</w:t>
+      </w:r>
+    </w:p>
+    <w:p>
+      <w:pPr>
+        <w:pStyle w:val="BodyText"/>
+      </w:pPr>
+      <w:r>
+        <w:t xml:space="preserve">С момента Всемирного саммита по окружающей среде в Рио-де-Жанейро в 1992 году города по всему миру играют ведущую роль в усилиях по стабилизации климата и борьбе с разрушением окружающей среды. Появились различные движения — «устойчивые города», «здоровые города», «экологичные города» и, совсем недавно, «переходные города» — а также организации, созданные для поддержки городских инициатив. ICLEI была одной из первых: изначально она называлась Международный совет по местным экологическим инициативам, затем стала ICLEI — Местные органы власти за устойчивое развитие</w:t>
+      </w:r>
+      <w:r>
+        <w:t xml:space="preserve"> </w:t>
+      </w:r>
+      <w:r>
+        <w:t xml:space="preserve">4</w:t>
+      </w:r>
+      <w:r>
+        <w:t xml:space="preserve">.</w:t>
+      </w:r>
+    </w:p>
+    <w:p>
+      <w:pPr>
+        <w:pStyle w:val="BodyText"/>
+      </w:pPr>
+      <w:r>
+        <w:t xml:space="preserve">Масштаб и глубина этого движения подтверждаются ростом других организаций за последние два десятилетия: Институт устойчивых сообществ, программа «Здоровые города» Всемирной организации здравоохранения, Международная организация «Здоровые города», Международная организация «Экополисы», Центр устойчивых городов, сеть Cities PLUS, Глобальные инициативы сообществ и крупнейшая из них — Организация «Объединённые города и местные власти» (ОУМВ). Международный конгресс городов был создан в 2004 году, когда несколько глобальных коалиций городов (Международный союз местных властей, Метрополис и Всемирная федерация объединённых городов) объединились в одну организацию.</w:t>
+      </w:r>
+      <w:r>
+        <w:t xml:space="preserve">5</w:t>
+      </w:r>
+      <w:r>
+        <w:t xml:space="preserve"> </w:t>
+      </w:r>
+      <w:r>
+        <w:t xml:space="preserve">Кампания «Города тысячелетия» ОУМВ поддерживает Цели развития тысячелетия ООН, где в центре внимания — устойчивое окружение и устойчивая местная экономика. Города всё больше осознают, что решения проблем климата и экологии заложены в созданной нами экономике, и могут стать ключевыми катализаторами масштабных изменений.</w:t>
+      </w:r>
+    </w:p>
+    <w:p>
+      <w:pPr>
+        <w:pStyle w:val="BodyText"/>
+      </w:pPr>
+      <w:r>
+        <w:t xml:space="preserve">Города действуют на нескольких уровнях: от общих политических преобразований, например перепрофилирования районов с коммерческих на промышленные, до мелких шагов — например покупки бумажных полотенец для общественных туалетов. Политика проявляется в разных формах: долгосрочные планы с видением, целями и стратегиями; операционные бюджеты и планы капиталовложений; постановления и правила; годовые цели; а также внутренние политики — кадровая, закупочная и т. п. Долгосрочные планы задают направление изменений в постановлениях и бюджетах; бюджеты, планы капиталовложений и годовые цели определяют ежегодные мероприятия по реализации. Другие политики формируют повседневные процедуры.</w:t>
+      </w:r>
+    </w:p>
+    <w:p>
+      <w:pPr>
+        <w:pStyle w:val="BodyText"/>
+      </w:pPr>
+      <w:r>
+        <w:t xml:space="preserve">Так, например, в городской совет была избрана женщина, которая во время предвыборной кампании обещала сократить выбросы углерода и уменьшить зависимость от ископаемого топлива. В первый же день ей представляют покупку для полиции автомобиля с высоким расходом топлива для нового автопарка. Если она попытается остановить покупку, то столкнётся с сопротивлением начальника полиции и городского управляющего: они объяснят, что автомобиль включён в капитальный план и является частью долгосрочной программы замены, возможно, с контрактами с местными автодилерами, которые нельзя расторгнуть. Возражения новоизбранной, вероятно, отвергнут более опытные члены совета, и покупка будет произведена. Она может возразить: «…граждане на этих выборах ясно показали, что хотят сократить выбросы углерода и потребление ископаемого топлива». Ветераны на её ответ лишь улыбнутся и обменяются многозначительными взглядами: идеализм терпимо воспринимается, но добиваться перемен в повседневной практике гораздо сложнее.</w:t>
+      </w:r>
+    </w:p>
+    <w:p>
+      <w:pPr>
+        <w:pStyle w:val="BodyText"/>
+      </w:pPr>
+      <w:r>
+        <w:t xml:space="preserve">Предвыборные обещания, регулярные местные выборы, референдумы и голосования по облигациям дают властям постоянный поток новой информации и мнений граждан, но для реальных изменений нужны скоординированные усилия. Новоиспечённые члены городского совета часто не знают процессов, которые определяют крупномасштабную реализацию, и их легко втянуть в привычный уклад работы, особенно учитывая системные силы, стремящиеся сохранить статус-кво.</w:t>
+      </w:r>
+    </w:p>
+    <w:p>
+      <w:pPr>
+        <w:pStyle w:val="BodyText"/>
+      </w:pPr>
+      <w:r>
+        <w:t xml:space="preserve">Города — сложные механизмы, основанные на профсоюзных договорах, долгосрочных контрактах с поставщиками, опытном штате и потоках материалов и энергии, поддерживаемых видимой и невидимой инфраструктурой. Радикальные изменения в инфраструктуре требуют тщательного планирования — нельзя просто перерезать канализационные трубы, чтобы перекрыть приток сточных вод на очистные сооружения, даже если это кажется простым решением: непреднамеренные последствия превысят краткосрочный эффект. В других сферах это менее наглядно, но не менее верно — например, когда полицейский департамент намерен закупить автомобили с высоким расходом топлива.</w:t>
+      </w:r>
+    </w:p>
+    <w:p>
+      <w:pPr>
+        <w:pStyle w:val="BodyText"/>
+      </w:pPr>
+      <w:r>
+        <w:t xml:space="preserve">Долгосрочная перспектива, основанная на ценностях людей — на том, что для них действительно важно, — необходима для мобилизации коллективных действий. Однако даже появление такой перспективы не изменит ситуацию само по себе. По‑прежнему будет сложно переориентировать закупки для городского автопарка, если только она не будет перенесена в конкретные краткосрочные политики и программы.</w:t>
+      </w:r>
+    </w:p>
+    <w:p>
+      <w:pPr>
+        <w:pStyle w:val="BodyText"/>
+      </w:pPr>
+      <w:r>
+        <w:t xml:space="preserve">Краткосрочные политики и программы определяют направления реализации. Идея города, удобного для пешеходов, с уютными кварталами и сдержанным пригородным разрастанием требует изменений в правилах землепользования, прежде чем плотность застройки ощутимо изменится. Концепция чистого воздуха и снижения климатического воздействия должна найти отражение в ряде мер — от закупочной политики, поощряющей альтернативы энергоёмким товарам, до капитального планирования по производству возобновляемой энергии.</w:t>
+      </w:r>
+    </w:p>
+    <w:p>
+      <w:pPr>
+        <w:pStyle w:val="BodyText"/>
+      </w:pPr>
+      <w:r>
+        <w:t xml:space="preserve">Сегодня немногие города располагают комплексными долгосрочными планами и политиками, необходимыми для перехода к устойчивому развитию. Зачастую политический контекст фрагментирован, ориентирован на краткосрочные выгоды и противоречив. У города может быть генеральный план, охватывающий инфраструктуру, землепользование и экономическое развитие на три–пять лет. При интегрированном подходе капитальный план может отражать эти цели, но чаще он превращается в перечень разрозненных проектов, продиктованных требованиями отдельных департаментов или членов совета, без понимания их связи с долгосрочными целями — стабилизацией климата или искоренением бедности. Города редко учитывают такие фундаментальные факторы политического контекста, как общие ценности, социальное и человеческое развитие и управленческие структуры.</w:t>
+      </w:r>
+    </w:p>
+    <w:p>
+      <w:pPr>
+        <w:pStyle w:val="BodyText"/>
+      </w:pPr>
+      <w:r>
+        <w:t xml:space="preserve">Достижение долгосрочной устойчивости требует мер, выходящих за рамки полномочий городских властей; их усилия окажутся малоэффективными без сопутствующих изменений в более широком сообществе. Процесс с участием многих заинтересованных сторон даёт людям, организациям и крупным институтам возможность внести вклад в план и затем действовать в своих сферах для его реализации. Так город и его независимые силы начнут работать ради общих целей. Но и эти согласованные действия не возникают сами по себе — нужны руководство и организация со стороны города и партнёров.</w:t>
+      </w:r>
+    </w:p>
+    <w:p>
+      <w:pPr>
+        <w:pStyle w:val="BodyText"/>
+      </w:pPr>
+      <w:r>
+        <w:t xml:space="preserve">Интеграция и долгосрочный временной горизонт важнее для достижения городских целей, чем фокус на отдельных проблемах — климате, здравоохранении или экономике. Эти вопросы значимы, но меры будут неэффективны, если их реализовать поодиночке. Интегрированный подход связывает разные сферы, социально‑экономические границы и департаменты. Он также помогает избежать ситуации, когда достижение одной цели происходит за счёт другой.</w:t>
+      </w:r>
+    </w:p>
+    <w:p>
+      <w:pPr>
+        <w:pStyle w:val="BodyText"/>
+      </w:pPr>
+      <w:r>
+        <w:t xml:space="preserve">Экологическая политика, маргинализующая или обедняющая группы населения или районы — местные или отдалённые — в долгосрочной перспективе обречена на неудачу. Жилищные программы, не учитывающие влияние на важные открытые пространства, водно‑болотные угодья и сельскохозяйственные земли, со временем наносят городу ущерб. Экономическое развитие, основанное на истощении природных ресурсов или эксплуатации человеческого потенциала, в итоге даёт обратный эффект: оно обедняет сообщество вместо создания реального богатства.</w:t>
+      </w:r>
+    </w:p>
+    <w:p>
+      <w:pPr>
+        <w:pStyle w:val="BodyText"/>
+      </w:pPr>
+      <w:r>
+        <w:t xml:space="preserve">Если спросить некоторых мэров или членов городских советов, какое влияние они оказывают на экономику, они, вероятно, будут озадачены. Некоторые пошли так далеко, что строили промышленную инфраструктуру в надежде вернуть рабочие места промышленного века, не учитывая глобальные тренды, из‑за которых производство переместилось в другие части света.</w:t>
+      </w:r>
+    </w:p>
+    <w:p>
+      <w:pPr>
+        <w:pStyle w:val="BodyText"/>
+      </w:pPr>
+      <w:r>
+        <w:t xml:space="preserve">Другие возлагают надежды на маркетинговые усилия местной торговой палаты, которая активно участвует в выставках и размещает рекламу, продвигая регион как благоприятный для бизнеса.</w:t>
+      </w:r>
+    </w:p>
+    <w:p>
+      <w:pPr>
+        <w:pStyle w:val="BodyText"/>
+      </w:pPr>
+      <w:r>
+        <w:t xml:space="preserve">Некоторые из наиболее прогрессивных городских властей создали револьверные фонды кредитования, выступающие в роли кредитора последней инстанции для местных предприятий, испытывающих трудности с ликвидностью или ростом. Они организуют бизнес-инкубаторы, предоставляют услуги по составлению бизнес-планов и иногда помогают найти источники венчурного капитала для стартапов. Многие власти понимают важность местного бизнеса, но по-прежнему боятся занять твердую позицию, когда крупные компании угрожают вытеснить мелких предпринимателей с рынка.</w:t>
+      </w:r>
+    </w:p>
+    <w:p>
+      <w:pPr>
+        <w:pStyle w:val="BodyText"/>
+      </w:pPr>
+      <w:r>
+        <w:t xml:space="preserve">Большинство местных органов власти полагают, что все рабочие места равны, и что любая новая налоговая база священна. Экономика выступает хозяином, а местные сообщества — слугами, готовыми на всё ради инвесторов, даже если деловые практики последних вызывают сомнения.</w:t>
+      </w:r>
+    </w:p>
+    <w:p>
+      <w:pPr>
+        <w:pStyle w:val="BodyText"/>
+      </w:pPr>
+      <w:r>
+        <w:t xml:space="preserve">Переосмысление понятия богатства и переориентация местных инициатив на удовлетворение человеческих потребностей помогут лидерам рассматривать экономику как средство служения сообществу, а не наоборот. Существуют разные формы капитала, которые требуют инвестиций для процветания местного сообщества, а не только финансовый капитал. Социальный капитал, человеческий капитал, природный капитал, институциональный капитал, технологический капитал, обменный потенциал, построенный капитал и культурный капитал — всё это нужно понимать и укреплять, и эти многоплановые усилия — исключительная прерогатива местных сообществ.</w:t>
       </w:r>
     </w:p>
     <w:bookmarkEnd w:id="22"/>
-    <w:bookmarkStart w:id="24" w:name="богатство-городов"/>
+    <w:bookmarkEnd w:id="23"/>
+    <w:bookmarkStart w:id="24" w:name="X13e97629671b86903ae5110e61ebaefa82d689e"/>
     <w:p>
       <w:pPr>
         <w:pStyle w:val="Heading2"/>
       </w:pPr>
       <w:r>
-        <w:t xml:space="preserve">Богатство городов</w:t>
+        <w:t xml:space="preserve">Миф (и потенциал) индивидуального богатства</w:t>
       </w:r>
     </w:p>
     <w:p>
@@ -868,211 +1181,59 @@
         <w:pStyle w:val="FirstParagraph"/>
       </w:pPr>
       <w:r>
-        <w:t xml:space="preserve">Чтобы понять альтернативные пути к индивидуальному, общественному и экономическому благополучию в городском контексте, нужно изучить устройство городов и вовлечь городское руководство в решение критически важных задач устойчивой экономики. В книге</w:t>
-      </w:r>
-      <w:r>
-        <w:t xml:space="preserve"> </w:t>
-      </w:r>
-      <w:r>
-        <w:rPr>
-          <w:i/>
-          <w:iCs/>
-        </w:rPr>
-        <w:t xml:space="preserve">«Города и богатство наций»</w:t>
-      </w:r>
-      <w:r>
-        <w:t xml:space="preserve"> </w:t>
-      </w:r>
-      <w:r>
-        <w:t xml:space="preserve">Джейн Джейкобс утверждала, что городские регионы были главным двигателем экономического роста на протяжении всей истории. Она показала, что города обладали экономической мощью не только для импорта товаров, но и для замещения импорта продукцией и услугами местного производства. Эта замена импорта стала ключевым источником экономического роста городов</w:t>
-      </w:r>
-      <w:r>
-        <w:t xml:space="preserve"> </w:t>
-      </w:r>
-      <w:r>
-        <w:t xml:space="preserve">3</w:t>
-      </w:r>
-      <w:r>
-        <w:t xml:space="preserve">.</w:t>
+        <w:t xml:space="preserve">До сих пор мы затронули три вещи, которые определяют наше понимание богатства:</w:t>
       </w:r>
     </w:p>
     <w:p>
       <w:pPr>
-        <w:pStyle w:val="BodyText"/>
-      </w:pPr>
-      <w:r>
-        <w:t xml:space="preserve">Со времени Всемирного саммита по окружающей среде в Рио‑де‑Жанейро (1992) города по всему миру играют ведущую роль в усилиях по стабилизации климата и решению экологических проблем. Появились разные движения — «устойчивые города», «здоровые города», «экополисы», а недавно — «переходные города», а также новые организации, поддерживающие городские инициативы. ICLEI была одной из первых: изначально она называлась Международным советом по местным экологическим инициативам, затем получила название ICLEI — Местные власти за устойчивое развитие</w:t>
-      </w:r>
-      <w:r>
-        <w:t xml:space="preserve"> </w:t>
-      </w:r>
-      <w:r>
-        <w:t xml:space="preserve">4</w:t>
-      </w:r>
-      <w:r>
-        <w:t xml:space="preserve">.</w:t>
+        <w:pStyle xmlns:wps="http://schemas.microsoft.com/office/word/2010/wordprocessingShape" xmlns:wpg="http://schemas.microsoft.com/office/word/2010/wordprocessingGroup" xmlns:mc="http://schemas.openxmlformats.org/markup-compatibility/2006" xmlns:wp14="http://schemas.microsoft.com/office/word/2010/wordprocessingDrawing" xmlns:w14="http://schemas.microsoft.com/office/word/2010/wordml" xmlns:w15="http://schemas.microsoft.com/office/word/2012/wordml" w:val="ListParagraph"/>
+        <w:tabs xmlns:wps="http://schemas.microsoft.com/office/word/2010/wordprocessingShape" xmlns:wpg="http://schemas.microsoft.com/office/word/2010/wordprocessingGroup" xmlns:mc="http://schemas.openxmlformats.org/markup-compatibility/2006" xmlns:wp14="http://schemas.microsoft.com/office/word/2010/wordprocessingDrawing" xmlns:w14="http://schemas.microsoft.com/office/word/2010/wordml" xmlns:w15="http://schemas.microsoft.com/office/word/2012/wordml">
+          <w:tab w:val="clear" w:pos="709"/>
+          <w:tab w:val="left" w:pos="1898" w:leader="none"/>
+        </w:tabs>
+        <w:bidi xmlns:wps="http://schemas.microsoft.com/office/word/2010/wordprocessingShape" xmlns:wpg="http://schemas.microsoft.com/office/word/2010/wordprocessingGroup" xmlns:mc="http://schemas.openxmlformats.org/markup-compatibility/2006" xmlns:wp14="http://schemas.microsoft.com/office/word/2010/wordprocessingDrawing" xmlns:w14="http://schemas.microsoft.com/office/word/2010/wordml" xmlns:w15="http://schemas.microsoft.com/office/word/2012/wordml" w:val="0"/>
+        <w:spacing xmlns:wps="http://schemas.microsoft.com/office/word/2010/wordprocessingShape" xmlns:wpg="http://schemas.microsoft.com/office/word/2010/wordprocessingGroup" xmlns:mc="http://schemas.openxmlformats.org/markup-compatibility/2006" xmlns:wp14="http://schemas.microsoft.com/office/word/2010/wordprocessingDrawing" xmlns:w14="http://schemas.microsoft.com/office/word/2010/wordml" xmlns:w15="http://schemas.microsoft.com/office/word/2012/wordml" w:lineRule="exact" w:line="321" w:before="0" w:after="0"/>
+        <w:ind xmlns:wps="http://schemas.microsoft.com/office/word/2010/wordprocessingShape" xmlns:wpg="http://schemas.microsoft.com/office/word/2010/wordprocessingGroup" xmlns:mc="http://schemas.openxmlformats.org/markup-compatibility/2006" xmlns:wp14="http://schemas.microsoft.com/office/word/2010/wordprocessingDrawing" xmlns:w14="http://schemas.microsoft.com/office/word/2010/wordml" xmlns:w15="http://schemas.microsoft.com/office/word/2012/wordml" w:hanging="273" w:start="949" w:end="0"/>
+        <w:jc xmlns:wps="http://schemas.microsoft.com/office/word/2010/wordprocessingShape" xmlns:wpg="http://schemas.microsoft.com/office/word/2010/wordprocessingGroup" xmlns:mc="http://schemas.openxmlformats.org/markup-compatibility/2006" xmlns:wp14="http://schemas.microsoft.com/office/word/2010/wordprocessingDrawing" xmlns:w14="http://schemas.microsoft.com/office/word/2010/wordml" xmlns:w15="http://schemas.microsoft.com/office/word/2012/wordml" w:val="start"/>
+        <w:rPr xmlns:wps="http://schemas.microsoft.com/office/word/2010/wordprocessingShape" xmlns:wpg="http://schemas.microsoft.com/office/word/2010/wordprocessingGroup" xmlns:mc="http://schemas.openxmlformats.org/markup-compatibility/2006" xmlns:wp14="http://schemas.microsoft.com/office/word/2010/wordprocessingDrawing" xmlns:w14="http://schemas.microsoft.com/office/word/2010/wordml" xmlns:w15="http://schemas.microsoft.com/office/word/2012/wordml">
+          <w:sz w:val="28"/>
+        </w:rPr>
+        <w:numPr>
+          <w:ilvl w:val="1"/>
+          <w:numId w:val="1002"/>
+        </w:numPr>
+      </w:pPr>
+      <w:r>
+        <w:t xml:space="preserve">Очевидная идея обладания большим количеством денег</w:t>
+      </w:r>
+      <w:r>
+        <w:br/>
       </w:r>
     </w:p>
     <w:p>
       <w:pPr>
-        <w:pStyle w:val="BodyText"/>
-      </w:pPr>
-      <w:r>
-        <w:t xml:space="preserve">Масштаб и глубина этого движения подтверждаются появлением других организаций за последние два десятилетия: Института устойчивых сообществ, программы «Здоровые города» Всемирной организации здравоохранения, Международной организации «Здоровые города», движения «Экополисы», Центра устойчивых городов, сети Cities PLUS, Global Community Initiatives и крупнейшей из них — Организации «Объединённые города и местные власти» (ОУМВ). Международный конгресс городов (UCLG) был создан в 2004 году, когда несколько глобальных коалиций — Международный союз местных властей, Метрополис и Всемирная федерация объединённых городов — объединились в одну структуру</w:t>
-      </w:r>
-      <w:r>
-        <w:t xml:space="preserve"> </w:t>
-      </w:r>
-      <w:r>
-        <w:t xml:space="preserve">5</w:t>
-      </w:r>
-      <w:r>
-        <w:t xml:space="preserve">. Кампания «Города тысячелетия» ОУМВ поддерживает Цели развития тысячелетия ООН, подчёркивающие важность устойчивой среды и устойчивой местной экономики. Города всё больше осознают, что причины климатических и экологических проблем кроются в нашей экономике, и могут стать ключевыми катализаторами широкомасштабных изменений.</w:t>
-      </w:r>
-    </w:p>
-    <w:p>
-      <w:pPr>
-        <w:pStyle w:val="BodyText"/>
-      </w:pPr>
-      <w:r>
-        <w:t xml:space="preserve">Города действуют на разных уровнях: от крупных политических преобразований, например перепрофилирования районов с коммерческих на промышленные, до мелочей вроде закупки бумажных полотенец для общественных туалетов. Политика проявляется в разных формах — долгосрочных планах с видением, целями и стратегиями; операционных бюджетах и планах капиталовложений; постановлениях и правилах; годовых задачах; а также в регламентах, таких как кадровая и закупочная политика. Долгосрочные планы задают рамки для изменений в постановлениях и бюджетах, а бюджеты, планы капиталовложений и годовые цели превращают это в конкретные ежегодные мероприятия. Другие политики определяют направления повседневной деятельности.</w:t>
-      </w:r>
-    </w:p>
-    <w:p>
-      <w:pPr>
-        <w:pStyle w:val="BodyText"/>
-      </w:pPr>
-      <w:r>
-        <w:t xml:space="preserve">Представим, что в городской совет избран новый член, который в предвыборной кампании обещал сократить выбросы углерода и уменьшить использование ископаемого топлива. В первый же день ему докладывают о запланированной полицейским управлением покупке автомобиля с высоким расходом топлива для обновления автопарка. Если он попытается остановить эту покупку, он столкнётся с сопротивлением начальника полиции и городского управляющего, которые объяснят, что автомобиль включён в план капитальных вложений и является частью долгосрочной программы замены, возможно с контрактами с местными дилерами, которые нельзя разорвать. Возражения, скорее всего, отклонят ветераны совета, и покупка состоится. Новый член может напомнить: «Граждане на выборах ясно высказались за сокращение выбросов и уменьшение использования ископаемого топлива». Терпеливые улыбки и невысказанные намёки ветеранов среди сотрудников и членов совета дадут понять: идеализм допустим, но реализация повседневных изменений далека от простой.</w:t>
-      </w:r>
-    </w:p>
-    <w:p>
-      <w:pPr>
-        <w:pStyle w:val="BodyText"/>
-      </w:pPr>
-      <w:r>
-        <w:t xml:space="preserve">Предвыборные обещания, регулярные местные выборы, референдумы и голосования по облигациям обеспечивают постоянный приток мнений граждан в адрес городских властей, но для реальных поворотных изменений требуются согласованные усилия. Новоизбранные члены совета часто не знают процессов крупномасштабной реализации и быстро вливаются в привычный порядок, особенно под давлением системных сил, стремящихся сохранить статус‑кво.</w:t>
-      </w:r>
-    </w:p>
-    <w:p>
-      <w:pPr>
-        <w:pStyle w:val="BodyText"/>
-      </w:pPr>
-      <w:r>
-        <w:t xml:space="preserve">Города — сложные механизмы: они опираются на профсоюзные соглашения, долгосрочные контракты с поставщиками, опытный персонал и потоки материалов и энергии, подкреплённые видимой и скрытой инфраструктурой. Серьёзные изменения инфраструктуры требуют тщательного планирования — нельзя просто перерезать канализационные трубы, чтобы остановить поток стоков на очистные сооружения, если цель — снизить их вред для города, как бы заманчиво это ни казалось. В таких случаях непреднамеренные последствия неизменно перевесят краткосрочную выгоду. Это верно и в менее наглядных случаях — например, когда полиция закупает автомобили с высоким расходом топлива.</w:t>
-      </w:r>
-    </w:p>
-    <w:p>
-      <w:pPr>
-        <w:pStyle w:val="BodyText"/>
-      </w:pPr>
-      <w:r>
-        <w:t xml:space="preserve">Долгосрочная перспектива, основанная на ценностях людей — на том, что для них действительно важно, — необходима для мобилизации коллективных действий. Однако даже если город выработает такую перспективу, перемены не наступят сами по себе. По‑прежнему будет сложно переориентировать закупки автопарка, если только</w:t>
-      </w:r>
-    </w:p>
-    <w:p>
-      <w:pPr>
-        <w:pStyle w:val="BodyText"/>
-      </w:pPr>
-      <w:r>
-        <w:t xml:space="preserve">долгосрочная перспектива не будет воплощаться в краткосрочных политиках и программах, задающих направление реализации. Идея пешеходного, комфортного города с компактными кварталами и сдержанным пригородным ростом всё равно требует изменений в правилах землепользования, прежде чем плотность застройки изменится заметно. Концепция чистого воздуха и снижения климатического воздействия должна найти отражение в ряде мер — от политики закупок, приоритизирующей альтернативы энергоёмким товарам, до капитального планирования производства возобновляемой энергии.</w:t>
-      </w:r>
-    </w:p>
-    <w:p>
-      <w:pPr>
-        <w:pStyle w:val="BodyText"/>
-      </w:pPr>
-      <w:r>
-        <w:t xml:space="preserve">Сегодня лишь немногие города располагают комплексными долгосрочными планами и политиками, необходимыми для перехода к более устойчивому развитию. Политический контекст часто фрагментирован, краткосрочен и противоречив. У города может быть генеральный план, охватывающий инфраструктуру, землепользование и экономическое развитие на ближайшие три–пять лет. Если сотрудники администрации и/или совет нацелены на интеграцию, капитальный план может отражать цели генерального плана. Но слишком часто капитальный план — лишь длинный список проектов, сформированный требованиями отдельных департаментов или членов совета, не связанных друг с другом, без понимания, как эти проекты соотносятся с долгосрочными целями, такими как стабилизация климата или искоренение бедности. Города почти не уделяют внимания важнейшим факторам политического контекста — общим ценностям, социальному и человеческому развитию и структурам управления.</w:t>
-      </w:r>
-    </w:p>
-    <w:p>
-      <w:pPr>
-        <w:pStyle w:val="BodyText"/>
-      </w:pPr>
-      <w:r>
-        <w:t xml:space="preserve">Шаги, необходимые для достижения долгосрочной устойчивости, выходят за пределы мер городских властей; их усилия окажутся недостаточными, если в широком сообществе не произойдут сопутствующие и соразмерные изменения. Процесс с участием множества заинтересованных сторон даёт людям, организациям и крупным учреждениям города возможность участвовать в создании плана и высказать своё мнение, чтобы затем работать в рамках своих полномочий над его реализацией. Так город и его независимые движущие силы начнут действовать в одном направлении. Но и в этом случае согласованные действия не возникают сами по себе — им нужно руководство и координация со стороны города и заинтересованных сторон.</w:t>
-      </w:r>
-    </w:p>
-    <w:p>
-      <w:pPr>
-        <w:pStyle w:val="BodyText"/>
-      </w:pPr>
-      <w:r>
-        <w:t xml:space="preserve">Интеграция и долгосрочные горизонты важнее для планирования устойчивого развития, чем фокус на отдельных проблемах — будь то изменение климата, здравоохранение или развитие местной экономики. Эти вопросы важны, но меры по их решению обречены на неэффективность, если их принимать в отрыве друг от друга. Интегрированный подход связывает разные сферы, социально‑экономические границы и городские ведомства.</w:t>
-      </w:r>
-    </w:p>
-    <w:p>
-      <w:pPr>
-        <w:pStyle w:val="BodyText"/>
-      </w:pPr>
-      <w:r>
-        <w:t xml:space="preserve">Это также помогает не допустить, чтобы достижение одной цели шло в ущерб другой.</w:t>
-      </w:r>
-    </w:p>
-    <w:p>
-      <w:pPr>
-        <w:pStyle w:val="BodyText"/>
-      </w:pPr>
-      <w:r>
-        <w:t xml:space="preserve">Экологическая политика, маргинализирующая или обнищивающая целые группы или районы — пусть даже где‑то в мире — в долгосрочной перспективе не сработает. Жилищные проекты, игнорирующие влияние на ценные открытые пространства, водно‑болотные угодья и сельскохозяйственные земли, в конце концов повредят городу. Экономическая практика, опирающаяся на неустойчивую эксплуатацию природных ресурсов или людей, со временем даст обратный эффект — ещё больше обеднит сообщество вместо создания настоящего богатства.</w:t>
-      </w:r>
-    </w:p>
-    <w:p>
-      <w:pPr>
-        <w:pStyle w:val="BodyText"/>
-      </w:pPr>
-      <w:r>
-        <w:t xml:space="preserve">Если спросить некоторых местных мэров или членов советов, какое у них влияние на экономику, они, скорее всего, посмотрят недоумённо. Некоторые пошли ещё дальше: вложились в промышленную инфраструктуру в надежде вернуть высокооплачиваемые производства XIX–XX веков, не замечая глобальных трендов, из‑за которых большая часть производства ушла в другие регионы.</w:t>
-      </w:r>
-    </w:p>
-    <w:p>
-      <w:pPr>
-        <w:pStyle w:val="BodyText"/>
-      </w:pPr>
-      <w:r>
-        <w:t xml:space="preserve">Другие полагаются на маркетинговые усилия местной торговой палаты: она активно участвует в выставках и размещает рекламу, продвигая регион как благоприятный для бизнеса.</w:t>
-      </w:r>
-    </w:p>
-    <w:p>
-      <w:pPr>
-        <w:pStyle w:val="BodyText"/>
-      </w:pPr>
-      <w:r>
-        <w:t xml:space="preserve">Некоторые из наиболее прогрессивных городских властей создали поворотные кредитные фонды, которые служат кредитором последней инстанции для местных предприятий, испытывающих проблемы с денежными потоками или ростом. Они создают инкубаторы, предлагают услуги по составлению бизнес‑планов и иногда находят источники венчурного капитала для стартапов. Многие правительства понимают важность местного бизнеса, но всё ещё боятся занять твердую позицию, когда крупные компании угрожают вытеснить с рынка мелкие предприятия.</w:t>
-      </w:r>
-    </w:p>
-    <w:p>
-      <w:pPr>
-        <w:pStyle w:val="BodyText"/>
-      </w:pPr>
-      <w:r>
-        <w:t xml:space="preserve">Большинство местных властей считает, что все рабочие места одинаково ценны, а любые новые налоговые поступления — священны. Экономика — хозяин, а местные сообщества — слуги, готовые на всё ради инвесторов, даже если их деловые практики вызывают сомнения.</w:t>
-      </w:r>
-    </w:p>
-    <w:p>
-      <w:pPr>
-        <w:pStyle w:val="BodyText"/>
-      </w:pPr>
-      <w:r>
-        <w:t xml:space="preserve">Переосмысление понятия богатства и переориентация местных инициатив на удовлетворение человеческих потребностей помогут лидерам увидеть экономику как средство служения сообществу, а не наоборот. Существует множество форм капитала, которые требуют инвестиций для процветания местного сообщества, а не только финансовый капитал. Социальный капитал, человеческий капитал, природный капитал, институциональный капитал, технологический капитал, потенциальный обменный капитал, построенный капитал и культурный капитал — все они должны быть поняты и укреплены, и эти многоплановые усилия — исключительная прерогатива местных сообществ.</w:t>
-      </w:r>
-    </w:p>
-    <w:bookmarkStart w:id="23" w:name="X13e97629671b86903ae5110e61ebaefa82d689e"/>
-    <w:p>
-      <w:pPr>
-        <w:pStyle w:val="Heading3"/>
-      </w:pPr>
-      <w:r>
-        <w:t xml:space="preserve">Миф (и потенциал) индивидуального богатства</w:t>
-      </w:r>
-    </w:p>
-    <w:p>
-      <w:pPr>
-        <w:pStyle w:val="FirstParagraph"/>
-      </w:pPr>
-      <w:r>
-        <w:t xml:space="preserve">До сих пор мы затронули три вещи, которые определяют наше понимание богатства:</w:t>
+        <w:pStyle xmlns:wps="http://schemas.microsoft.com/office/word/2010/wordprocessingShape" xmlns:wpg="http://schemas.microsoft.com/office/word/2010/wordprocessingGroup" xmlns:mc="http://schemas.openxmlformats.org/markup-compatibility/2006" xmlns:wp14="http://schemas.microsoft.com/office/word/2010/wordprocessingDrawing" xmlns:w14="http://schemas.microsoft.com/office/word/2010/wordml" xmlns:w15="http://schemas.microsoft.com/office/word/2012/wordml" w:val="ListParagraph"/>
+        <w:tabs xmlns:wps="http://schemas.microsoft.com/office/word/2010/wordprocessingShape" xmlns:wpg="http://schemas.microsoft.com/office/word/2010/wordprocessingGroup" xmlns:mc="http://schemas.openxmlformats.org/markup-compatibility/2006" xmlns:wp14="http://schemas.microsoft.com/office/word/2010/wordprocessingDrawing" xmlns:w14="http://schemas.microsoft.com/office/word/2010/wordml" xmlns:w15="http://schemas.microsoft.com/office/word/2012/wordml">
+          <w:tab w:val="clear" w:pos="709"/>
+          <w:tab w:val="left" w:pos="1898" w:leader="none"/>
+        </w:tabs>
+        <w:bidi xmlns:wps="http://schemas.microsoft.com/office/word/2010/wordprocessingShape" xmlns:wpg="http://schemas.microsoft.com/office/word/2010/wordprocessingGroup" xmlns:mc="http://schemas.openxmlformats.org/markup-compatibility/2006" xmlns:wp14="http://schemas.microsoft.com/office/word/2010/wordprocessingDrawing" xmlns:w14="http://schemas.microsoft.com/office/word/2010/wordml" xmlns:w15="http://schemas.microsoft.com/office/word/2012/wordml" w:val="0"/>
+        <w:spacing xmlns:wps="http://schemas.microsoft.com/office/word/2010/wordprocessingShape" xmlns:wpg="http://schemas.microsoft.com/office/word/2010/wordprocessingGroup" xmlns:mc="http://schemas.openxmlformats.org/markup-compatibility/2006" xmlns:wp14="http://schemas.microsoft.com/office/word/2010/wordprocessingDrawing" xmlns:w14="http://schemas.microsoft.com/office/word/2010/wordml" xmlns:w15="http://schemas.microsoft.com/office/word/2012/wordml" w:lineRule="auto" w:line="240" w:before="9" w:after="0"/>
+        <w:ind xmlns:wps="http://schemas.microsoft.com/office/word/2010/wordprocessingShape" xmlns:wpg="http://schemas.microsoft.com/office/word/2010/wordprocessingGroup" xmlns:mc="http://schemas.openxmlformats.org/markup-compatibility/2006" xmlns:wp14="http://schemas.microsoft.com/office/word/2010/wordprocessingDrawing" xmlns:w14="http://schemas.microsoft.com/office/word/2010/wordml" xmlns:w15="http://schemas.microsoft.com/office/word/2012/wordml" w:hanging="273" w:start="949" w:end="0"/>
+        <w:jc xmlns:wps="http://schemas.microsoft.com/office/word/2010/wordprocessingShape" xmlns:wpg="http://schemas.microsoft.com/office/word/2010/wordprocessingGroup" xmlns:mc="http://schemas.openxmlformats.org/markup-compatibility/2006" xmlns:wp14="http://schemas.microsoft.com/office/word/2010/wordprocessingDrawing" xmlns:w14="http://schemas.microsoft.com/office/word/2010/wordml" xmlns:w15="http://schemas.microsoft.com/office/word/2012/wordml" w:val="start"/>
+        <w:rPr xmlns:wps="http://schemas.microsoft.com/office/word/2010/wordprocessingShape" xmlns:wpg="http://schemas.microsoft.com/office/word/2010/wordprocessingGroup" xmlns:mc="http://schemas.openxmlformats.org/markup-compatibility/2006" xmlns:wp14="http://schemas.microsoft.com/office/word/2010/wordprocessingDrawing" xmlns:w14="http://schemas.microsoft.com/office/word/2010/wordml" xmlns:w15="http://schemas.microsoft.com/office/word/2012/wordml">
+          <w:sz w:val="28"/>
+        </w:rPr>
+        <w:numPr>
+          <w:ilvl w:val="1"/>
+          <w:numId w:val="1002"/>
+        </w:numPr>
+      </w:pPr>
+      <w:r>
+        <w:t xml:space="preserve">Благополучие, достигаемое через удовлетворение широкого спектра человеческих потребностей</w:t>
+      </w:r>
+      <w:r>
+        <w:br/>
       </w:r>
     </w:p>
     <w:p>
@@ -1084,45 +1245,31 @@
         </w:numPr>
       </w:pPr>
       <w:r>
-        <w:t xml:space="preserve">Очевидная идея обладания большим количеством денег</w:t>
-      </w:r>
-      <w:r>
-        <w:br/>
+        <w:t xml:space="preserve">Социальные системы, которые мы создаём для удовлетворения этих потребностей</w:t>
       </w:r>
     </w:p>
     <w:p>
       <w:pPr>
-        <w:pStyle w:val="Compact"/>
-        <w:numPr>
-          <w:ilvl w:val="0"/>
-          <w:numId w:val="1001"/>
-        </w:numPr>
-      </w:pPr>
-      <w:r>
-        <w:t xml:space="preserve">Благополучие, достигаемое путем удовлетворения широкого спектра человеческих потребностей</w:t>
-      </w:r>
-      <w:r>
-        <w:br/>
+        <w:pStyle w:val="FirstParagraph"/>
+      </w:pPr>
+      <w:r>
+        <w:t xml:space="preserve">Истинное богатство — сумма всех трёх составляющих. Однако можно чувствовать себя богатым, обладая лишь двумя последними, и можно быть бедным, имея много денег, но не будучи в состоянии удовлетворить важнейшие потребности и не получая поддержки сообщества.</w:t>
       </w:r>
     </w:p>
     <w:p>
       <w:pPr>
-        <w:pStyle w:val="Compact"/>
-        <w:numPr>
-          <w:ilvl w:val="0"/>
-          <w:numId w:val="1001"/>
-        </w:numPr>
-      </w:pPr>
-      <w:r>
-        <w:t xml:space="preserve">Социальные системы, которые мы разработали для удовлетворения многих наших потребностей</w:t>
+        <w:pStyle w:val="BodyText"/>
+      </w:pPr>
+      <w:r>
+        <w:t xml:space="preserve">Североамериканская мифология сурового индивидуализма заставляет забывать, что настоящее богатство возможно только в обществе. «Самодеятельные миллионеры» нередко благополучно забывают о том, что их состояние стало возможным благодаря государственной инфраструктуре, институциональным механизмам и участию многих других людей. Они первыми выступают за снижение налогов.</w:t>
       </w:r>
     </w:p>
     <w:p>
       <w:pPr>
-        <w:pStyle w:val="FirstParagraph"/>
-      </w:pPr>
-      <w:r>
-        <w:t xml:space="preserve">Истинное богатство — сумма всех трёх составляющих. Однако можно чувствовать себя богатым, имея только две последние, и быть бедным, имея много денег, но не способным удовлетворить важнейшие потребности и не имея поддержки сообщества.</w:t>
+        <w:pStyle w:val="BodyText"/>
+      </w:pPr>
+      <w:r>
+        <w:t xml:space="preserve">Американская торговая палата тратит на лоббирование больше, чем любая другая группа в Вашингтоне. Часто создаётся впечатление, что она не осознаёт: без верховенства закона, без водоснабжения и канализации в промышленных зонах, без политик, позволяющих бизнесу функционировать, их компании не смогли бы выжить, не говоря уже о получении прибыли.</w:t>
       </w:r>
     </w:p>
     <w:p>
@@ -1130,7 +1277,7 @@
         <w:pStyle w:val="BodyText"/>
       </w:pPr>
       <w:r>
-        <w:t xml:space="preserve">Североамериканская мифология сурового индивидуализма заставляет нас забывать, что настоящее богатство возможно только в обществе. «Самодеятельные миллионеры» порой охотно упускают из виду, что их состояние стало возможным благодаря государственной инфраструктуре, институциональным механизмам и участию многих людей. Они же первыми требуют снижения налогов.</w:t>
+        <w:t xml:space="preserve">Если большинство людей не замечает структуры городов и сообществ, которые позволяют предприятиям и организациям успешно работать, то они так же не видят структуры другого важного компонента индивидуального богатства — денег. Современная денежная система скрыта от публичного взгляда, и большинство людей её не понимают. Если бы они понимали её, возможно, не стали бы слепо полагаться на неё как на единственный источник своей финансовой безопасности.</w:t>
       </w:r>
     </w:p>
     <w:p>
@@ -1138,26 +1285,9 @@
         <w:pStyle w:val="BodyText"/>
       </w:pPr>
       <w:r>
-        <w:t xml:space="preserve">Американская торговая палата тратит на лоббирование больше, чем любая другая группа в Вашингтоне. Ей, похоже, не понять, что без верховенства закона, без водоснабжения и канализации в промышленных районах, без политик, позволяющих предприятиям функционировать, у них не было бы ни выживания, ни прибыли.</w:t>
+        <w:t xml:space="preserve">Мы надеемся, что эта книга откроет вам глаза и на роль сообщества в создании богатства, и на роль денег и других средств обмена. Для этого нужно помочь снять с вас повязку на глазах (это не ваша вина): денежная система была завуалирована силами, извлекающими из неё прибыль. В конце концов, прежде чем вы начнёте создавать богатство и строить устойчивую местную экономику, важно понять, что такое богатство и на чём оно основано. Хорошая новость в том, что у вас тоже есть возможность создать настоящее богатство для себя, своих детей и своего сообщества. Но прежде чем покупать ещё лотерейные билеты, прочтите эту книгу — она покажет, как эффективные местные действия помогут вам достичь этой цели с гораздо меньшим риском.</w:t>
       </w:r>
     </w:p>
-    <w:p>
-      <w:pPr>
-        <w:pStyle w:val="BodyText"/>
-      </w:pPr>
-      <w:r>
-        <w:t xml:space="preserve">Если большинство людей не замечает структуры городов и сообществ, которые позволяют предприятиям успешно работать, то мы также не замечаем структуры другого важного компонента индивидуального богатства — денег. Большинство не понимает современную денежную систему — она скрыта от общественности. Если бы люди её понимали, возможно, дважды подумали бы, прежде чем полностью полагаться на неё в вопросах собственной финансовой безопасности.</w:t>
-      </w:r>
-    </w:p>
-    <w:p>
-      <w:pPr>
-        <w:pStyle w:val="BodyText"/>
-      </w:pPr>
-      <w:r>
-        <w:t xml:space="preserve">Мы надеемся, что эта книга откроет вам глаза и на роль сообщества в создании богатства, и на роль денег и других средств обмена. Для этого нам нужно помочь вам снять повязку с глаз (не по вашей вине): денежная система была завуалирована силами, которые извлекают из неё прибыль. Прежде чем вы сможете создать богатство и построить устойчивую местную экономику, необходимо понять, что такое богатство и на чём оно основано. Хорошая новость в том, что у вас есть возможность создать настоящее богатство — для себя, своих детей и своего сообщества. Но прежде чем покупать ещё лотерейные билеты, прочитайте эту книгу: вы узнаете, как эффективные местные действия могут помочь вам достичь этой цели с гораздо меньшим риском.</w:t>
-      </w:r>
-    </w:p>
-    <w:bookmarkEnd w:id="23"/>
     <w:bookmarkEnd w:id="24"/>
     <w:bookmarkEnd w:id="25"/>
     <w:sectPr>
@@ -1652,6 +1782,170 @@
     <w:lvlOverride w:ilvl="8">
       <w:startOverride w:val="1"/>
     </w:lvlOverride>
+  </w:num>
+  <w:abstractNum w:abstractNumId="99412">
+    <w:lvl w:ilvl="0">
+      <w:numFmt w:val="bullet"/>
+      <w:lvlText w:val="—"/>
+      <w:lvlJc w:val="start"/>
+      <w:pPr>
+        <w:tabs>
+          <w:tab w:val="num" w:pos="0"/>
+        </w:tabs>
+        <w:ind w:start="100" w:hanging="361"/>
+      </w:pPr>
+      <w:rPr>
+        <w:rFonts w:ascii="Liberation Serif" w:hAnsi="Liberation Serif" w:cs="Liberation Serif" w:hint="default"/>
+        <w:b w:val="false"/>
+        <w:bCs w:val="false"/>
+        <w:i w:val="false"/>
+        <w:iCs w:val="false"/>
+        <w:spacing w:val="0"/>
+        <w:w w:val="102"/>
+        <w:sz w:val="28"/>
+        <w:szCs w:val="28"/>
+        <w:lang w:val="en-US" w:eastAsia="en-US" w:bidi="ar-SA"/>
+      </w:rPr>
+    </w:lvl>
+    <w:lvl w:ilvl="1">
+      <w:start w:val="1"/>
+      <w:numFmt w:val="decimal"/>
+      <w:lvlText w:val="%2."/>
+      <w:lvlJc w:val="start"/>
+      <w:pPr>
+        <w:tabs>
+          <w:tab w:val="num" w:pos="0"/>
+        </w:tabs>
+        <w:ind w:start="949" w:hanging="274"/>
+      </w:pPr>
+      <w:rPr>
+        <w:rFonts w:ascii="Liberation Serif" w:hAnsi="Liberation Serif" w:eastAsia="Liberation Serif" w:cs="Liberation Serif"/>
+        <w:b w:val="false"/>
+        <w:bCs w:val="false"/>
+        <w:i w:val="false"/>
+        <w:iCs w:val="false"/>
+        <w:spacing w:val="0"/>
+        <w:w w:val="102"/>
+        <w:sz w:val="28"/>
+        <w:szCs w:val="28"/>
+        <w:lang w:val="en-US" w:eastAsia="en-US" w:bidi="ar-SA"/>
+      </w:rPr>
+    </w:lvl>
+    <w:lvl w:ilvl="2">
+      <w:start w:val="0"/>
+      <w:numFmt w:val="bullet"/>
+      <w:lvlText w:val=""/>
+      <w:lvlJc w:val="start"/>
+      <w:pPr>
+        <w:tabs>
+          <w:tab w:val="num" w:pos="0"/>
+        </w:tabs>
+        <w:ind w:start="2195" w:hanging="274"/>
+      </w:pPr>
+      <w:rPr>
+        <w:rFonts w:ascii="Symbol" w:hAnsi="Symbol" w:cs="Symbol" w:hint="default"/>
+        <w:lang w:val="en-US" w:eastAsia="en-US" w:bidi="ar-SA"/>
+      </w:rPr>
+    </w:lvl>
+    <w:lvl w:ilvl="3">
+      <w:start w:val="0"/>
+      <w:numFmt w:val="bullet"/>
+      <w:lvlText w:val=""/>
+      <w:lvlJc w:val="start"/>
+      <w:pPr>
+        <w:tabs>
+          <w:tab w:val="num" w:pos="0"/>
+        </w:tabs>
+        <w:ind w:start="3451" w:hanging="274"/>
+      </w:pPr>
+      <w:rPr>
+        <w:rFonts w:ascii="Symbol" w:hAnsi="Symbol" w:cs="Symbol" w:hint="default"/>
+        <w:lang w:val="en-US" w:eastAsia="en-US" w:bidi="ar-SA"/>
+      </w:rPr>
+    </w:lvl>
+    <w:lvl w:ilvl="4">
+      <w:start w:val="0"/>
+      <w:numFmt w:val="bullet"/>
+      <w:lvlText w:val=""/>
+      <w:lvlJc w:val="start"/>
+      <w:pPr>
+        <w:tabs>
+          <w:tab w:val="num" w:pos="0"/>
+        </w:tabs>
+        <w:ind w:start="4706" w:hanging="274"/>
+      </w:pPr>
+      <w:rPr>
+        <w:rFonts w:ascii="Symbol" w:hAnsi="Symbol" w:cs="Symbol" w:hint="default"/>
+        <w:lang w:val="en-US" w:eastAsia="en-US" w:bidi="ar-SA"/>
+      </w:rPr>
+    </w:lvl>
+    <w:lvl w:ilvl="5">
+      <w:start w:val="0"/>
+      <w:numFmt w:val="bullet"/>
+      <w:lvlText w:val=""/>
+      <w:lvlJc w:val="start"/>
+      <w:pPr>
+        <w:tabs>
+          <w:tab w:val="num" w:pos="0"/>
+        </w:tabs>
+        <w:ind w:start="5962" w:hanging="274"/>
+      </w:pPr>
+      <w:rPr>
+        <w:rFonts w:ascii="Symbol" w:hAnsi="Symbol" w:cs="Symbol" w:hint="default"/>
+        <w:lang w:val="en-US" w:eastAsia="en-US" w:bidi="ar-SA"/>
+      </w:rPr>
+    </w:lvl>
+    <w:lvl w:ilvl="6">
+      <w:start w:val="0"/>
+      <w:numFmt w:val="bullet"/>
+      <w:lvlText w:val=""/>
+      <w:lvlJc w:val="start"/>
+      <w:pPr>
+        <w:tabs>
+          <w:tab w:val="num" w:pos="0"/>
+        </w:tabs>
+        <w:ind w:start="7217" w:hanging="274"/>
+      </w:pPr>
+      <w:rPr>
+        <w:rFonts w:ascii="Symbol" w:hAnsi="Symbol" w:cs="Symbol" w:hint="default"/>
+        <w:lang w:val="en-US" w:eastAsia="en-US" w:bidi="ar-SA"/>
+      </w:rPr>
+    </w:lvl>
+    <w:lvl w:ilvl="7">
+      <w:start w:val="0"/>
+      <w:numFmt w:val="bullet"/>
+      <w:lvlText w:val=""/>
+      <w:lvlJc w:val="start"/>
+      <w:pPr>
+        <w:tabs>
+          <w:tab w:val="num" w:pos="0"/>
+        </w:tabs>
+        <w:ind w:start="8473" w:hanging="274"/>
+      </w:pPr>
+      <w:rPr>
+        <w:rFonts w:ascii="Symbol" w:hAnsi="Symbol" w:cs="Symbol" w:hint="default"/>
+        <w:lang w:val="en-US" w:eastAsia="en-US" w:bidi="ar-SA"/>
+      </w:rPr>
+    </w:lvl>
+    <w:lvl w:ilvl="8">
+      <w:start w:val="0"/>
+      <w:numFmt w:val="bullet"/>
+      <w:lvlText w:val=""/>
+      <w:lvlJc w:val="start"/>
+      <w:pPr>
+        <w:tabs>
+          <w:tab w:val="num" w:pos="0"/>
+        </w:tabs>
+        <w:ind w:start="9728" w:hanging="274"/>
+      </w:pPr>
+      <w:rPr>
+        <w:rFonts w:ascii="Symbol" w:hAnsi="Symbol" w:cs="Symbol" w:hint="default"/>
+        <w:lang w:val="en-US" w:eastAsia="en-US" w:bidi="ar-SA"/>
+      </w:rPr>
+    </w:lvl>
+  </w:abstractNum>
+  <w:num w:numId="1002">
+    <w:abstractNumId w:val="99412"/>
   </w:num>
 </w:numbering>
 </file>

</xml_diff>

<commit_message>
Add regression tests and improve handling for incomplete responses in document processing
- Introduced tests to validate the normalization of semantic output in DOCX files, ensuring proper mapping of paragraphs and styles.
- Enhanced the generation of markdown blocks to retry on incomplete responses, logging appropriate events for better traceability.
- Implemented fallback mechanisms for handling incomplete responses during image analysis and validation assessments.
- Strengthened the validation logic for multi-level numbering in documents, ensuring accurate counting and restoration of ordered lists.
- Added detailed specifications for addressing quality regressions in the Lietaer document validation process, outlining necessary improvements and verification criteria.
</commit_message>
<xml_diff>
--- a/tests/artifacts/real_document_pipeline/Лиетर глава1_validated.docx
+++ b/tests/artifacts/real_document_pipeline/Лиетर глава1_validated.docx
@@ -2,7 +2,7 @@
 <file path=word/document.xml><?xml version="1.0" encoding="utf-8"?>
 <w:document xmlns:w="http://schemas.openxmlformats.org/wordprocessingml/2006/main" xmlns:m="http://schemas.openxmlformats.org/officeDocument/2006/math" xmlns:r="http://schemas.openxmlformats.org/officeDocument/2006/relationships" xmlns:o="urn:schemas-microsoft-com:office:office" xmlns:v="urn:schemas-microsoft-com:vml" xmlns:w10="urn:schemas-microsoft-com:office:word" xmlns:a="http://schemas.openxmlformats.org/drawingml/2006/main" xmlns:pic="http://schemas.openxmlformats.org/drawingml/2006/picture" xmlns:wp="http://schemas.openxmlformats.org/drawingml/2006/wordprocessingDrawing">
   <w:body>
-    <w:bookmarkStart w:id="25" w:name="глава-1"/>
+    <w:bookmarkStart w:id="9" w:name="глава-1"/>
     <w:p>
       <w:pPr>
         <w:pStyle xmlns:wps="http://schemas.microsoft.com/office/word/2010/wordprocessingShape" xmlns:wpg="http://schemas.microsoft.com/office/word/2010/wordprocessingGroup" xmlns:mc="http://schemas.openxmlformats.org/markup-compatibility/2006" xmlns:wp14="http://schemas.microsoft.com/office/word/2010/wordprocessingDrawing" xmlns:w14="http://schemas.microsoft.com/office/word/2010/wordml" xmlns:w15="http://schemas.microsoft.com/office/word/2012/wordml" w:val="Heading2"/>
@@ -16,10 +16,11 @@
         </w:rPr>
       </w:pPr>
       <w:r>
-        <w:t xml:space="preserve">Глава 1</w:t>
+        <w:t xml:space="preserve">ГЛАВА 1</w:t>
       </w:r>
     </w:p>
-    <w:bookmarkStart w:id="20" w:name="что-такое-богатство"/>
+    <w:bookmarkEnd w:id="9"/>
+    <w:bookmarkStart w:id="10" w:name="что-такое-богатство"/>
     <w:p>
       <w:pPr>
         <w:pStyle xmlns:wps="http://schemas.microsoft.com/office/word/2010/wordprocessingShape" xmlns:wpg="http://schemas.microsoft.com/office/word/2010/wordprocessingGroup" xmlns:mc="http://schemas.openxmlformats.org/markup-compatibility/2006" xmlns:wp14="http://schemas.microsoft.com/office/word/2010/wordprocessingDrawing" xmlns:w14="http://schemas.microsoft.com/office/word/2010/wordml" xmlns:w15="http://schemas.microsoft.com/office/word/2012/wordml" w:val="Heading2"/>
@@ -80,18 +81,26 @@
     </w:p>
     <w:p>
       <w:pPr>
-        <w:pStyle w:val="BodyText"/>
+        <w:pStyle xmlns:wps="http://schemas.microsoft.com/office/word/2010/wordprocessingShape" xmlns:wpg="http://schemas.microsoft.com/office/word/2010/wordprocessingGroup" xmlns:mc="http://schemas.openxmlformats.org/markup-compatibility/2006" xmlns:wp14="http://schemas.microsoft.com/office/word/2010/wordprocessingDrawing" xmlns:w14="http://schemas.microsoft.com/office/word/2010/wordml" xmlns:w15="http://schemas.microsoft.com/office/word/2012/wordml" w:val="BodyText"/>
+        <w:bidi xmlns:wps="http://schemas.microsoft.com/office/word/2010/wordprocessingShape" xmlns:wpg="http://schemas.microsoft.com/office/word/2010/wordprocessingGroup" xmlns:mc="http://schemas.openxmlformats.org/markup-compatibility/2006" xmlns:wp14="http://schemas.microsoft.com/office/word/2010/wordprocessingDrawing" xmlns:w14="http://schemas.microsoft.com/office/word/2010/wordml" xmlns:w15="http://schemas.microsoft.com/office/word/2012/wordml" w:val="0"/>
+        <w:spacing xmlns:wps="http://schemas.microsoft.com/office/word/2010/wordprocessingShape" xmlns:wpg="http://schemas.microsoft.com/office/word/2010/wordprocessingGroup" xmlns:mc="http://schemas.openxmlformats.org/markup-compatibility/2006" xmlns:wp14="http://schemas.microsoft.com/office/word/2010/wordprocessingDrawing" xmlns:w14="http://schemas.microsoft.com/office/word/2010/wordml" xmlns:w15="http://schemas.microsoft.com/office/word/2012/wordml" w:lineRule="auto" w:line="242" w:before="0" w:after="0"/>
+        <w:ind xmlns:wps="http://schemas.microsoft.com/office/word/2010/wordprocessingShape" xmlns:wpg="http://schemas.microsoft.com/office/word/2010/wordprocessingGroup" xmlns:mc="http://schemas.openxmlformats.org/markup-compatibility/2006" xmlns:wp14="http://schemas.microsoft.com/office/word/2010/wordprocessingDrawing" xmlns:w14="http://schemas.microsoft.com/office/word/2010/wordml" xmlns:w15="http://schemas.microsoft.com/office/word/2012/wordml" w:hanging="0" w:start="3959" w:end="3961"/>
+        <w:jc xmlns:wps="http://schemas.microsoft.com/office/word/2010/wordprocessingShape" xmlns:wpg="http://schemas.microsoft.com/office/word/2010/wordprocessingGroup" xmlns:mc="http://schemas.openxmlformats.org/markup-compatibility/2006" xmlns:wp14="http://schemas.microsoft.com/office/word/2010/wordprocessingDrawing" xmlns:w14="http://schemas.microsoft.com/office/word/2010/wordml" xmlns:w15="http://schemas.microsoft.com/office/word/2012/wordml" w:val="center"/>
+        <w:rPr xmlns:wps="http://schemas.microsoft.com/office/word/2010/wordprocessingShape" xmlns:wpg="http://schemas.microsoft.com/office/word/2010/wordprocessingGroup" xmlns:mc="http://schemas.openxmlformats.org/markup-compatibility/2006" xmlns:wp14="http://schemas.microsoft.com/office/word/2010/wordprocessingDrawing" xmlns:w14="http://schemas.microsoft.com/office/word/2010/wordml" xmlns:w15="http://schemas.microsoft.com/office/word/2012/wordml">
+          <w:i/>
+          <w:sz w:val="21"/>
+        </w:rPr>
       </w:pPr>
       <w:r>
         <w:rPr>
           <w:i/>
           <w:iCs/>
         </w:rPr>
-        <w:t xml:space="preserve">Богатство — не в обилии имущества, а в скромности желаний.</w:t>
+        <w:t xml:space="preserve">Богатство — не в обладании множеством вещей, а в немногих желаниях.</w:t>
       </w:r>
     </w:p>
-    <w:bookmarkEnd w:id="20"/>
-    <w:bookmarkStart w:id="23" w:name="эпиктет"/>
+    <w:bookmarkEnd w:id="10"/>
+    <w:bookmarkStart w:id="11" w:name="эпиктет"/>
     <w:p>
       <w:pPr>
         <w:pStyle xmlns:wps="http://schemas.microsoft.com/office/word/2010/wordprocessingShape" xmlns:wpg="http://schemas.microsoft.com/office/word/2010/wordprocessingGroup" xmlns:mc="http://schemas.openxmlformats.org/markup-compatibility/2006" xmlns:wp14="http://schemas.microsoft.com/office/word/2010/wordprocessingDrawing" xmlns:w14="http://schemas.microsoft.com/office/word/2010/wordml" xmlns:w15="http://schemas.microsoft.com/office/word/2012/wordml" w:val="Heading2"/>
@@ -109,37 +118,30 @@
     </w:p>
     <w:p>
       <w:pPr>
-        <w:pStyle w:val="FirstParagraph"/>
-      </w:pPr>
-      <w:r>
-        <w:t xml:space="preserve">Привлекательность лотерейных билетов с большими призами отчасти объясняется фантазиями, которые они пробуждают. Мы представляем всё, что могли бы сделать: благотворительные проекты, реальные перемены, которые смогли бы осуществить. Нельзя отрицать притягательность огромных сумм. В мечтах деньги решают все наши проблемы и дают ресурсы для удовлетворения потребностей, о которых мы даже не подозревали. Но является ли это богатством?</w:t>
+        <w:pStyle xmlns:wps="http://schemas.microsoft.com/office/word/2010/wordprocessingShape" xmlns:wpg="http://schemas.microsoft.com/office/word/2010/wordprocessingGroup" xmlns:mc="http://schemas.openxmlformats.org/markup-compatibility/2006" xmlns:wp14="http://schemas.microsoft.com/office/word/2010/wordprocessingDrawing" xmlns:w14="http://schemas.microsoft.com/office/word/2010/wordml" xmlns:w15="http://schemas.microsoft.com/office/word/2012/wordml" w:val="BodyText"/>
+        <w:bidi xmlns:wps="http://schemas.microsoft.com/office/word/2010/wordprocessingShape" xmlns:wpg="http://schemas.microsoft.com/office/word/2010/wordprocessingGroup" xmlns:mc="http://schemas.openxmlformats.org/markup-compatibility/2006" xmlns:wp14="http://schemas.microsoft.com/office/word/2010/wordprocessingDrawing" xmlns:w14="http://schemas.microsoft.com/office/word/2010/wordml" xmlns:w15="http://schemas.microsoft.com/office/word/2012/wordml" w:val="0"/>
+        <w:spacing xmlns:wps="http://schemas.microsoft.com/office/word/2010/wordprocessingShape" xmlns:wpg="http://schemas.microsoft.com/office/word/2010/wordprocessingGroup" xmlns:mc="http://schemas.openxmlformats.org/markup-compatibility/2006" xmlns:wp14="http://schemas.microsoft.com/office/word/2010/wordprocessingDrawing" xmlns:w14="http://schemas.microsoft.com/office/word/2010/wordml" xmlns:w15="http://schemas.microsoft.com/office/word/2012/wordml" w:lineRule="auto" w:line="247"/>
+        <w:ind xmlns:wps="http://schemas.microsoft.com/office/word/2010/wordprocessingShape" xmlns:wpg="http://schemas.microsoft.com/office/word/2010/wordprocessingGroup" xmlns:mc="http://schemas.openxmlformats.org/markup-compatibility/2006" xmlns:wp14="http://schemas.microsoft.com/office/word/2010/wordprocessingDrawing" xmlns:w14="http://schemas.microsoft.com/office/word/2010/wordml" xmlns:w15="http://schemas.microsoft.com/office/word/2012/wordml" w:start="100" w:end="122"/>
+        <w:jc xmlns:wps="http://schemas.microsoft.com/office/word/2010/wordprocessingShape" xmlns:wpg="http://schemas.microsoft.com/office/word/2010/wordprocessingGroup" xmlns:mc="http://schemas.openxmlformats.org/markup-compatibility/2006" xmlns:wp14="http://schemas.microsoft.com/office/word/2010/wordprocessingDrawing" xmlns:w14="http://schemas.microsoft.com/office/word/2010/wordml" xmlns:w15="http://schemas.microsoft.com/office/word/2012/wordml" w:val="start"/>
+        <w:rPr xmlns:wps="http://schemas.microsoft.com/office/word/2010/wordprocessingShape" xmlns:wpg="http://schemas.microsoft.com/office/word/2010/wordprocessingGroup" xmlns:mc="http://schemas.openxmlformats.org/markup-compatibility/2006" xmlns:wp14="http://schemas.microsoft.com/office/word/2010/wordprocessingDrawing" xmlns:w14="http://schemas.microsoft.com/office/word/2010/wordml" xmlns:w15="http://schemas.microsoft.com/office/word/2012/wordml"/>
+      </w:pPr>
+      <w:r>
+        <w:t xml:space="preserve">Привлекательность лотерейных билетов с крупными призами отчасти объясняется фантазиями, которые они пробуждают. Мы представляем себе всё, что могли бы сделать: благотворительные проекты, реальные перемены, в которых могли бы участвовать. Нельзя отрицать соблазн огромных сумм. В мечтах деньги решают все проблемы, дают ресурсы для удовлетворения потребностей, о которых мы и не подозревали. Но является ли это богатством?</w:t>
       </w:r>
     </w:p>
     <w:p>
       <w:pPr>
-        <w:pStyle w:val="BodyText"/>
-      </w:pPr>
-      <w:r>
-        <w:t xml:space="preserve">Возможно, вы взяли эту книгу в надежде узнать, как приумножить собственное состояние — и во многом она именно об этом. Но</w:t>
-      </w:r>
-      <w:r>
-        <w:t xml:space="preserve"> </w:t>
-      </w:r>
-      <w:r>
-        <w:rPr>
-          <w:i/>
-          <w:iCs/>
-        </w:rPr>
-        <w:t xml:space="preserve">«Создание богатства»</w:t>
-      </w:r>
-      <w:r>
-        <w:t xml:space="preserve"> </w:t>
-      </w:r>
-      <w:r>
-        <w:t xml:space="preserve">— не очередная схема быстрого обогащения. Эта книга поможет вам найти и создать богатство там, где вы его не ожидаете. Она также может показать, насколько вы уже богаты.</w:t>
+        <w:pStyle xmlns:wps="http://schemas.microsoft.com/office/word/2010/wordprocessingShape" xmlns:wpg="http://schemas.microsoft.com/office/word/2010/wordprocessingGroup" xmlns:mc="http://schemas.openxmlformats.org/markup-compatibility/2006" xmlns:wp14="http://schemas.microsoft.com/office/word/2010/wordprocessingDrawing" xmlns:w14="http://schemas.microsoft.com/office/word/2010/wordml" xmlns:w15="http://schemas.microsoft.com/office/word/2012/wordml" w:val="BodyText"/>
+        <w:bidi xmlns:wps="http://schemas.microsoft.com/office/word/2010/wordprocessingShape" xmlns:wpg="http://schemas.microsoft.com/office/word/2010/wordprocessingGroup" xmlns:mc="http://schemas.openxmlformats.org/markup-compatibility/2006" xmlns:wp14="http://schemas.microsoft.com/office/word/2010/wordprocessingDrawing" xmlns:w14="http://schemas.microsoft.com/office/word/2010/wordml" xmlns:w15="http://schemas.microsoft.com/office/word/2012/wordml" w:val="0"/>
+        <w:spacing xmlns:wps="http://schemas.microsoft.com/office/word/2010/wordprocessingShape" xmlns:wpg="http://schemas.microsoft.com/office/word/2010/wordprocessingGroup" xmlns:mc="http://schemas.openxmlformats.org/markup-compatibility/2006" xmlns:wp14="http://schemas.microsoft.com/office/word/2010/wordprocessingDrawing" xmlns:w14="http://schemas.microsoft.com/office/word/2010/wordml" xmlns:w15="http://schemas.microsoft.com/office/word/2012/wordml" w:lineRule="auto" w:line="247"/>
+        <w:ind xmlns:wps="http://schemas.microsoft.com/office/word/2010/wordprocessingShape" xmlns:wpg="http://schemas.microsoft.com/office/word/2010/wordprocessingGroup" xmlns:mc="http://schemas.openxmlformats.org/markup-compatibility/2006" xmlns:wp14="http://schemas.microsoft.com/office/word/2010/wordprocessingDrawing" xmlns:w14="http://schemas.microsoft.com/office/word/2010/wordml" xmlns:w15="http://schemas.microsoft.com/office/word/2012/wordml" w:firstLine="288" w:start="100" w:end="122"/>
+        <w:jc xmlns:wps="http://schemas.microsoft.com/office/word/2010/wordprocessingShape" xmlns:wpg="http://schemas.microsoft.com/office/word/2010/wordprocessingGroup" xmlns:mc="http://schemas.openxmlformats.org/markup-compatibility/2006" xmlns:wp14="http://schemas.microsoft.com/office/word/2010/wordprocessingDrawing" xmlns:w14="http://schemas.microsoft.com/office/word/2010/wordml" xmlns:w15="http://schemas.microsoft.com/office/word/2012/wordml" w:val="start"/>
+        <w:rPr xmlns:wps="http://schemas.microsoft.com/office/word/2010/wordprocessingShape" xmlns:wpg="http://schemas.microsoft.com/office/word/2010/wordprocessingGroup" xmlns:mc="http://schemas.openxmlformats.org/markup-compatibility/2006" xmlns:wp14="http://schemas.microsoft.com/office/word/2010/wordprocessingDrawing" xmlns:w14="http://schemas.microsoft.com/office/word/2010/wordml" xmlns:w15="http://schemas.microsoft.com/office/word/2012/wordml"/>
+      </w:pPr>
+      <w:r>
+        <w:t xml:space="preserve">Возможно, вы взяли эту книгу в надежде узнать, как приумножить личное состояние — и она действительно об этом. Но «Создание богатства» — не очередная схема быстрого обогащения. Эта книга поможет вам найти и создать богатство там, где вы его не ожидаете, а также показать, насколько вы уже богаты.</w:t>
       </w:r>
     </w:p>
-    <w:bookmarkStart w:id="21" w:name="переосмысление-богатства"/>
     <w:p>
       <w:pPr>
         <w:pStyle xmlns:wps="http://schemas.microsoft.com/office/word/2010/wordprocessingShape" xmlns:wpg="http://schemas.microsoft.com/office/word/2010/wordprocessingGroup" xmlns:mc="http://schemas.openxmlformats.org/markup-compatibility/2006" xmlns:wp14="http://schemas.microsoft.com/office/word/2010/wordprocessingDrawing" xmlns:w14="http://schemas.microsoft.com/office/word/2010/wordml" xmlns:w15="http://schemas.microsoft.com/office/word/2012/wordml" w:val="BodyText"/>
@@ -155,69 +157,60 @@
     </w:p>
     <w:p>
       <w:pPr>
-        <w:pStyle w:val="FirstParagraph"/>
-      </w:pPr>
-      <w:r>
-        <w:t xml:space="preserve">Богатство — то, чего мы все хотим. Кто такой «богатый человек» — богат чем? Вещами, деньгами, доходами? Всё зависит от того, как вы определяете это слово. Его первоначальное значение — от староанглийского</w:t>
-      </w:r>
-      <w:r>
-        <w:t xml:space="preserve"> </w:t>
-      </w:r>
-      <w:r>
-        <w:rPr>
-          <w:i/>
-          <w:iCs/>
-        </w:rPr>
-        <w:t xml:space="preserve">weal</w:t>
-      </w:r>
-      <w:r>
-        <w:t xml:space="preserve"> </w:t>
-      </w:r>
-      <w:r>
-        <w:t xml:space="preserve">(как в</w:t>
-      </w:r>
-      <w:r>
-        <w:t xml:space="preserve"> </w:t>
-      </w:r>
-      <w:r>
-        <w:rPr>
-          <w:i/>
-          <w:iCs/>
-        </w:rPr>
-        <w:t xml:space="preserve">commonweal</w:t>
-      </w:r>
-      <w:r>
-        <w:t xml:space="preserve">) — было просто «процветание» или «благополучие»</w:t>
+        <w:pStyle xmlns:wps="http://schemas.microsoft.com/office/word/2010/wordprocessingShape" xmlns:wpg="http://schemas.microsoft.com/office/word/2010/wordprocessingGroup" xmlns:mc="http://schemas.openxmlformats.org/markup-compatibility/2006" xmlns:wp14="http://schemas.microsoft.com/office/word/2010/wordprocessingDrawing" xmlns:w14="http://schemas.microsoft.com/office/word/2010/wordml" xmlns:w15="http://schemas.microsoft.com/office/word/2012/wordml" w:val="BodyText"/>
+        <w:bidi xmlns:wps="http://schemas.microsoft.com/office/word/2010/wordprocessingShape" xmlns:wpg="http://schemas.microsoft.com/office/word/2010/wordprocessingGroup" xmlns:mc="http://schemas.openxmlformats.org/markup-compatibility/2006" xmlns:wp14="http://schemas.microsoft.com/office/word/2010/wordprocessingDrawing" xmlns:w14="http://schemas.microsoft.com/office/word/2010/wordml" xmlns:w15="http://schemas.microsoft.com/office/word/2012/wordml" w:val="0"/>
+        <w:spacing xmlns:wps="http://schemas.microsoft.com/office/word/2010/wordprocessingShape" xmlns:wpg="http://schemas.microsoft.com/office/word/2010/wordprocessingGroup" xmlns:mc="http://schemas.openxmlformats.org/markup-compatibility/2006" xmlns:wp14="http://schemas.microsoft.com/office/word/2010/wordprocessingDrawing" xmlns:w14="http://schemas.microsoft.com/office/word/2010/wordml" xmlns:w15="http://schemas.microsoft.com/office/word/2012/wordml" w:lineRule="auto" w:line="250" w:before="9" w:after="0"/>
+        <w:ind xmlns:wps="http://schemas.microsoft.com/office/word/2010/wordprocessingShape" xmlns:wpg="http://schemas.microsoft.com/office/word/2010/wordprocessingGroup" xmlns:mc="http://schemas.openxmlformats.org/markup-compatibility/2006" xmlns:wp14="http://schemas.microsoft.com/office/word/2010/wordprocessingDrawing" xmlns:w14="http://schemas.microsoft.com/office/word/2010/wordml" xmlns:w15="http://schemas.microsoft.com/office/word/2012/wordml" w:start="100" w:end="280"/>
+        <w:jc xmlns:wps="http://schemas.microsoft.com/office/word/2010/wordprocessingShape" xmlns:wpg="http://schemas.microsoft.com/office/word/2010/wordprocessingGroup" xmlns:mc="http://schemas.openxmlformats.org/markup-compatibility/2006" xmlns:wp14="http://schemas.microsoft.com/office/word/2010/wordprocessingDrawing" xmlns:w14="http://schemas.microsoft.com/office/word/2010/wordml" xmlns:w15="http://schemas.microsoft.com/office/word/2012/wordml" w:val="start"/>
+        <w:rPr xmlns:wps="http://schemas.microsoft.com/office/word/2010/wordprocessingShape" xmlns:wpg="http://schemas.microsoft.com/office/word/2010/wordprocessingGroup" xmlns:mc="http://schemas.openxmlformats.org/markup-compatibility/2006" xmlns:wp14="http://schemas.microsoft.com/office/word/2010/wordprocessingDrawing" xmlns:w14="http://schemas.microsoft.com/office/word/2010/wordml" xmlns:w15="http://schemas.microsoft.com/office/word/2012/wordml"/>
+      </w:pPr>
+      <w:r>
+        <w:t xml:space="preserve">Богатство. Это то, чего мы все хотим. Но богатый — богат чем? Вещами, деньгами, доходом? Всё зависит от того, как вы определяете это слово. Его первоначальное значение — староанглийское weal (как в commonweal) — означало просто процветание или благополучие</w:t>
       </w:r>
       <w:r>
         <w:t xml:space="preserve">(1)</w:t>
       </w:r>
       <w:r>
-        <w:t xml:space="preserve">. Какая идея! Как далеко это от того значения, с которым многие из нас теперь ассоциируют это слово. Богатство — больше, чем накопление денег и ресурсов, и его можно создать не только традиционными финансовыми средствами. Чтобы по‑настоящему понять богатство обществ, культур и окружающей среды, нужно вернуться к старому представлению о богатстве как о благополучии. Мы можем думать, что выигрыш в лотерею сделает нас богатыми, а богатство сделает нас счастливыми, но это не всегда так. Хотя бедность действительно ведёт к несчастью, много денег не всегда покупают счастье.</w:t>
+        <w:t xml:space="preserve">. Как далеко это от того смысла, который многие из нас теперь вкладывают в это слово. Богатство — больше, чем накопление денег и ресурсов, и его можно создать не только традиционными финансовыми средствами. Чтобы по‑настоящему понять богатство обществ, культур и окружающей среды, стоит вернуться к старому понятию богатства как благополучия. Мы можем думать, что выигрыш в лотерею сделает нас богатыми, а богатство — счастливыми, но это не всегда так. Хотя бедность действительно ведёт к несчастью, много денег не гарантирует счастья.</w:t>
       </w:r>
     </w:p>
     <w:p>
       <w:pPr>
-        <w:pStyle w:val="BodyText"/>
-      </w:pPr>
-      <w:r>
-        <w:t xml:space="preserve">Возможно, вы видели случаи, когда человек с очень низким доходом выигрывал в лотерею или получал крупную компенсацию по суду, но эти деньги зачастую не приносили значительного улучшения в его жизни. Во многих таких случаях ситуация даже ухудшается. Стресс от наличия денег и всех новых проблем — как их сохранить, внезапно появившиеся родственники и друзья, о которых вы даже не подозревали, мошенники и целая армия «инвестиционных консультантов» — подрывает спокойствие.</w:t>
+        <w:pStyle xmlns:wps="http://schemas.microsoft.com/office/word/2010/wordprocessingShape" xmlns:wpg="http://schemas.microsoft.com/office/word/2010/wordprocessingGroup" xmlns:mc="http://schemas.openxmlformats.org/markup-compatibility/2006" xmlns:wp14="http://schemas.microsoft.com/office/word/2010/wordprocessingDrawing" xmlns:w14="http://schemas.microsoft.com/office/word/2010/wordml" xmlns:w15="http://schemas.microsoft.com/office/word/2012/wordml" w:val="BodyText"/>
+        <w:bidi xmlns:wps="http://schemas.microsoft.com/office/word/2010/wordprocessingShape" xmlns:wpg="http://schemas.microsoft.com/office/word/2010/wordprocessingGroup" xmlns:mc="http://schemas.openxmlformats.org/markup-compatibility/2006" xmlns:wp14="http://schemas.microsoft.com/office/word/2010/wordprocessingDrawing" xmlns:w14="http://schemas.microsoft.com/office/word/2010/wordml" xmlns:w15="http://schemas.microsoft.com/office/word/2012/wordml" w:val="0"/>
+        <w:spacing xmlns:wps="http://schemas.microsoft.com/office/word/2010/wordprocessingShape" xmlns:wpg="http://schemas.microsoft.com/office/word/2010/wordprocessingGroup" xmlns:mc="http://schemas.openxmlformats.org/markup-compatibility/2006" xmlns:wp14="http://schemas.microsoft.com/office/word/2010/wordprocessingDrawing" xmlns:w14="http://schemas.microsoft.com/office/word/2010/wordml" xmlns:w15="http://schemas.microsoft.com/office/word/2012/wordml" w:lineRule="auto" w:line="247"/>
+        <w:ind xmlns:wps="http://schemas.microsoft.com/office/word/2010/wordprocessingShape" xmlns:wpg="http://schemas.microsoft.com/office/word/2010/wordprocessingGroup" xmlns:mc="http://schemas.openxmlformats.org/markup-compatibility/2006" xmlns:wp14="http://schemas.microsoft.com/office/word/2010/wordprocessingDrawing" xmlns:w14="http://schemas.microsoft.com/office/word/2010/wordml" xmlns:w15="http://schemas.microsoft.com/office/word/2012/wordml" w:firstLine="288" w:start="100" w:end="122"/>
+        <w:jc xmlns:wps="http://schemas.microsoft.com/office/word/2010/wordprocessingShape" xmlns:wpg="http://schemas.microsoft.com/office/word/2010/wordprocessingGroup" xmlns:mc="http://schemas.openxmlformats.org/markup-compatibility/2006" xmlns:wp14="http://schemas.microsoft.com/office/word/2010/wordprocessingDrawing" xmlns:w14="http://schemas.microsoft.com/office/word/2010/wordml" xmlns:w15="http://schemas.microsoft.com/office/word/2012/wordml" w:val="start"/>
+        <w:rPr xmlns:wps="http://schemas.microsoft.com/office/word/2010/wordprocessingShape" xmlns:wpg="http://schemas.microsoft.com/office/word/2010/wordprocessingGroup" xmlns:mc="http://schemas.openxmlformats.org/markup-compatibility/2006" xmlns:wp14="http://schemas.microsoft.com/office/word/2010/wordprocessingDrawing" xmlns:w14="http://schemas.microsoft.com/office/word/2010/wordml" xmlns:w15="http://schemas.microsoft.com/office/word/2012/wordml"/>
+      </w:pPr>
+      <w:r>
+        <w:t xml:space="preserve">Возможно, вы видели случаи, когда человек с очень низким доходом выигрывал в лотерею или получал крупную компенсацию по суду, но эти деньги нередко не улучшали его жизни. Во многих таких случаях всё лишь ухудшается: стресс от обладания деньгами и новых требований сказывается на человеке — как их сохранить; вдруг появляются родственники и «друзья», о которых вы и не подозревали; появляются мошенники и целая армия «инвестиционных консультантов».</w:t>
       </w:r>
     </w:p>
     <w:p>
       <w:pPr>
-        <w:pStyle w:val="BodyText"/>
-      </w:pPr>
-      <w:r>
-        <w:t xml:space="preserve">Как достичь благополучия, если это не связано с приобретением больших сумм? Когда мы счастливы? Ответ прост: мы чувствуем себя счастливыми, когда наши потребности удовлетворены. Не только базовые — в еде, одежде и жилье — но и потребность быть творчески вовлечёнными в жизнь сообщества, иметь право голоса в решении собственной судьбы, стремиться к духовному развитию без социальных ограничений, иметь время на отдых, развлечения и общение с семьёй. Наши потребности разнообразны…</w:t>
+        <w:pStyle xmlns:wps="http://schemas.microsoft.com/office/word/2010/wordprocessingShape" xmlns:wpg="http://schemas.microsoft.com/office/word/2010/wordprocessingGroup" xmlns:mc="http://schemas.openxmlformats.org/markup-compatibility/2006" xmlns:wp14="http://schemas.microsoft.com/office/word/2010/wordprocessingDrawing" xmlns:w14="http://schemas.microsoft.com/office/word/2010/wordml" xmlns:w15="http://schemas.microsoft.com/office/word/2012/wordml" w:val="BodyText"/>
+        <w:bidi xmlns:wps="http://schemas.microsoft.com/office/word/2010/wordprocessingShape" xmlns:wpg="http://schemas.microsoft.com/office/word/2010/wordprocessingGroup" xmlns:mc="http://schemas.openxmlformats.org/markup-compatibility/2006" xmlns:wp14="http://schemas.microsoft.com/office/word/2010/wordprocessingDrawing" xmlns:w14="http://schemas.microsoft.com/office/word/2010/wordml" xmlns:w15="http://schemas.microsoft.com/office/word/2012/wordml" w:val="0"/>
+        <w:spacing xmlns:wps="http://schemas.microsoft.com/office/word/2010/wordprocessingShape" xmlns:wpg="http://schemas.microsoft.com/office/word/2010/wordprocessingGroup" xmlns:mc="http://schemas.openxmlformats.org/markup-compatibility/2006" xmlns:wp14="http://schemas.microsoft.com/office/word/2010/wordprocessingDrawing" xmlns:w14="http://schemas.microsoft.com/office/word/2010/wordml" xmlns:w15="http://schemas.microsoft.com/office/word/2012/wordml" w:lineRule="auto" w:line="247" w:before="0" w:after="0"/>
+        <w:ind xmlns:wps="http://schemas.microsoft.com/office/word/2010/wordprocessingShape" xmlns:wpg="http://schemas.microsoft.com/office/word/2010/wordprocessingGroup" xmlns:mc="http://schemas.openxmlformats.org/markup-compatibility/2006" xmlns:wp14="http://schemas.microsoft.com/office/word/2010/wordprocessingDrawing" xmlns:w14="http://schemas.microsoft.com/office/word/2010/wordml" xmlns:w15="http://schemas.microsoft.com/office/word/2012/wordml" w:firstLine="288" w:start="100" w:end="122"/>
+        <w:jc xmlns:wps="http://schemas.microsoft.com/office/word/2010/wordprocessingShape" xmlns:wpg="http://schemas.microsoft.com/office/word/2010/wordprocessingGroup" xmlns:mc="http://schemas.openxmlformats.org/markup-compatibility/2006" xmlns:wp14="http://schemas.microsoft.com/office/word/2010/wordprocessingDrawing" xmlns:w14="http://schemas.microsoft.com/office/word/2010/wordml" xmlns:w15="http://schemas.microsoft.com/office/word/2012/wordml" w:val="start"/>
+        <w:rPr xmlns:wps="http://schemas.microsoft.com/office/word/2010/wordprocessingShape" xmlns:wpg="http://schemas.microsoft.com/office/word/2010/wordprocessingGroup" xmlns:mc="http://schemas.openxmlformats.org/markup-compatibility/2006" xmlns:wp14="http://schemas.microsoft.com/office/word/2010/wordprocessingDrawing" xmlns:w14="http://schemas.microsoft.com/office/word/2010/wordml" xmlns:w15="http://schemas.microsoft.com/office/word/2012/wordml"/>
+      </w:pPr>
+      <w:r>
+        <w:t xml:space="preserve">Как достичь благополучия, если оно не связано с накоплением больших сумм? Когда мы счастливы? Ответ прост: мы чувствуем себя счастливыми, когда удовлетворены наши потребности — не только в еде, одежде и жилье, но и в творческом участии в жизни сообщества, в праве голоса при формировании своей судьбы, в стремлении к духовному развитию без социальных ограничений, во времени для отдыха, развлечений и общения с семьёй. Наши потребности многообразны…</w:t>
       </w:r>
     </w:p>
     <w:p>
       <w:pPr>
-        <w:pStyle w:val="BodyText"/>
-      </w:pPr>
-      <w:r>
-        <w:t xml:space="preserve">Они многогранны, но в доминирующей потребительской экономике основные игроки — фирмы и корпорации — постоянно рекламируют свои товары, пытаясь убедить нас, что покупки принесут удовлетворение.</w:t>
+        <w:pStyle xmlns:wps="http://schemas.microsoft.com/office/word/2010/wordprocessingShape" xmlns:wpg="http://schemas.microsoft.com/office/word/2010/wordprocessingGroup" xmlns:mc="http://schemas.openxmlformats.org/markup-compatibility/2006" xmlns:wp14="http://schemas.microsoft.com/office/word/2010/wordprocessingDrawing" xmlns:w14="http://schemas.microsoft.com/office/word/2010/wordml" xmlns:w15="http://schemas.microsoft.com/office/word/2012/wordml" w:val="BodyText"/>
+        <w:bidi xmlns:wps="http://schemas.microsoft.com/office/word/2010/wordprocessingShape" xmlns:wpg="http://schemas.microsoft.com/office/word/2010/wordprocessingGroup" xmlns:mc="http://schemas.openxmlformats.org/markup-compatibility/2006" xmlns:wp14="http://schemas.microsoft.com/office/word/2010/wordprocessingDrawing" xmlns:w14="http://schemas.microsoft.com/office/word/2010/wordml" xmlns:w15="http://schemas.microsoft.com/office/word/2012/wordml" w:val="0"/>
+        <w:spacing xmlns:wps="http://schemas.microsoft.com/office/word/2010/wordprocessingShape" xmlns:wpg="http://schemas.microsoft.com/office/word/2010/wordprocessingGroup" xmlns:mc="http://schemas.openxmlformats.org/markup-compatibility/2006" xmlns:wp14="http://schemas.microsoft.com/office/word/2010/wordprocessingDrawing" xmlns:w14="http://schemas.microsoft.com/office/word/2010/wordml" xmlns:w15="http://schemas.microsoft.com/office/word/2012/wordml" w:lineRule="auto" w:line="247" w:before="84" w:after="0"/>
+        <w:ind xmlns:wps="http://schemas.microsoft.com/office/word/2010/wordprocessingShape" xmlns:wpg="http://schemas.microsoft.com/office/word/2010/wordprocessingGroup" xmlns:mc="http://schemas.openxmlformats.org/markup-compatibility/2006" xmlns:wp14="http://schemas.microsoft.com/office/word/2010/wordprocessingDrawing" xmlns:w14="http://schemas.microsoft.com/office/word/2010/wordml" xmlns:w15="http://schemas.microsoft.com/office/word/2012/wordml" w:start="100" w:end="122"/>
+        <w:jc xmlns:wps="http://schemas.microsoft.com/office/word/2010/wordprocessingShape" xmlns:wpg="http://schemas.microsoft.com/office/word/2010/wordprocessingGroup" xmlns:mc="http://schemas.openxmlformats.org/markup-compatibility/2006" xmlns:wp14="http://schemas.microsoft.com/office/word/2010/wordprocessingDrawing" xmlns:w14="http://schemas.microsoft.com/office/word/2010/wordml" xmlns:w15="http://schemas.microsoft.com/office/word/2012/wordml" w:val="start"/>
+        <w:rPr xmlns:wps="http://schemas.microsoft.com/office/word/2010/wordprocessingShape" xmlns:wpg="http://schemas.microsoft.com/office/word/2010/wordprocessingGroup" xmlns:mc="http://schemas.openxmlformats.org/markup-compatibility/2006" xmlns:wp14="http://schemas.microsoft.com/office/word/2010/wordprocessingDrawing" xmlns:w14="http://schemas.microsoft.com/office/word/2010/wordml" xmlns:w15="http://schemas.microsoft.com/office/word/2012/wordml"/>
+      </w:pPr>
+      <w:r>
+        <w:t xml:space="preserve">Многообразны, но при этом с доминирующим акцентом на потребительскую экономику: основные экономические игроки — предприятия и корпорации — постоянно рекламируют свои товары, убеждая нас, что покупки принесут удовлетворение.</w:t>
       </w:r>
     </w:p>
     <w:p>
@@ -230,15 +223,20 @@
         <w:rPr xmlns:wps="http://schemas.microsoft.com/office/word/2010/wordprocessingShape" xmlns:wpg="http://schemas.microsoft.com/office/word/2010/wordprocessingGroup" xmlns:mc="http://schemas.openxmlformats.org/markup-compatibility/2006" xmlns:wp14="http://schemas.microsoft.com/office/word/2010/wordprocessingDrawing" xmlns:w14="http://schemas.microsoft.com/office/word/2010/wordml" xmlns:w15="http://schemas.microsoft.com/office/word/2012/wordml"/>
       </w:pPr>
       <w:r>
-        <w:t xml:space="preserve">Нам не нужны деньги. Нам нужны вещи, которые можно купить за деньги.</w:t>
+        <w:t xml:space="preserve">Нам не нужны деньги сами по себе — нам нужны вещи, которые можно за них купить.</w:t>
       </w:r>
     </w:p>
     <w:p>
       <w:pPr>
-        <w:pStyle w:val="BodyText"/>
-      </w:pPr>
-      <w:r>
-        <w:t xml:space="preserve">Избыточный вес? Купите диетический план и тренажёр. Несчастны? Существует много программ самосовершенствования, которые можно купить. Духовно потеряны? Купите книгу, видеокассету, присоединитесь к успешной мегацеркви или отправьтесь в отпуск на курорт. Наша потребность в самовыражении всё чаще удовлетворяется через одежду, которую мы носим, и машины, на которых мы ездим. Искусство и музыка часто остаются делом профессионалов, которые предлагают свои товары и услуги. И всё же в конце концов мы обнаруживаем, что потребительские решения не работают — временное удовлетворение от новых вещей лишь усиливает нашу глубинную потребность. Если счастье не купить, значит, должен быть другой путь.</w:t>
+        <w:pStyle xmlns:wps="http://schemas.microsoft.com/office/word/2010/wordprocessingShape" xmlns:wpg="http://schemas.microsoft.com/office/word/2010/wordprocessingGroup" xmlns:mc="http://schemas.openxmlformats.org/markup-compatibility/2006" xmlns:wp14="http://schemas.microsoft.com/office/word/2010/wordprocessingDrawing" xmlns:w14="http://schemas.microsoft.com/office/word/2010/wordml" xmlns:w15="http://schemas.microsoft.com/office/word/2012/wordml" w:val="BodyText"/>
+        <w:bidi xmlns:wps="http://schemas.microsoft.com/office/word/2010/wordprocessingShape" xmlns:wpg="http://schemas.microsoft.com/office/word/2010/wordprocessingGroup" xmlns:mc="http://schemas.openxmlformats.org/markup-compatibility/2006" xmlns:wp14="http://schemas.microsoft.com/office/word/2010/wordprocessingDrawing" xmlns:w14="http://schemas.microsoft.com/office/word/2010/wordml" xmlns:w15="http://schemas.microsoft.com/office/word/2012/wordml" w:val="0"/>
+        <w:spacing xmlns:wps="http://schemas.microsoft.com/office/word/2010/wordprocessingShape" xmlns:wpg="http://schemas.microsoft.com/office/word/2010/wordprocessingGroup" xmlns:mc="http://schemas.openxmlformats.org/markup-compatibility/2006" xmlns:wp14="http://schemas.microsoft.com/office/word/2010/wordprocessingDrawing" xmlns:w14="http://schemas.microsoft.com/office/word/2010/wordml" xmlns:w15="http://schemas.microsoft.com/office/word/2012/wordml" w:lineRule="auto" w:line="247"/>
+        <w:ind xmlns:wps="http://schemas.microsoft.com/office/word/2010/wordprocessingShape" xmlns:wpg="http://schemas.microsoft.com/office/word/2010/wordprocessingGroup" xmlns:mc="http://schemas.openxmlformats.org/markup-compatibility/2006" xmlns:wp14="http://schemas.microsoft.com/office/word/2010/wordprocessingDrawing" xmlns:w14="http://schemas.microsoft.com/office/word/2010/wordml" xmlns:w15="http://schemas.microsoft.com/office/word/2012/wordml" w:firstLine="288" w:start="100" w:end="122"/>
+        <w:jc xmlns:wps="http://schemas.microsoft.com/office/word/2010/wordprocessingShape" xmlns:wpg="http://schemas.microsoft.com/office/word/2010/wordprocessingGroup" xmlns:mc="http://schemas.openxmlformats.org/markup-compatibility/2006" xmlns:wp14="http://schemas.microsoft.com/office/word/2010/wordprocessingDrawing" xmlns:w14="http://schemas.microsoft.com/office/word/2010/wordml" xmlns:w15="http://schemas.microsoft.com/office/word/2012/wordml" w:val="start"/>
+        <w:rPr xmlns:wps="http://schemas.microsoft.com/office/word/2010/wordprocessingShape" xmlns:wpg="http://schemas.microsoft.com/office/word/2010/wordprocessingGroup" xmlns:mc="http://schemas.openxmlformats.org/markup-compatibility/2006" xmlns:wp14="http://schemas.microsoft.com/office/word/2010/wordprocessingDrawing" xmlns:w14="http://schemas.microsoft.com/office/word/2010/wordml" xmlns:w15="http://schemas.microsoft.com/office/word/2012/wordml"/>
+      </w:pPr>
+      <w:r>
+        <w:t xml:space="preserve">Избыточный вес? Купите диетический план и тренажёр. Чувствуете себя несчастным? Существует множество программ саморазвития, которые можно приобрести. Потеряли духовный ориентир? Купите книгу или видеокурс, присоединитесь к успешной мегацеркви или отправьтесь на курорт. Потребность в самовыражении всё чаще удовлетворяется одеждой и автомобилем. Искусство и музыка остаются делом профессионалов, предлагающих свои услуги на продажу. И всё же после всего этого мы обнаруживаем: потребительские решения не работают — кратковременное удовлетворение от новых покупок лишь усугубляет первоначальную потребность. Если счастье не купить, значит, должен быть другой путь.</w:t>
       </w:r>
     </w:p>
     <w:p>
@@ -267,7 +265,7 @@
         <w:t xml:space="preserve"> </w:t>
       </w:r>
       <w:r>
-        <w:t xml:space="preserve">богатству нам нужно переосмыслить само понятие богатства. Что же оно означает? Вспомните идею общественного благосостояния (общественного благополучия). Создание реального богатства подразумевает принятие решений, которые позволяют всем членам общества достичь благополучия. Устойчивое богатство проецирует эту идею в будущее — как это сделала Всемирная комиссия по окружающей среде и развитию, определив устойчивое развитие как «удовлетворение потребностей настоящего времени без ущерба для способности будущих поколений удовлетворять свои собственные потребности»</w:t>
+        <w:t xml:space="preserve">богатству нам нужно переосмыслить само понятие богатства. Что это значит? Вспомните идею общественного благосостояния. Создание реального богатства подразумевает принятие решений, которые позволяют всем членам общества достичь благополучия. Устойчивое богатство проецирует это понятие в будущее — как сделала Всемирная комиссия по окружающей среде и развитию, определив устойчивое развитие как «удовлетворение потребностей настоящего времени без ущерба для способности будущих поколений удовлетворять свои собственные потребности»</w:t>
       </w:r>
       <w:r>
         <w:t xml:space="preserve">2</w:t>
@@ -289,11 +287,9 @@
         <w:t xml:space="preserve"> </w:t>
       </w:r>
       <w:r>
-        <w:t xml:space="preserve">сообщество — сообщество, чьи потребности удовлетворялись бы без заимствования богатства у будущих поколений.</w:t>
+        <w:t xml:space="preserve">сообщество — сообщество, чьи потребности удовлетворяются без заимствования благ у будущих поколений.</w:t>
       </w:r>
     </w:p>
-    <w:bookmarkEnd w:id="21"/>
-    <w:bookmarkStart w:id="22" w:name="системный-подход"/>
     <w:p>
       <w:pPr>
         <w:pStyle xmlns:wps="http://schemas.microsoft.com/office/word/2010/wordprocessingShape" xmlns:wpg="http://schemas.microsoft.com/office/word/2010/wordprocessingGroup" xmlns:mc="http://schemas.openxmlformats.org/markup-compatibility/2006" xmlns:wp14="http://schemas.microsoft.com/office/word/2010/wordprocessingDrawing" xmlns:w14="http://schemas.microsoft.com/office/word/2010/wordml" xmlns:w15="http://schemas.microsoft.com/office/word/2012/wordml" w:val="BodyText"/>
@@ -309,26 +305,15 @@
     </w:p>
     <w:p>
       <w:pPr>
-        <w:pStyle w:val="FirstParagraph"/>
-      </w:pPr>
-      <w:r>
-        <w:t xml:space="preserve">Каковы наши потребности и как они удовлетворяются? Эмпирическую оценку можно получить, просто оглядевшись на разные учреждения, программы, товары и услуги, предлагаемые в обществе. Не все из них удовлетворяют реальные потребности — некоторые существуют потому, что создано искусственное</w:t>
-      </w:r>
-      <w:r>
-        <w:t xml:space="preserve"> </w:t>
-      </w:r>
-      <w:r>
-        <w:rPr>
-          <w:i/>
-          <w:iCs/>
-        </w:rPr>
-        <w:t xml:space="preserve">желание</w:t>
-      </w:r>
-      <w:r>
-        <w:t xml:space="preserve"> </w:t>
-      </w:r>
-      <w:r>
-        <w:t xml:space="preserve">или потребность, — но инвентаризация наших активов (под активами понимаются средства удовлетворения потребностей) даёт хорошую отправную точку.</w:t>
+        <w:pStyle xmlns:wps="http://schemas.microsoft.com/office/word/2010/wordprocessingShape" xmlns:wpg="http://schemas.microsoft.com/office/word/2010/wordprocessingGroup" xmlns:mc="http://schemas.openxmlformats.org/markup-compatibility/2006" xmlns:wp14="http://schemas.microsoft.com/office/word/2010/wordprocessingDrawing" xmlns:w14="http://schemas.microsoft.com/office/word/2010/wordml" xmlns:w15="http://schemas.microsoft.com/office/word/2012/wordml" w:val="BodyText"/>
+        <w:bidi xmlns:wps="http://schemas.microsoft.com/office/word/2010/wordprocessingShape" xmlns:wpg="http://schemas.microsoft.com/office/word/2010/wordprocessingGroup" xmlns:mc="http://schemas.openxmlformats.org/markup-compatibility/2006" xmlns:wp14="http://schemas.microsoft.com/office/word/2010/wordprocessingDrawing" xmlns:w14="http://schemas.microsoft.com/office/word/2010/wordml" xmlns:w15="http://schemas.microsoft.com/office/word/2012/wordml" w:val="0"/>
+        <w:spacing xmlns:wps="http://schemas.microsoft.com/office/word/2010/wordprocessingShape" xmlns:wpg="http://schemas.microsoft.com/office/word/2010/wordprocessingGroup" xmlns:mc="http://schemas.openxmlformats.org/markup-compatibility/2006" xmlns:wp14="http://schemas.microsoft.com/office/word/2010/wordprocessingDrawing" xmlns:w14="http://schemas.microsoft.com/office/word/2010/wordml" xmlns:w15="http://schemas.microsoft.com/office/word/2012/wordml" w:lineRule="auto" w:line="247" w:before="9" w:after="0"/>
+        <w:ind xmlns:wps="http://schemas.microsoft.com/office/word/2010/wordprocessingShape" xmlns:wpg="http://schemas.microsoft.com/office/word/2010/wordprocessingGroup" xmlns:mc="http://schemas.openxmlformats.org/markup-compatibility/2006" xmlns:wp14="http://schemas.microsoft.com/office/word/2010/wordprocessingDrawing" xmlns:w14="http://schemas.microsoft.com/office/word/2010/wordml" xmlns:w15="http://schemas.microsoft.com/office/word/2012/wordml" w:start="100" w:end="122"/>
+        <w:jc xmlns:wps="http://schemas.microsoft.com/office/word/2010/wordprocessingShape" xmlns:wpg="http://schemas.microsoft.com/office/word/2010/wordprocessingGroup" xmlns:mc="http://schemas.openxmlformats.org/markup-compatibility/2006" xmlns:wp14="http://schemas.microsoft.com/office/word/2010/wordprocessingDrawing" xmlns:w14="http://schemas.microsoft.com/office/word/2010/wordml" xmlns:w15="http://schemas.microsoft.com/office/word/2012/wordml" w:val="start"/>
+        <w:rPr xmlns:wps="http://schemas.microsoft.com/office/word/2010/wordprocessingShape" xmlns:wpg="http://schemas.microsoft.com/office/word/2010/wordprocessingGroup" xmlns:mc="http://schemas.openxmlformats.org/markup-compatibility/2006" xmlns:wp14="http://schemas.microsoft.com/office/word/2010/wordprocessingDrawing" xmlns:w14="http://schemas.microsoft.com/office/word/2010/wordml" xmlns:w15="http://schemas.microsoft.com/office/word/2012/wordml"/>
+      </w:pPr>
+      <w:r>
+        <w:t xml:space="preserve">Каковы наши потребности и как они удовлетворяются? Эмпирическую оценку можно провести, просто оглядевшись на учреждения, программы, товары и услуги в обществе. Не все из них удовлетворяют реальные нужды — некоторые явно возникли из искусственно созданных желаний или потребностей. Тем не менее инвентаризация имеющихся активов (под активами понимаются средства удовлетворения потребностей) даёт хорошую отправную точку.</w:t>
       </w:r>
     </w:p>
     <w:p>
@@ -390,10 +375,7 @@
         <w:t xml:space="preserve"> </w:t>
       </w:r>
       <w:r>
-        <w:t xml:space="preserve">здоровье и благополучие</w:t>
-      </w:r>
-      <w:r>
-        <w:br/>
+        <w:t xml:space="preserve">здоровье и благополучие </w:t>
       </w:r>
       <w:r>
         <w:drawing>
@@ -443,10 +425,7 @@
         <w:t xml:space="preserve"> </w:t>
       </w:r>
       <w:r>
-        <w:t xml:space="preserve">равенство, урегулирование конфликтов, самоопределение</w:t>
-      </w:r>
-      <w:r>
-        <w:br/>
+        <w:t xml:space="preserve">равенство, урегулирование конфликтов, самоопределение </w:t>
       </w:r>
       <w:r>
         <w:drawing>
@@ -556,7 +535,7 @@
         <w:t xml:space="preserve"> </w:t>
       </w:r>
       <w:r>
-        <w:t xml:space="preserve">жильё, системы связи, транспорт, энергия, управление отходами, продовольствие</w:t>
+        <w:t xml:space="preserve">жильё, связь, транспорт, энергия, системы обращения с отходами, продовольствие</w:t>
       </w:r>
     </w:p>
     <w:p>
@@ -618,7 +597,7 @@
         <w:t xml:space="preserve"> </w:t>
       </w:r>
       <w:r>
-        <w:t xml:space="preserve">воздух, вода, биоразнообразие, опыление, стабильный климат</w:t>
+        <w:t xml:space="preserve">чистый воздух, вода, биоразнообразие, опылители, стабильный климат</w:t>
       </w:r>
     </w:p>
     <w:p>
@@ -633,15 +612,20 @@
         </w:rPr>
       </w:pPr>
       <w:r>
-        <w:t xml:space="preserve">РИСУНОК 1.1. Потребности человека и система сообщества</w:t>
+        <w:t xml:space="preserve">РИСУНОК 1.1. Потребности человека и системы сообщества</w:t>
       </w:r>
     </w:p>
     <w:p>
       <w:pPr>
-        <w:pStyle w:val="BodyText"/>
-      </w:pPr>
-      <w:r>
-        <w:t xml:space="preserve">Прежде чем мы сможем стать полноценными членами любого сообщества, нам необходимо</w:t>
+        <w:pStyle xmlns:wps="http://schemas.microsoft.com/office/word/2010/wordprocessingShape" xmlns:wpg="http://schemas.microsoft.com/office/word/2010/wordprocessingGroup" xmlns:mc="http://schemas.openxmlformats.org/markup-compatibility/2006" xmlns:wp14="http://schemas.microsoft.com/office/word/2010/wordprocessingDrawing" xmlns:w14="http://schemas.microsoft.com/office/word/2010/wordml" xmlns:w15="http://schemas.microsoft.com/office/word/2012/wordml" w:val="BodyText"/>
+        <w:bidi xmlns:wps="http://schemas.microsoft.com/office/word/2010/wordprocessingShape" xmlns:wpg="http://schemas.microsoft.com/office/word/2010/wordprocessingGroup" xmlns:mc="http://schemas.openxmlformats.org/markup-compatibility/2006" xmlns:wp14="http://schemas.microsoft.com/office/word/2010/wordprocessingDrawing" xmlns:w14="http://schemas.microsoft.com/office/word/2010/wordml" xmlns:w15="http://schemas.microsoft.com/office/word/2012/wordml" w:val="0"/>
+        <w:spacing xmlns:wps="http://schemas.microsoft.com/office/word/2010/wordprocessingShape" xmlns:wpg="http://schemas.microsoft.com/office/word/2010/wordprocessingGroup" xmlns:mc="http://schemas.openxmlformats.org/markup-compatibility/2006" xmlns:wp14="http://schemas.microsoft.com/office/word/2010/wordprocessingDrawing" xmlns:w14="http://schemas.microsoft.com/office/word/2010/wordml" xmlns:w15="http://schemas.microsoft.com/office/word/2012/wordml" w:lineRule="auto" w:line="247" w:before="84" w:after="0"/>
+        <w:ind xmlns:wps="http://schemas.microsoft.com/office/word/2010/wordprocessingShape" xmlns:wpg="http://schemas.microsoft.com/office/word/2010/wordprocessingGroup" xmlns:mc="http://schemas.openxmlformats.org/markup-compatibility/2006" xmlns:wp14="http://schemas.microsoft.com/office/word/2010/wordprocessingDrawing" xmlns:w14="http://schemas.microsoft.com/office/word/2010/wordml" xmlns:w15="http://schemas.microsoft.com/office/word/2012/wordml" w:firstLine="288" w:start="100" w:end="280"/>
+        <w:jc xmlns:wps="http://schemas.microsoft.com/office/word/2010/wordprocessingShape" xmlns:wpg="http://schemas.microsoft.com/office/word/2010/wordprocessingGroup" xmlns:mc="http://schemas.openxmlformats.org/markup-compatibility/2006" xmlns:wp14="http://schemas.microsoft.com/office/word/2010/wordprocessingDrawing" xmlns:w14="http://schemas.microsoft.com/office/word/2010/wordml" xmlns:w15="http://schemas.microsoft.com/office/word/2012/wordml" w:val="start"/>
+        <w:rPr xmlns:wps="http://schemas.microsoft.com/office/word/2010/wordprocessingShape" xmlns:wpg="http://schemas.microsoft.com/office/word/2010/wordprocessingGroup" xmlns:mc="http://schemas.openxmlformats.org/markup-compatibility/2006" xmlns:wp14="http://schemas.microsoft.com/office/word/2010/wordprocessingDrawing" xmlns:w14="http://schemas.microsoft.com/office/word/2010/wordml" xmlns:w15="http://schemas.microsoft.com/office/word/2012/wordml"/>
+      </w:pPr>
+      <w:r>
+        <w:t xml:space="preserve">Прежде чем стать полноценными членами сообщества, нам нужно</w:t>
       </w:r>
       <w:r>
         <w:t xml:space="preserve"> </w:t>
@@ -654,23 +638,7 @@
         <w:t xml:space="preserve">развиваться как личности</w:t>
       </w:r>
       <w:r>
-        <w:t xml:space="preserve">. Нам нужно образование, здравоохранение, самоуважение, навыки и возможности для отдыха. В сообществах есть ресурсы — школы, университеты, детские программы, оздоровительные и медицинские услуги, больницы, объекты досуга — которые удовлетворяют эти потребности. Если существуют системы, помогающие людям быть здоровыми, продуктивными и счастливыми, можно говорить о достаточном</w:t>
-      </w:r>
-      <w:r>
-        <w:t xml:space="preserve"> </w:t>
-      </w:r>
-      <w:r>
-        <w:rPr>
-          <w:i/>
-          <w:iCs/>
-        </w:rPr>
-        <w:t xml:space="preserve">человеческом капитале</w:t>
-      </w:r>
-      <w:r>
-        <w:t xml:space="preserve"> </w:t>
-      </w:r>
-      <w:r>
-        <w:t xml:space="preserve">сообщества.</w:t>
+        <w:t xml:space="preserve">. Нам нужны образование и здравоохранение, самоуважение, навыки и возможности для отдыха. В сообществах существуют ресурсы, удовлетворяющие эти потребности — школы, университеты, программы по уходу за детьми, оздоровительные и медицинские услуги, больницы, объекты и программы для досуга. Когда действуют системы, обеспечивающие здоровье, продуктивность и благополучие людей, можно сказать, что сообщество обладает достаточным человеческим капиталом.</w:t>
       </w:r>
       <w:r>
         <w:t xml:space="preserve"> </w:t>
@@ -686,15 +654,20 @@
         <w:t xml:space="preserve"> </w:t>
       </w:r>
       <w:r>
-        <w:t xml:space="preserve">— это способность сообщества способствовать нашему развитию и совокупность навыков, знаний и умений его жителей, которые они могут поддерживать.</w:t>
+        <w:t xml:space="preserve">— это способность сообществ способствовать нашему развитию как личностям, а также совокупность навыков, знаний и умений, которыми обладают люди и которые они могут поддерживать.</w:t>
       </w:r>
     </w:p>
     <w:p>
       <w:pPr>
-        <w:pStyle w:val="BodyText"/>
-      </w:pPr>
-      <w:r>
-        <w:t xml:space="preserve">Есть и</w:t>
+        <w:pStyle xmlns:wps="http://schemas.microsoft.com/office/word/2010/wordprocessingShape" xmlns:wpg="http://schemas.microsoft.com/office/word/2010/wordprocessingGroup" xmlns:mc="http://schemas.openxmlformats.org/markup-compatibility/2006" xmlns:wp14="http://schemas.microsoft.com/office/word/2010/wordprocessingDrawing" xmlns:w14="http://schemas.microsoft.com/office/word/2010/wordml" xmlns:w15="http://schemas.microsoft.com/office/word/2012/wordml" w:val="BodyText"/>
+        <w:bidi xmlns:wps="http://schemas.microsoft.com/office/word/2010/wordprocessingShape" xmlns:wpg="http://schemas.microsoft.com/office/word/2010/wordprocessingGroup" xmlns:mc="http://schemas.openxmlformats.org/markup-compatibility/2006" xmlns:wp14="http://schemas.microsoft.com/office/word/2010/wordprocessingDrawing" xmlns:w14="http://schemas.microsoft.com/office/word/2010/wordml" xmlns:w15="http://schemas.microsoft.com/office/word/2012/wordml" w:val="0"/>
+        <w:spacing xmlns:wps="http://schemas.microsoft.com/office/word/2010/wordprocessingShape" xmlns:wpg="http://schemas.microsoft.com/office/word/2010/wordprocessingGroup" xmlns:mc="http://schemas.openxmlformats.org/markup-compatibility/2006" xmlns:wp14="http://schemas.microsoft.com/office/word/2010/wordprocessingDrawing" xmlns:w14="http://schemas.microsoft.com/office/word/2010/wordml" xmlns:w15="http://schemas.microsoft.com/office/word/2012/wordml" w:lineRule="auto" w:line="247"/>
+        <w:ind xmlns:wps="http://schemas.microsoft.com/office/word/2010/wordprocessingShape" xmlns:wpg="http://schemas.microsoft.com/office/word/2010/wordprocessingGroup" xmlns:mc="http://schemas.openxmlformats.org/markup-compatibility/2006" xmlns:wp14="http://schemas.microsoft.com/office/word/2010/wordprocessingDrawing" xmlns:w14="http://schemas.microsoft.com/office/word/2010/wordml" xmlns:w15="http://schemas.microsoft.com/office/word/2012/wordml" w:firstLine="288" w:start="100" w:end="122"/>
+        <w:jc xmlns:wps="http://schemas.microsoft.com/office/word/2010/wordprocessingShape" xmlns:wpg="http://schemas.microsoft.com/office/word/2010/wordprocessingGroup" xmlns:mc="http://schemas.openxmlformats.org/markup-compatibility/2006" xmlns:wp14="http://schemas.microsoft.com/office/word/2010/wordprocessingDrawing" xmlns:w14="http://schemas.microsoft.com/office/word/2010/wordml" xmlns:w15="http://schemas.microsoft.com/office/word/2012/wordml" w:val="start"/>
+        <w:rPr xmlns:wps="http://schemas.microsoft.com/office/word/2010/wordprocessingShape" xmlns:wpg="http://schemas.microsoft.com/office/word/2010/wordprocessingGroup" xmlns:mc="http://schemas.openxmlformats.org/markup-compatibility/2006" xmlns:wp14="http://schemas.microsoft.com/office/word/2010/wordprocessingDrawing" xmlns:w14="http://schemas.microsoft.com/office/word/2010/wordml" xmlns:w15="http://schemas.microsoft.com/office/word/2012/wordml"/>
+      </w:pPr>
+      <w:r>
+        <w:t xml:space="preserve">У нас также есть</w:t>
       </w:r>
       <w:r>
         <w:t xml:space="preserve"> </w:t>
@@ -710,7 +683,7 @@
         <w:t xml:space="preserve"> </w:t>
       </w:r>
       <w:r>
-        <w:t xml:space="preserve">— те, которые можно удовлетворить только в сообществе. Нам важно ощущать связь и принадлежность, чувствовать безопасность, иметь возможность выражать себя и наслаждаться красотой мира. Нам нужны смысл и цель — а они неизменно возникают в отношениях: с детьми, семьёй, страной или с представлением о божественном. Эти человеческие и социальные потребности на протяжении веков породили многие религии и духовные традиции. Нужны поддерживающие отношения, сеть друзей и ощущение вклада в жизнь сообщества. Когда эти потребности удовлетворены, у сообщества много социальных активов. Если существуют системы, гарантирующие продолжение удовлетворения социальных и культурных потребностей, можно говорить о достаточном</w:t>
+        <w:t xml:space="preserve">— те, которые можно удовлетворить только в рамках сообщества. Нам нужно ощущение связи и общности, чувство безопасности, возможность самовыражения и наслаждение красотой окружающего мира. Нам нужен смысл и цель, которые неизменно возникают через отношения — с детьми, семьёй, страной или нашим представлением о божественном. Эти человеческие и социальные потребности на протяжении веков породили множество религий и духовных традиций. Нам нужны поддерживающие отношения, сети друзей и ощущение вклада в общество. Когда эти потребности удовлетворены, у нас есть значительные социальные активы. А когда существуют системы, гарантирующие длительное удовлетворение социальных и культурных потребностей, говорят о достаточном</w:t>
       </w:r>
       <w:r>
         <w:t xml:space="preserve"> </w:t>
@@ -728,10 +701,15 @@
     </w:p>
     <w:p>
       <w:pPr>
-        <w:pStyle w:val="BodyText"/>
-      </w:pPr>
-      <w:r>
-        <w:t xml:space="preserve">Для принятия решений, разрешения конфликтов и обеспечения равенства требуется</w:t>
+        <w:pStyle xmlns:wps="http://schemas.microsoft.com/office/word/2010/wordprocessingShape" xmlns:wpg="http://schemas.microsoft.com/office/word/2010/wordprocessingGroup" xmlns:mc="http://schemas.openxmlformats.org/markup-compatibility/2006" xmlns:wp14="http://schemas.microsoft.com/office/word/2010/wordprocessingDrawing" xmlns:w14="http://schemas.microsoft.com/office/word/2010/wordml" xmlns:w15="http://schemas.microsoft.com/office/word/2012/wordml" w:val="BodyText"/>
+        <w:bidi xmlns:wps="http://schemas.microsoft.com/office/word/2010/wordprocessingShape" xmlns:wpg="http://schemas.microsoft.com/office/word/2010/wordprocessingGroup" xmlns:mc="http://schemas.openxmlformats.org/markup-compatibility/2006" xmlns:wp14="http://schemas.microsoft.com/office/word/2010/wordprocessingDrawing" xmlns:w14="http://schemas.microsoft.com/office/word/2010/wordml" xmlns:w15="http://schemas.microsoft.com/office/word/2012/wordml" w:val="0"/>
+        <w:spacing xmlns:wps="http://schemas.microsoft.com/office/word/2010/wordprocessingShape" xmlns:wpg="http://schemas.microsoft.com/office/word/2010/wordprocessingGroup" xmlns:mc="http://schemas.openxmlformats.org/markup-compatibility/2006" xmlns:wp14="http://schemas.microsoft.com/office/word/2010/wordprocessingDrawing" xmlns:w14="http://schemas.microsoft.com/office/word/2010/wordml" xmlns:w15="http://schemas.microsoft.com/office/word/2012/wordml" w:lineRule="auto" w:line="247"/>
+        <w:ind xmlns:wps="http://schemas.microsoft.com/office/word/2010/wordprocessingShape" xmlns:wpg="http://schemas.microsoft.com/office/word/2010/wordprocessingGroup" xmlns:mc="http://schemas.openxmlformats.org/markup-compatibility/2006" xmlns:wp14="http://schemas.microsoft.com/office/word/2010/wordprocessingDrawing" xmlns:w14="http://schemas.microsoft.com/office/word/2010/wordml" xmlns:w15="http://schemas.microsoft.com/office/word/2012/wordml" w:firstLine="288" w:start="100" w:end="122"/>
+        <w:jc xmlns:wps="http://schemas.microsoft.com/office/word/2010/wordprocessingShape" xmlns:wpg="http://schemas.microsoft.com/office/word/2010/wordprocessingGroup" xmlns:mc="http://schemas.openxmlformats.org/markup-compatibility/2006" xmlns:wp14="http://schemas.microsoft.com/office/word/2010/wordprocessingDrawing" xmlns:w14="http://schemas.microsoft.com/office/word/2010/wordml" xmlns:w15="http://schemas.microsoft.com/office/word/2012/wordml" w:val="start"/>
+        <w:rPr xmlns:wps="http://schemas.microsoft.com/office/word/2010/wordprocessingShape" xmlns:wpg="http://schemas.microsoft.com/office/word/2010/wordprocessingGroup" xmlns:mc="http://schemas.openxmlformats.org/markup-compatibility/2006" xmlns:wp14="http://schemas.microsoft.com/office/word/2010/wordprocessingDrawing" xmlns:w14="http://schemas.microsoft.com/office/word/2010/wordml" xmlns:w15="http://schemas.microsoft.com/office/word/2012/wordml"/>
+      </w:pPr>
+      <w:r>
+        <w:t xml:space="preserve">Чтобы принимать решения, разрешать конфликты и обеспечивать равенство, нам необходимо</w:t>
       </w:r>
       <w:r>
         <w:t xml:space="preserve"> </w:t>
@@ -744,7 +722,7 @@
         <w:t xml:space="preserve">расширение прав и возможностей</w:t>
       </w:r>
       <w:r>
-        <w:t xml:space="preserve">. Институты самоуправления, общественные программы по урегулированию споров, законы и регламенты, призванные обеспечить справедливость и мир — всё это активы в этой сфере.</w:t>
+        <w:t xml:space="preserve">. Институты самоуправления, программы по урегулированию споров, а также законы и правила, направленные на справедливое и мирное общество, — всё это активы в этой области.</w:t>
       </w:r>
       <w:r>
         <w:t xml:space="preserve"> </w:t>
@@ -760,15 +738,20 @@
         <w:t xml:space="preserve"> </w:t>
       </w:r>
       <w:r>
-        <w:t xml:space="preserve">— правовая база, традиции, структуры и другие основы, позволяющие обществу воспроизводить нужные институты.</w:t>
+        <w:t xml:space="preserve">сообщества — правовая база, традиции, структуры и другие опоры, позволяющие обществам постоянно воспроизводить необходимые институты.</w:t>
       </w:r>
     </w:p>
     <w:p>
       <w:pPr>
-        <w:pStyle w:val="BodyText"/>
-      </w:pPr>
-      <w:r>
-        <w:t xml:space="preserve">Когда люди думают о потребностях, чаще всего первыми приходят на ум еда, одежда и жильё. Эти</w:t>
+        <w:pStyle xmlns:wps="http://schemas.microsoft.com/office/word/2010/wordprocessingShape" xmlns:wpg="http://schemas.microsoft.com/office/word/2010/wordprocessingGroup" xmlns:mc="http://schemas.openxmlformats.org/markup-compatibility/2006" xmlns:wp14="http://schemas.microsoft.com/office/word/2010/wordprocessingDrawing" xmlns:w14="http://schemas.microsoft.com/office/word/2010/wordml" xmlns:w15="http://schemas.microsoft.com/office/word/2012/wordml" w:val="BodyText"/>
+        <w:bidi xmlns:wps="http://schemas.microsoft.com/office/word/2010/wordprocessingShape" xmlns:wpg="http://schemas.microsoft.com/office/word/2010/wordprocessingGroup" xmlns:mc="http://schemas.openxmlformats.org/markup-compatibility/2006" xmlns:wp14="http://schemas.microsoft.com/office/word/2010/wordprocessingDrawing" xmlns:w14="http://schemas.microsoft.com/office/word/2010/wordml" xmlns:w15="http://schemas.microsoft.com/office/word/2012/wordml" w:val="0"/>
+        <w:spacing xmlns:wps="http://schemas.microsoft.com/office/word/2010/wordprocessingShape" xmlns:wpg="http://schemas.microsoft.com/office/word/2010/wordprocessingGroup" xmlns:mc="http://schemas.openxmlformats.org/markup-compatibility/2006" xmlns:wp14="http://schemas.microsoft.com/office/word/2010/wordprocessingDrawing" xmlns:w14="http://schemas.microsoft.com/office/word/2010/wordml" xmlns:w15="http://schemas.microsoft.com/office/word/2012/wordml" w:lineRule="auto" w:line="247"/>
+        <w:ind xmlns:wps="http://schemas.microsoft.com/office/word/2010/wordprocessingShape" xmlns:wpg="http://schemas.microsoft.com/office/word/2010/wordprocessingGroup" xmlns:mc="http://schemas.openxmlformats.org/markup-compatibility/2006" xmlns:wp14="http://schemas.microsoft.com/office/word/2010/wordprocessingDrawing" xmlns:w14="http://schemas.microsoft.com/office/word/2010/wordml" xmlns:w15="http://schemas.microsoft.com/office/word/2012/wordml" w:firstLine="288" w:start="100" w:end="122"/>
+        <w:jc xmlns:wps="http://schemas.microsoft.com/office/word/2010/wordprocessingShape" xmlns:wpg="http://schemas.microsoft.com/office/word/2010/wordprocessingGroup" xmlns:mc="http://schemas.openxmlformats.org/markup-compatibility/2006" xmlns:wp14="http://schemas.microsoft.com/office/word/2010/wordprocessingDrawing" xmlns:w14="http://schemas.microsoft.com/office/word/2010/wordml" xmlns:w15="http://schemas.microsoft.com/office/word/2012/wordml" w:val="start"/>
+        <w:rPr xmlns:wps="http://schemas.microsoft.com/office/word/2010/wordprocessingShape" xmlns:wpg="http://schemas.microsoft.com/office/word/2010/wordprocessingGroup" xmlns:mc="http://schemas.openxmlformats.org/markup-compatibility/2006" xmlns:wp14="http://schemas.microsoft.com/office/word/2010/wordprocessingDrawing" xmlns:w14="http://schemas.microsoft.com/office/word/2010/wordml" xmlns:w15="http://schemas.microsoft.com/office/word/2012/wordml"/>
+      </w:pPr>
+      <w:r>
+        <w:t xml:space="preserve">Когда люди думают о потребностях, чаще всего вспоминают еду, одежду и жильё. Эти</w:t>
       </w:r>
       <w:r>
         <w:t xml:space="preserve"> </w:t>
@@ -784,7 +767,7 @@
         <w:t xml:space="preserve"> </w:t>
       </w:r>
       <w:r>
-        <w:t xml:space="preserve">важны, а здания, промышленные товары, технологии и инфраструктура, создаваемые в сообществах, служат средствами их удовлетворения. Хорошее доступное жильё, чистая питьевая вода, эффективные системы переработки и повторного использования отходов, возобновляемая энергия, производство здоровой местной пищи, системы связи, соединяющие нас между собой и с миром — всё это</w:t>
+        <w:t xml:space="preserve">бесспорно важны, а здания, промышленные товары, технологии и инфраструктура, которые мы создаём в сообществах, служат средствами их удовлетворения. Качественное доступное жильё, безопасная питьевая вода, эффективные системы переработки и повторного использования отходов, сети возобновляемой энергии, производство здоровой местной пищи, коммуникационные сети, связывающие нас между собой и с остальным миром — всё это составляет</w:t>
       </w:r>
       <w:r>
         <w:t xml:space="preserve"> </w:t>
@@ -802,10 +785,15 @@
     </w:p>
     <w:p>
       <w:pPr>
-        <w:pStyle w:val="BodyText"/>
-      </w:pPr>
-      <w:r>
-        <w:t xml:space="preserve">Материальные потребности выходят за рамки того, что мы производим сами, поэтому существуют и</w:t>
+        <w:pStyle xmlns:wps="http://schemas.microsoft.com/office/word/2010/wordprocessingShape" xmlns:wpg="http://schemas.microsoft.com/office/word/2010/wordprocessingGroup" xmlns:mc="http://schemas.openxmlformats.org/markup-compatibility/2006" xmlns:wp14="http://schemas.microsoft.com/office/word/2010/wordprocessingDrawing" xmlns:w14="http://schemas.microsoft.com/office/word/2010/wordml" xmlns:w15="http://schemas.microsoft.com/office/word/2012/wordml" w:val="BodyText"/>
+        <w:bidi xmlns:wps="http://schemas.microsoft.com/office/word/2010/wordprocessingShape" xmlns:wpg="http://schemas.microsoft.com/office/word/2010/wordprocessingGroup" xmlns:mc="http://schemas.openxmlformats.org/markup-compatibility/2006" xmlns:wp14="http://schemas.microsoft.com/office/word/2010/wordprocessingDrawing" xmlns:w14="http://schemas.microsoft.com/office/word/2010/wordml" xmlns:w15="http://schemas.microsoft.com/office/word/2012/wordml" w:val="0"/>
+        <w:spacing xmlns:wps="http://schemas.microsoft.com/office/word/2010/wordprocessingShape" xmlns:wpg="http://schemas.microsoft.com/office/word/2010/wordprocessingGroup" xmlns:mc="http://schemas.openxmlformats.org/markup-compatibility/2006" xmlns:wp14="http://schemas.microsoft.com/office/word/2010/wordprocessingDrawing" xmlns:w14="http://schemas.microsoft.com/office/word/2010/wordml" xmlns:w15="http://schemas.microsoft.com/office/word/2012/wordml" w:lineRule="auto" w:line="247"/>
+        <w:ind xmlns:wps="http://schemas.microsoft.com/office/word/2010/wordprocessingShape" xmlns:wpg="http://schemas.microsoft.com/office/word/2010/wordprocessingGroup" xmlns:mc="http://schemas.openxmlformats.org/markup-compatibility/2006" xmlns:wp14="http://schemas.microsoft.com/office/word/2010/wordprocessingDrawing" xmlns:w14="http://schemas.microsoft.com/office/word/2010/wordml" xmlns:w15="http://schemas.microsoft.com/office/word/2012/wordml" w:firstLine="288" w:start="100" w:end="122"/>
+        <w:jc xmlns:wps="http://schemas.microsoft.com/office/word/2010/wordprocessingShape" xmlns:wpg="http://schemas.microsoft.com/office/word/2010/wordprocessingGroup" xmlns:mc="http://schemas.openxmlformats.org/markup-compatibility/2006" xmlns:wp14="http://schemas.microsoft.com/office/word/2010/wordprocessingDrawing" xmlns:w14="http://schemas.microsoft.com/office/word/2010/wordml" xmlns:w15="http://schemas.microsoft.com/office/word/2012/wordml" w:val="start"/>
+        <w:rPr xmlns:wps="http://schemas.microsoft.com/office/word/2010/wordprocessingShape" xmlns:wpg="http://schemas.microsoft.com/office/word/2010/wordprocessingGroup" xmlns:mc="http://schemas.openxmlformats.org/markup-compatibility/2006" xmlns:wp14="http://schemas.microsoft.com/office/word/2010/wordprocessingDrawing" xmlns:w14="http://schemas.microsoft.com/office/word/2010/wordml" xmlns:w15="http://schemas.microsoft.com/office/word/2012/wordml"/>
+      </w:pPr>
+      <w:r>
+        <w:t xml:space="preserve">Наши материальные потребности выходят за рамки того, что мы производим сами, поэтому существуют и</w:t>
       </w:r>
       <w:r>
         <w:t xml:space="preserve"> </w:t>
@@ -818,7 +806,7 @@
         <w:t xml:space="preserve">экологические потребности</w:t>
       </w:r>
       <w:r>
-        <w:t xml:space="preserve">. Нам нужен чистый воздух, разнообразные экосистемы, поддерживающие множество видов, стабильный климат, способность ассимилировать отходы, вода для поддержания жизни и для того, чтобы мы могли мыться, пить и радоваться жизни. Здоровые почвы, опылители — всё это</w:t>
+        <w:t xml:space="preserve">. Нам нужен чистый воздух, разнообразные экосистемы, поддерживающие множество видов, стабильный климат, способность экосистем усваивать наши отходы, вода для поддержания жизни, а также для питья, гигиены и досуга. Нам нужны здоровые почвы и опылители; всё это —</w:t>
       </w:r>
       <w:r>
         <w:t xml:space="preserve"> </w:t>
@@ -831,7 +819,7 @@
         <w:t xml:space="preserve">экологические активы</w:t>
       </w:r>
       <w:r>
-        <w:t xml:space="preserve">, которые служат нашей системе жизнеобеспечения. Когда экосистема здорова и продуктивна, её регенеративные способности представляют собой</w:t>
+        <w:t xml:space="preserve">, служащие нашей системе жизнеобеспечения. Когда экосистема здорова и продуктивна, её регенеративные способности составляют</w:t>
       </w:r>
       <w:r>
         <w:t xml:space="preserve"> </w:t>
@@ -849,10 +837,15 @@
     </w:p>
     <w:p>
       <w:pPr>
-        <w:pStyle w:val="BodyText"/>
-      </w:pPr>
-      <w:r>
-        <w:t xml:space="preserve">Мы описали несколько видов активов и капитала, которые удовлетворяют наши потребности, но пока не упомянули финансовые активы и капитал, которые обычно ассоциируются со словами</w:t>
+        <w:pStyle xmlns:wps="http://schemas.microsoft.com/office/word/2010/wordprocessingShape" xmlns:wpg="http://schemas.microsoft.com/office/word/2010/wordprocessingGroup" xmlns:mc="http://schemas.openxmlformats.org/markup-compatibility/2006" xmlns:wp14="http://schemas.microsoft.com/office/word/2010/wordprocessingDrawing" xmlns:w14="http://schemas.microsoft.com/office/word/2010/wordml" xmlns:w15="http://schemas.microsoft.com/office/word/2012/wordml" w:val="BodyText"/>
+        <w:bidi xmlns:wps="http://schemas.microsoft.com/office/word/2010/wordprocessingShape" xmlns:wpg="http://schemas.microsoft.com/office/word/2010/wordprocessingGroup" xmlns:mc="http://schemas.openxmlformats.org/markup-compatibility/2006" xmlns:wp14="http://schemas.microsoft.com/office/word/2010/wordprocessingDrawing" xmlns:w14="http://schemas.microsoft.com/office/word/2010/wordml" xmlns:w15="http://schemas.microsoft.com/office/word/2012/wordml" w:val="0"/>
+        <w:spacing xmlns:wps="http://schemas.microsoft.com/office/word/2010/wordprocessingShape" xmlns:wpg="http://schemas.microsoft.com/office/word/2010/wordprocessingGroup" xmlns:mc="http://schemas.openxmlformats.org/markup-compatibility/2006" xmlns:wp14="http://schemas.microsoft.com/office/word/2010/wordprocessingDrawing" xmlns:w14="http://schemas.microsoft.com/office/word/2010/wordml" xmlns:w15="http://schemas.microsoft.com/office/word/2012/wordml" w:lineRule="auto" w:line="247"/>
+        <w:ind xmlns:wps="http://schemas.microsoft.com/office/word/2010/wordprocessingShape" xmlns:wpg="http://schemas.microsoft.com/office/word/2010/wordprocessingGroup" xmlns:mc="http://schemas.openxmlformats.org/markup-compatibility/2006" xmlns:wp14="http://schemas.microsoft.com/office/word/2010/wordprocessingDrawing" xmlns:w14="http://schemas.microsoft.com/office/word/2010/wordml" xmlns:w15="http://schemas.microsoft.com/office/word/2012/wordml" w:firstLine="288" w:start="100" w:end="122"/>
+        <w:jc xmlns:wps="http://schemas.microsoft.com/office/word/2010/wordprocessingShape" xmlns:wpg="http://schemas.microsoft.com/office/word/2010/wordprocessingGroup" xmlns:mc="http://schemas.openxmlformats.org/markup-compatibility/2006" xmlns:wp14="http://schemas.microsoft.com/office/word/2010/wordprocessingDrawing" xmlns:w14="http://schemas.microsoft.com/office/word/2010/wordml" xmlns:w15="http://schemas.microsoft.com/office/word/2012/wordml" w:val="start"/>
+        <w:rPr xmlns:wps="http://schemas.microsoft.com/office/word/2010/wordprocessingShape" xmlns:wpg="http://schemas.microsoft.com/office/word/2010/wordprocessingGroup" xmlns:mc="http://schemas.openxmlformats.org/markup-compatibility/2006" xmlns:wp14="http://schemas.microsoft.com/office/word/2010/wordprocessingDrawing" xmlns:w14="http://schemas.microsoft.com/office/word/2010/wordml" xmlns:w15="http://schemas.microsoft.com/office/word/2012/wordml"/>
+      </w:pPr>
+      <w:r>
+        <w:t xml:space="preserve">Мы перечислили несколько видов активов и капитала, которые удовлетворяют наши потребности, но ещё не говорили о финансовых активах и капитале, которые обычно ассоциируют с</w:t>
       </w:r>
       <w:r>
         <w:t xml:space="preserve"> </w:t>
@@ -862,7 +855,7 @@
           <w:i/>
           <w:iCs/>
         </w:rPr>
-        <w:t xml:space="preserve">«деньги»</w:t>
+        <w:t xml:space="preserve">«деньгами»</w:t>
       </w:r>
       <w:r>
         <w:t xml:space="preserve"> </w:t>
@@ -878,18 +871,36 @@
           <w:i/>
           <w:iCs/>
         </w:rPr>
-        <w:t xml:space="preserve">«инвестиции»</w:t>
-      </w:r>
-      <w:r>
-        <w:t xml:space="preserve">. Отчасти это потому, что деньги — скорее средство, чем сама потребность. Деньги нам на самом деле не нужны; нам нужны вещи, которые можно за них купить. Финансовый капитал сам по себе не обязателен, если можно получить необходимые блага и услуги другим способом. Обменная способность денег — одна из ключевых причин, почему они нам нужны сейчас и, надеемся, будут нужны и в будущем. Деньги позволяют обменивать то, что ценно для нас — время и труд, — на то, что ценно для других.</w:t>
+        <w:t xml:space="preserve">«инвестициями»</w:t>
+      </w:r>
+      <w:r>
+        <w:t xml:space="preserve">. Отчасти это потому, что деньги — скорее средство для достижения цели, чем сама по себе потребность. Деньги сами по себе нам не нужны; нужны вещи, которые за них покупают. Финансовый капитал не обязателен сам по себе, если можно получить необходимые блага и услуги иными способами. Способность денег облегчать обмен — сейчас и, надеюсь, в будущем — одна из главных причин их необходимости. Деньги помогают обменивать то, что ценно для нас (например, наше время и труд), на то, что ценно для других.</w:t>
       </w:r>
     </w:p>
     <w:p>
       <w:pPr>
-        <w:pStyle w:val="BodyText"/>
-      </w:pPr>
-      <w:r>
-        <w:t xml:space="preserve">Однако деньги — не единственное средство обмена. Тысячи лет люди обменивались товарами и услугами без денег. Вы помогаете соседу поставить новую крышу; он лечит вам зубы и ставит коронку. Вы отвозите детей подруги в школу; она присматривает за вашими детьми. В обоих случаях деньги не переходят из рук в руки, но обмен всё равно происходит. Ценность такого обмена — ещё один актив и форма капитала —</w:t>
+        <w:pStyle xmlns:wps="http://schemas.microsoft.com/office/word/2010/wordprocessingShape" xmlns:wpg="http://schemas.microsoft.com/office/word/2010/wordprocessingGroup" xmlns:mc="http://schemas.openxmlformats.org/markup-compatibility/2006" xmlns:wp14="http://schemas.microsoft.com/office/word/2010/wordprocessingDrawing" xmlns:w14="http://schemas.microsoft.com/office/word/2010/wordml" xmlns:w15="http://schemas.microsoft.com/office/word/2012/wordml" w:val="BodyText"/>
+        <w:bidi xmlns:wps="http://schemas.microsoft.com/office/word/2010/wordprocessingShape" xmlns:wpg="http://schemas.microsoft.com/office/word/2010/wordprocessingGroup" xmlns:mc="http://schemas.openxmlformats.org/markup-compatibility/2006" xmlns:wp14="http://schemas.microsoft.com/office/word/2010/wordprocessingDrawing" xmlns:w14="http://schemas.microsoft.com/office/word/2010/wordml" xmlns:w15="http://schemas.microsoft.com/office/word/2012/wordml" w:val="0"/>
+        <w:spacing xmlns:wps="http://schemas.microsoft.com/office/word/2010/wordprocessingShape" xmlns:wpg="http://schemas.microsoft.com/office/word/2010/wordprocessingGroup" xmlns:mc="http://schemas.openxmlformats.org/markup-compatibility/2006" xmlns:wp14="http://schemas.microsoft.com/office/word/2010/wordprocessingDrawing" xmlns:w14="http://schemas.microsoft.com/office/word/2010/wordml" xmlns:w15="http://schemas.microsoft.com/office/word/2012/wordml" w:lineRule="auto" w:line="247" w:before="0" w:after="0"/>
+        <w:ind xmlns:wps="http://schemas.microsoft.com/office/word/2010/wordprocessingShape" xmlns:wpg="http://schemas.microsoft.com/office/word/2010/wordprocessingGroup" xmlns:mc="http://schemas.openxmlformats.org/markup-compatibility/2006" xmlns:wp14="http://schemas.microsoft.com/office/word/2010/wordprocessingDrawing" xmlns:w14="http://schemas.microsoft.com/office/word/2010/wordml" xmlns:w15="http://schemas.microsoft.com/office/word/2012/wordml" w:firstLine="288" w:start="100" w:end="194"/>
+        <w:jc xmlns:wps="http://schemas.microsoft.com/office/word/2010/wordprocessingShape" xmlns:wpg="http://schemas.microsoft.com/office/word/2010/wordprocessingGroup" xmlns:mc="http://schemas.openxmlformats.org/markup-compatibility/2006" xmlns:wp14="http://schemas.microsoft.com/office/word/2010/wordprocessingDrawing" xmlns:w14="http://schemas.microsoft.com/office/word/2010/wordml" xmlns:w15="http://schemas.microsoft.com/office/word/2012/wordml" w:val="start"/>
+        <w:rPr xmlns:wps="http://schemas.microsoft.com/office/word/2010/wordprocessingShape" xmlns:wpg="http://schemas.microsoft.com/office/word/2010/wordprocessingGroup" xmlns:mc="http://schemas.openxmlformats.org/markup-compatibility/2006" xmlns:wp14="http://schemas.microsoft.com/office/word/2010/wordprocessingDrawing" xmlns:w14="http://schemas.microsoft.com/office/word/2010/wordml" xmlns:w15="http://schemas.microsoft.com/office/word/2012/wordml"/>
+      </w:pPr>
+      <w:r>
+        <w:t xml:space="preserve">Однако деньги — не единственное средство обмена. Люди тысячелетиями обменивались товарами и услугами без денег. Вы помогаете соседу установить</w:t>
+      </w:r>
+    </w:p>
+    <w:p>
+      <w:pPr>
+        <w:pStyle xmlns:wps="http://schemas.microsoft.com/office/word/2010/wordprocessingShape" xmlns:wpg="http://schemas.microsoft.com/office/word/2010/wordprocessingGroup" xmlns:mc="http://schemas.openxmlformats.org/markup-compatibility/2006" xmlns:wp14="http://schemas.microsoft.com/office/word/2010/wordprocessingDrawing" xmlns:w14="http://schemas.microsoft.com/office/word/2010/wordml" xmlns:w15="http://schemas.microsoft.com/office/word/2012/wordml" w:val="BodyText"/>
+        <w:bidi xmlns:wps="http://schemas.microsoft.com/office/word/2010/wordprocessingShape" xmlns:wpg="http://schemas.microsoft.com/office/word/2010/wordprocessingGroup" xmlns:mc="http://schemas.openxmlformats.org/markup-compatibility/2006" xmlns:wp14="http://schemas.microsoft.com/office/word/2010/wordprocessingDrawing" xmlns:w14="http://schemas.microsoft.com/office/word/2010/wordml" xmlns:w15="http://schemas.microsoft.com/office/word/2012/wordml" w:val="0"/>
+        <w:spacing xmlns:wps="http://schemas.microsoft.com/office/word/2010/wordprocessingShape" xmlns:wpg="http://schemas.microsoft.com/office/word/2010/wordprocessingGroup" xmlns:mc="http://schemas.openxmlformats.org/markup-compatibility/2006" xmlns:wp14="http://schemas.microsoft.com/office/word/2010/wordprocessingDrawing" xmlns:w14="http://schemas.microsoft.com/office/word/2010/wordml" xmlns:w15="http://schemas.microsoft.com/office/word/2012/wordml" w:lineRule="auto" w:line="247" w:before="84" w:after="0"/>
+        <w:ind xmlns:wps="http://schemas.microsoft.com/office/word/2010/wordprocessingShape" xmlns:wpg="http://schemas.microsoft.com/office/word/2010/wordprocessingGroup" xmlns:mc="http://schemas.openxmlformats.org/markup-compatibility/2006" xmlns:wp14="http://schemas.microsoft.com/office/word/2010/wordprocessingDrawing" xmlns:w14="http://schemas.microsoft.com/office/word/2010/wordml" xmlns:w15="http://schemas.microsoft.com/office/word/2012/wordml" w:start="100" w:end="709"/>
+        <w:jc xmlns:wps="http://schemas.microsoft.com/office/word/2010/wordprocessingShape" xmlns:wpg="http://schemas.microsoft.com/office/word/2010/wordprocessingGroup" xmlns:mc="http://schemas.openxmlformats.org/markup-compatibility/2006" xmlns:wp14="http://schemas.microsoft.com/office/word/2010/wordprocessingDrawing" xmlns:w14="http://schemas.microsoft.com/office/word/2010/wordml" xmlns:w15="http://schemas.microsoft.com/office/word/2012/wordml" w:val="both"/>
+        <w:rPr xmlns:wps="http://schemas.microsoft.com/office/word/2010/wordprocessingShape" xmlns:wpg="http://schemas.microsoft.com/office/word/2010/wordprocessingGroup" xmlns:mc="http://schemas.openxmlformats.org/markup-compatibility/2006" xmlns:wp14="http://schemas.microsoft.com/office/word/2010/wordprocessingDrawing" xmlns:w14="http://schemas.microsoft.com/office/word/2010/wordml" xmlns:w15="http://schemas.microsoft.com/office/word/2012/wordml"/>
+      </w:pPr>
+      <w:r>
+        <w:t xml:space="preserve">новую крышу. Он лечит вам зубы и ставит коронку. Вы отвозите детей своей подруги в школу — она приглядывает за вашими детьми. В обоих случаях деньги не меняют владельца, но обмен товарами и услугами происходит. Ценность такого обмена — ещё один актив и форма капитала —</w:t>
       </w:r>
       <w:r>
         <w:t xml:space="preserve"> </w:t>
@@ -907,10 +918,15 @@
     </w:p>
     <w:p>
       <w:pPr>
-        <w:pStyle w:val="BodyText"/>
-      </w:pPr>
-      <w:r>
-        <w:t xml:space="preserve">Наши общественные системы развивались веками под влиянием потребностей людей и стремления их удовлетворять. Под богатым сообществом обычно понимают</w:t>
+        <w:pStyle xmlns:wps="http://schemas.microsoft.com/office/word/2010/wordprocessingShape" xmlns:wpg="http://schemas.microsoft.com/office/word/2010/wordprocessingGroup" xmlns:mc="http://schemas.openxmlformats.org/markup-compatibility/2006" xmlns:wp14="http://schemas.microsoft.com/office/word/2010/wordprocessingDrawing" xmlns:w14="http://schemas.microsoft.com/office/word/2010/wordml" xmlns:w15="http://schemas.microsoft.com/office/word/2012/wordml" w:val="BodyText"/>
+        <w:bidi xmlns:wps="http://schemas.microsoft.com/office/word/2010/wordprocessingShape" xmlns:wpg="http://schemas.microsoft.com/office/word/2010/wordprocessingGroup" xmlns:mc="http://schemas.openxmlformats.org/markup-compatibility/2006" xmlns:wp14="http://schemas.microsoft.com/office/word/2010/wordprocessingDrawing" xmlns:w14="http://schemas.microsoft.com/office/word/2010/wordml" xmlns:w15="http://schemas.microsoft.com/office/word/2012/wordml" w:val="0"/>
+        <w:spacing xmlns:wps="http://schemas.microsoft.com/office/word/2010/wordprocessingShape" xmlns:wpg="http://schemas.microsoft.com/office/word/2010/wordprocessingGroup" xmlns:mc="http://schemas.openxmlformats.org/markup-compatibility/2006" xmlns:wp14="http://schemas.microsoft.com/office/word/2010/wordprocessingDrawing" xmlns:w14="http://schemas.microsoft.com/office/word/2010/wordml" xmlns:w15="http://schemas.microsoft.com/office/word/2012/wordml" w:lineRule="auto" w:line="247"/>
+        <w:ind xmlns:wps="http://schemas.microsoft.com/office/word/2010/wordprocessingShape" xmlns:wpg="http://schemas.microsoft.com/office/word/2010/wordprocessingGroup" xmlns:mc="http://schemas.openxmlformats.org/markup-compatibility/2006" xmlns:wp14="http://schemas.microsoft.com/office/word/2010/wordprocessingDrawing" xmlns:w14="http://schemas.microsoft.com/office/word/2010/wordml" xmlns:w15="http://schemas.microsoft.com/office/word/2012/wordml" w:firstLine="288" w:start="100" w:end="122"/>
+        <w:jc xmlns:wps="http://schemas.microsoft.com/office/word/2010/wordprocessingShape" xmlns:wpg="http://schemas.microsoft.com/office/word/2010/wordprocessingGroup" xmlns:mc="http://schemas.openxmlformats.org/markup-compatibility/2006" xmlns:wp14="http://schemas.microsoft.com/office/word/2010/wordprocessingDrawing" xmlns:w14="http://schemas.microsoft.com/office/word/2010/wordml" xmlns:w15="http://schemas.microsoft.com/office/word/2012/wordml" w:val="start"/>
+        <w:rPr xmlns:wps="http://schemas.microsoft.com/office/word/2010/wordprocessingShape" xmlns:wpg="http://schemas.microsoft.com/office/word/2010/wordprocessingGroup" xmlns:mc="http://schemas.openxmlformats.org/markup-compatibility/2006" xmlns:wp14="http://schemas.microsoft.com/office/word/2010/wordprocessingDrawing" xmlns:w14="http://schemas.microsoft.com/office/word/2010/wordml" xmlns:w15="http://schemas.microsoft.com/office/word/2012/wordml"/>
+      </w:pPr>
+      <w:r>
+        <w:t xml:space="preserve">Наши общественные системы формировались веками в ответ на потребности людей и необходимость их удовлетворения. Под богатым сообществом мы понимаем такое, которое способно удовлетворить широкий спектр человеческих потребностей и инвестировало во все формы капитала: социальный, культурный, человеческий, институциональный, материальный, технологический, природный, финансовый и потенциальный обменный капитал. Создание и поддержание этих разнообразных форм капитала с течением времени — одна из задач устойчивого развития.</w:t>
       </w:r>
     </w:p>
     <w:p>
@@ -970,17 +986,24 @@
         </w:rPr>
       </w:pPr>
       <w:r>
-        <w:t xml:space="preserve">Рисунок 1.2. Взаимосвязь между потребностями, активами и капиталом</w:t>
+        <w:t xml:space="preserve">Рисунок 1.2. Взаимосвязь потребностей, активов и капитала</w:t>
       </w:r>
     </w:p>
     <w:p>
       <w:pPr>
-        <w:pStyle w:val="BodyText"/>
-      </w:pPr>
-      <w:r>
-        <w:t xml:space="preserve">Более половины человечества сейчас живёт в городах, и эта тенденция, по прогнозам, сохранится как минимум ещё на десятилетие. Поэтому богатство нашего общества во многом сосредоточено в городах. Города — памятники коллективных усилий человечества на протяжении тысячелетий. Они формируют физические, пространственные и когнитивные структуры, которые удовлетворяют многие наши потребности. Учитывая это, в большинстве конкретных примеров создания богатства, которые мы обсуждаем, мы сосредоточимся на городах.</w:t>
+        <w:pStyle xmlns:wps="http://schemas.microsoft.com/office/word/2010/wordprocessingShape" xmlns:wpg="http://schemas.microsoft.com/office/word/2010/wordprocessingGroup" xmlns:mc="http://schemas.openxmlformats.org/markup-compatibility/2006" xmlns:wp14="http://schemas.microsoft.com/office/word/2010/wordprocessingDrawing" xmlns:w14="http://schemas.microsoft.com/office/word/2010/wordml" xmlns:w15="http://schemas.microsoft.com/office/word/2012/wordml" w:val="BodyText"/>
+        <w:bidi xmlns:wps="http://schemas.microsoft.com/office/word/2010/wordprocessingShape" xmlns:wpg="http://schemas.microsoft.com/office/word/2010/wordprocessingGroup" xmlns:mc="http://schemas.openxmlformats.org/markup-compatibility/2006" xmlns:wp14="http://schemas.microsoft.com/office/word/2010/wordprocessingDrawing" xmlns:w14="http://schemas.microsoft.com/office/word/2010/wordml" xmlns:w15="http://schemas.microsoft.com/office/word/2012/wordml" w:val="0"/>
+        <w:spacing xmlns:wps="http://schemas.microsoft.com/office/word/2010/wordprocessingShape" xmlns:wpg="http://schemas.microsoft.com/office/word/2010/wordprocessingGroup" xmlns:mc="http://schemas.openxmlformats.org/markup-compatibility/2006" xmlns:wp14="http://schemas.microsoft.com/office/word/2010/wordprocessingDrawing" xmlns:w14="http://schemas.microsoft.com/office/word/2010/wordml" xmlns:w15="http://schemas.microsoft.com/office/word/2012/wordml" w:lineRule="auto" w:line="247" w:before="1" w:after="0"/>
+        <w:ind xmlns:wps="http://schemas.microsoft.com/office/word/2010/wordprocessingShape" xmlns:wpg="http://schemas.microsoft.com/office/word/2010/wordprocessingGroup" xmlns:mc="http://schemas.openxmlformats.org/markup-compatibility/2006" xmlns:wp14="http://schemas.microsoft.com/office/word/2010/wordprocessingDrawing" xmlns:w14="http://schemas.microsoft.com/office/word/2010/wordml" xmlns:w15="http://schemas.microsoft.com/office/word/2012/wordml" w:firstLine="288" w:start="100" w:end="122"/>
+        <w:jc xmlns:wps="http://schemas.microsoft.com/office/word/2010/wordprocessingShape" xmlns:wpg="http://schemas.microsoft.com/office/word/2010/wordprocessingGroup" xmlns:mc="http://schemas.openxmlformats.org/markup-compatibility/2006" xmlns:wp14="http://schemas.microsoft.com/office/word/2010/wordprocessingDrawing" xmlns:w14="http://schemas.microsoft.com/office/word/2010/wordml" xmlns:w15="http://schemas.microsoft.com/office/word/2012/wordml" w:val="start"/>
+        <w:rPr xmlns:wps="http://schemas.microsoft.com/office/word/2010/wordprocessingShape" xmlns:wpg="http://schemas.microsoft.com/office/word/2010/wordprocessingGroup" xmlns:mc="http://schemas.openxmlformats.org/markup-compatibility/2006" xmlns:wp14="http://schemas.microsoft.com/office/word/2010/wordprocessingDrawing" xmlns:w14="http://schemas.microsoft.com/office/word/2010/wordml" xmlns:w15="http://schemas.microsoft.com/office/word/2012/wordml"/>
+      </w:pPr>
+      <w:r>
+        <w:t xml:space="preserve">Более половины человечества уже живут в городах, и эта тенденция, как ожидается, сохранится по крайней мере ещё в ближайшее десятилетие. Значительная часть богатства нашего общества сосредоточена именно в городах. Города — памятники коллективных усилий человечества на протяжении веков. Они формируют физические, пространственные и когнитивные структуры, которые удовлетворяют многие наши потребности. Учитывая это, в большинстве конкретных примеров создания богатства, которые мы рассматриваем, внимание будет уделено городам.</w:t>
       </w:r>
     </w:p>
+    <w:bookmarkEnd w:id="11"/>
+    <w:bookmarkStart w:id="13" w:name="богатство-городов"/>
     <w:p>
       <w:pPr>
         <w:pStyle xmlns:wps="http://schemas.microsoft.com/office/word/2010/wordprocessingShape" xmlns:wpg="http://schemas.microsoft.com/office/word/2010/wordprocessingGroup" xmlns:mc="http://schemas.openxmlformats.org/markup-compatibility/2006" xmlns:wp14="http://schemas.microsoft.com/office/word/2010/wordprocessingDrawing" xmlns:w14="http://schemas.microsoft.com/office/word/2010/wordml" xmlns:w15="http://schemas.microsoft.com/office/word/2012/wordml" w:val="BodyText"/>
@@ -996,10 +1019,31 @@
     </w:p>
     <w:p>
       <w:pPr>
-        <w:pStyle w:val="BodyText"/>
-      </w:pPr>
-      <w:r>
-        <w:t xml:space="preserve">Чтобы понять альтернативные пути достижения индивидуального, общественного и экономического благополучия в городском контексте, нужно изучить, как функционируют города, и требуются активные действия городского руководства по решению ключевых вопросов устойчивой экономики. В книге «Города и богатство наций» Джейн Джейкобс городские регионы определены как главный двигатель экономического роста на протяжении истории. Она показала, что города и регионы обладали экономической мощью, позволяющей импортировать товары из других областей и одновременно разрабатывать местные замены этим импортам. Замещение импорта стало ключевым источником экономического роста городов</w:t>
+        <w:pStyle xmlns:wps="http://schemas.microsoft.com/office/word/2010/wordprocessingShape" xmlns:wpg="http://schemas.microsoft.com/office/word/2010/wordprocessingGroup" xmlns:mc="http://schemas.openxmlformats.org/markup-compatibility/2006" xmlns:wp14="http://schemas.microsoft.com/office/word/2010/wordprocessingDrawing" xmlns:w14="http://schemas.microsoft.com/office/word/2010/wordml" xmlns:w15="http://schemas.microsoft.com/office/word/2012/wordml" w:val="BodyText"/>
+        <w:bidi xmlns:wps="http://schemas.microsoft.com/office/word/2010/wordprocessingShape" xmlns:wpg="http://schemas.microsoft.com/office/word/2010/wordprocessingGroup" xmlns:mc="http://schemas.openxmlformats.org/markup-compatibility/2006" xmlns:wp14="http://schemas.microsoft.com/office/word/2010/wordprocessingDrawing" xmlns:w14="http://schemas.microsoft.com/office/word/2010/wordml" xmlns:w15="http://schemas.microsoft.com/office/word/2012/wordml" w:val="0"/>
+        <w:spacing xmlns:wps="http://schemas.microsoft.com/office/word/2010/wordprocessingShape" xmlns:wpg="http://schemas.microsoft.com/office/word/2010/wordprocessingGroup" xmlns:mc="http://schemas.openxmlformats.org/markup-compatibility/2006" xmlns:wp14="http://schemas.microsoft.com/office/word/2010/wordprocessingDrawing" xmlns:w14="http://schemas.microsoft.com/office/word/2010/wordml" xmlns:w15="http://schemas.microsoft.com/office/word/2012/wordml" w:lineRule="auto" w:line="250" w:before="10" w:after="0"/>
+        <w:ind xmlns:wps="http://schemas.microsoft.com/office/word/2010/wordprocessingShape" xmlns:wpg="http://schemas.microsoft.com/office/word/2010/wordprocessingGroup" xmlns:mc="http://schemas.openxmlformats.org/markup-compatibility/2006" xmlns:wp14="http://schemas.microsoft.com/office/word/2010/wordprocessingDrawing" xmlns:w14="http://schemas.microsoft.com/office/word/2010/wordml" xmlns:w15="http://schemas.microsoft.com/office/word/2012/wordml" w:start="100" w:end="122"/>
+        <w:jc xmlns:wps="http://schemas.microsoft.com/office/word/2010/wordprocessingShape" xmlns:wpg="http://schemas.microsoft.com/office/word/2010/wordprocessingGroup" xmlns:mc="http://schemas.openxmlformats.org/markup-compatibility/2006" xmlns:wp14="http://schemas.microsoft.com/office/word/2010/wordprocessingDrawing" xmlns:w14="http://schemas.microsoft.com/office/word/2010/wordml" xmlns:w15="http://schemas.microsoft.com/office/word/2012/wordml" w:val="start"/>
+        <w:rPr xmlns:wps="http://schemas.microsoft.com/office/word/2010/wordprocessingShape" xmlns:wpg="http://schemas.microsoft.com/office/word/2010/wordprocessingGroup" xmlns:mc="http://schemas.openxmlformats.org/markup-compatibility/2006" xmlns:wp14="http://schemas.microsoft.com/office/word/2010/wordprocessingDrawing" xmlns:w14="http://schemas.microsoft.com/office/word/2010/wordml" xmlns:w15="http://schemas.microsoft.com/office/word/2012/wordml"/>
+      </w:pPr>
+      <w:r>
+        <w:t xml:space="preserve">Чтобы понять альтернативные пути достижения индивидуального, общественного и экономического благополучия в городском контексте, нужно изучить, как функционируют города, и обеспечить, чтобы городское руководство занималось решением ключевых вопросов устойчивой экономики. Джейн Джейкобс в книге</w:t>
+      </w:r>
+      <w:r>
+        <w:t xml:space="preserve"> </w:t>
+      </w:r>
+      <w:r>
+        <w:rPr>
+          <w:i/>
+          <w:iCs/>
+        </w:rPr>
+        <w:t xml:space="preserve">«Города и богатство наций»</w:t>
+      </w:r>
+      <w:r>
+        <w:t xml:space="preserve"> </w:t>
+      </w:r>
+      <w:r>
+        <w:t xml:space="preserve">назвала городские регионы главным двигателем экономического роста на протяжении всей истории. Она показала, что города и регионы обладали экономической мощью: могли импортировать товары из других мест и со временем разрабатывать местные аналоги — товары и услуги, заменяющие импорт. Замещение импорта стало ключевым источником экономического роста городов</w:t>
       </w:r>
       <w:r>
         <w:t xml:space="preserve"> </w:t>
@@ -1013,10 +1057,15 @@
     </w:p>
     <w:p>
       <w:pPr>
-        <w:pStyle w:val="BodyText"/>
-      </w:pPr>
-      <w:r>
-        <w:t xml:space="preserve">С момента Всемирного саммита по окружающей среде в Рио-де-Жанейро в 1992 году города по всему миру играют ведущую роль в усилиях по стабилизации климата и борьбе с разрушением окружающей среды. Появились различные движения — «устойчивые города», «здоровые города», «экологичные города» и, совсем недавно, «переходные города» — а также организации, созданные для поддержки городских инициатив. ICLEI была одной из первых: изначально она называлась Международный совет по местным экологическим инициативам, затем стала ICLEI — Местные органы власти за устойчивое развитие</w:t>
+        <w:pStyle xmlns:wps="http://schemas.microsoft.com/office/word/2010/wordprocessingShape" xmlns:wpg="http://schemas.microsoft.com/office/word/2010/wordprocessingGroup" xmlns:mc="http://schemas.openxmlformats.org/markup-compatibility/2006" xmlns:wp14="http://schemas.microsoft.com/office/word/2010/wordprocessingDrawing" xmlns:w14="http://schemas.microsoft.com/office/word/2010/wordml" xmlns:w15="http://schemas.microsoft.com/office/word/2012/wordml" w:val="BodyText"/>
+        <w:bidi xmlns:wps="http://schemas.microsoft.com/office/word/2010/wordprocessingShape" xmlns:wpg="http://schemas.microsoft.com/office/word/2010/wordprocessingGroup" xmlns:mc="http://schemas.openxmlformats.org/markup-compatibility/2006" xmlns:wp14="http://schemas.microsoft.com/office/word/2010/wordprocessingDrawing" xmlns:w14="http://schemas.microsoft.com/office/word/2010/wordml" xmlns:w15="http://schemas.microsoft.com/office/word/2012/wordml" w:val="0"/>
+        <w:spacing xmlns:wps="http://schemas.microsoft.com/office/word/2010/wordprocessingShape" xmlns:wpg="http://schemas.microsoft.com/office/word/2010/wordprocessingGroup" xmlns:mc="http://schemas.openxmlformats.org/markup-compatibility/2006" xmlns:wp14="http://schemas.microsoft.com/office/word/2010/wordprocessingDrawing" xmlns:w14="http://schemas.microsoft.com/office/word/2010/wordml" xmlns:w15="http://schemas.microsoft.com/office/word/2012/wordml" w:lineRule="auto" w:line="252" w:before="3" w:after="0"/>
+        <w:ind xmlns:wps="http://schemas.microsoft.com/office/word/2010/wordprocessingShape" xmlns:wpg="http://schemas.microsoft.com/office/word/2010/wordprocessingGroup" xmlns:mc="http://schemas.openxmlformats.org/markup-compatibility/2006" xmlns:wp14="http://schemas.microsoft.com/office/word/2010/wordprocessingDrawing" xmlns:w14="http://schemas.microsoft.com/office/word/2010/wordml" xmlns:w15="http://schemas.microsoft.com/office/word/2012/wordml" w:firstLine="288" w:start="100" w:end="280"/>
+        <w:jc xmlns:wps="http://schemas.microsoft.com/office/word/2010/wordprocessingShape" xmlns:wpg="http://schemas.microsoft.com/office/word/2010/wordprocessingGroup" xmlns:mc="http://schemas.openxmlformats.org/markup-compatibility/2006" xmlns:wp14="http://schemas.microsoft.com/office/word/2010/wordprocessingDrawing" xmlns:w14="http://schemas.microsoft.com/office/word/2010/wordml" xmlns:w15="http://schemas.microsoft.com/office/word/2012/wordml" w:val="start"/>
+        <w:rPr xmlns:wps="http://schemas.microsoft.com/office/word/2010/wordprocessingShape" xmlns:wpg="http://schemas.microsoft.com/office/word/2010/wordprocessingGroup" xmlns:mc="http://schemas.openxmlformats.org/markup-compatibility/2006" xmlns:wp14="http://schemas.microsoft.com/office/word/2010/wordprocessingDrawing" xmlns:w14="http://schemas.microsoft.com/office/word/2010/wordml" xmlns:w15="http://schemas.microsoft.com/office/word/2012/wordml"/>
+      </w:pPr>
+      <w:r>
+        <w:t xml:space="preserve">Со времени Всемирного саммита по окружающей среде в Рио‑де‑Жанейро в 1992 году города по всему миру играют ведущую роль в усилиях по стабилизации климата и защите окружающей среды. Появилились разные движения — «здоровые города», «экологичные города», «переходные города» и другие — а также новые организации, поддерживающие городские инициативы. Одной из первых стала ICLEI: изначально Международный совет по местным экологическим инициативам, позже переименованный в ICLEI — «Местные власти за устойчивое развитие»</w:t>
       </w:r>
       <w:r>
         <w:t xml:space="preserve"> </w:t>
@@ -1030,155 +1079,300 @@
     </w:p>
     <w:p>
       <w:pPr>
-        <w:pStyle w:val="BodyText"/>
-      </w:pPr>
-      <w:r>
-        <w:t xml:space="preserve">Масштаб и глубина этого движения подтверждаются ростом других организаций за последние два десятилетия: Институт устойчивых сообществ, программа «Здоровые города» Всемирной организации здравоохранения, Международная организация «Здоровые города», Международная организация «Экополисы», Центр устойчивых городов, сеть Cities PLUS, Глобальные инициативы сообществ и крупнейшая из них — Организация «Объединённые города и местные власти» (ОУМВ). Международный конгресс городов был создан в 2004 году, когда несколько глобальных коалиций городов (Международный союз местных властей, Метрополис и Всемирная федерация объединённых городов) объединились в одну организацию.</w:t>
-      </w:r>
-      <w:r>
-        <w:t xml:space="preserve">5</w:t>
-      </w:r>
-      <w:r>
-        <w:t xml:space="preserve"> </w:t>
-      </w:r>
-      <w:r>
-        <w:t xml:space="preserve">Кампания «Города тысячелетия» ОУМВ поддерживает Цели развития тысячелетия ООН, где в центре внимания — устойчивое окружение и устойчивая местная экономика. Города всё больше осознают, что решения проблем климата и экологии заложены в созданной нами экономике, и могут стать ключевыми катализаторами масштабных изменений.</w:t>
+        <w:pStyle xmlns:wps="http://schemas.microsoft.com/office/word/2010/wordprocessingShape" xmlns:wpg="http://schemas.microsoft.com/office/word/2010/wordprocessingGroup" xmlns:mc="http://schemas.openxmlformats.org/markup-compatibility/2006" xmlns:wp14="http://schemas.microsoft.com/office/word/2010/wordprocessingDrawing" xmlns:w14="http://schemas.microsoft.com/office/word/2010/wordml" xmlns:w15="http://schemas.microsoft.com/office/word/2012/wordml" w:val="BodyText"/>
+        <w:bidi xmlns:wps="http://schemas.microsoft.com/office/word/2010/wordprocessingShape" xmlns:wpg="http://schemas.microsoft.com/office/word/2010/wordprocessingGroup" xmlns:mc="http://schemas.openxmlformats.org/markup-compatibility/2006" xmlns:wp14="http://schemas.microsoft.com/office/word/2010/wordprocessingDrawing" xmlns:w14="http://schemas.microsoft.com/office/word/2010/wordml" xmlns:w15="http://schemas.microsoft.com/office/word/2012/wordml" w:val="0"/>
+        <w:spacing xmlns:wps="http://schemas.microsoft.com/office/word/2010/wordprocessingShape" xmlns:wpg="http://schemas.microsoft.com/office/word/2010/wordprocessingGroup" xmlns:mc="http://schemas.openxmlformats.org/markup-compatibility/2006" xmlns:wp14="http://schemas.microsoft.com/office/word/2010/wordprocessingDrawing" xmlns:w14="http://schemas.microsoft.com/office/word/2010/wordml" xmlns:w15="http://schemas.microsoft.com/office/word/2012/wordml" w:lineRule="auto" w:line="247" w:before="0" w:after="0"/>
+        <w:ind xmlns:wps="http://schemas.microsoft.com/office/word/2010/wordprocessingShape" xmlns:wpg="http://schemas.microsoft.com/office/word/2010/wordprocessingGroup" xmlns:mc="http://schemas.openxmlformats.org/markup-compatibility/2006" xmlns:wp14="http://schemas.microsoft.com/office/word/2010/wordprocessingDrawing" xmlns:w14="http://schemas.microsoft.com/office/word/2010/wordml" xmlns:w15="http://schemas.microsoft.com/office/word/2012/wordml" w:firstLine="288" w:start="100" w:end="122"/>
+        <w:jc xmlns:wps="http://schemas.microsoft.com/office/word/2010/wordprocessingShape" xmlns:wpg="http://schemas.microsoft.com/office/word/2010/wordprocessingGroup" xmlns:mc="http://schemas.openxmlformats.org/markup-compatibility/2006" xmlns:wp14="http://schemas.microsoft.com/office/word/2010/wordprocessingDrawing" xmlns:w14="http://schemas.microsoft.com/office/word/2010/wordml" xmlns:w15="http://schemas.microsoft.com/office/word/2012/wordml" w:val="start"/>
+        <w:rPr xmlns:wps="http://schemas.microsoft.com/office/word/2010/wordprocessingShape" xmlns:wpg="http://schemas.microsoft.com/office/word/2010/wordprocessingGroup" xmlns:mc="http://schemas.openxmlformats.org/markup-compatibility/2006" xmlns:wp14="http://schemas.microsoft.com/office/word/2010/wordprocessingDrawing" xmlns:w14="http://schemas.microsoft.com/office/word/2010/wordml" xmlns:w15="http://schemas.microsoft.com/office/word/2012/wordml"/>
+      </w:pPr>
+      <w:r>
+        <w:t xml:space="preserve">Масштаб и глубину этого движения подтверждает появление за последние два десятилетия множества организаций: Института устойчивых сообществ, программы «Здоровые города» Всемирной организации здравоохранения, Международной организации «Здоровые города», международной организации «Экополисы», Центра устойчивых городов, сети Cities PLUS, Глобальных инициатив сообществ и, крупнейшей из всех — Организации «Объединённые города и местные власти» (ОУМВ) — новая</w:t>
       </w:r>
     </w:p>
     <w:p>
       <w:pPr>
-        <w:pStyle w:val="BodyText"/>
-      </w:pPr>
-      <w:r>
-        <w:t xml:space="preserve">Города действуют на нескольких уровнях: от общих политических преобразований, например перепрофилирования районов с коммерческих на промышленные, до мелких шагов — например покупки бумажных полотенец для общественных туалетов. Политика проявляется в разных формах: долгосрочные планы с видением, целями и стратегиями; операционные бюджеты и планы капиталовложений; постановления и правила; годовые цели; а также внутренние политики — кадровая, закупочная и т. п. Долгосрочные планы задают направление изменений в постановлениях и бюджетах; бюджеты, планы капиталовложений и годовые цели определяют ежегодные мероприятия по реализации. Другие политики формируют повседневные процедуры.</w:t>
+        <w:pStyle xmlns:wps="http://schemas.microsoft.com/office/word/2010/wordprocessingShape" xmlns:wpg="http://schemas.microsoft.com/office/word/2010/wordprocessingGroup" xmlns:mc="http://schemas.openxmlformats.org/markup-compatibility/2006" xmlns:wp14="http://schemas.microsoft.com/office/word/2010/wordprocessingDrawing" xmlns:w14="http://schemas.microsoft.com/office/word/2010/wordml" xmlns:w15="http://schemas.microsoft.com/office/word/2012/wordml" w:val="BodyText"/>
+        <w:bidi xmlns:wps="http://schemas.microsoft.com/office/word/2010/wordprocessingShape" xmlns:wpg="http://schemas.microsoft.com/office/word/2010/wordprocessingGroup" xmlns:mc="http://schemas.openxmlformats.org/markup-compatibility/2006" xmlns:wp14="http://schemas.microsoft.com/office/word/2010/wordprocessingDrawing" xmlns:w14="http://schemas.microsoft.com/office/word/2010/wordml" xmlns:w15="http://schemas.microsoft.com/office/word/2012/wordml" w:val="0"/>
+        <w:spacing xmlns:wps="http://schemas.microsoft.com/office/word/2010/wordprocessingShape" xmlns:wpg="http://schemas.microsoft.com/office/word/2010/wordprocessingGroup" xmlns:mc="http://schemas.openxmlformats.org/markup-compatibility/2006" xmlns:wp14="http://schemas.microsoft.com/office/word/2010/wordprocessingDrawing" xmlns:w14="http://schemas.microsoft.com/office/word/2010/wordml" xmlns:w15="http://schemas.microsoft.com/office/word/2012/wordml" w:lineRule="auto" w:line="250" w:before="84" w:after="0"/>
+        <w:ind xmlns:wps="http://schemas.microsoft.com/office/word/2010/wordprocessingShape" xmlns:wpg="http://schemas.microsoft.com/office/word/2010/wordprocessingGroup" xmlns:mc="http://schemas.openxmlformats.org/markup-compatibility/2006" xmlns:wp14="http://schemas.microsoft.com/office/word/2010/wordprocessingDrawing" xmlns:w14="http://schemas.microsoft.com/office/word/2010/wordml" xmlns:w15="http://schemas.microsoft.com/office/word/2012/wordml" w:start="100" w:end="280"/>
+        <w:jc xmlns:wps="http://schemas.microsoft.com/office/word/2010/wordprocessingShape" xmlns:wpg="http://schemas.microsoft.com/office/word/2010/wordprocessingGroup" xmlns:mc="http://schemas.openxmlformats.org/markup-compatibility/2006" xmlns:wp14="http://schemas.microsoft.com/office/word/2010/wordprocessingDrawing" xmlns:w14="http://schemas.microsoft.com/office/word/2010/wordml" xmlns:w15="http://schemas.microsoft.com/office/word/2012/wordml" w:val="start"/>
+        <w:rPr xmlns:wps="http://schemas.microsoft.com/office/word/2010/wordprocessingShape" xmlns:wpg="http://schemas.microsoft.com/office/word/2010/wordprocessingGroup" xmlns:mc="http://schemas.openxmlformats.org/markup-compatibility/2006" xmlns:wp14="http://schemas.microsoft.com/office/word/2010/wordprocessingDrawing" xmlns:w14="http://schemas.microsoft.com/office/word/2010/wordml" xmlns:w15="http://schemas.microsoft.com/office/word/2012/wordml"/>
+      </w:pPr>
+      <w:r>
+        <w:t xml:space="preserve">Международный конгресс городов был создан в 2004 году, когда несколько глобальных коалиций городов (Международный союз местных властей, Метрополис и Всемирная федерация объединённых городов) объединились в одну организацию.</w:t>
+      </w:r>
+      <w:r>
+        <w:t xml:space="preserve">5</w:t>
+      </w:r>
+      <w:r>
+        <w:t xml:space="preserve"> </w:t>
+      </w:r>
+      <w:r>
+        <w:t xml:space="preserve">Кампания «Города тысячелетия» ОУМВ поддерживает Цели развития тысячелетия ООН, ориентированные на устойчивую окружающую среду и устойчивую местную экономику. Города всё больше осознают, что решения проблем изменения климата и деградации окружающей среды во многом зависят от структуры нашей экономики. Такие города могут стать ключевыми катализаторами масштабных изменений.</w:t>
       </w:r>
     </w:p>
     <w:p>
       <w:pPr>
-        <w:pStyle w:val="BodyText"/>
-      </w:pPr>
-      <w:r>
-        <w:t xml:space="preserve">Так, например, в городской совет была избрана женщина, которая во время предвыборной кампании обещала сократить выбросы углерода и уменьшить зависимость от ископаемого топлива. В первый же день ей представляют покупку для полиции автомобиля с высоким расходом топлива для нового автопарка. Если она попытается остановить покупку, то столкнётся с сопротивлением начальника полиции и городского управляющего: они объяснят, что автомобиль включён в капитальный план и является частью долгосрочной программы замены, возможно, с контрактами с местными автодилерами, которые нельзя расторгнуть. Возражения новоизбранной, вероятно, отвергнут более опытные члены совета, и покупка будет произведена. Она может возразить: «…граждане на этих выборах ясно показали, что хотят сократить выбросы углерода и потребление ископаемого топлива». Ветераны на её ответ лишь улыбнутся и обменяются многозначительными взглядами: идеализм терпимо воспринимается, но добиваться перемен в повседневной практике гораздо сложнее.</w:t>
+        <w:pStyle xmlns:wps="http://schemas.microsoft.com/office/word/2010/wordprocessingShape" xmlns:wpg="http://schemas.microsoft.com/office/word/2010/wordprocessingGroup" xmlns:mc="http://schemas.openxmlformats.org/markup-compatibility/2006" xmlns:wp14="http://schemas.microsoft.com/office/word/2010/wordprocessingDrawing" xmlns:w14="http://schemas.microsoft.com/office/word/2010/wordml" xmlns:w15="http://schemas.microsoft.com/office/word/2012/wordml" w:val="BodyText"/>
+        <w:bidi xmlns:wps="http://schemas.microsoft.com/office/word/2010/wordprocessingShape" xmlns:wpg="http://schemas.microsoft.com/office/word/2010/wordprocessingGroup" xmlns:mc="http://schemas.openxmlformats.org/markup-compatibility/2006" xmlns:wp14="http://schemas.microsoft.com/office/word/2010/wordprocessingDrawing" xmlns:w14="http://schemas.microsoft.com/office/word/2010/wordml" xmlns:w15="http://schemas.microsoft.com/office/word/2012/wordml" w:val="0"/>
+        <w:spacing xmlns:wps="http://schemas.microsoft.com/office/word/2010/wordprocessingShape" xmlns:wpg="http://schemas.microsoft.com/office/word/2010/wordprocessingGroup" xmlns:mc="http://schemas.openxmlformats.org/markup-compatibility/2006" xmlns:wp14="http://schemas.microsoft.com/office/word/2010/wordprocessingDrawing" xmlns:w14="http://schemas.microsoft.com/office/word/2010/wordml" xmlns:w15="http://schemas.microsoft.com/office/word/2012/wordml" w:lineRule="auto" w:line="247" w:before="3" w:after="0"/>
+        <w:ind xmlns:wps="http://schemas.microsoft.com/office/word/2010/wordprocessingShape" xmlns:wpg="http://schemas.microsoft.com/office/word/2010/wordprocessingGroup" xmlns:mc="http://schemas.openxmlformats.org/markup-compatibility/2006" xmlns:wp14="http://schemas.microsoft.com/office/word/2010/wordprocessingDrawing" xmlns:w14="http://schemas.microsoft.com/office/word/2010/wordml" xmlns:w15="http://schemas.microsoft.com/office/word/2012/wordml" w:firstLine="288" w:start="100" w:end="198"/>
+        <w:jc xmlns:wps="http://schemas.microsoft.com/office/word/2010/wordprocessingShape" xmlns:wpg="http://schemas.microsoft.com/office/word/2010/wordprocessingGroup" xmlns:mc="http://schemas.openxmlformats.org/markup-compatibility/2006" xmlns:wp14="http://schemas.microsoft.com/office/word/2010/wordprocessingDrawing" xmlns:w14="http://schemas.microsoft.com/office/word/2010/wordml" xmlns:w15="http://schemas.microsoft.com/office/word/2012/wordml" w:val="start"/>
+        <w:rPr xmlns:wps="http://schemas.microsoft.com/office/word/2010/wordprocessingShape" xmlns:wpg="http://schemas.microsoft.com/office/word/2010/wordprocessingGroup" xmlns:mc="http://schemas.openxmlformats.org/markup-compatibility/2006" xmlns:wp14="http://schemas.microsoft.com/office/word/2010/wordprocessingDrawing" xmlns:w14="http://schemas.microsoft.com/office/word/2010/wordml" xmlns:w15="http://schemas.microsoft.com/office/word/2012/wordml"/>
+      </w:pPr>
+      <w:r>
+        <w:t xml:space="preserve">Города действуют на нескольких уровнях: от масштабных политических изменений — например, переквалификации района с коммерческого на промышленный — до мелких решений вроде покупки бумажных полотенец для общественных туалетов. Политика принимает разные формы: документы долгосрочного планирования с видением, целями и стратегиями; операционные бюджеты и планы капиталовложений; постановления и регламенты; годовые цели и правила, определяющие повседневную деятельность — кадровая и закупочная политика, например. Долгосрочные планы задают направление для изменений в нормативной базе и бюджетах; бюджеты, планы капиталовложений и годовые цели определяют конкретные мероприятия, которые осуществляются ежегодно. Другие политики направляют повседневную работу.</w:t>
       </w:r>
     </w:p>
     <w:p>
       <w:pPr>
-        <w:pStyle w:val="BodyText"/>
-      </w:pPr>
-      <w:r>
-        <w:t xml:space="preserve">Предвыборные обещания, регулярные местные выборы, референдумы и голосования по облигациям дают властям постоянный поток новой информации и мнений граждан, но для реальных изменений нужны скоординированные усилия. Новоиспечённые члены городского совета часто не знают процессов, которые определяют крупномасштабную реализацию, и их легко втянуть в привычный уклад работы, особенно учитывая системные силы, стремящиеся сохранить статус-кво.</w:t>
+        <w:pStyle xmlns:wps="http://schemas.microsoft.com/office/word/2010/wordprocessingShape" xmlns:wpg="http://schemas.microsoft.com/office/word/2010/wordprocessingGroup" xmlns:mc="http://schemas.openxmlformats.org/markup-compatibility/2006" xmlns:wp14="http://schemas.microsoft.com/office/word/2010/wordprocessingDrawing" xmlns:w14="http://schemas.microsoft.com/office/word/2010/wordml" xmlns:w15="http://schemas.microsoft.com/office/word/2012/wordml" w:val="BodyText"/>
+        <w:bidi xmlns:wps="http://schemas.microsoft.com/office/word/2010/wordprocessingShape" xmlns:wpg="http://schemas.microsoft.com/office/word/2010/wordprocessingGroup" xmlns:mc="http://schemas.openxmlformats.org/markup-compatibility/2006" xmlns:wp14="http://schemas.microsoft.com/office/word/2010/wordprocessingDrawing" xmlns:w14="http://schemas.microsoft.com/office/word/2010/wordml" xmlns:w15="http://schemas.microsoft.com/office/word/2012/wordml" w:val="0"/>
+        <w:spacing xmlns:wps="http://schemas.microsoft.com/office/word/2010/wordprocessingShape" xmlns:wpg="http://schemas.microsoft.com/office/word/2010/wordprocessingGroup" xmlns:mc="http://schemas.openxmlformats.org/markup-compatibility/2006" xmlns:wp14="http://schemas.microsoft.com/office/word/2010/wordprocessingDrawing" xmlns:w14="http://schemas.microsoft.com/office/word/2010/wordml" xmlns:w15="http://schemas.microsoft.com/office/word/2012/wordml" w:lineRule="auto" w:line="247"/>
+        <w:ind xmlns:wps="http://schemas.microsoft.com/office/word/2010/wordprocessingShape" xmlns:wpg="http://schemas.microsoft.com/office/word/2010/wordprocessingGroup" xmlns:mc="http://schemas.openxmlformats.org/markup-compatibility/2006" xmlns:wp14="http://schemas.microsoft.com/office/word/2010/wordprocessingDrawing" xmlns:w14="http://schemas.microsoft.com/office/word/2010/wordml" xmlns:w15="http://schemas.microsoft.com/office/word/2012/wordml" w:firstLine="288" w:start="100" w:end="122"/>
+        <w:jc xmlns:wps="http://schemas.microsoft.com/office/word/2010/wordprocessingShape" xmlns:wpg="http://schemas.microsoft.com/office/word/2010/wordprocessingGroup" xmlns:mc="http://schemas.openxmlformats.org/markup-compatibility/2006" xmlns:wp14="http://schemas.microsoft.com/office/word/2010/wordprocessingDrawing" xmlns:w14="http://schemas.microsoft.com/office/word/2010/wordml" xmlns:w15="http://schemas.microsoft.com/office/word/2012/wordml" w:val="start"/>
+        <w:rPr xmlns:wps="http://schemas.microsoft.com/office/word/2010/wordprocessingShape" xmlns:wpg="http://schemas.microsoft.com/office/word/2010/wordprocessingGroup" xmlns:mc="http://schemas.openxmlformats.org/markup-compatibility/2006" xmlns:wp14="http://schemas.microsoft.com/office/word/2010/wordprocessingDrawing" xmlns:w14="http://schemas.microsoft.com/office/word/2010/wordml" xmlns:w15="http://schemas.microsoft.com/office/word/2012/wordml"/>
+      </w:pPr>
+      <w:r>
+        <w:t xml:space="preserve">Например, в городской совет избрали нового члена, который в предвыборной кампании обещал сократить выбросы углерода и уменьшить потребление ископаемого топлива. В первый же рабочий день ему докладывают о закупке для полицейского управления автомобиля с большим расходом топлива для обновления автопарка. Если он попытается остановить эту покупку, он столкнётся с сопротивлением начальника полиции и городского управляющего: тот объяснит, что автомобиль включён в капитальный план как часть долгосрочной замены и возможно связан с контрактами с местными дилерами, которые нельзя разорвать. Возражения новичка, скорее всего, будут отклонены опытными членами совета, и покупка состоится. Новичок может сказать: «Но избиратели на этих выборах показали, что хотят сокращения выбросов углерода и использования ископаемого топлива». Терпеливые улыбки и многозначительные взгляды ветеранов среди сотрудников и членов совета дадут понять, что идеализм встретят с пониманием, но изменения на уровне повседневной реализации не так просты.</w:t>
       </w:r>
     </w:p>
     <w:p>
       <w:pPr>
-        <w:pStyle w:val="BodyText"/>
-      </w:pPr>
-      <w:r>
-        <w:t xml:space="preserve">Города — сложные механизмы, основанные на профсоюзных договорах, долгосрочных контрактах с поставщиками, опытном штате и потоках материалов и энергии, поддерживаемых видимой и невидимой инфраструктурой. Радикальные изменения в инфраструктуре требуют тщательного планирования — нельзя просто перерезать канализационные трубы, чтобы перекрыть приток сточных вод на очистные сооружения, даже если это кажется простым решением: непреднамеренные последствия превысят краткосрочный эффект. В других сферах это менее наглядно, но не менее верно — например, когда полицейский департамент намерен закупить автомобили с высоким расходом топлива.</w:t>
+        <w:pStyle xmlns:wps="http://schemas.microsoft.com/office/word/2010/wordprocessingShape" xmlns:wpg="http://schemas.microsoft.com/office/word/2010/wordprocessingGroup" xmlns:mc="http://schemas.openxmlformats.org/markup-compatibility/2006" xmlns:wp14="http://schemas.microsoft.com/office/word/2010/wordprocessingDrawing" xmlns:w14="http://schemas.microsoft.com/office/word/2010/wordml" xmlns:w15="http://schemas.microsoft.com/office/word/2012/wordml" w:val="BodyText"/>
+        <w:bidi xmlns:wps="http://schemas.microsoft.com/office/word/2010/wordprocessingShape" xmlns:wpg="http://schemas.microsoft.com/office/word/2010/wordprocessingGroup" xmlns:mc="http://schemas.openxmlformats.org/markup-compatibility/2006" xmlns:wp14="http://schemas.microsoft.com/office/word/2010/wordprocessingDrawing" xmlns:w14="http://schemas.microsoft.com/office/word/2010/wordml" xmlns:w15="http://schemas.microsoft.com/office/word/2012/wordml" w:val="0"/>
+        <w:spacing xmlns:wps="http://schemas.microsoft.com/office/word/2010/wordprocessingShape" xmlns:wpg="http://schemas.microsoft.com/office/word/2010/wordprocessingGroup" xmlns:mc="http://schemas.openxmlformats.org/markup-compatibility/2006" xmlns:wp14="http://schemas.microsoft.com/office/word/2010/wordprocessingDrawing" xmlns:w14="http://schemas.microsoft.com/office/word/2010/wordml" xmlns:w15="http://schemas.microsoft.com/office/word/2012/wordml" w:lineRule="auto" w:line="247"/>
+        <w:ind xmlns:wps="http://schemas.microsoft.com/office/word/2010/wordprocessingShape" xmlns:wpg="http://schemas.microsoft.com/office/word/2010/wordprocessingGroup" xmlns:mc="http://schemas.openxmlformats.org/markup-compatibility/2006" xmlns:wp14="http://schemas.microsoft.com/office/word/2010/wordprocessingDrawing" xmlns:w14="http://schemas.microsoft.com/office/word/2010/wordml" xmlns:w15="http://schemas.microsoft.com/office/word/2012/wordml" w:firstLine="288" w:start="100" w:end="122"/>
+        <w:jc xmlns:wps="http://schemas.microsoft.com/office/word/2010/wordprocessingShape" xmlns:wpg="http://schemas.microsoft.com/office/word/2010/wordprocessingGroup" xmlns:mc="http://schemas.openxmlformats.org/markup-compatibility/2006" xmlns:wp14="http://schemas.microsoft.com/office/word/2010/wordprocessingDrawing" xmlns:w14="http://schemas.microsoft.com/office/word/2010/wordml" xmlns:w15="http://schemas.microsoft.com/office/word/2012/wordml" w:val="start"/>
+        <w:rPr xmlns:wps="http://schemas.microsoft.com/office/word/2010/wordprocessingShape" xmlns:wpg="http://schemas.microsoft.com/office/word/2010/wordprocessingGroup" xmlns:mc="http://schemas.openxmlformats.org/markup-compatibility/2006" xmlns:wp14="http://schemas.microsoft.com/office/word/2010/wordprocessingDrawing" xmlns:w14="http://schemas.microsoft.com/office/word/2010/wordml" xmlns:w15="http://schemas.microsoft.com/office/word/2012/wordml"/>
+      </w:pPr>
+      <w:r>
+        <w:t xml:space="preserve">Предвыборные обещания, регулярные местные выборы, референдумы и голосования по облигациям обеспечивают постоянный приток информации и мнений граждан органам местного самоуправления, но для реальных сдвигов в политике нужны согласованные усилия. Новые члены городских советов часто не представляют себе процессов, определяющих масштабную реализацию, и их легко втянуть в устоявшийся уклад — особенно с учётом системных сил, стремящихся сохранить статус‑кво.</w:t>
       </w:r>
     </w:p>
     <w:p>
       <w:pPr>
-        <w:pStyle w:val="BodyText"/>
-      </w:pPr>
-      <w:r>
-        <w:t xml:space="preserve">Долгосрочная перспектива, основанная на ценностях людей — на том, что для них действительно важно, — необходима для мобилизации коллективных действий. Однако даже появление такой перспективы не изменит ситуацию само по себе. По‑прежнему будет сложно переориентировать закупки для городского автопарка, если только она не будет перенесена в конкретные краткосрочные политики и программы.</w:t>
+        <w:pStyle xmlns:wps="http://schemas.microsoft.com/office/word/2010/wordprocessingShape" xmlns:wpg="http://schemas.microsoft.com/office/word/2010/wordprocessingGroup" xmlns:mc="http://schemas.openxmlformats.org/markup-compatibility/2006" xmlns:wp14="http://schemas.microsoft.com/office/word/2010/wordprocessingDrawing" xmlns:w14="http://schemas.microsoft.com/office/word/2010/wordml" xmlns:w15="http://schemas.microsoft.com/office/word/2012/wordml" w:val="BodyText"/>
+        <w:bidi xmlns:wps="http://schemas.microsoft.com/office/word/2010/wordprocessingShape" xmlns:wpg="http://schemas.microsoft.com/office/word/2010/wordprocessingGroup" xmlns:mc="http://schemas.openxmlformats.org/markup-compatibility/2006" xmlns:wp14="http://schemas.microsoft.com/office/word/2010/wordprocessingDrawing" xmlns:w14="http://schemas.microsoft.com/office/word/2010/wordml" xmlns:w15="http://schemas.microsoft.com/office/word/2012/wordml" w:val="0"/>
+        <w:spacing xmlns:wps="http://schemas.microsoft.com/office/word/2010/wordprocessingShape" xmlns:wpg="http://schemas.microsoft.com/office/word/2010/wordprocessingGroup" xmlns:mc="http://schemas.openxmlformats.org/markup-compatibility/2006" xmlns:wp14="http://schemas.microsoft.com/office/word/2010/wordprocessingDrawing" xmlns:w14="http://schemas.microsoft.com/office/word/2010/wordml" xmlns:w15="http://schemas.microsoft.com/office/word/2012/wordml" w:lineRule="auto" w:line="247"/>
+        <w:ind xmlns:wps="http://schemas.microsoft.com/office/word/2010/wordprocessingShape" xmlns:wpg="http://schemas.microsoft.com/office/word/2010/wordprocessingGroup" xmlns:mc="http://schemas.openxmlformats.org/markup-compatibility/2006" xmlns:wp14="http://schemas.microsoft.com/office/word/2010/wordprocessingDrawing" xmlns:w14="http://schemas.microsoft.com/office/word/2010/wordml" xmlns:w15="http://schemas.microsoft.com/office/word/2012/wordml" w:firstLine="288" w:start="100" w:end="122"/>
+        <w:jc xmlns:wps="http://schemas.microsoft.com/office/word/2010/wordprocessingShape" xmlns:wpg="http://schemas.microsoft.com/office/word/2010/wordprocessingGroup" xmlns:mc="http://schemas.openxmlformats.org/markup-compatibility/2006" xmlns:wp14="http://schemas.microsoft.com/office/word/2010/wordprocessingDrawing" xmlns:w14="http://schemas.microsoft.com/office/word/2010/wordml" xmlns:w15="http://schemas.microsoft.com/office/word/2012/wordml" w:val="start"/>
+        <w:rPr xmlns:wps="http://schemas.microsoft.com/office/word/2010/wordprocessingShape" xmlns:wpg="http://schemas.microsoft.com/office/word/2010/wordprocessingGroup" xmlns:mc="http://schemas.openxmlformats.org/markup-compatibility/2006" xmlns:wp14="http://schemas.microsoft.com/office/word/2010/wordprocessingDrawing" xmlns:w14="http://schemas.microsoft.com/office/word/2010/wordml" xmlns:w15="http://schemas.microsoft.com/office/word/2012/wordml"/>
+      </w:pPr>
+      <w:r>
+        <w:t xml:space="preserve">Города — сложные механизмы: профсоюзные соглашения, долгосрочные контракты с поставщиками, опытный персонал и потоки материалов и энергии опираются на видимую и скрытую инфраструктуру. Серьёзные изменения инфраструктуры требуют тщательного планирования — нельзя просто перерезать канализационную трубу, чтобы прекратить подачу стоков на очистные сооружения; подобный шаг, каким бы простым ни казался, принесёт больше вреда, чем пользы. Непреднамеренные последствия таких действий, как правило, перевешивают предполагаемые краткосрочные выгоды. В других сферах это менее заметно, но не менее верно — например, когда полицейское управление собирается закупить автомобили с большим расходом топлива.</w:t>
       </w:r>
     </w:p>
     <w:p>
       <w:pPr>
-        <w:pStyle w:val="BodyText"/>
-      </w:pPr>
-      <w:r>
-        <w:t xml:space="preserve">Краткосрочные политики и программы определяют направления реализации. Идея города, удобного для пешеходов, с уютными кварталами и сдержанным пригородным разрастанием требует изменений в правилах землепользования, прежде чем плотность застройки ощутимо изменится. Концепция чистого воздуха и снижения климатического воздействия должна найти отражение в ряде мер — от закупочной политики, поощряющей альтернативы энергоёмким товарам, до капитального планирования по производству возобновляемой энергии.</w:t>
+        <w:pStyle xmlns:wps="http://schemas.microsoft.com/office/word/2010/wordprocessingShape" xmlns:wpg="http://schemas.microsoft.com/office/word/2010/wordprocessingGroup" xmlns:mc="http://schemas.openxmlformats.org/markup-compatibility/2006" xmlns:wp14="http://schemas.microsoft.com/office/word/2010/wordprocessingDrawing" xmlns:w14="http://schemas.microsoft.com/office/word/2010/wordml" xmlns:w15="http://schemas.microsoft.com/office/word/2012/wordml" w:val="BodyText"/>
+        <w:bidi xmlns:wps="http://schemas.microsoft.com/office/word/2010/wordprocessingShape" xmlns:wpg="http://schemas.microsoft.com/office/word/2010/wordprocessingGroup" xmlns:mc="http://schemas.openxmlformats.org/markup-compatibility/2006" xmlns:wp14="http://schemas.microsoft.com/office/word/2010/wordprocessingDrawing" xmlns:w14="http://schemas.microsoft.com/office/word/2010/wordml" xmlns:w15="http://schemas.microsoft.com/office/word/2012/wordml" w:val="0"/>
+        <w:spacing xmlns:wps="http://schemas.microsoft.com/office/word/2010/wordprocessingShape" xmlns:wpg="http://schemas.microsoft.com/office/word/2010/wordprocessingGroup" xmlns:mc="http://schemas.openxmlformats.org/markup-compatibility/2006" xmlns:wp14="http://schemas.microsoft.com/office/word/2010/wordprocessingDrawing" xmlns:w14="http://schemas.microsoft.com/office/word/2010/wordml" xmlns:w15="http://schemas.microsoft.com/office/word/2012/wordml" w:lineRule="auto" w:line="247"/>
+        <w:ind xmlns:wps="http://schemas.microsoft.com/office/word/2010/wordprocessingShape" xmlns:wpg="http://schemas.microsoft.com/office/word/2010/wordprocessingGroup" xmlns:mc="http://schemas.openxmlformats.org/markup-compatibility/2006" xmlns:wp14="http://schemas.microsoft.com/office/word/2010/wordprocessingDrawing" xmlns:w14="http://schemas.microsoft.com/office/word/2010/wordml" xmlns:w15="http://schemas.microsoft.com/office/word/2012/wordml" w:firstLine="288" w:start="100" w:end="443"/>
+        <w:jc xmlns:wps="http://schemas.microsoft.com/office/word/2010/wordprocessingShape" xmlns:wpg="http://schemas.microsoft.com/office/word/2010/wordprocessingGroup" xmlns:mc="http://schemas.openxmlformats.org/markup-compatibility/2006" xmlns:wp14="http://schemas.microsoft.com/office/word/2010/wordprocessingDrawing" xmlns:w14="http://schemas.microsoft.com/office/word/2010/wordml" xmlns:w15="http://schemas.microsoft.com/office/word/2012/wordml" w:val="start"/>
+        <w:rPr xmlns:wps="http://schemas.microsoft.com/office/word/2010/wordprocessingShape" xmlns:wpg="http://schemas.microsoft.com/office/word/2010/wordprocessingGroup" xmlns:mc="http://schemas.openxmlformats.org/markup-compatibility/2006" xmlns:wp14="http://schemas.microsoft.com/office/word/2010/wordprocessingDrawing" xmlns:w14="http://schemas.microsoft.com/office/word/2010/wordml" xmlns:w15="http://schemas.microsoft.com/office/word/2012/wordml"/>
+      </w:pPr>
+      <w:r>
+        <w:t xml:space="preserve">Долгосрочная перспектива, вытекающая из ценностей людей — того, что для них действительно важно, — необходима для мобилизации коллективных действий. Но даже когда город сформулирует такую перспективу, перемены не произойдут сами собой. По‑прежнему будет трудно переориентировать закупки автопарка, если только</w:t>
       </w:r>
     </w:p>
     <w:p>
       <w:pPr>
-        <w:pStyle w:val="BodyText"/>
-      </w:pPr>
-      <w:r>
-        <w:t xml:space="preserve">Сегодня немногие города располагают комплексными долгосрочными планами и политиками, необходимыми для перехода к устойчивому развитию. Зачастую политический контекст фрагментирован, ориентирован на краткосрочные выгоды и противоречив. У города может быть генеральный план, охватывающий инфраструктуру, землепользование и экономическое развитие на три–пять лет. При интегрированном подходе капитальный план может отражать эти цели, но чаще он превращается в перечень разрозненных проектов, продиктованных требованиями отдельных департаментов или членов совета, без понимания их связи с долгосрочными целями — стабилизацией климата или искоренением бедности. Города редко учитывают такие фундаментальные факторы политического контекста, как общие ценности, социальное и человеческое развитие и управленческие структуры.</w:t>
+        <w:pStyle xmlns:wps="http://schemas.microsoft.com/office/word/2010/wordprocessingShape" xmlns:wpg="http://schemas.microsoft.com/office/word/2010/wordprocessingGroup" xmlns:mc="http://schemas.openxmlformats.org/markup-compatibility/2006" xmlns:wp14="http://schemas.microsoft.com/office/word/2010/wordprocessingDrawing" xmlns:w14="http://schemas.microsoft.com/office/word/2010/wordml" xmlns:w15="http://schemas.microsoft.com/office/word/2012/wordml" w:val="BodyText"/>
+        <w:bidi xmlns:wps="http://schemas.microsoft.com/office/word/2010/wordprocessingShape" xmlns:wpg="http://schemas.microsoft.com/office/word/2010/wordprocessingGroup" xmlns:mc="http://schemas.openxmlformats.org/markup-compatibility/2006" xmlns:wp14="http://schemas.microsoft.com/office/word/2010/wordprocessingDrawing" xmlns:w14="http://schemas.microsoft.com/office/word/2010/wordml" xmlns:w15="http://schemas.microsoft.com/office/word/2012/wordml" w:val="0"/>
+        <w:spacing xmlns:wps="http://schemas.microsoft.com/office/word/2010/wordprocessingShape" xmlns:wpg="http://schemas.microsoft.com/office/word/2010/wordprocessingGroup" xmlns:mc="http://schemas.openxmlformats.org/markup-compatibility/2006" xmlns:wp14="http://schemas.microsoft.com/office/word/2010/wordprocessingDrawing" xmlns:w14="http://schemas.microsoft.com/office/word/2010/wordml" xmlns:w15="http://schemas.microsoft.com/office/word/2012/wordml" w:lineRule="auto" w:line="247" w:before="0" w:after="0"/>
+        <w:ind xmlns:wps="http://schemas.microsoft.com/office/word/2010/wordprocessingShape" xmlns:wpg="http://schemas.microsoft.com/office/word/2010/wordprocessingGroup" xmlns:mc="http://schemas.openxmlformats.org/markup-compatibility/2006" xmlns:wp14="http://schemas.microsoft.com/office/word/2010/wordprocessingDrawing" xmlns:w14="http://schemas.microsoft.com/office/word/2010/wordml" xmlns:w15="http://schemas.microsoft.com/office/word/2012/wordml" w:start="100" w:end="194"/>
+        <w:jc xmlns:wps="http://schemas.microsoft.com/office/word/2010/wordprocessingShape" xmlns:wpg="http://schemas.microsoft.com/office/word/2010/wordprocessingGroup" xmlns:mc="http://schemas.openxmlformats.org/markup-compatibility/2006" xmlns:wp14="http://schemas.microsoft.com/office/word/2010/wordprocessingDrawing" xmlns:w14="http://schemas.microsoft.com/office/word/2010/wordml" xmlns:w15="http://schemas.microsoft.com/office/word/2012/wordml" w:val="start"/>
+        <w:rPr xmlns:wps="http://schemas.microsoft.com/office/word/2010/wordprocessingShape" xmlns:wpg="http://schemas.microsoft.com/office/word/2010/wordprocessingGroup" xmlns:mc="http://schemas.openxmlformats.org/markup-compatibility/2006" xmlns:wp14="http://schemas.microsoft.com/office/word/2010/wordprocessingDrawing" xmlns:w14="http://schemas.microsoft.com/office/word/2010/wordml" xmlns:w15="http://schemas.microsoft.com/office/word/2012/wordml"/>
+      </w:pPr>
+      <w:r>
+        <w:t xml:space="preserve">Долгосрочная перспектива воплощается через краткосрочные политики и программы, которые задают направление реализации. Создание города, удобного для пешеходов, с дружелюбными микрорайонами и сдерживанием разрастания пригородов всё равно требует изменений в правилах землепользования, прежде чем появятся заметные изменения в плотности застройки. Концепция чистого воздуха и снижения климатического воздействия должна найти отражение в ряде политик — от политики закупок, требующей альтернатив энергоёмким товарам, до капитального планирования производства возобновляемой энергии.</w:t>
       </w:r>
     </w:p>
     <w:p>
       <w:pPr>
-        <w:pStyle w:val="BodyText"/>
-      </w:pPr>
-      <w:r>
-        <w:t xml:space="preserve">Достижение долгосрочной устойчивости требует мер, выходящих за рамки полномочий городских властей; их усилия окажутся малоэффективными без сопутствующих изменений в более широком сообществе. Процесс с участием многих заинтересованных сторон даёт людям, организациям и крупным институтам возможность внести вклад в план и затем действовать в своих сферах для его реализации. Так город и его независимые силы начнут работать ради общих целей. Но и эти согласованные действия не возникают сами по себе — нужны руководство и организация со стороны города и партнёров.</w:t>
+        <w:pStyle xmlns:wps="http://schemas.microsoft.com/office/word/2010/wordprocessingShape" xmlns:wpg="http://schemas.microsoft.com/office/word/2010/wordprocessingGroup" xmlns:mc="http://schemas.openxmlformats.org/markup-compatibility/2006" xmlns:wp14="http://schemas.microsoft.com/office/word/2010/wordprocessingDrawing" xmlns:w14="http://schemas.microsoft.com/office/word/2010/wordml" xmlns:w15="http://schemas.microsoft.com/office/word/2012/wordml" w:val="BodyText"/>
+        <w:bidi xmlns:wps="http://schemas.microsoft.com/office/word/2010/wordprocessingShape" xmlns:wpg="http://schemas.microsoft.com/office/word/2010/wordprocessingGroup" xmlns:mc="http://schemas.openxmlformats.org/markup-compatibility/2006" xmlns:wp14="http://schemas.microsoft.com/office/word/2010/wordprocessingDrawing" xmlns:w14="http://schemas.microsoft.com/office/word/2010/wordml" xmlns:w15="http://schemas.microsoft.com/office/word/2012/wordml" w:val="0"/>
+        <w:spacing xmlns:wps="http://schemas.microsoft.com/office/word/2010/wordprocessingShape" xmlns:wpg="http://schemas.microsoft.com/office/word/2010/wordprocessingGroup" xmlns:mc="http://schemas.openxmlformats.org/markup-compatibility/2006" xmlns:wp14="http://schemas.microsoft.com/office/word/2010/wordprocessingDrawing" xmlns:w14="http://schemas.microsoft.com/office/word/2010/wordml" xmlns:w15="http://schemas.microsoft.com/office/word/2012/wordml" w:lineRule="auto" w:line="247" w:before="84" w:after="0"/>
+        <w:ind xmlns:wps="http://schemas.microsoft.com/office/word/2010/wordprocessingShape" xmlns:wpg="http://schemas.microsoft.com/office/word/2010/wordprocessingGroup" xmlns:mc="http://schemas.openxmlformats.org/markup-compatibility/2006" xmlns:wp14="http://schemas.microsoft.com/office/word/2010/wordprocessingDrawing" xmlns:w14="http://schemas.microsoft.com/office/word/2010/wordml" xmlns:w15="http://schemas.microsoft.com/office/word/2012/wordml" w:firstLine="288" w:start="100" w:end="158"/>
+        <w:jc xmlns:wps="http://schemas.microsoft.com/office/word/2010/wordprocessingShape" xmlns:wpg="http://schemas.microsoft.com/office/word/2010/wordprocessingGroup" xmlns:mc="http://schemas.openxmlformats.org/markup-compatibility/2006" xmlns:wp14="http://schemas.microsoft.com/office/word/2010/wordprocessingDrawing" xmlns:w14="http://schemas.microsoft.com/office/word/2010/wordml" xmlns:w15="http://schemas.microsoft.com/office/word/2012/wordml" w:val="start"/>
+        <w:rPr xmlns:wps="http://schemas.microsoft.com/office/word/2010/wordprocessingShape" xmlns:wpg="http://schemas.microsoft.com/office/word/2010/wordprocessingGroup" xmlns:mc="http://schemas.openxmlformats.org/markup-compatibility/2006" xmlns:wp14="http://schemas.microsoft.com/office/word/2010/wordprocessingDrawing" xmlns:w14="http://schemas.microsoft.com/office/word/2010/wordml" xmlns:w15="http://schemas.microsoft.com/office/word/2012/wordml"/>
+      </w:pPr>
+      <w:r>
+        <w:t xml:space="preserve">Сегодня немногие города располагают комплексными долгосрочными планами и политиками, нужными для перехода к устойчивому развитию. Часто политический контекст фрагментирован, краткосрочен и внутренне противоречив. Город может иметь генеральный или комплексный план, охватывающий инфраструктуру, землепользование и экономическое развитие на ближайшие три–пять лет. Если сотрудники администрации и/или совет ориентированы на интеграцию, капитальный план может отражать цели генерального плана. Но чаще капитальный план — это длинный список проектов, составленный по запросам отдельных департаментов или членов совета, не связанных между собой и не учитывающих, как они соотносятся с долгосрочными целями, такими как стабилизация климата или искоренение бедности. Города почти не принимают во внимание такие фундаментальные факторы, как общее чувство ценностей, вопросы социального и человеческого развития и структура управления.</w:t>
       </w:r>
     </w:p>
     <w:p>
       <w:pPr>
-        <w:pStyle w:val="BodyText"/>
-      </w:pPr>
-      <w:r>
-        <w:t xml:space="preserve">Интеграция и долгосрочный временной горизонт важнее для достижения городских целей, чем фокус на отдельных проблемах — климате, здравоохранении или экономике. Эти вопросы значимы, но меры будут неэффективны, если их реализовать поодиночке. Интегрированный подход связывает разные сферы, социально‑экономические границы и департаменты. Он также помогает избежать ситуации, когда достижение одной цели происходит за счёт другой.</w:t>
+        <w:pStyle xmlns:wps="http://schemas.microsoft.com/office/word/2010/wordprocessingShape" xmlns:wpg="http://schemas.microsoft.com/office/word/2010/wordprocessingGroup" xmlns:mc="http://schemas.openxmlformats.org/markup-compatibility/2006" xmlns:wp14="http://schemas.microsoft.com/office/word/2010/wordprocessingDrawing" xmlns:w14="http://schemas.microsoft.com/office/word/2010/wordml" xmlns:w15="http://schemas.microsoft.com/office/word/2012/wordml" w:val="BodyText"/>
+        <w:bidi xmlns:wps="http://schemas.microsoft.com/office/word/2010/wordprocessingShape" xmlns:wpg="http://schemas.microsoft.com/office/word/2010/wordprocessingGroup" xmlns:mc="http://schemas.openxmlformats.org/markup-compatibility/2006" xmlns:wp14="http://schemas.microsoft.com/office/word/2010/wordprocessingDrawing" xmlns:w14="http://schemas.microsoft.com/office/word/2010/wordml" xmlns:w15="http://schemas.microsoft.com/office/word/2012/wordml" w:val="0"/>
+        <w:spacing xmlns:wps="http://schemas.microsoft.com/office/word/2010/wordprocessingShape" xmlns:wpg="http://schemas.microsoft.com/office/word/2010/wordprocessingGroup" xmlns:mc="http://schemas.openxmlformats.org/markup-compatibility/2006" xmlns:wp14="http://schemas.microsoft.com/office/word/2010/wordprocessingDrawing" xmlns:w14="http://schemas.microsoft.com/office/word/2010/wordml" xmlns:w15="http://schemas.microsoft.com/office/word/2012/wordml" w:lineRule="auto" w:line="247"/>
+        <w:ind xmlns:wps="http://schemas.microsoft.com/office/word/2010/wordprocessingShape" xmlns:wpg="http://schemas.microsoft.com/office/word/2010/wordprocessingGroup" xmlns:mc="http://schemas.openxmlformats.org/markup-compatibility/2006" xmlns:wp14="http://schemas.microsoft.com/office/word/2010/wordprocessingDrawing" xmlns:w14="http://schemas.microsoft.com/office/word/2010/wordml" xmlns:w15="http://schemas.microsoft.com/office/word/2012/wordml" w:firstLine="288" w:start="100" w:end="194"/>
+        <w:jc xmlns:wps="http://schemas.microsoft.com/office/word/2010/wordprocessingShape" xmlns:wpg="http://schemas.microsoft.com/office/word/2010/wordprocessingGroup" xmlns:mc="http://schemas.openxmlformats.org/markup-compatibility/2006" xmlns:wp14="http://schemas.microsoft.com/office/word/2010/wordprocessingDrawing" xmlns:w14="http://schemas.microsoft.com/office/word/2010/wordml" xmlns:w15="http://schemas.microsoft.com/office/word/2012/wordml" w:val="start"/>
+        <w:rPr xmlns:wps="http://schemas.microsoft.com/office/word/2010/wordprocessingShape" xmlns:wpg="http://schemas.microsoft.com/office/word/2010/wordprocessingGroup" xmlns:mc="http://schemas.openxmlformats.org/markup-compatibility/2006" xmlns:wp14="http://schemas.microsoft.com/office/word/2010/wordprocessingDrawing" xmlns:w14="http://schemas.microsoft.com/office/word/2010/wordml" xmlns:w15="http://schemas.microsoft.com/office/word/2012/wordml"/>
+      </w:pPr>
+      <w:r>
+        <w:t xml:space="preserve">Действия для достижения долгосрочной устойчивости выходят за рамки мер одних городских властей и окажутся бесполезными, если в широком сообществе не произойдут сопутствующие и соразмерные изменения. Процесс с участием множества заинтересованных сторон даёт людям, организациям и крупным учреждениям города возможность участвовать в подготовке плана и высказывать своё мнение, а затем работать в своём контексте над путями его реализации. Так город и его самостоятельные движущие силы начнут действовать согласованно ради общих целей. Но и тогда синхронные действия не появятся сами по себе — они нуждаются в руководстве и организации со стороны города и заинтересованных сторон.</w:t>
       </w:r>
     </w:p>
     <w:p>
       <w:pPr>
-        <w:pStyle w:val="BodyText"/>
-      </w:pPr>
-      <w:r>
-        <w:t xml:space="preserve">Экологическая политика, маргинализующая или обедняющая группы населения или районы — местные или отдалённые — в долгосрочной перспективе обречена на неудачу. Жилищные программы, не учитывающие влияние на важные открытые пространства, водно‑болотные угодья и сельскохозяйственные земли, со временем наносят городу ущерб. Экономическое развитие, основанное на истощении природных ресурсов или эксплуатации человеческого потенциала, в итоге даёт обратный эффект: оно обедняет сообщество вместо создания реального богатства.</w:t>
+        <w:pStyle xmlns:wps="http://schemas.microsoft.com/office/word/2010/wordprocessingShape" xmlns:wpg="http://schemas.microsoft.com/office/word/2010/wordprocessingGroup" xmlns:mc="http://schemas.openxmlformats.org/markup-compatibility/2006" xmlns:wp14="http://schemas.microsoft.com/office/word/2010/wordprocessingDrawing" xmlns:w14="http://schemas.microsoft.com/office/word/2010/wordml" xmlns:w15="http://schemas.microsoft.com/office/word/2012/wordml" w:val="BodyText"/>
+        <w:bidi xmlns:wps="http://schemas.microsoft.com/office/word/2010/wordprocessingShape" xmlns:wpg="http://schemas.microsoft.com/office/word/2010/wordprocessingGroup" xmlns:mc="http://schemas.openxmlformats.org/markup-compatibility/2006" xmlns:wp14="http://schemas.microsoft.com/office/word/2010/wordprocessingDrawing" xmlns:w14="http://schemas.microsoft.com/office/word/2010/wordml" xmlns:w15="http://schemas.microsoft.com/office/word/2012/wordml" w:val="0"/>
+        <w:spacing xmlns:wps="http://schemas.microsoft.com/office/word/2010/wordprocessingShape" xmlns:wpg="http://schemas.microsoft.com/office/word/2010/wordprocessingGroup" xmlns:mc="http://schemas.openxmlformats.org/markup-compatibility/2006" xmlns:wp14="http://schemas.microsoft.com/office/word/2010/wordprocessingDrawing" xmlns:w14="http://schemas.microsoft.com/office/word/2010/wordml" xmlns:w15="http://schemas.microsoft.com/office/word/2012/wordml" w:lineRule="auto" w:line="247"/>
+        <w:ind xmlns:wps="http://schemas.microsoft.com/office/word/2010/wordprocessingShape" xmlns:wpg="http://schemas.microsoft.com/office/word/2010/wordprocessingGroup" xmlns:mc="http://schemas.openxmlformats.org/markup-compatibility/2006" xmlns:wp14="http://schemas.microsoft.com/office/word/2010/wordprocessingDrawing" xmlns:w14="http://schemas.microsoft.com/office/word/2010/wordml" xmlns:w15="http://schemas.microsoft.com/office/word/2012/wordml" w:firstLine="288" w:start="100" w:end="122"/>
+        <w:jc xmlns:wps="http://schemas.microsoft.com/office/word/2010/wordprocessingShape" xmlns:wpg="http://schemas.microsoft.com/office/word/2010/wordprocessingGroup" xmlns:mc="http://schemas.openxmlformats.org/markup-compatibility/2006" xmlns:wp14="http://schemas.microsoft.com/office/word/2010/wordprocessingDrawing" xmlns:w14="http://schemas.microsoft.com/office/word/2010/wordml" xmlns:w15="http://schemas.microsoft.com/office/word/2012/wordml" w:val="start"/>
+        <w:rPr xmlns:wps="http://schemas.microsoft.com/office/word/2010/wordprocessingShape" xmlns:wpg="http://schemas.microsoft.com/office/word/2010/wordprocessingGroup" xmlns:mc="http://schemas.openxmlformats.org/markup-compatibility/2006" xmlns:wp14="http://schemas.microsoft.com/office/word/2010/wordprocessingDrawing" xmlns:w14="http://schemas.microsoft.com/office/word/2010/wordml" xmlns:w15="http://schemas.microsoft.com/office/word/2012/wordml"/>
+      </w:pPr>
+      <w:r>
+        <w:t xml:space="preserve">Интеграция и долгосрочный горизонт планирования важнее для достижения городских целей, чем отдельный фокус на таких вопросах, как изменение климата, здравоохранение или развитие местной экономики. Эти вопросы важны, но любые меры окажутся неэффективны, если их принимать поодиночке. Интегрированный подход связывает разные сферы, социально‑экономические границы и городские ведомства.</w:t>
       </w:r>
     </w:p>
     <w:p>
       <w:pPr>
-        <w:pStyle w:val="BodyText"/>
-      </w:pPr>
-      <w:r>
-        <w:t xml:space="preserve">Если спросить некоторых мэров или членов городских советов, какое влияние они оказывают на экономику, они, вероятно, будут озадачены. Некоторые пошли так далеко, что строили промышленную инфраструктуру в надежде вернуть рабочие места промышленного века, не учитывая глобальные тренды, из‑за которых производство переместилось в другие части света.</w:t>
+        <w:pStyle xmlns:wps="http://schemas.microsoft.com/office/word/2010/wordprocessingShape" xmlns:wpg="http://schemas.microsoft.com/office/word/2010/wordprocessingGroup" xmlns:mc="http://schemas.openxmlformats.org/markup-compatibility/2006" xmlns:wp14="http://schemas.microsoft.com/office/word/2010/wordprocessingDrawing" xmlns:w14="http://schemas.microsoft.com/office/word/2010/wordml" xmlns:w15="http://schemas.microsoft.com/office/word/2012/wordml" w:val="BodyText"/>
+        <w:bidi xmlns:wps="http://schemas.microsoft.com/office/word/2010/wordprocessingShape" xmlns:wpg="http://schemas.microsoft.com/office/word/2010/wordprocessingGroup" xmlns:mc="http://schemas.openxmlformats.org/markup-compatibility/2006" xmlns:wp14="http://schemas.microsoft.com/office/word/2010/wordprocessingDrawing" xmlns:w14="http://schemas.microsoft.com/office/word/2010/wordml" xmlns:w15="http://schemas.microsoft.com/office/word/2012/wordml" w:val="0"/>
+        <w:spacing xmlns:wps="http://schemas.microsoft.com/office/word/2010/wordprocessingShape" xmlns:wpg="http://schemas.microsoft.com/office/word/2010/wordprocessingGroup" xmlns:mc="http://schemas.openxmlformats.org/markup-compatibility/2006" xmlns:wp14="http://schemas.microsoft.com/office/word/2010/wordprocessingDrawing" xmlns:w14="http://schemas.microsoft.com/office/word/2010/wordml" xmlns:w15="http://schemas.microsoft.com/office/word/2012/wordml" w:lineRule="exact" w:line="320"/>
+        <w:ind xmlns:wps="http://schemas.microsoft.com/office/word/2010/wordprocessingShape" xmlns:wpg="http://schemas.microsoft.com/office/word/2010/wordprocessingGroup" xmlns:mc="http://schemas.openxmlformats.org/markup-compatibility/2006" xmlns:wp14="http://schemas.microsoft.com/office/word/2010/wordprocessingDrawing" xmlns:w14="http://schemas.microsoft.com/office/word/2010/wordml" xmlns:w15="http://schemas.microsoft.com/office/word/2012/wordml" w:start="388" w:end="0"/>
+        <w:jc xmlns:wps="http://schemas.microsoft.com/office/word/2010/wordprocessingShape" xmlns:wpg="http://schemas.microsoft.com/office/word/2010/wordprocessingGroup" xmlns:mc="http://schemas.openxmlformats.org/markup-compatibility/2006" xmlns:wp14="http://schemas.microsoft.com/office/word/2010/wordprocessingDrawing" xmlns:w14="http://schemas.microsoft.com/office/word/2010/wordml" xmlns:w15="http://schemas.microsoft.com/office/word/2012/wordml" w:val="start"/>
+        <w:rPr xmlns:wps="http://schemas.microsoft.com/office/word/2010/wordprocessingShape" xmlns:wpg="http://schemas.microsoft.com/office/word/2010/wordprocessingGroup" xmlns:mc="http://schemas.openxmlformats.org/markup-compatibility/2006" xmlns:wp14="http://schemas.microsoft.com/office/word/2010/wordprocessingDrawing" xmlns:w14="http://schemas.microsoft.com/office/word/2010/wordml" xmlns:w15="http://schemas.microsoft.com/office/word/2012/wordml"/>
+      </w:pPr>
+      <w:r>
+        <w:t xml:space="preserve">Это также помогает гарантировать, что достижение одной цели не будет происходить за счёт другой.</w:t>
       </w:r>
     </w:p>
     <w:p>
       <w:pPr>
-        <w:pStyle w:val="BodyText"/>
-      </w:pPr>
-      <w:r>
-        <w:t xml:space="preserve">Другие возлагают надежды на маркетинговые усилия местной торговой палаты, которая активно участвует в выставках и размещает рекламу, продвигая регион как благоприятный для бизнеса.</w:t>
+        <w:pStyle xmlns:wps="http://schemas.microsoft.com/office/word/2010/wordprocessingShape" xmlns:wpg="http://schemas.microsoft.com/office/word/2010/wordprocessingGroup" xmlns:mc="http://schemas.openxmlformats.org/markup-compatibility/2006" xmlns:wp14="http://schemas.microsoft.com/office/word/2010/wordprocessingDrawing" xmlns:w14="http://schemas.microsoft.com/office/word/2010/wordml" xmlns:w15="http://schemas.microsoft.com/office/word/2012/wordml" w:val="BodyText"/>
+        <w:bidi xmlns:wps="http://schemas.microsoft.com/office/word/2010/wordprocessingShape" xmlns:wpg="http://schemas.microsoft.com/office/word/2010/wordprocessingGroup" xmlns:mc="http://schemas.openxmlformats.org/markup-compatibility/2006" xmlns:wp14="http://schemas.microsoft.com/office/word/2010/wordprocessingDrawing" xmlns:w14="http://schemas.microsoft.com/office/word/2010/wordml" xmlns:w15="http://schemas.microsoft.com/office/word/2012/wordml" w:val="0"/>
+        <w:spacing xmlns:wps="http://schemas.microsoft.com/office/word/2010/wordprocessingShape" xmlns:wpg="http://schemas.microsoft.com/office/word/2010/wordprocessingGroup" xmlns:mc="http://schemas.openxmlformats.org/markup-compatibility/2006" xmlns:wp14="http://schemas.microsoft.com/office/word/2010/wordprocessingDrawing" xmlns:w14="http://schemas.microsoft.com/office/word/2010/wordml" xmlns:w15="http://schemas.microsoft.com/office/word/2012/wordml" w:lineRule="auto" w:line="247" w:before="1" w:after="0"/>
+        <w:ind xmlns:wps="http://schemas.microsoft.com/office/word/2010/wordprocessingShape" xmlns:wpg="http://schemas.microsoft.com/office/word/2010/wordprocessingGroup" xmlns:mc="http://schemas.openxmlformats.org/markup-compatibility/2006" xmlns:wp14="http://schemas.microsoft.com/office/word/2010/wordprocessingDrawing" xmlns:w14="http://schemas.microsoft.com/office/word/2010/wordml" xmlns:w15="http://schemas.microsoft.com/office/word/2012/wordml" w:start="100" w:end="122"/>
+        <w:jc xmlns:wps="http://schemas.microsoft.com/office/word/2010/wordprocessingShape" xmlns:wpg="http://schemas.microsoft.com/office/word/2010/wordprocessingGroup" xmlns:mc="http://schemas.openxmlformats.org/markup-compatibility/2006" xmlns:wp14="http://schemas.microsoft.com/office/word/2010/wordprocessingDrawing" xmlns:w14="http://schemas.microsoft.com/office/word/2010/wordml" xmlns:w15="http://schemas.microsoft.com/office/word/2012/wordml" w:val="start"/>
+        <w:rPr xmlns:wps="http://schemas.microsoft.com/office/word/2010/wordprocessingShape" xmlns:wpg="http://schemas.microsoft.com/office/word/2010/wordprocessingGroup" xmlns:mc="http://schemas.openxmlformats.org/markup-compatibility/2006" xmlns:wp14="http://schemas.microsoft.com/office/word/2010/wordprocessingDrawing" xmlns:w14="http://schemas.microsoft.com/office/word/2010/wordml" xmlns:w15="http://schemas.microsoft.com/office/word/2012/wordml"/>
+      </w:pPr>
+      <w:r>
+        <w:t xml:space="preserve">Экологическая политика, маргинализирующая или обедняющая группы людей или районы — будь то в городе или в других частях мира — в долгосрочной перспективе не даст результата. Планы жилищного строительства, игнорирующие влияние на ценные открытые пространства, водно‑болотные угодья и сельскохозяйственные земли, в перспективе повредят городу. Меры экономического развития, основанные на неустойчивой эксплуатации природных ресурсов или трудового потенциала, в итоге дадут обратный эффект — усилят бедность вместо создания реального благосостояния.</w:t>
       </w:r>
     </w:p>
     <w:p>
       <w:pPr>
-        <w:pStyle w:val="BodyText"/>
-      </w:pPr>
-      <w:r>
-        <w:t xml:space="preserve">Некоторые из наиболее прогрессивных городских властей создали револьверные фонды кредитования, выступающие в роли кредитора последней инстанции для местных предприятий, испытывающих трудности с ликвидностью или ростом. Они организуют бизнес-инкубаторы, предоставляют услуги по составлению бизнес-планов и иногда помогают найти источники венчурного капитала для стартапов. Многие власти понимают важность местного бизнеса, но по-прежнему боятся занять твердую позицию, когда крупные компании угрожают вытеснить мелких предпринимателей с рынка.</w:t>
+        <w:pStyle xmlns:wps="http://schemas.microsoft.com/office/word/2010/wordprocessingShape" xmlns:wpg="http://schemas.microsoft.com/office/word/2010/wordprocessingGroup" xmlns:mc="http://schemas.openxmlformats.org/markup-compatibility/2006" xmlns:wp14="http://schemas.microsoft.com/office/word/2010/wordprocessingDrawing" xmlns:w14="http://schemas.microsoft.com/office/word/2010/wordml" xmlns:w15="http://schemas.microsoft.com/office/word/2012/wordml" w:val="BodyText"/>
+        <w:bidi xmlns:wps="http://schemas.microsoft.com/office/word/2010/wordprocessingShape" xmlns:wpg="http://schemas.microsoft.com/office/word/2010/wordprocessingGroup" xmlns:mc="http://schemas.openxmlformats.org/markup-compatibility/2006" xmlns:wp14="http://schemas.microsoft.com/office/word/2010/wordprocessingDrawing" xmlns:w14="http://schemas.microsoft.com/office/word/2010/wordml" xmlns:w15="http://schemas.microsoft.com/office/word/2012/wordml" w:val="0"/>
+        <w:spacing xmlns:wps="http://schemas.microsoft.com/office/word/2010/wordprocessingShape" xmlns:wpg="http://schemas.microsoft.com/office/word/2010/wordprocessingGroup" xmlns:mc="http://schemas.openxmlformats.org/markup-compatibility/2006" xmlns:wp14="http://schemas.microsoft.com/office/word/2010/wordprocessingDrawing" xmlns:w14="http://schemas.microsoft.com/office/word/2010/wordml" xmlns:w15="http://schemas.microsoft.com/office/word/2012/wordml" w:lineRule="auto" w:line="247"/>
+        <w:ind xmlns:wps="http://schemas.microsoft.com/office/word/2010/wordprocessingShape" xmlns:wpg="http://schemas.microsoft.com/office/word/2010/wordprocessingGroup" xmlns:mc="http://schemas.openxmlformats.org/markup-compatibility/2006" xmlns:wp14="http://schemas.microsoft.com/office/word/2010/wordprocessingDrawing" xmlns:w14="http://schemas.microsoft.com/office/word/2010/wordml" xmlns:w15="http://schemas.microsoft.com/office/word/2012/wordml" w:firstLine="288" w:start="100" w:end="122"/>
+        <w:jc xmlns:wps="http://schemas.microsoft.com/office/word/2010/wordprocessingShape" xmlns:wpg="http://schemas.microsoft.com/office/word/2010/wordprocessingGroup" xmlns:mc="http://schemas.openxmlformats.org/markup-compatibility/2006" xmlns:wp14="http://schemas.microsoft.com/office/word/2010/wordprocessingDrawing" xmlns:w14="http://schemas.microsoft.com/office/word/2010/wordml" xmlns:w15="http://schemas.microsoft.com/office/word/2012/wordml" w:val="start"/>
+        <w:rPr xmlns:wps="http://schemas.microsoft.com/office/word/2010/wordprocessingShape" xmlns:wpg="http://schemas.microsoft.com/office/word/2010/wordprocessingGroup" xmlns:mc="http://schemas.openxmlformats.org/markup-compatibility/2006" xmlns:wp14="http://schemas.microsoft.com/office/word/2010/wordprocessingDrawing" xmlns:w14="http://schemas.microsoft.com/office/word/2010/wordml" xmlns:w15="http://schemas.microsoft.com/office/word/2012/wordml"/>
+      </w:pPr>
+      <w:r>
+        <w:t xml:space="preserve">Однако если спросить некоторых мэров или членов городских советов, какое влияние они оказывают на экономику, они, скорее всего, посмотрят с недоумением. Некоторые даже строили промышленную инфраструктуру в надежде привлечь производственные предприятия с высокооплачиваемыми рабочими местами XIX–XX веков, не замечая глобальных тенденций, по которым большая часть производства ушла в другие регионы.</w:t>
       </w:r>
     </w:p>
     <w:p>
       <w:pPr>
-        <w:pStyle w:val="BodyText"/>
-      </w:pPr>
-      <w:r>
-        <w:t xml:space="preserve">Большинство местных органов власти полагают, что все рабочие места равны, и что любая новая налоговая база священна. Экономика выступает хозяином, а местные сообщества — слугами, готовыми на всё ради инвесторов, даже если деловые практики последних вызывают сомнения.</w:t>
+        <w:pStyle xmlns:wps="http://schemas.microsoft.com/office/word/2010/wordprocessingShape" xmlns:wpg="http://schemas.microsoft.com/office/word/2010/wordprocessingGroup" xmlns:mc="http://schemas.openxmlformats.org/markup-compatibility/2006" xmlns:wp14="http://schemas.microsoft.com/office/word/2010/wordprocessingDrawing" xmlns:w14="http://schemas.microsoft.com/office/word/2010/wordml" xmlns:w15="http://schemas.microsoft.com/office/word/2012/wordml" w:val="BodyText"/>
+        <w:bidi xmlns:wps="http://schemas.microsoft.com/office/word/2010/wordprocessingShape" xmlns:wpg="http://schemas.microsoft.com/office/word/2010/wordprocessingGroup" xmlns:mc="http://schemas.openxmlformats.org/markup-compatibility/2006" xmlns:wp14="http://schemas.microsoft.com/office/word/2010/wordprocessingDrawing" xmlns:w14="http://schemas.microsoft.com/office/word/2010/wordml" xmlns:w15="http://schemas.microsoft.com/office/word/2012/wordml" w:val="0"/>
+        <w:spacing xmlns:wps="http://schemas.microsoft.com/office/word/2010/wordprocessingShape" xmlns:wpg="http://schemas.microsoft.com/office/word/2010/wordprocessingGroup" xmlns:mc="http://schemas.openxmlformats.org/markup-compatibility/2006" xmlns:wp14="http://schemas.microsoft.com/office/word/2010/wordprocessingDrawing" xmlns:w14="http://schemas.microsoft.com/office/word/2010/wordml" xmlns:w15="http://schemas.microsoft.com/office/word/2012/wordml" w:lineRule="auto" w:line="247"/>
+        <w:ind xmlns:wps="http://schemas.microsoft.com/office/word/2010/wordprocessingShape" xmlns:wpg="http://schemas.microsoft.com/office/word/2010/wordprocessingGroup" xmlns:mc="http://schemas.openxmlformats.org/markup-compatibility/2006" xmlns:wp14="http://schemas.microsoft.com/office/word/2010/wordprocessingDrawing" xmlns:w14="http://schemas.microsoft.com/office/word/2010/wordml" xmlns:w15="http://schemas.microsoft.com/office/word/2012/wordml" w:start="100" w:end="122"/>
+        <w:jc xmlns:wps="http://schemas.microsoft.com/office/word/2010/wordprocessingShape" xmlns:wpg="http://schemas.microsoft.com/office/word/2010/wordprocessingGroup" xmlns:mc="http://schemas.openxmlformats.org/markup-compatibility/2006" xmlns:wp14="http://schemas.microsoft.com/office/word/2010/wordprocessingDrawing" xmlns:w14="http://schemas.microsoft.com/office/word/2010/wordml" xmlns:w15="http://schemas.microsoft.com/office/word/2012/wordml" w:val="start"/>
+        <w:rPr xmlns:wps="http://schemas.microsoft.com/office/word/2010/wordprocessingShape" xmlns:wpg="http://schemas.microsoft.com/office/word/2010/wordprocessingGroup" xmlns:mc="http://schemas.openxmlformats.org/markup-compatibility/2006" xmlns:wp14="http://schemas.microsoft.com/office/word/2010/wordprocessingDrawing" xmlns:w14="http://schemas.microsoft.com/office/word/2010/wordml" xmlns:w15="http://schemas.microsoft.com/office/word/2012/wordml"/>
+      </w:pPr>
+      <w:r>
+        <w:t xml:space="preserve">Другие надеются на маркетинговые усилия местной торговой палаты: она активно участвует в выставках и размещает рекламу, продвигая регион как благоприятный для бизнеса.</w:t>
       </w:r>
     </w:p>
     <w:p>
       <w:pPr>
-        <w:pStyle w:val="BodyText"/>
-      </w:pPr>
-      <w:r>
-        <w:t xml:space="preserve">Переосмысление понятия богатства и переориентация местных инициатив на удовлетворение человеческих потребностей помогут лидерам рассматривать экономику как средство служения сообществу, а не наоборот. Существуют разные формы капитала, которые требуют инвестиций для процветания местного сообщества, а не только финансовый капитал. Социальный капитал, человеческий капитал, природный капитал, институциональный капитал, технологический капитал, обменный потенциал, построенный капитал и культурный капитал — всё это нужно понимать и укреплять, и эти многоплановые усилия — исключительная прерогатива местных сообществ.</w:t>
-      </w:r>
-    </w:p>
-    <w:bookmarkEnd w:id="22"/>
-    <w:bookmarkEnd w:id="23"/>
-    <w:bookmarkStart w:id="24" w:name="X13e97629671b86903ae5110e61ebaefa82d689e"/>
-    <w:p>
-      <w:pPr>
-        <w:pStyle w:val="Heading2"/>
-      </w:pPr>
-      <w:r>
-        <w:t xml:space="preserve">Миф (и потенциал) индивидуального богатства</w:t>
+        <w:pStyle xmlns:wps="http://schemas.microsoft.com/office/word/2010/wordprocessingShape" xmlns:wpg="http://schemas.microsoft.com/office/word/2010/wordprocessingGroup" xmlns:mc="http://schemas.openxmlformats.org/markup-compatibility/2006" xmlns:wp14="http://schemas.microsoft.com/office/word/2010/wordprocessingDrawing" xmlns:w14="http://schemas.microsoft.com/office/word/2010/wordml" xmlns:w15="http://schemas.microsoft.com/office/word/2012/wordml" w:val="BodyText"/>
+        <w:bidi xmlns:wps="http://schemas.microsoft.com/office/word/2010/wordprocessingShape" xmlns:wpg="http://schemas.microsoft.com/office/word/2010/wordprocessingGroup" xmlns:mc="http://schemas.openxmlformats.org/markup-compatibility/2006" xmlns:wp14="http://schemas.microsoft.com/office/word/2010/wordprocessingDrawing" xmlns:w14="http://schemas.microsoft.com/office/word/2010/wordml" xmlns:w15="http://schemas.microsoft.com/office/word/2012/wordml" w:val="0"/>
+        <w:spacing xmlns:wps="http://schemas.microsoft.com/office/word/2010/wordprocessingShape" xmlns:wpg="http://schemas.microsoft.com/office/word/2010/wordprocessingGroup" xmlns:mc="http://schemas.openxmlformats.org/markup-compatibility/2006" xmlns:wp14="http://schemas.microsoft.com/office/word/2010/wordprocessingDrawing" xmlns:w14="http://schemas.microsoft.com/office/word/2010/wordml" xmlns:w15="http://schemas.microsoft.com/office/word/2012/wordml" w:lineRule="auto" w:line="247"/>
+        <w:ind xmlns:wps="http://schemas.microsoft.com/office/word/2010/wordprocessingShape" xmlns:wpg="http://schemas.microsoft.com/office/word/2010/wordprocessingGroup" xmlns:mc="http://schemas.openxmlformats.org/markup-compatibility/2006" xmlns:wp14="http://schemas.microsoft.com/office/word/2010/wordprocessingDrawing" xmlns:w14="http://schemas.microsoft.com/office/word/2010/wordml" xmlns:w15="http://schemas.microsoft.com/office/word/2012/wordml" w:firstLine="288" w:start="100" w:end="122"/>
+        <w:jc xmlns:wps="http://schemas.microsoft.com/office/word/2010/wordprocessingShape" xmlns:wpg="http://schemas.microsoft.com/office/word/2010/wordprocessingGroup" xmlns:mc="http://schemas.openxmlformats.org/markup-compatibility/2006" xmlns:wp14="http://schemas.microsoft.com/office/word/2010/wordprocessingDrawing" xmlns:w14="http://schemas.microsoft.com/office/word/2010/wordml" xmlns:w15="http://schemas.microsoft.com/office/word/2012/wordml" w:val="start"/>
+        <w:rPr xmlns:wps="http://schemas.microsoft.com/office/word/2010/wordprocessingShape" xmlns:wpg="http://schemas.microsoft.com/office/word/2010/wordprocessingGroup" xmlns:mc="http://schemas.openxmlformats.org/markup-compatibility/2006" xmlns:wp14="http://schemas.microsoft.com/office/word/2010/wordprocessingDrawing" xmlns:w14="http://schemas.microsoft.com/office/word/2010/wordml" xmlns:w15="http://schemas.microsoft.com/office/word/2012/wordml"/>
+      </w:pPr>
+      <w:r>
+        <w:t xml:space="preserve">Некоторые из самых прогрессивных муниципалитетов создали фонды возобновляемых кредитов — кредиторов последней инстанции для местных предприятий с проблемами денежного потока или роста. Они создают бизнес-инкубаторы, помогают с бизнес-планированием и порой находят источники венчурного капитала для стартапов. Многие власти понимают важность локального бизнеса, но по-прежнему боятся занять твердую позицию, когда крупные компании угрожают вытеснить с рынка мелкие предприятия.</w:t>
       </w:r>
     </w:p>
     <w:p>
       <w:pPr>
-        <w:pStyle w:val="FirstParagraph"/>
+        <w:pStyle xmlns:wps="http://schemas.microsoft.com/office/word/2010/wordprocessingShape" xmlns:wpg="http://schemas.microsoft.com/office/word/2010/wordprocessingGroup" xmlns:mc="http://schemas.openxmlformats.org/markup-compatibility/2006" xmlns:wp14="http://schemas.microsoft.com/office/word/2010/wordprocessingDrawing" xmlns:w14="http://schemas.microsoft.com/office/word/2010/wordml" xmlns:w15="http://schemas.microsoft.com/office/word/2012/wordml" w:val="BodyText"/>
+        <w:bidi xmlns:wps="http://schemas.microsoft.com/office/word/2010/wordprocessingShape" xmlns:wpg="http://schemas.microsoft.com/office/word/2010/wordprocessingGroup" xmlns:mc="http://schemas.openxmlformats.org/markup-compatibility/2006" xmlns:wp14="http://schemas.microsoft.com/office/word/2010/wordprocessingDrawing" xmlns:w14="http://schemas.microsoft.com/office/word/2010/wordml" xmlns:w15="http://schemas.microsoft.com/office/word/2012/wordml" w:val="0"/>
+        <w:spacing xmlns:wps="http://schemas.microsoft.com/office/word/2010/wordprocessingShape" xmlns:wpg="http://schemas.microsoft.com/office/word/2010/wordprocessingGroup" xmlns:mc="http://schemas.openxmlformats.org/markup-compatibility/2006" xmlns:wp14="http://schemas.microsoft.com/office/word/2010/wordprocessingDrawing" xmlns:w14="http://schemas.microsoft.com/office/word/2010/wordml" xmlns:w15="http://schemas.microsoft.com/office/word/2012/wordml" w:lineRule="auto" w:line="247"/>
+        <w:ind xmlns:wps="http://schemas.microsoft.com/office/word/2010/wordprocessingShape" xmlns:wpg="http://schemas.microsoft.com/office/word/2010/wordprocessingGroup" xmlns:mc="http://schemas.openxmlformats.org/markup-compatibility/2006" xmlns:wp14="http://schemas.microsoft.com/office/word/2010/wordprocessingDrawing" xmlns:w14="http://schemas.microsoft.com/office/word/2010/wordml" xmlns:w15="http://schemas.microsoft.com/office/word/2012/wordml" w:start="100" w:end="122"/>
+        <w:jc xmlns:wps="http://schemas.microsoft.com/office/word/2010/wordprocessingShape" xmlns:wpg="http://schemas.microsoft.com/office/word/2010/wordprocessingGroup" xmlns:mc="http://schemas.openxmlformats.org/markup-compatibility/2006" xmlns:wp14="http://schemas.microsoft.com/office/word/2010/wordprocessingDrawing" xmlns:w14="http://schemas.microsoft.com/office/word/2010/wordml" xmlns:w15="http://schemas.microsoft.com/office/word/2012/wordml" w:val="start"/>
+        <w:rPr xmlns:wps="http://schemas.microsoft.com/office/word/2010/wordprocessingShape" xmlns:wpg="http://schemas.microsoft.com/office/word/2010/wordprocessingGroup" xmlns:mc="http://schemas.openxmlformats.org/markup-compatibility/2006" xmlns:wp14="http://schemas.microsoft.com/office/word/2010/wordprocessingDrawing" xmlns:w14="http://schemas.microsoft.com/office/word/2010/wordml" xmlns:w15="http://schemas.microsoft.com/office/word/2012/wordml"/>
+      </w:pPr>
+      <w:r>
+        <w:t xml:space="preserve">Многие муниципальные органы считают, что все рабочие места одинаково ценны, а новые налоговые базы — священны. Экономика — хозяин, а сообщества — слуги, готовые на всё ради инвесторов, даже если деловые практики последних вызывают сомнения.</w:t>
+      </w:r>
+    </w:p>
+    <w:p>
+      <w:pPr>
+        <w:pStyle xmlns:wps="http://schemas.microsoft.com/office/word/2010/wordprocessingShape" xmlns:wpg="http://schemas.microsoft.com/office/word/2010/wordprocessingGroup" xmlns:mc="http://schemas.openxmlformats.org/markup-compatibility/2006" xmlns:wp14="http://schemas.microsoft.com/office/word/2010/wordprocessingDrawing" xmlns:w14="http://schemas.microsoft.com/office/word/2010/wordml" xmlns:w15="http://schemas.microsoft.com/office/word/2012/wordml" w:val="BodyText"/>
+        <w:bidi xmlns:wps="http://schemas.microsoft.com/office/word/2010/wordprocessingShape" xmlns:wpg="http://schemas.microsoft.com/office/word/2010/wordprocessingGroup" xmlns:mc="http://schemas.openxmlformats.org/markup-compatibility/2006" xmlns:wp14="http://schemas.microsoft.com/office/word/2010/wordprocessingDrawing" xmlns:w14="http://schemas.microsoft.com/office/word/2010/wordml" xmlns:w15="http://schemas.microsoft.com/office/word/2012/wordml" w:val="0"/>
+        <w:spacing xmlns:wps="http://schemas.microsoft.com/office/word/2010/wordprocessingShape" xmlns:wpg="http://schemas.microsoft.com/office/word/2010/wordprocessingGroup" xmlns:mc="http://schemas.openxmlformats.org/markup-compatibility/2006" xmlns:wp14="http://schemas.microsoft.com/office/word/2010/wordprocessingDrawing" xmlns:w14="http://schemas.microsoft.com/office/word/2010/wordml" xmlns:w15="http://schemas.microsoft.com/office/word/2012/wordml" w:lineRule="auto" w:line="247" w:before="0" w:after="0"/>
+        <w:ind xmlns:wps="http://schemas.microsoft.com/office/word/2010/wordprocessingShape" xmlns:wpg="http://schemas.microsoft.com/office/word/2010/wordprocessingGroup" xmlns:mc="http://schemas.openxmlformats.org/markup-compatibility/2006" xmlns:wp14="http://schemas.microsoft.com/office/word/2010/wordprocessingDrawing" xmlns:w14="http://schemas.microsoft.com/office/word/2010/wordml" xmlns:w15="http://schemas.microsoft.com/office/word/2012/wordml" w:firstLine="288" w:start="100" w:end="122"/>
+        <w:jc xmlns:wps="http://schemas.microsoft.com/office/word/2010/wordprocessingShape" xmlns:wpg="http://schemas.microsoft.com/office/word/2010/wordprocessingGroup" xmlns:mc="http://schemas.openxmlformats.org/markup-compatibility/2006" xmlns:wp14="http://schemas.microsoft.com/office/word/2010/wordprocessingDrawing" xmlns:w14="http://schemas.microsoft.com/office/word/2010/wordml" xmlns:w15="http://schemas.microsoft.com/office/word/2012/wordml" w:val="start"/>
+        <w:rPr xmlns:wps="http://schemas.microsoft.com/office/word/2010/wordprocessingShape" xmlns:wpg="http://schemas.microsoft.com/office/word/2010/wordprocessingGroup" xmlns:mc="http://schemas.openxmlformats.org/markup-compatibility/2006" xmlns:wp14="http://schemas.microsoft.com/office/word/2010/wordprocessingDrawing" xmlns:w14="http://schemas.microsoft.com/office/word/2010/wordml" xmlns:w15="http://schemas.microsoft.com/office/word/2012/wordml"/>
+      </w:pPr>
+      <w:r>
+        <w:t xml:space="preserve">Переосмысление понятия богатства и переориентация местных инициатив на удовлетворение человеческих потребностей помогут лидерам увидеть экономику как средство служения сообществу, а не наоборот. Существуют</w:t>
+      </w:r>
+    </w:p>
+    <w:p>
+      <w:pPr>
+        <w:pStyle xmlns:wps="http://schemas.microsoft.com/office/word/2010/wordprocessingShape" xmlns:wpg="http://schemas.microsoft.com/office/word/2010/wordprocessingGroup" xmlns:mc="http://schemas.openxmlformats.org/markup-compatibility/2006" xmlns:wp14="http://schemas.microsoft.com/office/word/2010/wordprocessingDrawing" xmlns:w14="http://schemas.microsoft.com/office/word/2010/wordml" xmlns:w15="http://schemas.microsoft.com/office/word/2012/wordml" w:val="BodyText"/>
+        <w:bidi xmlns:wps="http://schemas.microsoft.com/office/word/2010/wordprocessingShape" xmlns:wpg="http://schemas.microsoft.com/office/word/2010/wordprocessingGroup" xmlns:mc="http://schemas.openxmlformats.org/markup-compatibility/2006" xmlns:wp14="http://schemas.microsoft.com/office/word/2010/wordprocessingDrawing" xmlns:w14="http://schemas.microsoft.com/office/word/2010/wordml" xmlns:w15="http://schemas.microsoft.com/office/word/2012/wordml" w:val="0"/>
+        <w:spacing xmlns:wps="http://schemas.microsoft.com/office/word/2010/wordprocessingShape" xmlns:wpg="http://schemas.microsoft.com/office/word/2010/wordprocessingGroup" xmlns:mc="http://schemas.openxmlformats.org/markup-compatibility/2006" xmlns:wp14="http://schemas.microsoft.com/office/word/2010/wordprocessingDrawing" xmlns:w14="http://schemas.microsoft.com/office/word/2010/wordml" xmlns:w15="http://schemas.microsoft.com/office/word/2012/wordml" w:lineRule="auto" w:line="247" w:before="84" w:after="0"/>
+        <w:ind xmlns:wps="http://schemas.microsoft.com/office/word/2010/wordprocessingShape" xmlns:wpg="http://schemas.microsoft.com/office/word/2010/wordprocessingGroup" xmlns:mc="http://schemas.openxmlformats.org/markup-compatibility/2006" xmlns:wp14="http://schemas.microsoft.com/office/word/2010/wordprocessingDrawing" xmlns:w14="http://schemas.microsoft.com/office/word/2010/wordml" xmlns:w15="http://schemas.microsoft.com/office/word/2012/wordml" w:start="100" w:end="122"/>
+        <w:jc xmlns:wps="http://schemas.microsoft.com/office/word/2010/wordprocessingShape" xmlns:wpg="http://schemas.microsoft.com/office/word/2010/wordprocessingGroup" xmlns:mc="http://schemas.openxmlformats.org/markup-compatibility/2006" xmlns:wp14="http://schemas.microsoft.com/office/word/2010/wordprocessingDrawing" xmlns:w14="http://schemas.microsoft.com/office/word/2010/wordml" xmlns:w15="http://schemas.microsoft.com/office/word/2012/wordml" w:val="start"/>
+        <w:rPr xmlns:wps="http://schemas.microsoft.com/office/word/2010/wordprocessingShape" xmlns:wpg="http://schemas.microsoft.com/office/word/2010/wordprocessingGroup" xmlns:mc="http://schemas.openxmlformats.org/markup-compatibility/2006" xmlns:wp14="http://schemas.microsoft.com/office/word/2010/wordprocessingDrawing" xmlns:w14="http://schemas.microsoft.com/office/word/2010/wordml" xmlns:w15="http://schemas.microsoft.com/office/word/2012/wordml"/>
+      </w:pPr>
+      <w:r>
+        <w:t xml:space="preserve">многие формы капитала, требующие инвестиций для процветания местного сообщества, а не только финансовый капитал. Социальный, человеческий, природный, институциональный, технологический, потенциальный обменный, построенный и культурный — все они должны быть поняты и укреплены.</w:t>
+      </w:r>
+    </w:p>
+    <w:p>
+      <w:pPr>
+        <w:pStyle xmlns:wps="http://schemas.microsoft.com/office/word/2010/wordprocessingShape" xmlns:wpg="http://schemas.microsoft.com/office/word/2010/wordprocessingGroup" xmlns:mc="http://schemas.openxmlformats.org/markup-compatibility/2006" xmlns:wp14="http://schemas.microsoft.com/office/word/2010/wordprocessingDrawing" xmlns:w14="http://schemas.microsoft.com/office/word/2010/wordml" xmlns:w15="http://schemas.microsoft.com/office/word/2012/wordml" w:val="ListParagraph"/>
+        <w:tabs xmlns:wps="http://schemas.microsoft.com/office/word/2010/wordprocessingShape" xmlns:wpg="http://schemas.microsoft.com/office/word/2010/wordprocessingGroup" xmlns:mc="http://schemas.openxmlformats.org/markup-compatibility/2006" xmlns:wp14="http://schemas.microsoft.com/office/word/2010/wordprocessingDrawing" xmlns:w14="http://schemas.microsoft.com/office/word/2010/wordml" xmlns:w15="http://schemas.microsoft.com/office/word/2012/wordml">
+          <w:tab w:val="clear" w:pos="709"/>
+          <w:tab w:val="left" w:pos="920" w:leader="none"/>
+        </w:tabs>
+        <w:bidi xmlns:wps="http://schemas.microsoft.com/office/word/2010/wordprocessingShape" xmlns:wpg="http://schemas.microsoft.com/office/word/2010/wordprocessingGroup" xmlns:mc="http://schemas.openxmlformats.org/markup-compatibility/2006" xmlns:wp14="http://schemas.microsoft.com/office/word/2010/wordprocessingDrawing" xmlns:w14="http://schemas.microsoft.com/office/word/2010/wordml" xmlns:w15="http://schemas.microsoft.com/office/word/2012/wordml" w:val="0"/>
+        <w:spacing xmlns:wps="http://schemas.microsoft.com/office/word/2010/wordprocessingShape" xmlns:wpg="http://schemas.microsoft.com/office/word/2010/wordprocessingGroup" xmlns:mc="http://schemas.openxmlformats.org/markup-compatibility/2006" xmlns:wp14="http://schemas.microsoft.com/office/word/2010/wordprocessingDrawing" xmlns:w14="http://schemas.microsoft.com/office/word/2010/wordml" xmlns:w15="http://schemas.microsoft.com/office/word/2012/wordml" w:lineRule="exact" w:line="321" w:before="0" w:after="0"/>
+        <w:ind xmlns:wps="http://schemas.microsoft.com/office/word/2010/wordprocessingShape" xmlns:wpg="http://schemas.microsoft.com/office/word/2010/wordprocessingGroup" xmlns:mc="http://schemas.openxmlformats.org/markup-compatibility/2006" xmlns:wp14="http://schemas.microsoft.com/office/word/2010/wordprocessingDrawing" xmlns:w14="http://schemas.microsoft.com/office/word/2010/wordml" xmlns:w15="http://schemas.microsoft.com/office/word/2012/wordml" w:hanging="360" w:start="460" w:end="0"/>
+        <w:jc xmlns:wps="http://schemas.microsoft.com/office/word/2010/wordprocessingShape" xmlns:wpg="http://schemas.microsoft.com/office/word/2010/wordprocessingGroup" xmlns:mc="http://schemas.openxmlformats.org/markup-compatibility/2006" xmlns:wp14="http://schemas.microsoft.com/office/word/2010/wordprocessingDrawing" xmlns:w14="http://schemas.microsoft.com/office/word/2010/wordml" xmlns:w15="http://schemas.microsoft.com/office/word/2012/wordml" w:val="start"/>
+        <w:rPr xmlns:wps="http://schemas.microsoft.com/office/word/2010/wordprocessingShape" xmlns:wpg="http://schemas.microsoft.com/office/word/2010/wordprocessingGroup" xmlns:mc="http://schemas.openxmlformats.org/markup-compatibility/2006" xmlns:wp14="http://schemas.microsoft.com/office/word/2010/wordprocessingDrawing" xmlns:w14="http://schemas.microsoft.com/office/word/2010/wordml" xmlns:w15="http://schemas.microsoft.com/office/word/2012/wordml">
+          <w:sz w:val="28"/>
+        </w:rPr>
+        <w:numPr>
+          <w:ilvl w:val="0"/>
+          <w:numId w:val="1002"/>
+        </w:numPr>
+      </w:pPr>
+      <w:r>
+        <w:t xml:space="preserve">И эти многоплановые усилия — исключительная прерогатива местных сообществ.</w:t>
+      </w:r>
+    </w:p>
+    <w:bookmarkStart w:id="12" w:name="X13e97629671b86903ae5110e61ebaefa82d689e"/>
+    <w:p>
+      <w:pPr>
+        <w:pStyle w:val="Heading3"/>
+      </w:pPr>
+      <w:r>
+        <w:t xml:space="preserve">Миф (и потенциал) индивидуального богатства</w:t>
+      </w:r>
+    </w:p>
+    <w:p>
+      <w:pPr>
+        <w:pStyle xmlns:wps="http://schemas.microsoft.com/office/word/2010/wordprocessingShape" xmlns:wpg="http://schemas.microsoft.com/office/word/2010/wordprocessingGroup" xmlns:mc="http://schemas.openxmlformats.org/markup-compatibility/2006" xmlns:wp14="http://schemas.microsoft.com/office/word/2010/wordprocessingDrawing" xmlns:w14="http://schemas.microsoft.com/office/word/2010/wordml" xmlns:w15="http://schemas.microsoft.com/office/word/2012/wordml" w:val="BodyText"/>
+        <w:bidi xmlns:wps="http://schemas.microsoft.com/office/word/2010/wordprocessingShape" xmlns:wpg="http://schemas.microsoft.com/office/word/2010/wordprocessingGroup" xmlns:mc="http://schemas.openxmlformats.org/markup-compatibility/2006" xmlns:wp14="http://schemas.microsoft.com/office/word/2010/wordprocessingDrawing" xmlns:w14="http://schemas.microsoft.com/office/word/2010/wordml" xmlns:w15="http://schemas.microsoft.com/office/word/2012/wordml" w:val="0"/>
+        <w:spacing xmlns:wps="http://schemas.microsoft.com/office/word/2010/wordprocessingShape" xmlns:wpg="http://schemas.microsoft.com/office/word/2010/wordprocessingGroup" xmlns:mc="http://schemas.openxmlformats.org/markup-compatibility/2006" xmlns:wp14="http://schemas.microsoft.com/office/word/2010/wordprocessingDrawing" xmlns:w14="http://schemas.microsoft.com/office/word/2010/wordml" xmlns:w15="http://schemas.microsoft.com/office/word/2012/wordml" w:lineRule="auto" w:line="247" w:before="297" w:after="0"/>
+        <w:ind xmlns:wps="http://schemas.microsoft.com/office/word/2010/wordprocessingShape" xmlns:wpg="http://schemas.microsoft.com/office/word/2010/wordprocessingGroup" xmlns:mc="http://schemas.openxmlformats.org/markup-compatibility/2006" xmlns:wp14="http://schemas.microsoft.com/office/word/2010/wordprocessingDrawing" xmlns:w14="http://schemas.microsoft.com/office/word/2010/wordml" xmlns:w15="http://schemas.microsoft.com/office/word/2012/wordml" w:firstLine="3312" w:start="100" w:end="3311"/>
+        <w:jc xmlns:wps="http://schemas.microsoft.com/office/word/2010/wordprocessingShape" xmlns:wpg="http://schemas.microsoft.com/office/word/2010/wordprocessingGroup" xmlns:mc="http://schemas.openxmlformats.org/markup-compatibility/2006" xmlns:wp14="http://schemas.microsoft.com/office/word/2010/wordprocessingDrawing" xmlns:w14="http://schemas.microsoft.com/office/word/2010/wordml" xmlns:w15="http://schemas.microsoft.com/office/word/2012/wordml" w:val="start"/>
+        <w:rPr xmlns:wps="http://schemas.microsoft.com/office/word/2010/wordprocessingShape" xmlns:wpg="http://schemas.microsoft.com/office/word/2010/wordprocessingGroup" xmlns:mc="http://schemas.openxmlformats.org/markup-compatibility/2006" xmlns:wp14="http://schemas.microsoft.com/office/word/2010/wordprocessingDrawing" xmlns:w14="http://schemas.microsoft.com/office/word/2010/wordml" xmlns:w15="http://schemas.microsoft.com/office/word/2012/wordml"/>
       </w:pPr>
       <w:r>
         <w:t xml:space="preserve">До сих пор мы затронули три вещи, которые определяют наше понимание богатства:</w:t>
@@ -1204,10 +1398,7 @@
         </w:numPr>
       </w:pPr>
       <w:r>
-        <w:t xml:space="preserve">Очевидная идея обладания большим количеством денег</w:t>
-      </w:r>
-      <w:r>
-        <w:br/>
+        <w:t xml:space="preserve">Очевидная идея: обладание большим количеством денег</w:t>
       </w:r>
     </w:p>
     <w:p>
@@ -1230,66 +1421,109 @@
         </w:numPr>
       </w:pPr>
       <w:r>
-        <w:t xml:space="preserve">Благополучие, достигаемое через удовлетворение широкого спектра человеческих потребностей</w:t>
-      </w:r>
-      <w:r>
-        <w:br/>
+        <w:t xml:space="preserve">Благополучие, достигаемое удовлетворением широкого спектра человеческих потребностей</w:t>
       </w:r>
     </w:p>
     <w:p>
       <w:pPr>
-        <w:pStyle w:val="Compact"/>
+        <w:pStyle xmlns:wps="http://schemas.microsoft.com/office/word/2010/wordprocessingShape" xmlns:wpg="http://schemas.microsoft.com/office/word/2010/wordprocessingGroup" xmlns:mc="http://schemas.openxmlformats.org/markup-compatibility/2006" xmlns:wp14="http://schemas.microsoft.com/office/word/2010/wordprocessingDrawing" xmlns:w14="http://schemas.microsoft.com/office/word/2010/wordml" xmlns:w15="http://schemas.microsoft.com/office/word/2012/wordml" w:val="ListParagraph"/>
+        <w:tabs xmlns:wps="http://schemas.microsoft.com/office/word/2010/wordprocessingShape" xmlns:wpg="http://schemas.microsoft.com/office/word/2010/wordprocessingGroup" xmlns:mc="http://schemas.openxmlformats.org/markup-compatibility/2006" xmlns:wp14="http://schemas.microsoft.com/office/word/2010/wordprocessingDrawing" xmlns:w14="http://schemas.microsoft.com/office/word/2010/wordml" xmlns:w15="http://schemas.microsoft.com/office/word/2012/wordml">
+          <w:tab w:val="clear" w:pos="709"/>
+          <w:tab w:val="left" w:pos="1898" w:leader="none"/>
+        </w:tabs>
+        <w:bidi xmlns:wps="http://schemas.microsoft.com/office/word/2010/wordprocessingShape" xmlns:wpg="http://schemas.microsoft.com/office/word/2010/wordprocessingGroup" xmlns:mc="http://schemas.openxmlformats.org/markup-compatibility/2006" xmlns:wp14="http://schemas.microsoft.com/office/word/2010/wordprocessingDrawing" xmlns:w14="http://schemas.microsoft.com/office/word/2010/wordml" xmlns:w15="http://schemas.microsoft.com/office/word/2012/wordml" w:val="0"/>
+        <w:spacing xmlns:wps="http://schemas.microsoft.com/office/word/2010/wordprocessingShape" xmlns:wpg="http://schemas.microsoft.com/office/word/2010/wordprocessingGroup" xmlns:mc="http://schemas.openxmlformats.org/markup-compatibility/2006" xmlns:wp14="http://schemas.microsoft.com/office/word/2010/wordprocessingDrawing" xmlns:w14="http://schemas.microsoft.com/office/word/2010/wordml" xmlns:w15="http://schemas.microsoft.com/office/word/2012/wordml" w:lineRule="auto" w:line="240" w:before="10" w:after="0"/>
+        <w:ind xmlns:wps="http://schemas.microsoft.com/office/word/2010/wordprocessingShape" xmlns:wpg="http://schemas.microsoft.com/office/word/2010/wordprocessingGroup" xmlns:mc="http://schemas.openxmlformats.org/markup-compatibility/2006" xmlns:wp14="http://schemas.microsoft.com/office/word/2010/wordprocessingDrawing" xmlns:w14="http://schemas.microsoft.com/office/word/2010/wordml" xmlns:w15="http://schemas.microsoft.com/office/word/2012/wordml" w:hanging="273" w:start="949" w:end="0"/>
+        <w:jc xmlns:wps="http://schemas.microsoft.com/office/word/2010/wordprocessingShape" xmlns:wpg="http://schemas.microsoft.com/office/word/2010/wordprocessingGroup" xmlns:mc="http://schemas.openxmlformats.org/markup-compatibility/2006" xmlns:wp14="http://schemas.microsoft.com/office/word/2010/wordprocessingDrawing" xmlns:w14="http://schemas.microsoft.com/office/word/2010/wordml" xmlns:w15="http://schemas.microsoft.com/office/word/2012/wordml" w:val="start"/>
+        <w:rPr xmlns:wps="http://schemas.microsoft.com/office/word/2010/wordprocessingShape" xmlns:wpg="http://schemas.microsoft.com/office/word/2010/wordprocessingGroup" xmlns:mc="http://schemas.openxmlformats.org/markup-compatibility/2006" xmlns:wp14="http://schemas.microsoft.com/office/word/2010/wordprocessingDrawing" xmlns:w14="http://schemas.microsoft.com/office/word/2010/wordml" xmlns:w15="http://schemas.microsoft.com/office/word/2012/wordml">
+          <w:sz w:val="28"/>
+        </w:rPr>
+        <w:numPr>
+          <w:ilvl w:val="1"/>
+          <w:numId w:val="1002"/>
+        </w:numPr>
+      </w:pPr>
+      <w:r>
+        <w:t xml:space="preserve">Социальные системы, созданные для удовлетворения наших потребностей</w:t>
+      </w:r>
+    </w:p>
+    <w:p>
+      <w:pPr>
+        <w:pStyle xmlns:wps="http://schemas.microsoft.com/office/word/2010/wordprocessingShape" xmlns:wpg="http://schemas.microsoft.com/office/word/2010/wordprocessingGroup" xmlns:mc="http://schemas.openxmlformats.org/markup-compatibility/2006" xmlns:wp14="http://schemas.microsoft.com/office/word/2010/wordprocessingDrawing" xmlns:w14="http://schemas.microsoft.com/office/word/2010/wordml" xmlns:w15="http://schemas.microsoft.com/office/word/2012/wordml" w:val="BodyText"/>
+        <w:bidi xmlns:wps="http://schemas.microsoft.com/office/word/2010/wordprocessingShape" xmlns:wpg="http://schemas.microsoft.com/office/word/2010/wordprocessingGroup" xmlns:mc="http://schemas.openxmlformats.org/markup-compatibility/2006" xmlns:wp14="http://schemas.microsoft.com/office/word/2010/wordprocessingDrawing" xmlns:w14="http://schemas.microsoft.com/office/word/2010/wordml" xmlns:w15="http://schemas.microsoft.com/office/word/2012/wordml" w:val="0"/>
+        <w:spacing xmlns:wps="http://schemas.microsoft.com/office/word/2010/wordprocessingShape" xmlns:wpg="http://schemas.microsoft.com/office/word/2010/wordprocessingGroup" xmlns:mc="http://schemas.openxmlformats.org/markup-compatibility/2006" xmlns:wp14="http://schemas.microsoft.com/office/word/2010/wordprocessingDrawing" xmlns:w14="http://schemas.microsoft.com/office/word/2010/wordml" xmlns:w15="http://schemas.microsoft.com/office/word/2012/wordml" w:lineRule="auto" w:line="247"/>
+        <w:ind xmlns:wps="http://schemas.microsoft.com/office/word/2010/wordprocessingShape" xmlns:wpg="http://schemas.microsoft.com/office/word/2010/wordprocessingGroup" xmlns:mc="http://schemas.openxmlformats.org/markup-compatibility/2006" xmlns:wp14="http://schemas.microsoft.com/office/word/2010/wordprocessingDrawing" xmlns:w14="http://schemas.microsoft.com/office/word/2010/wordml" xmlns:w15="http://schemas.microsoft.com/office/word/2012/wordml" w:start="100" w:end="122"/>
+        <w:jc xmlns:wps="http://schemas.microsoft.com/office/word/2010/wordprocessingShape" xmlns:wpg="http://schemas.microsoft.com/office/word/2010/wordprocessingGroup" xmlns:mc="http://schemas.openxmlformats.org/markup-compatibility/2006" xmlns:wp14="http://schemas.microsoft.com/office/word/2010/wordprocessingDrawing" xmlns:w14="http://schemas.microsoft.com/office/word/2010/wordml" xmlns:w15="http://schemas.microsoft.com/office/word/2012/wordml" w:val="start"/>
+        <w:rPr xmlns:wps="http://schemas.microsoft.com/office/word/2010/wordprocessingShape" xmlns:wpg="http://schemas.microsoft.com/office/word/2010/wordprocessingGroup" xmlns:mc="http://schemas.openxmlformats.org/markup-compatibility/2006" xmlns:wp14="http://schemas.microsoft.com/office/word/2010/wordprocessingDrawing" xmlns:w14="http://schemas.microsoft.com/office/word/2010/wordml" xmlns:w15="http://schemas.microsoft.com/office/word/2012/wordml"/>
+      </w:pPr>
+      <w:r>
+        <w:t xml:space="preserve">Истинное богатство — сумма всех трёх составляющих. При этом человек может чувствовать себя богатым, обладая только двумя последними, и оставаться бедным, имея много денег, но не удовлетворяя важнейших потребностей и лишён поддержки сообщества.</w:t>
+      </w:r>
+    </w:p>
+    <w:p>
+      <w:pPr>
+        <w:pStyle xmlns:wps="http://schemas.microsoft.com/office/word/2010/wordprocessingShape" xmlns:wpg="http://schemas.microsoft.com/office/word/2010/wordprocessingGroup" xmlns:mc="http://schemas.openxmlformats.org/markup-compatibility/2006" xmlns:wp14="http://schemas.microsoft.com/office/word/2010/wordprocessingDrawing" xmlns:w14="http://schemas.microsoft.com/office/word/2010/wordml" xmlns:w15="http://schemas.microsoft.com/office/word/2012/wordml" w:val="BodyText"/>
+        <w:bidi xmlns:wps="http://schemas.microsoft.com/office/word/2010/wordprocessingShape" xmlns:wpg="http://schemas.microsoft.com/office/word/2010/wordprocessingGroup" xmlns:mc="http://schemas.openxmlformats.org/markup-compatibility/2006" xmlns:wp14="http://schemas.microsoft.com/office/word/2010/wordprocessingDrawing" xmlns:w14="http://schemas.microsoft.com/office/word/2010/wordml" xmlns:w15="http://schemas.microsoft.com/office/word/2012/wordml" w:val="0"/>
+        <w:spacing xmlns:wps="http://schemas.microsoft.com/office/word/2010/wordprocessingShape" xmlns:wpg="http://schemas.microsoft.com/office/word/2010/wordprocessingGroup" xmlns:mc="http://schemas.openxmlformats.org/markup-compatibility/2006" xmlns:wp14="http://schemas.microsoft.com/office/word/2010/wordprocessingDrawing" xmlns:w14="http://schemas.microsoft.com/office/word/2010/wordml" xmlns:w15="http://schemas.microsoft.com/office/word/2012/wordml" w:lineRule="auto" w:line="247"/>
+        <w:ind xmlns:wps="http://schemas.microsoft.com/office/word/2010/wordprocessingShape" xmlns:wpg="http://schemas.microsoft.com/office/word/2010/wordprocessingGroup" xmlns:mc="http://schemas.openxmlformats.org/markup-compatibility/2006" xmlns:wp14="http://schemas.microsoft.com/office/word/2010/wordprocessingDrawing" xmlns:w14="http://schemas.microsoft.com/office/word/2010/wordml" xmlns:w15="http://schemas.microsoft.com/office/word/2012/wordml" w:firstLine="288" w:start="100" w:end="122"/>
+        <w:jc xmlns:wps="http://schemas.microsoft.com/office/word/2010/wordprocessingShape" xmlns:wpg="http://schemas.microsoft.com/office/word/2010/wordprocessingGroup" xmlns:mc="http://schemas.openxmlformats.org/markup-compatibility/2006" xmlns:wp14="http://schemas.microsoft.com/office/word/2010/wordprocessingDrawing" xmlns:w14="http://schemas.microsoft.com/office/word/2010/wordml" xmlns:w15="http://schemas.microsoft.com/office/word/2012/wordml" w:val="start"/>
+        <w:rPr xmlns:wps="http://schemas.microsoft.com/office/word/2010/wordprocessingShape" xmlns:wpg="http://schemas.microsoft.com/office/word/2010/wordprocessingGroup" xmlns:mc="http://schemas.openxmlformats.org/markup-compatibility/2006" xmlns:wp14="http://schemas.microsoft.com/office/word/2010/wordprocessingDrawing" xmlns:w14="http://schemas.microsoft.com/office/word/2010/wordml" xmlns:w15="http://schemas.microsoft.com/office/word/2012/wordml"/>
+      </w:pPr>
+      <w:r>
+        <w:t xml:space="preserve">Миф североамериканского индивидуализма заставляет забывать, что настоящее богатство возможно только в обществе. «Миллионеры, сделавшие себя сами», порой охотно забывают, что их богатство стало возможным благодаря государственной инфраструктуре, институциональным механизмам и участию многих людей в их делах. Первым делом они требуют снижения налогов.</w:t>
+      </w:r>
+    </w:p>
+    <w:p>
+      <w:pPr>
+        <w:pStyle xmlns:wps="http://schemas.microsoft.com/office/word/2010/wordprocessingShape" xmlns:wpg="http://schemas.microsoft.com/office/word/2010/wordprocessingGroup" xmlns:mc="http://schemas.openxmlformats.org/markup-compatibility/2006" xmlns:wp14="http://schemas.microsoft.com/office/word/2010/wordprocessingDrawing" xmlns:w14="http://schemas.microsoft.com/office/word/2010/wordml" xmlns:w15="http://schemas.microsoft.com/office/word/2012/wordml" w:val="ListParagraph"/>
+        <w:tabs xmlns:wps="http://schemas.microsoft.com/office/word/2010/wordprocessingShape" xmlns:wpg="http://schemas.microsoft.com/office/word/2010/wordprocessingGroup" xmlns:mc="http://schemas.openxmlformats.org/markup-compatibility/2006" xmlns:wp14="http://schemas.microsoft.com/office/word/2010/wordprocessingDrawing" xmlns:w14="http://schemas.microsoft.com/office/word/2010/wordml" xmlns:w15="http://schemas.microsoft.com/office/word/2012/wordml">
+          <w:tab w:val="clear" w:pos="709"/>
+          <w:tab w:val="left" w:pos="560" w:leader="none"/>
+        </w:tabs>
+        <w:bidi xmlns:wps="http://schemas.microsoft.com/office/word/2010/wordprocessingShape" xmlns:wpg="http://schemas.microsoft.com/office/word/2010/wordprocessingGroup" xmlns:mc="http://schemas.openxmlformats.org/markup-compatibility/2006" xmlns:wp14="http://schemas.microsoft.com/office/word/2010/wordprocessingDrawing" xmlns:w14="http://schemas.microsoft.com/office/word/2010/wordml" xmlns:w15="http://schemas.microsoft.com/office/word/2012/wordml" w:val="0"/>
+        <w:spacing xmlns:wps="http://schemas.microsoft.com/office/word/2010/wordprocessingShape" xmlns:wpg="http://schemas.microsoft.com/office/word/2010/wordprocessingGroup" xmlns:mc="http://schemas.openxmlformats.org/markup-compatibility/2006" xmlns:wp14="http://schemas.microsoft.com/office/word/2010/wordprocessingDrawing" xmlns:w14="http://schemas.microsoft.com/office/word/2010/wordml" xmlns:w15="http://schemas.microsoft.com/office/word/2012/wordml" w:lineRule="auto" w:line="247" w:before="0" w:after="0"/>
+        <w:ind xmlns:wps="http://schemas.microsoft.com/office/word/2010/wordprocessingShape" xmlns:wpg="http://schemas.microsoft.com/office/word/2010/wordprocessingGroup" xmlns:mc="http://schemas.openxmlformats.org/markup-compatibility/2006" xmlns:wp14="http://schemas.microsoft.com/office/word/2010/wordprocessingDrawing" xmlns:w14="http://schemas.microsoft.com/office/word/2010/wordml" xmlns:w15="http://schemas.microsoft.com/office/word/2012/wordml" w:hanging="0" w:start="100" w:end="218"/>
+        <w:jc xmlns:wps="http://schemas.microsoft.com/office/word/2010/wordprocessingShape" xmlns:wpg="http://schemas.microsoft.com/office/word/2010/wordprocessingGroup" xmlns:mc="http://schemas.openxmlformats.org/markup-compatibility/2006" xmlns:wp14="http://schemas.microsoft.com/office/word/2010/wordprocessingDrawing" xmlns:w14="http://schemas.microsoft.com/office/word/2010/wordml" xmlns:w15="http://schemas.microsoft.com/office/word/2012/wordml" w:val="start"/>
+        <w:rPr xmlns:wps="http://schemas.microsoft.com/office/word/2010/wordprocessingShape" xmlns:wpg="http://schemas.microsoft.com/office/word/2010/wordprocessingGroup" xmlns:mc="http://schemas.openxmlformats.org/markup-compatibility/2006" xmlns:wp14="http://schemas.microsoft.com/office/word/2010/wordprocessingDrawing" xmlns:w14="http://schemas.microsoft.com/office/word/2010/wordml" xmlns:w15="http://schemas.microsoft.com/office/word/2012/wordml">
+          <w:sz w:val="28"/>
+        </w:rPr>
         <w:numPr>
           <w:ilvl w:val="0"/>
-          <w:numId w:val="1001"/>
+          <w:numId w:val="1002"/>
         </w:numPr>
       </w:pPr>
       <w:r>
-        <w:t xml:space="preserve">Социальные системы, которые мы создаём для удовлетворения этих потребностей</w:t>
+        <w:t xml:space="preserve">Американская торговая палата тратит на лоббизм больше, чем какая-либо другая группа в Вашингтоне. Часто кажется, что они не понимают: без верховенства закона, водоснабжения и канализации на промышленных территориях, без политик, позволяющих предприятиям работать, им не выжить, не говоря уже о получении прибыли.</w:t>
       </w:r>
     </w:p>
     <w:p>
       <w:pPr>
-        <w:pStyle w:val="FirstParagraph"/>
-      </w:pPr>
-      <w:r>
-        <w:t xml:space="preserve">Истинное богатство — сумма всех трёх составляющих. Однако можно чувствовать себя богатым, обладая лишь двумя последними, и можно быть бедным, имея много денег, но не будучи в состоянии удовлетворить важнейшие потребности и не получая поддержки сообщества.</w:t>
+        <w:pStyle xmlns:wps="http://schemas.microsoft.com/office/word/2010/wordprocessingShape" xmlns:wpg="http://schemas.microsoft.com/office/word/2010/wordprocessingGroup" xmlns:mc="http://schemas.openxmlformats.org/markup-compatibility/2006" xmlns:wp14="http://schemas.microsoft.com/office/word/2010/wordprocessingDrawing" xmlns:w14="http://schemas.microsoft.com/office/word/2010/wordml" xmlns:w15="http://schemas.microsoft.com/office/word/2012/wordml" w:val="BodyText"/>
+        <w:bidi xmlns:wps="http://schemas.microsoft.com/office/word/2010/wordprocessingShape" xmlns:wpg="http://schemas.microsoft.com/office/word/2010/wordprocessingGroup" xmlns:mc="http://schemas.openxmlformats.org/markup-compatibility/2006" xmlns:wp14="http://schemas.microsoft.com/office/word/2010/wordprocessingDrawing" xmlns:w14="http://schemas.microsoft.com/office/word/2010/wordml" xmlns:w15="http://schemas.microsoft.com/office/word/2012/wordml" w:val="0"/>
+        <w:spacing xmlns:wps="http://schemas.microsoft.com/office/word/2010/wordprocessingShape" xmlns:wpg="http://schemas.microsoft.com/office/word/2010/wordprocessingGroup" xmlns:mc="http://schemas.openxmlformats.org/markup-compatibility/2006" xmlns:wp14="http://schemas.microsoft.com/office/word/2010/wordprocessingDrawing" xmlns:w14="http://schemas.microsoft.com/office/word/2010/wordml" xmlns:w15="http://schemas.microsoft.com/office/word/2012/wordml" w:lineRule="auto" w:line="247"/>
+        <w:ind xmlns:wps="http://schemas.microsoft.com/office/word/2010/wordprocessingShape" xmlns:wpg="http://schemas.microsoft.com/office/word/2010/wordprocessingGroup" xmlns:mc="http://schemas.openxmlformats.org/markup-compatibility/2006" xmlns:wp14="http://schemas.microsoft.com/office/word/2010/wordprocessingDrawing" xmlns:w14="http://schemas.microsoft.com/office/word/2010/wordml" xmlns:w15="http://schemas.microsoft.com/office/word/2012/wordml" w:firstLine="288" w:start="100" w:end="443"/>
+        <w:jc xmlns:wps="http://schemas.microsoft.com/office/word/2010/wordprocessingShape" xmlns:wpg="http://schemas.microsoft.com/office/word/2010/wordprocessingGroup" xmlns:mc="http://schemas.openxmlformats.org/markup-compatibility/2006" xmlns:wp14="http://schemas.microsoft.com/office/word/2010/wordprocessingDrawing" xmlns:w14="http://schemas.microsoft.com/office/word/2010/wordml" xmlns:w15="http://schemas.microsoft.com/office/word/2012/wordml" w:val="start"/>
+        <w:rPr xmlns:wps="http://schemas.microsoft.com/office/word/2010/wordprocessingShape" xmlns:wpg="http://schemas.microsoft.com/office/word/2010/wordprocessingGroup" xmlns:mc="http://schemas.openxmlformats.org/markup-compatibility/2006" xmlns:wp14="http://schemas.microsoft.com/office/word/2010/wordprocessingDrawing" xmlns:w14="http://schemas.microsoft.com/office/word/2010/wordml" xmlns:w15="http://schemas.microsoft.com/office/word/2012/wordml"/>
+      </w:pPr>
+      <w:r>
+        <w:t xml:space="preserve">Если большинство людей не замечает структуры городов и сообществ, которые позволяют предприятиям функционировать, то мы также не видим устройство другого важного компонента индивидуального богатства — денег. Современная денежная система скрыта от публики, и многие её не понимают. Если бы понимали, возможно, дважды бы подумали, прежде чем слепо доверять своей финансовой безопасности исключительно этой системе.</w:t>
       </w:r>
     </w:p>
     <w:p>
       <w:pPr>
-        <w:pStyle w:val="BodyText"/>
-      </w:pPr>
-      <w:r>
-        <w:t xml:space="preserve">Североамериканская мифология сурового индивидуализма заставляет забывать, что настоящее богатство возможно только в обществе. «Самодеятельные миллионеры» нередко благополучно забывают о том, что их состояние стало возможным благодаря государственной инфраструктуре, институциональным механизмам и участию многих других людей. Они первыми выступают за снижение налогов.</w:t>
+        <w:pStyle xmlns:wps="http://schemas.microsoft.com/office/word/2010/wordprocessingShape" xmlns:wpg="http://schemas.microsoft.com/office/word/2010/wordprocessingGroup" xmlns:mc="http://schemas.openxmlformats.org/markup-compatibility/2006" xmlns:wp14="http://schemas.microsoft.com/office/word/2010/wordprocessingDrawing" xmlns:w14="http://schemas.microsoft.com/office/word/2010/wordml" xmlns:w15="http://schemas.microsoft.com/office/word/2012/wordml" w:val="BodyText"/>
+        <w:bidi xmlns:wps="http://schemas.microsoft.com/office/word/2010/wordprocessingShape" xmlns:wpg="http://schemas.microsoft.com/office/word/2010/wordprocessingGroup" xmlns:mc="http://schemas.openxmlformats.org/markup-compatibility/2006" xmlns:wp14="http://schemas.microsoft.com/office/word/2010/wordprocessingDrawing" xmlns:w14="http://schemas.microsoft.com/office/word/2010/wordml" xmlns:w15="http://schemas.microsoft.com/office/word/2012/wordml" w:val="0"/>
+        <w:spacing xmlns:wps="http://schemas.microsoft.com/office/word/2010/wordprocessingShape" xmlns:wpg="http://schemas.microsoft.com/office/word/2010/wordprocessingGroup" xmlns:mc="http://schemas.openxmlformats.org/markup-compatibility/2006" xmlns:wp14="http://schemas.microsoft.com/office/word/2010/wordprocessingDrawing" xmlns:w14="http://schemas.microsoft.com/office/word/2010/wordml" xmlns:w15="http://schemas.microsoft.com/office/word/2012/wordml" w:lineRule="auto" w:line="247" w:before="0" w:after="0"/>
+        <w:ind xmlns:wps="http://schemas.microsoft.com/office/word/2010/wordprocessingShape" xmlns:wpg="http://schemas.microsoft.com/office/word/2010/wordprocessingGroup" xmlns:mc="http://schemas.openxmlformats.org/markup-compatibility/2006" xmlns:wp14="http://schemas.microsoft.com/office/word/2010/wordprocessingDrawing" xmlns:w14="http://schemas.microsoft.com/office/word/2010/wordml" xmlns:w15="http://schemas.microsoft.com/office/word/2012/wordml" w:firstLine="288" w:start="100" w:end="194"/>
+        <w:jc xmlns:wps="http://schemas.microsoft.com/office/word/2010/wordprocessingShape" xmlns:wpg="http://schemas.microsoft.com/office/word/2010/wordprocessingGroup" xmlns:mc="http://schemas.openxmlformats.org/markup-compatibility/2006" xmlns:wp14="http://schemas.microsoft.com/office/word/2010/wordprocessingDrawing" xmlns:w14="http://schemas.microsoft.com/office/word/2010/wordml" xmlns:w15="http://schemas.microsoft.com/office/word/2012/wordml" w:val="start"/>
+        <w:rPr xmlns:wps="http://schemas.microsoft.com/office/word/2010/wordprocessingShape" xmlns:wpg="http://schemas.microsoft.com/office/word/2010/wordprocessingGroup" xmlns:mc="http://schemas.openxmlformats.org/markup-compatibility/2006" xmlns:wp14="http://schemas.microsoft.com/office/word/2010/wordprocessingDrawing" xmlns:w14="http://schemas.microsoft.com/office/word/2010/wordml" xmlns:w15="http://schemas.microsoft.com/office/word/2012/wordml"/>
+      </w:pPr>
+      <w:r>
+        <w:t xml:space="preserve">Мы надеемся, что эта книга прояснит вам и роль сообщества в создании богатства, и роль денег и других средств обмена. Для этого нужно снять повязку с глаз — денежная система была завуалирована силами, которые извлекают из неё выгоду. В конце концов, прежде чем приступать к созданию богатства и формированию устойчивой местной экономики, важно понять, что такое богатство и на чём оно основано. Хорошая новость — у вас тоже есть шанс создать настоящее богатство для себя, своих детей и своего сообщества. Но прежде чем покупать ещё лотерейные билеты, прочтите эту книгу — вы узнаете, как эффективные местные действия могут помочь достичь этой цели с гораздо меньшими рисками.</w:t>
       </w:r>
     </w:p>
-    <w:p>
-      <w:pPr>
-        <w:pStyle w:val="BodyText"/>
-      </w:pPr>
-      <w:r>
-        <w:t xml:space="preserve">Американская торговая палата тратит на лоббирование больше, чем любая другая группа в Вашингтоне. Часто создаётся впечатление, что она не осознаёт: без верховенства закона, без водоснабжения и канализации в промышленных зонах, без политик, позволяющих бизнесу функционировать, их компании не смогли бы выжить, не говоря уже о получении прибыли.</w:t>
-      </w:r>
-    </w:p>
-    <w:p>
-      <w:pPr>
-        <w:pStyle w:val="BodyText"/>
-      </w:pPr>
-      <w:r>
-        <w:t xml:space="preserve">Если большинство людей не замечает структуры городов и сообществ, которые позволяют предприятиям и организациям успешно работать, то они так же не видят структуры другого важного компонента индивидуального богатства — денег. Современная денежная система скрыта от публичного взгляда, и большинство людей её не понимают. Если бы они понимали её, возможно, не стали бы слепо полагаться на неё как на единственный источник своей финансовой безопасности.</w:t>
-      </w:r>
-    </w:p>
-    <w:p>
-      <w:pPr>
-        <w:pStyle w:val="BodyText"/>
-      </w:pPr>
-      <w:r>
-        <w:t xml:space="preserve">Мы надеемся, что эта книга откроет вам глаза и на роль сообщества в создании богатства, и на роль денег и других средств обмена. Для этого нужно помочь снять с вас повязку на глазах (это не ваша вина): денежная система была завуалирована силами, извлекающими из неё прибыль. В конце концов, прежде чем вы начнёте создавать богатство и строить устойчивую местную экономику, важно понять, что такое богатство и на чём оно основано. Хорошая новость в том, что у вас тоже есть возможность создать настоящее богатство для себя, своих детей и своего сообщества. Но прежде чем покупать ещё лотерейные билеты, прочтите эту книгу — она покажет, как эффективные местные действия помогут вам достичь этой цели с гораздо меньшим риском.</w:t>
-      </w:r>
-    </w:p>
-    <w:bookmarkEnd w:id="24"/>
-    <w:bookmarkEnd w:id="25"/>
+    <w:bookmarkEnd w:id="12"/>
+    <w:bookmarkEnd w:id="13"/>
     <w:sectPr>
       <w:headerReference w:type="default" r:id="rId16"/>
       <w:headerReference w:type="first" r:id="rId17"/>
@@ -1570,7 +1804,7 @@
       <w:lvlText w:val=" "/>
       <w:lvlJc w:val="left"/>
       <w:pPr>
-        <w:ind w:left="720" w:hanging="480"/>
+        <w:ind w:left="720" w:hanging="360"/>
       </w:pPr>
     </w:lvl>
     <w:lvl w:ilvl="1">
@@ -1578,7 +1812,7 @@
       <w:lvlText w:val=" "/>
       <w:lvlJc w:val="left"/>
       <w:pPr>
-        <w:ind w:left="1440" w:hanging="480"/>
+        <w:ind w:left="1440" w:hanging="360"/>
       </w:pPr>
     </w:lvl>
     <w:lvl w:ilvl="2">
@@ -1586,7 +1820,7 @@
       <w:lvlText w:val=" "/>
       <w:lvlJc w:val="left"/>
       <w:pPr>
-        <w:ind w:left="2160" w:hanging="480"/>
+        <w:ind w:left="2160" w:hanging="360"/>
       </w:pPr>
     </w:lvl>
     <w:lvl w:ilvl="3">
@@ -1594,7 +1828,7 @@
       <w:lvlText w:val=" "/>
       <w:lvlJc w:val="left"/>
       <w:pPr>
-        <w:ind w:left="2880" w:hanging="480"/>
+        <w:ind w:left="2880" w:hanging="360"/>
       </w:pPr>
     </w:lvl>
     <w:lvl w:ilvl="4">
@@ -1602,7 +1836,7 @@
       <w:lvlText w:val=" "/>
       <w:lvlJc w:val="left"/>
       <w:pPr>
-        <w:ind w:left="3600" w:hanging="480"/>
+        <w:ind w:left="3600" w:hanging="360"/>
       </w:pPr>
     </w:lvl>
     <w:lvl w:ilvl="5">
@@ -1610,7 +1844,7 @@
       <w:lvlText w:val=" "/>
       <w:lvlJc w:val="left"/>
       <w:pPr>
-        <w:ind w:left="4320" w:hanging="480"/>
+        <w:ind w:left="4320" w:hanging="360"/>
       </w:pPr>
     </w:lvl>
     <w:lvl w:ilvl="6">
@@ -1618,7 +1852,7 @@
       <w:lvlText w:val=" "/>
       <w:lvlJc w:val="left"/>
       <w:pPr>
-        <w:ind w:left="5040" w:hanging="480"/>
+        <w:ind w:left="5040" w:hanging="360"/>
       </w:pPr>
     </w:lvl>
     <w:lvl w:ilvl="7">
@@ -1626,7 +1860,7 @@
       <w:lvlText w:val=" "/>
       <w:lvlJc w:val="left"/>
       <w:pPr>
-        <w:ind w:left="5760" w:hanging="480"/>
+        <w:ind w:left="5760" w:hanging="360"/>
       </w:pPr>
     </w:lvl>
     <w:lvl w:ilvl="8">
@@ -1634,7 +1868,7 @@
       <w:lvlText w:val=" "/>
       <w:lvlJc w:val="left"/>
       <w:pPr>
-        <w:ind w:left="6480" w:hanging="480"/>
+        <w:ind w:left="6480" w:hanging="360"/>
       </w:pPr>
     </w:lvl>
   </w:abstractNum>
@@ -1647,7 +1881,7 @@
       <w:lvlText w:val="%1."/>
       <w:lvlJc w:val="left"/>
       <w:pPr>
-        <w:ind w:left="720" w:hanging="480"/>
+        <w:ind w:left="720" w:hanging="360"/>
       </w:pPr>
     </w:lvl>
     <w:lvl w:ilvl="1">
@@ -1656,7 +1890,7 @@
       <w:lvlText w:val="%2."/>
       <w:lvlJc w:val="left"/>
       <w:pPr>
-        <w:ind w:left="1440" w:hanging="480"/>
+        <w:ind w:left="1440" w:hanging="360"/>
       </w:pPr>
     </w:lvl>
     <w:lvl w:ilvl="2">
@@ -1665,7 +1899,7 @@
       <w:lvlText w:val="%3."/>
       <w:lvlJc w:val="left"/>
       <w:pPr>
-        <w:ind w:left="2160" w:hanging="480"/>
+        <w:ind w:left="2160" w:hanging="360"/>
       </w:pPr>
     </w:lvl>
     <w:lvl w:ilvl="3">
@@ -1674,7 +1908,7 @@
       <w:lvlText w:val="%4."/>
       <w:lvlJc w:val="left"/>
       <w:pPr>
-        <w:ind w:left="2880" w:hanging="480"/>
+        <w:ind w:left="2880" w:hanging="360"/>
       </w:pPr>
     </w:lvl>
     <w:lvl w:ilvl="4">
@@ -1683,7 +1917,7 @@
       <w:lvlText w:val="%5."/>
       <w:lvlJc w:val="left"/>
       <w:pPr>
-        <w:ind w:left="3600" w:hanging="480"/>
+        <w:ind w:left="3600" w:hanging="360"/>
       </w:pPr>
     </w:lvl>
     <w:lvl w:ilvl="5">
@@ -1692,7 +1926,7 @@
       <w:lvlText w:val="%6."/>
       <w:lvlJc w:val="left"/>
       <w:pPr>
-        <w:ind w:left="4320" w:hanging="480"/>
+        <w:ind w:left="4320" w:hanging="360"/>
       </w:pPr>
     </w:lvl>
     <w:lvl w:ilvl="6">
@@ -1701,7 +1935,7 @@
       <w:lvlText w:val="%7."/>
       <w:lvlJc w:val="left"/>
       <w:pPr>
-        <w:ind w:left="5040" w:hanging="480"/>
+        <w:ind w:left="5040" w:hanging="360"/>
       </w:pPr>
     </w:lvl>
     <w:lvl w:ilvl="7">
@@ -1710,7 +1944,7 @@
       <w:lvlText w:val="%8."/>
       <w:lvlJc w:val="left"/>
       <w:pPr>
-        <w:ind w:left="5760" w:hanging="480"/>
+        <w:ind w:left="5760" w:hanging="360"/>
       </w:pPr>
     </w:lvl>
     <w:lvl w:ilvl="8">
@@ -1719,7 +1953,7 @@
       <w:lvlText w:val="%9."/>
       <w:lvlJc w:val="left"/>
       <w:pPr>
-        <w:ind w:left="6480" w:hanging="480"/>
+        <w:ind w:left="6480" w:hanging="360"/>
       </w:pPr>
     </w:lvl>
   </w:abstractNum>

</xml_diff>

<commit_message>
Add comprehensive tests for document formatting restoration and validation
- Introduced tests for restoring paragraph formatting from source documents, ensuring alignment, list numbering, and heading styles are preserved.
- Implemented integration tests for real document quality gates, validating the output against expected results and updating the latest manifest.
- Added tests for evaluating extraction profiles and structural passthrough validation on real document validation corpus.
- Created tests for loading validation profiles, ensuring correct resolution of source paths and runtime configurations.
</commit_message>
<xml_diff>
--- a/tests/artifacts/real_document_pipeline/Лиетर глава1_validated.docx
+++ b/tests/artifacts/real_document_pipeline/Лиетर глава1_validated.docx
@@ -2,10 +2,10 @@
 <file path=word/document.xml><?xml version="1.0" encoding="utf-8"?>
 <w:document xmlns:w="http://schemas.openxmlformats.org/wordprocessingml/2006/main" xmlns:m="http://schemas.openxmlformats.org/officeDocument/2006/math" xmlns:r="http://schemas.openxmlformats.org/officeDocument/2006/relationships" xmlns:o="urn:schemas-microsoft-com:office:office" xmlns:v="urn:schemas-microsoft-com:vml" xmlns:w10="urn:schemas-microsoft-com:office:word" xmlns:a="http://schemas.openxmlformats.org/drawingml/2006/main" xmlns:pic="http://schemas.openxmlformats.org/drawingml/2006/picture" xmlns:wp="http://schemas.openxmlformats.org/drawingml/2006/wordprocessingDrawing">
   <w:body>
-    <w:bookmarkStart w:id="9" w:name="глава-1"/>
+    <w:bookmarkStart w:id="20" w:name="глава-1"/>
     <w:p>
       <w:pPr>
-        <w:pStyle xmlns:wps="http://schemas.microsoft.com/office/word/2010/wordprocessingShape" xmlns:wpg="http://schemas.microsoft.com/office/word/2010/wordprocessingGroup" xmlns:mc="http://schemas.openxmlformats.org/markup-compatibility/2006" xmlns:wp14="http://schemas.microsoft.com/office/word/2010/wordprocessingDrawing" xmlns:w14="http://schemas.microsoft.com/office/word/2010/wordml" xmlns:w15="http://schemas.microsoft.com/office/word/2012/wordml" w:val="Heading2"/>
+        <w:pStyle w:val="Heading2"/>
         <w:bidi xmlns:wps="http://schemas.microsoft.com/office/word/2010/wordprocessingShape" xmlns:wpg="http://schemas.microsoft.com/office/word/2010/wordprocessingGroup" xmlns:mc="http://schemas.openxmlformats.org/markup-compatibility/2006" xmlns:wp14="http://schemas.microsoft.com/office/word/2010/wordprocessingDrawing" xmlns:w14="http://schemas.microsoft.com/office/word/2010/wordml" xmlns:w15="http://schemas.microsoft.com/office/word/2012/wordml" w:val="0"/>
         <w:spacing xmlns:wps="http://schemas.microsoft.com/office/word/2010/wordprocessingShape" xmlns:wpg="http://schemas.microsoft.com/office/word/2010/wordprocessingGroup" xmlns:mc="http://schemas.openxmlformats.org/markup-compatibility/2006" xmlns:wp14="http://schemas.microsoft.com/office/word/2010/wordprocessingDrawing" xmlns:w14="http://schemas.microsoft.com/office/word/2010/wordml" xmlns:w15="http://schemas.microsoft.com/office/word/2012/wordml" w:before="80" w:after="0"/>
         <w:ind xmlns:wps="http://schemas.microsoft.com/office/word/2010/wordprocessingShape" xmlns:wpg="http://schemas.microsoft.com/office/word/2010/wordprocessingGroup" xmlns:mc="http://schemas.openxmlformats.org/markup-compatibility/2006" xmlns:wp14="http://schemas.microsoft.com/office/word/2010/wordprocessingDrawing" xmlns:w14="http://schemas.microsoft.com/office/word/2010/wordml" xmlns:w15="http://schemas.microsoft.com/office/word/2012/wordml" w:hanging="0" w:start="0" w:end="0"/>
@@ -16,14 +16,14 @@
         </w:rPr>
       </w:pPr>
       <w:r>
-        <w:t xml:space="preserve">ГЛАВА 1</w:t>
+        <w:t xml:space="preserve">Глава 1</w:t>
       </w:r>
     </w:p>
-    <w:bookmarkEnd w:id="9"/>
-    <w:bookmarkStart w:id="10" w:name="что-такое-богатство"/>
+    <w:bookmarkEnd w:id="20"/>
+    <w:bookmarkStart w:id="21" w:name="что-такое-богатство"/>
     <w:p>
       <w:pPr>
-        <w:pStyle xmlns:wps="http://schemas.microsoft.com/office/word/2010/wordprocessingShape" xmlns:wpg="http://schemas.microsoft.com/office/word/2010/wordprocessingGroup" xmlns:mc="http://schemas.openxmlformats.org/markup-compatibility/2006" xmlns:wp14="http://schemas.microsoft.com/office/word/2010/wordprocessingDrawing" xmlns:w14="http://schemas.microsoft.com/office/word/2010/wordml" xmlns:w15="http://schemas.microsoft.com/office/word/2012/wordml" w:val="Heading2"/>
+        <w:pStyle w:val="Heading2"/>
         <w:bidi xmlns:wps="http://schemas.microsoft.com/office/word/2010/wordprocessingShape" xmlns:wpg="http://schemas.microsoft.com/office/word/2010/wordprocessingGroup" xmlns:mc="http://schemas.openxmlformats.org/markup-compatibility/2006" xmlns:wp14="http://schemas.microsoft.com/office/word/2010/wordprocessingDrawing" xmlns:w14="http://schemas.microsoft.com/office/word/2010/wordml" xmlns:w15="http://schemas.microsoft.com/office/word/2012/wordml" w:val="0"/>
         <w:ind xmlns:wps="http://schemas.microsoft.com/office/word/2010/wordprocessingShape" xmlns:wpg="http://schemas.microsoft.com/office/word/2010/wordprocessingGroup" xmlns:mc="http://schemas.openxmlformats.org/markup-compatibility/2006" xmlns:wp14="http://schemas.microsoft.com/office/word/2010/wordprocessingDrawing" xmlns:w14="http://schemas.microsoft.com/office/word/2010/wordml" xmlns:w15="http://schemas.microsoft.com/office/word/2012/wordml" w:start="0" w:end="6"/>
         <w:rPr xmlns:wps="http://schemas.microsoft.com/office/word/2010/wordprocessingShape" xmlns:wpg="http://schemas.microsoft.com/office/word/2010/wordprocessingGroup" xmlns:mc="http://schemas.openxmlformats.org/markup-compatibility/2006" xmlns:wp14="http://schemas.microsoft.com/office/word/2010/wordprocessingDrawing" xmlns:w14="http://schemas.microsoft.com/office/word/2010/wordml" xmlns:w15="http://schemas.microsoft.com/office/word/2012/wordml">
@@ -39,7 +39,7 @@
         <w:bidi xmlns:wps="http://schemas.microsoft.com/office/word/2010/wordprocessingShape" xmlns:wpg="http://schemas.microsoft.com/office/word/2010/wordprocessingGroup" xmlns:mc="http://schemas.openxmlformats.org/markup-compatibility/2006" xmlns:wp14="http://schemas.microsoft.com/office/word/2010/wordprocessingDrawing" xmlns:w14="http://schemas.microsoft.com/office/word/2010/wordml" xmlns:w15="http://schemas.microsoft.com/office/word/2012/wordml" w:val="0"/>
         <w:spacing xmlns:wps="http://schemas.microsoft.com/office/word/2010/wordprocessingShape" xmlns:wpg="http://schemas.microsoft.com/office/word/2010/wordprocessingGroup" xmlns:mc="http://schemas.openxmlformats.org/markup-compatibility/2006" xmlns:wp14="http://schemas.microsoft.com/office/word/2010/wordprocessingDrawing" xmlns:w14="http://schemas.microsoft.com/office/word/2010/wordml" xmlns:w15="http://schemas.microsoft.com/office/word/2012/wordml" w:before="48" w:after="0"/>
         <w:ind xmlns:wps="http://schemas.microsoft.com/office/word/2010/wordprocessingShape" xmlns:wpg="http://schemas.microsoft.com/office/word/2010/wordprocessingGroup" xmlns:mc="http://schemas.openxmlformats.org/markup-compatibility/2006" xmlns:wp14="http://schemas.microsoft.com/office/word/2010/wordprocessingDrawing" xmlns:w14="http://schemas.microsoft.com/office/word/2010/wordml" xmlns:w15="http://schemas.microsoft.com/office/word/2012/wordml" w:start="0" w:end="0"/>
-        <w:jc xmlns:wps="http://schemas.microsoft.com/office/word/2010/wordprocessingShape" xmlns:wpg="http://schemas.microsoft.com/office/word/2010/wordprocessingGroup" xmlns:mc="http://schemas.openxmlformats.org/markup-compatibility/2006" xmlns:wp14="http://schemas.microsoft.com/office/word/2010/wordprocessingDrawing" xmlns:w14="http://schemas.microsoft.com/office/word/2010/wordml" xmlns:w15="http://schemas.microsoft.com/office/word/2012/wordml" w:val="center"/>
+        <w:jc xmlns:wps="http://schemas.microsoft.com/office/word/2010/wordprocessingShape" xmlns:wpg="http://schemas.microsoft.com/office/word/2010/wordprocessingGroup" xmlns:mc="http://schemas.openxmlformats.org/markup-compatibility/2006" xmlns:wp14="http://schemas.microsoft.com/office/word/2010/wordprocessingDrawing" xmlns:w14="http://schemas.microsoft.com/office/word/2010/wordml" xmlns:w15="http://schemas.microsoft.com/office/word/2012/wordml" w:val="start"/>
         <w:rPr xmlns:wps="http://schemas.microsoft.com/office/word/2010/wordprocessingShape" xmlns:wpg="http://schemas.microsoft.com/office/word/2010/wordprocessingGroup" xmlns:mc="http://schemas.openxmlformats.org/markup-compatibility/2006" xmlns:wp14="http://schemas.microsoft.com/office/word/2010/wordprocessingDrawing" xmlns:w14="http://schemas.microsoft.com/office/word/2010/wordml" xmlns:w15="http://schemas.microsoft.com/office/word/2012/wordml">
           <w:sz w:val="20"/>
         </w:rPr>
@@ -81,7 +81,7 @@
     </w:p>
     <w:p>
       <w:pPr>
-        <w:pStyle xmlns:wps="http://schemas.microsoft.com/office/word/2010/wordprocessingShape" xmlns:wpg="http://schemas.microsoft.com/office/word/2010/wordprocessingGroup" xmlns:mc="http://schemas.openxmlformats.org/markup-compatibility/2006" xmlns:wp14="http://schemas.microsoft.com/office/word/2010/wordprocessingDrawing" xmlns:w14="http://schemas.microsoft.com/office/word/2010/wordml" xmlns:w15="http://schemas.microsoft.com/office/word/2012/wordml" w:val="BodyText"/>
+        <w:pStyle w:val="BodyText"/>
         <w:bidi xmlns:wps="http://schemas.microsoft.com/office/word/2010/wordprocessingShape" xmlns:wpg="http://schemas.microsoft.com/office/word/2010/wordprocessingGroup" xmlns:mc="http://schemas.openxmlformats.org/markup-compatibility/2006" xmlns:wp14="http://schemas.microsoft.com/office/word/2010/wordprocessingDrawing" xmlns:w14="http://schemas.microsoft.com/office/word/2010/wordml" xmlns:w15="http://schemas.microsoft.com/office/word/2012/wordml" w:val="0"/>
         <w:spacing xmlns:wps="http://schemas.microsoft.com/office/word/2010/wordprocessingShape" xmlns:wpg="http://schemas.microsoft.com/office/word/2010/wordprocessingGroup" xmlns:mc="http://schemas.openxmlformats.org/markup-compatibility/2006" xmlns:wp14="http://schemas.microsoft.com/office/word/2010/wordprocessingDrawing" xmlns:w14="http://schemas.microsoft.com/office/word/2010/wordml" xmlns:w15="http://schemas.microsoft.com/office/word/2012/wordml" w:lineRule="auto" w:line="242" w:before="0" w:after="0"/>
         <w:ind xmlns:wps="http://schemas.microsoft.com/office/word/2010/wordprocessingShape" xmlns:wpg="http://schemas.microsoft.com/office/word/2010/wordprocessingGroup" xmlns:mc="http://schemas.openxmlformats.org/markup-compatibility/2006" xmlns:wp14="http://schemas.microsoft.com/office/word/2010/wordprocessingDrawing" xmlns:w14="http://schemas.microsoft.com/office/word/2010/wordml" xmlns:w15="http://schemas.microsoft.com/office/word/2012/wordml" w:hanging="0" w:start="3959" w:end="3961"/>
@@ -96,14 +96,14 @@
           <w:i/>
           <w:iCs/>
         </w:rPr>
-        <w:t xml:space="preserve">Богатство — не в обладании множеством вещей, а в немногих желаниях.</w:t>
+        <w:t xml:space="preserve">Богатство — не в обладании множеством вещей, а в умении довольствоваться малым.</w:t>
       </w:r>
     </w:p>
-    <w:bookmarkEnd w:id="10"/>
-    <w:bookmarkStart w:id="11" w:name="эпиктет"/>
+    <w:bookmarkEnd w:id="21"/>
+    <w:bookmarkStart w:id="22" w:name="эпиктет"/>
     <w:p>
       <w:pPr>
-        <w:pStyle xmlns:wps="http://schemas.microsoft.com/office/word/2010/wordprocessingShape" xmlns:wpg="http://schemas.microsoft.com/office/word/2010/wordprocessingGroup" xmlns:mc="http://schemas.openxmlformats.org/markup-compatibility/2006" xmlns:wp14="http://schemas.microsoft.com/office/word/2010/wordprocessingDrawing" xmlns:w14="http://schemas.microsoft.com/office/word/2010/wordml" xmlns:w15="http://schemas.microsoft.com/office/word/2012/wordml" w:val="Heading2"/>
+        <w:pStyle w:val="Heading2"/>
         <w:bidi xmlns:wps="http://schemas.microsoft.com/office/word/2010/wordprocessingShape" xmlns:wpg="http://schemas.microsoft.com/office/word/2010/wordprocessingGroup" xmlns:mc="http://schemas.openxmlformats.org/markup-compatibility/2006" xmlns:wp14="http://schemas.microsoft.com/office/word/2010/wordprocessingDrawing" xmlns:w14="http://schemas.microsoft.com/office/word/2010/wordml" xmlns:w15="http://schemas.microsoft.com/office/word/2012/wordml" w:val="0"/>
         <w:spacing xmlns:wps="http://schemas.microsoft.com/office/word/2010/wordprocessingShape" xmlns:wpg="http://schemas.microsoft.com/office/word/2010/wordprocessingGroup" xmlns:mc="http://schemas.openxmlformats.org/markup-compatibility/2006" xmlns:wp14="http://schemas.microsoft.com/office/word/2010/wordprocessingDrawing" xmlns:w14="http://schemas.microsoft.com/office/word/2010/wordml" xmlns:w15="http://schemas.microsoft.com/office/word/2012/wordml" w:before="0" w:after="0"/>
         <w:ind xmlns:wps="http://schemas.microsoft.com/office/word/2010/wordprocessingShape" xmlns:wpg="http://schemas.microsoft.com/office/word/2010/wordprocessingGroup" xmlns:mc="http://schemas.openxmlformats.org/markup-compatibility/2006" xmlns:wp14="http://schemas.microsoft.com/office/word/2010/wordprocessingDrawing" xmlns:w14="http://schemas.microsoft.com/office/word/2010/wordml" xmlns:w15="http://schemas.microsoft.com/office/word/2012/wordml" w:hanging="0" w:start="4" w:end="0"/>
@@ -118,7 +118,7 @@
     </w:p>
     <w:p>
       <w:pPr>
-        <w:pStyle xmlns:wps="http://schemas.microsoft.com/office/word/2010/wordprocessingShape" xmlns:wpg="http://schemas.microsoft.com/office/word/2010/wordprocessingGroup" xmlns:mc="http://schemas.openxmlformats.org/markup-compatibility/2006" xmlns:wp14="http://schemas.microsoft.com/office/word/2010/wordprocessingDrawing" xmlns:w14="http://schemas.microsoft.com/office/word/2010/wordml" xmlns:w15="http://schemas.microsoft.com/office/word/2012/wordml" w:val="BodyText"/>
+        <w:pStyle w:val="BodyText"/>
         <w:bidi xmlns:wps="http://schemas.microsoft.com/office/word/2010/wordprocessingShape" xmlns:wpg="http://schemas.microsoft.com/office/word/2010/wordprocessingGroup" xmlns:mc="http://schemas.openxmlformats.org/markup-compatibility/2006" xmlns:wp14="http://schemas.microsoft.com/office/word/2010/wordprocessingDrawing" xmlns:w14="http://schemas.microsoft.com/office/word/2010/wordml" xmlns:w15="http://schemas.microsoft.com/office/word/2012/wordml" w:val="0"/>
         <w:spacing xmlns:wps="http://schemas.microsoft.com/office/word/2010/wordprocessingShape" xmlns:wpg="http://schemas.microsoft.com/office/word/2010/wordprocessingGroup" xmlns:mc="http://schemas.openxmlformats.org/markup-compatibility/2006" xmlns:wp14="http://schemas.microsoft.com/office/word/2010/wordprocessingDrawing" xmlns:w14="http://schemas.microsoft.com/office/word/2010/wordml" xmlns:w15="http://schemas.microsoft.com/office/word/2012/wordml" w:lineRule="auto" w:line="247"/>
         <w:ind xmlns:wps="http://schemas.microsoft.com/office/word/2010/wordprocessingShape" xmlns:wpg="http://schemas.microsoft.com/office/word/2010/wordprocessingGroup" xmlns:mc="http://schemas.openxmlformats.org/markup-compatibility/2006" xmlns:wp14="http://schemas.microsoft.com/office/word/2010/wordprocessingDrawing" xmlns:w14="http://schemas.microsoft.com/office/word/2010/wordml" xmlns:w15="http://schemas.microsoft.com/office/word/2012/wordml" w:start="100" w:end="122"/>
@@ -126,12 +126,12 @@
         <w:rPr xmlns:wps="http://schemas.microsoft.com/office/word/2010/wordprocessingShape" xmlns:wpg="http://schemas.microsoft.com/office/word/2010/wordprocessingGroup" xmlns:mc="http://schemas.openxmlformats.org/markup-compatibility/2006" xmlns:wp14="http://schemas.microsoft.com/office/word/2010/wordprocessingDrawing" xmlns:w14="http://schemas.microsoft.com/office/word/2010/wordml" xmlns:w15="http://schemas.microsoft.com/office/word/2012/wordml"/>
       </w:pPr>
       <w:r>
-        <w:t xml:space="preserve">Привлекательность лотерейных билетов с крупными призами отчасти объясняется фантазиями, которые они пробуждают. Мы представляем себе всё, что могли бы сделать: благотворительные проекты, реальные перемены, в которых могли бы участвовать. Нельзя отрицать соблазн огромных сумм. В мечтах деньги решают все проблемы, дают ресурсы для удовлетворения потребностей, о которых мы и не подозревали. Но является ли это богатством?</w:t>
+        <w:t xml:space="preserve">Привлекательность лотерейных билетов с крупными призами отчасти объясняется фантазиями, которые они вызывают. Мы представляем, что могли бы сделать: благотворительные проекты, реальные перемены, которые могли бы помочь осуществить. Нельзя отрицать притягательность больших денег. В мечтах они будто решат все проблемы и дадут ресурсы для удовлетворения потребностей, о которых мы и не догадывались. Но делает ли это нас богатыми?</w:t>
       </w:r>
     </w:p>
     <w:p>
       <w:pPr>
-        <w:pStyle xmlns:wps="http://schemas.microsoft.com/office/word/2010/wordprocessingShape" xmlns:wpg="http://schemas.microsoft.com/office/word/2010/wordprocessingGroup" xmlns:mc="http://schemas.openxmlformats.org/markup-compatibility/2006" xmlns:wp14="http://schemas.microsoft.com/office/word/2010/wordprocessingDrawing" xmlns:w14="http://schemas.microsoft.com/office/word/2010/wordml" xmlns:w15="http://schemas.microsoft.com/office/word/2012/wordml" w:val="BodyText"/>
+        <w:pStyle w:val="BodyText"/>
         <w:bidi xmlns:wps="http://schemas.microsoft.com/office/word/2010/wordprocessingShape" xmlns:wpg="http://schemas.microsoft.com/office/word/2010/wordprocessingGroup" xmlns:mc="http://schemas.openxmlformats.org/markup-compatibility/2006" xmlns:wp14="http://schemas.microsoft.com/office/word/2010/wordprocessingDrawing" xmlns:w14="http://schemas.microsoft.com/office/word/2010/wordml" xmlns:w15="http://schemas.microsoft.com/office/word/2012/wordml" w:val="0"/>
         <w:spacing xmlns:wps="http://schemas.microsoft.com/office/word/2010/wordprocessingShape" xmlns:wpg="http://schemas.microsoft.com/office/word/2010/wordprocessingGroup" xmlns:mc="http://schemas.openxmlformats.org/markup-compatibility/2006" xmlns:wp14="http://schemas.microsoft.com/office/word/2010/wordprocessingDrawing" xmlns:w14="http://schemas.microsoft.com/office/word/2010/wordml" xmlns:w15="http://schemas.microsoft.com/office/word/2012/wordml" w:lineRule="auto" w:line="247"/>
         <w:ind xmlns:wps="http://schemas.microsoft.com/office/word/2010/wordprocessingShape" xmlns:wpg="http://schemas.microsoft.com/office/word/2010/wordprocessingGroup" xmlns:mc="http://schemas.openxmlformats.org/markup-compatibility/2006" xmlns:wp14="http://schemas.microsoft.com/office/word/2010/wordprocessingDrawing" xmlns:w14="http://schemas.microsoft.com/office/word/2010/wordml" xmlns:w15="http://schemas.microsoft.com/office/word/2012/wordml" w:firstLine="288" w:start="100" w:end="122"/>
@@ -139,12 +139,28 @@
         <w:rPr xmlns:wps="http://schemas.microsoft.com/office/word/2010/wordprocessingShape" xmlns:wpg="http://schemas.microsoft.com/office/word/2010/wordprocessingGroup" xmlns:mc="http://schemas.openxmlformats.org/markup-compatibility/2006" xmlns:wp14="http://schemas.microsoft.com/office/word/2010/wordprocessingDrawing" xmlns:w14="http://schemas.microsoft.com/office/word/2010/wordml" xmlns:w15="http://schemas.microsoft.com/office/word/2012/wordml"/>
       </w:pPr>
       <w:r>
-        <w:t xml:space="preserve">Возможно, вы взяли эту книгу в надежде узнать, как приумножить личное состояние — и она действительно об этом. Но «Создание богатства» — не очередная схема быстрого обогащения. Эта книга поможет вам найти и создать богатство там, где вы его не ожидаете, а также показать, насколько вы уже богаты.</w:t>
+        <w:t xml:space="preserve">Возможно, вы взяли эту книгу в надежде узнать, как приумножить личное состояние — и она действительно поможет в этом. Но</w:t>
+      </w:r>
+      <w:r>
+        <w:t xml:space="preserve"> </w:t>
+      </w:r>
+      <w:r>
+        <w:rPr>
+          <w:i/>
+          <w:iCs/>
+        </w:rPr>
+        <w:t xml:space="preserve">«Создание богатства»</w:t>
+      </w:r>
+      <w:r>
+        <w:t xml:space="preserve"> </w:t>
+      </w:r>
+      <w:r>
+        <w:t xml:space="preserve">— не очередная схема быстрого обогащения. Книга подскажет, где искать и как создавать богатство там, где вы его не ожидаете, и покажет, насколько вы уже богаты.</w:t>
       </w:r>
     </w:p>
     <w:p>
       <w:pPr>
-        <w:pStyle xmlns:wps="http://schemas.microsoft.com/office/word/2010/wordprocessingShape" xmlns:wpg="http://schemas.microsoft.com/office/word/2010/wordprocessingGroup" xmlns:mc="http://schemas.openxmlformats.org/markup-compatibility/2006" xmlns:wp14="http://schemas.microsoft.com/office/word/2010/wordprocessingDrawing" xmlns:w14="http://schemas.microsoft.com/office/word/2010/wordml" xmlns:w15="http://schemas.microsoft.com/office/word/2012/wordml" w:val="BodyText"/>
+        <w:pStyle w:val="BodyText"/>
         <w:bidi xmlns:wps="http://schemas.microsoft.com/office/word/2010/wordprocessingShape" xmlns:wpg="http://schemas.microsoft.com/office/word/2010/wordprocessingGroup" xmlns:mc="http://schemas.openxmlformats.org/markup-compatibility/2006" xmlns:wp14="http://schemas.microsoft.com/office/word/2010/wordprocessingDrawing" xmlns:w14="http://schemas.microsoft.com/office/word/2010/wordml" xmlns:w15="http://schemas.microsoft.com/office/word/2012/wordml" w:val="0"/>
         <w:spacing xmlns:wps="http://schemas.microsoft.com/office/word/2010/wordprocessingShape" xmlns:wpg="http://schemas.microsoft.com/office/word/2010/wordprocessingGroup" xmlns:mc="http://schemas.openxmlformats.org/markup-compatibility/2006" xmlns:wp14="http://schemas.microsoft.com/office/word/2010/wordprocessingDrawing" xmlns:w14="http://schemas.microsoft.com/office/word/2010/wordml" xmlns:w15="http://schemas.microsoft.com/office/word/2012/wordml" w:before="285" w:after="0"/>
         <w:ind xmlns:wps="http://schemas.microsoft.com/office/word/2010/wordprocessingShape" xmlns:wpg="http://schemas.microsoft.com/office/word/2010/wordprocessingGroup" xmlns:mc="http://schemas.openxmlformats.org/markup-compatibility/2006" xmlns:wp14="http://schemas.microsoft.com/office/word/2010/wordprocessingDrawing" xmlns:w14="http://schemas.microsoft.com/office/word/2010/wordml" xmlns:w15="http://schemas.microsoft.com/office/word/2012/wordml" w:start="5025" w:end="0"/>
@@ -157,7 +173,7 @@
     </w:p>
     <w:p>
       <w:pPr>
-        <w:pStyle xmlns:wps="http://schemas.microsoft.com/office/word/2010/wordprocessingShape" xmlns:wpg="http://schemas.microsoft.com/office/word/2010/wordprocessingGroup" xmlns:mc="http://schemas.openxmlformats.org/markup-compatibility/2006" xmlns:wp14="http://schemas.microsoft.com/office/word/2010/wordprocessingDrawing" xmlns:w14="http://schemas.microsoft.com/office/word/2010/wordml" xmlns:w15="http://schemas.microsoft.com/office/word/2012/wordml" w:val="BodyText"/>
+        <w:pStyle w:val="BodyText"/>
         <w:bidi xmlns:wps="http://schemas.microsoft.com/office/word/2010/wordprocessingShape" xmlns:wpg="http://schemas.microsoft.com/office/word/2010/wordprocessingGroup" xmlns:mc="http://schemas.openxmlformats.org/markup-compatibility/2006" xmlns:wp14="http://schemas.microsoft.com/office/word/2010/wordprocessingDrawing" xmlns:w14="http://schemas.microsoft.com/office/word/2010/wordml" xmlns:w15="http://schemas.microsoft.com/office/word/2012/wordml" w:val="0"/>
         <w:spacing xmlns:wps="http://schemas.microsoft.com/office/word/2010/wordprocessingShape" xmlns:wpg="http://schemas.microsoft.com/office/word/2010/wordprocessingGroup" xmlns:mc="http://schemas.openxmlformats.org/markup-compatibility/2006" xmlns:wp14="http://schemas.microsoft.com/office/word/2010/wordprocessingDrawing" xmlns:w14="http://schemas.microsoft.com/office/word/2010/wordml" xmlns:w15="http://schemas.microsoft.com/office/word/2012/wordml" w:lineRule="auto" w:line="250" w:before="9" w:after="0"/>
         <w:ind xmlns:wps="http://schemas.microsoft.com/office/word/2010/wordprocessingShape" xmlns:wpg="http://schemas.microsoft.com/office/word/2010/wordprocessingGroup" xmlns:mc="http://schemas.openxmlformats.org/markup-compatibility/2006" xmlns:wp14="http://schemas.microsoft.com/office/word/2010/wordprocessingDrawing" xmlns:w14="http://schemas.microsoft.com/office/word/2010/wordml" xmlns:w15="http://schemas.microsoft.com/office/word/2012/wordml" w:start="100" w:end="280"/>
@@ -165,18 +181,34 @@
         <w:rPr xmlns:wps="http://schemas.microsoft.com/office/word/2010/wordprocessingShape" xmlns:wpg="http://schemas.microsoft.com/office/word/2010/wordprocessingGroup" xmlns:mc="http://schemas.openxmlformats.org/markup-compatibility/2006" xmlns:wp14="http://schemas.microsoft.com/office/word/2010/wordprocessingDrawing" xmlns:w14="http://schemas.microsoft.com/office/word/2010/wordml" xmlns:w15="http://schemas.microsoft.com/office/word/2012/wordml"/>
       </w:pPr>
       <w:r>
-        <w:t xml:space="preserve">Богатство. Это то, чего мы все хотим. Но богатый — богат чем? Вещами, деньгами, доходом? Всё зависит от того, как вы определяете это слово. Его первоначальное значение — староанглийское weal (как в commonweal) — означало просто процветание или благополучие</w:t>
+        <w:t xml:space="preserve">Богатство — то, чего мы все хотим. Но чем именно богат человек? Вещами, деньгами, доходом? Всё зависит от определения. Первоначальное значение слова, от староанглийского</w:t>
+      </w:r>
+      <w:r>
+        <w:t xml:space="preserve"> </w:t>
+      </w:r>
+      <w:r>
+        <w:rPr>
+          <w:i/>
+          <w:iCs/>
+        </w:rPr>
+        <w:t xml:space="preserve">weal</w:t>
+      </w:r>
+      <w:r>
+        <w:t xml:space="preserve"> </w:t>
+      </w:r>
+      <w:r>
+        <w:t xml:space="preserve">(как в commonweal), — простое процветание или благополучие</w:t>
       </w:r>
       <w:r>
         <w:t xml:space="preserve">(1)</w:t>
       </w:r>
       <w:r>
-        <w:t xml:space="preserve">. Как далеко это от того смысла, который многие из нас теперь вкладывают в это слово. Богатство — больше, чем накопление денег и ресурсов, и его можно создать не только традиционными финансовыми средствами. Чтобы по‑настоящему понять богатство обществ, культур и окружающей среды, стоит вернуться к старому понятию богатства как благополучия. Мы можем думать, что выигрыш в лотерею сделает нас богатыми, а богатство — счастливыми, но это не всегда так. Хотя бедность действительно ведёт к несчастью, много денег не гарантирует счастья.</w:t>
+        <w:t xml:space="preserve">. Какое контрастное отличие от того смысла, который многие из нас теперь вкладывают в это слово. Богатство — не просто накопление денег и ресурсов; его можно создавать не только традиционными финансовыми средствами. Чтобы по-настоящему понять богатство наших обществ, культур и окружающей среды, стоит вернуть внимание к старому смыслу — благополучию. Мы можем думать, что выигрыш в лотерею сделает нас богаче, а богатство — счастливее, но это не всегда так. Бедность действительно приносит несчастье, но много денег не всегда покупают счастье.</w:t>
       </w:r>
     </w:p>
     <w:p>
       <w:pPr>
-        <w:pStyle xmlns:wps="http://schemas.microsoft.com/office/word/2010/wordprocessingShape" xmlns:wpg="http://schemas.microsoft.com/office/word/2010/wordprocessingGroup" xmlns:mc="http://schemas.openxmlformats.org/markup-compatibility/2006" xmlns:wp14="http://schemas.microsoft.com/office/word/2010/wordprocessingDrawing" xmlns:w14="http://schemas.microsoft.com/office/word/2010/wordml" xmlns:w15="http://schemas.microsoft.com/office/word/2012/wordml" w:val="BodyText"/>
+        <w:pStyle w:val="BodyText"/>
         <w:bidi xmlns:wps="http://schemas.microsoft.com/office/word/2010/wordprocessingShape" xmlns:wpg="http://schemas.microsoft.com/office/word/2010/wordprocessingGroup" xmlns:mc="http://schemas.openxmlformats.org/markup-compatibility/2006" xmlns:wp14="http://schemas.microsoft.com/office/word/2010/wordprocessingDrawing" xmlns:w14="http://schemas.microsoft.com/office/word/2010/wordml" xmlns:w15="http://schemas.microsoft.com/office/word/2012/wordml" w:val="0"/>
         <w:spacing xmlns:wps="http://schemas.microsoft.com/office/word/2010/wordprocessingShape" xmlns:wpg="http://schemas.microsoft.com/office/word/2010/wordprocessingGroup" xmlns:mc="http://schemas.openxmlformats.org/markup-compatibility/2006" xmlns:wp14="http://schemas.microsoft.com/office/word/2010/wordprocessingDrawing" xmlns:w14="http://schemas.microsoft.com/office/word/2010/wordml" xmlns:w15="http://schemas.microsoft.com/office/word/2012/wordml" w:lineRule="auto" w:line="247"/>
         <w:ind xmlns:wps="http://schemas.microsoft.com/office/word/2010/wordprocessingShape" xmlns:wpg="http://schemas.microsoft.com/office/word/2010/wordprocessingGroup" xmlns:mc="http://schemas.openxmlformats.org/markup-compatibility/2006" xmlns:wp14="http://schemas.microsoft.com/office/word/2010/wordprocessingDrawing" xmlns:w14="http://schemas.microsoft.com/office/word/2010/wordml" xmlns:w15="http://schemas.microsoft.com/office/word/2012/wordml" w:firstLine="288" w:start="100" w:end="122"/>
@@ -184,12 +216,12 @@
         <w:rPr xmlns:wps="http://schemas.microsoft.com/office/word/2010/wordprocessingShape" xmlns:wpg="http://schemas.microsoft.com/office/word/2010/wordprocessingGroup" xmlns:mc="http://schemas.openxmlformats.org/markup-compatibility/2006" xmlns:wp14="http://schemas.microsoft.com/office/word/2010/wordprocessingDrawing" xmlns:w14="http://schemas.microsoft.com/office/word/2010/wordml" xmlns:w15="http://schemas.microsoft.com/office/word/2012/wordml"/>
       </w:pPr>
       <w:r>
-        <w:t xml:space="preserve">Возможно, вы видели случаи, когда человек с очень низким доходом выигрывал в лотерею или получал крупную компенсацию по суду, но эти деньги нередко не улучшали его жизни. Во многих таких случаях всё лишь ухудшается: стресс от обладания деньгами и новых требований сказывается на человеке — как их сохранить; вдруг появляются родственники и «друзья», о которых вы и не подозревали; появляются мошенники и целая армия «инвестиционных консультантов».</w:t>
+        <w:t xml:space="preserve">Мы, вероятно, видели случаи, когда человек с очень низким доходом выигрывал в лотерею или получал крупную компенсацию по суду, но эти деньги нередко не приносили значительного улучшения в жизни. Во многих таких случаях всё даже ухудшается: стресс от обладания деньгами и новых требований сказывается на человеке — надо решать, как сохранить средства; вдруг появляются родственники и «друзья», о которых вы и не подозревали; появляются мошенники и целая армия «инвестиционных консультантов».</w:t>
       </w:r>
     </w:p>
     <w:p>
       <w:pPr>
-        <w:pStyle xmlns:wps="http://schemas.microsoft.com/office/word/2010/wordprocessingShape" xmlns:wpg="http://schemas.microsoft.com/office/word/2010/wordprocessingGroup" xmlns:mc="http://schemas.openxmlformats.org/markup-compatibility/2006" xmlns:wp14="http://schemas.microsoft.com/office/word/2010/wordprocessingDrawing" xmlns:w14="http://schemas.microsoft.com/office/word/2010/wordml" xmlns:w15="http://schemas.microsoft.com/office/word/2012/wordml" w:val="BodyText"/>
+        <w:pStyle w:val="BodyText"/>
         <w:bidi xmlns:wps="http://schemas.microsoft.com/office/word/2010/wordprocessingShape" xmlns:wpg="http://schemas.microsoft.com/office/word/2010/wordprocessingGroup" xmlns:mc="http://schemas.openxmlformats.org/markup-compatibility/2006" xmlns:wp14="http://schemas.microsoft.com/office/word/2010/wordprocessingDrawing" xmlns:w14="http://schemas.microsoft.com/office/word/2010/wordml" xmlns:w15="http://schemas.microsoft.com/office/word/2012/wordml" w:val="0"/>
         <w:spacing xmlns:wps="http://schemas.microsoft.com/office/word/2010/wordprocessingShape" xmlns:wpg="http://schemas.microsoft.com/office/word/2010/wordprocessingGroup" xmlns:mc="http://schemas.openxmlformats.org/markup-compatibility/2006" xmlns:wp14="http://schemas.microsoft.com/office/word/2010/wordprocessingDrawing" xmlns:w14="http://schemas.microsoft.com/office/word/2010/wordml" xmlns:w15="http://schemas.microsoft.com/office/word/2012/wordml" w:lineRule="auto" w:line="247" w:before="0" w:after="0"/>
         <w:ind xmlns:wps="http://schemas.microsoft.com/office/word/2010/wordprocessingShape" xmlns:wpg="http://schemas.microsoft.com/office/word/2010/wordprocessingGroup" xmlns:mc="http://schemas.openxmlformats.org/markup-compatibility/2006" xmlns:wp14="http://schemas.microsoft.com/office/word/2010/wordprocessingDrawing" xmlns:w14="http://schemas.microsoft.com/office/word/2010/wordml" xmlns:w15="http://schemas.microsoft.com/office/word/2012/wordml" w:firstLine="288" w:start="100" w:end="122"/>
@@ -197,12 +229,12 @@
         <w:rPr xmlns:wps="http://schemas.microsoft.com/office/word/2010/wordprocessingShape" xmlns:wpg="http://schemas.microsoft.com/office/word/2010/wordprocessingGroup" xmlns:mc="http://schemas.openxmlformats.org/markup-compatibility/2006" xmlns:wp14="http://schemas.microsoft.com/office/word/2010/wordprocessingDrawing" xmlns:w14="http://schemas.microsoft.com/office/word/2010/wordml" xmlns:w15="http://schemas.microsoft.com/office/word/2012/wordml"/>
       </w:pPr>
       <w:r>
-        <w:t xml:space="preserve">Как достичь благополучия, если оно не связано с накоплением больших сумм? Когда мы счастливы? Ответ прост: мы чувствуем себя счастливыми, когда удовлетворены наши потребности — не только в еде, одежде и жилье, но и в творческом участии в жизни сообщества, в праве голоса при формировании своей судьбы, в стремлении к духовному развитию без социальных ограничений, во времени для отдыха, развлечений и общения с семьёй. Наши потребности многообразны…</w:t>
+        <w:t xml:space="preserve">Как достичь благополучия, если оно не сводится к большим деньгам? Когда мы счастливы? Ответ прост: мы счастливы, когда наши потребности удовлетворены. Речь не только о еде, одежде и жилье, но и о возможности быть творческим участником сообщества, иметь голос в собственной судьбе, стремиться к духовному развитию без социальных ограничений, иметь время для отдыха, развлечений и близких. Наши потребности разнообразны.</w:t>
       </w:r>
     </w:p>
     <w:p>
       <w:pPr>
-        <w:pStyle xmlns:wps="http://schemas.microsoft.com/office/word/2010/wordprocessingShape" xmlns:wpg="http://schemas.microsoft.com/office/word/2010/wordprocessingGroup" xmlns:mc="http://schemas.openxmlformats.org/markup-compatibility/2006" xmlns:wp14="http://schemas.microsoft.com/office/word/2010/wordprocessingDrawing" xmlns:w14="http://schemas.microsoft.com/office/word/2010/wordml" xmlns:w15="http://schemas.microsoft.com/office/word/2012/wordml" w:val="BodyText"/>
+        <w:pStyle w:val="BodyText"/>
         <w:bidi xmlns:wps="http://schemas.microsoft.com/office/word/2010/wordprocessingShape" xmlns:wpg="http://schemas.microsoft.com/office/word/2010/wordprocessingGroup" xmlns:mc="http://schemas.openxmlformats.org/markup-compatibility/2006" xmlns:wp14="http://schemas.microsoft.com/office/word/2010/wordprocessingDrawing" xmlns:w14="http://schemas.microsoft.com/office/word/2010/wordml" xmlns:w15="http://schemas.microsoft.com/office/word/2012/wordml" w:val="0"/>
         <w:spacing xmlns:wps="http://schemas.microsoft.com/office/word/2010/wordprocessingShape" xmlns:wpg="http://schemas.microsoft.com/office/word/2010/wordprocessingGroup" xmlns:mc="http://schemas.openxmlformats.org/markup-compatibility/2006" xmlns:wp14="http://schemas.microsoft.com/office/word/2010/wordprocessingDrawing" xmlns:w14="http://schemas.microsoft.com/office/word/2010/wordml" xmlns:w15="http://schemas.microsoft.com/office/word/2012/wordml" w:lineRule="auto" w:line="247" w:before="84" w:after="0"/>
         <w:ind xmlns:wps="http://schemas.microsoft.com/office/word/2010/wordprocessingShape" xmlns:wpg="http://schemas.microsoft.com/office/word/2010/wordprocessingGroup" xmlns:mc="http://schemas.openxmlformats.org/markup-compatibility/2006" xmlns:wp14="http://schemas.microsoft.com/office/word/2010/wordprocessingDrawing" xmlns:w14="http://schemas.microsoft.com/office/word/2010/wordml" xmlns:w15="http://schemas.microsoft.com/office/word/2012/wordml" w:start="100" w:end="122"/>
@@ -210,12 +242,12 @@
         <w:rPr xmlns:wps="http://schemas.microsoft.com/office/word/2010/wordprocessingShape" xmlns:wpg="http://schemas.microsoft.com/office/word/2010/wordprocessingGroup" xmlns:mc="http://schemas.openxmlformats.org/markup-compatibility/2006" xmlns:wp14="http://schemas.microsoft.com/office/word/2010/wordprocessingDrawing" xmlns:w14="http://schemas.microsoft.com/office/word/2010/wordml" xmlns:w15="http://schemas.microsoft.com/office/word/2012/wordml"/>
       </w:pPr>
       <w:r>
-        <w:t xml:space="preserve">Многообразны, но при этом с доминирующим акцентом на потребительскую экономику: основные экономические игроки — предприятия и корпорации — постоянно рекламируют свои товары, убеждая нас, что покупки принесут удовлетворение.</w:t>
+        <w:t xml:space="preserve">Они многогранны, но в современной экономике доминирует акцент на потреблении: главные экономические игроки — предприятия и корпорации — постоянно продвигают свои товары, убеждая нас, что покупки принесут удовлетворение.</w:t>
       </w:r>
     </w:p>
     <w:p>
       <w:pPr>
-        <w:pStyle xmlns:wps="http://schemas.microsoft.com/office/word/2010/wordprocessingShape" xmlns:wpg="http://schemas.microsoft.com/office/word/2010/wordprocessingGroup" xmlns:mc="http://schemas.openxmlformats.org/markup-compatibility/2006" xmlns:wp14="http://schemas.microsoft.com/office/word/2010/wordprocessingDrawing" xmlns:w14="http://schemas.microsoft.com/office/word/2010/wordml" xmlns:w15="http://schemas.microsoft.com/office/word/2012/wordml" w:val="BodyText"/>
+        <w:pStyle w:val="BodyText"/>
         <w:bidi xmlns:wps="http://schemas.microsoft.com/office/word/2010/wordprocessingShape" xmlns:wpg="http://schemas.microsoft.com/office/word/2010/wordprocessingGroup" xmlns:mc="http://schemas.openxmlformats.org/markup-compatibility/2006" xmlns:wp14="http://schemas.microsoft.com/office/word/2010/wordprocessingDrawing" xmlns:w14="http://schemas.microsoft.com/office/word/2010/wordml" xmlns:w15="http://schemas.microsoft.com/office/word/2012/wordml" w:val="0"/>
         <w:spacing xmlns:wps="http://schemas.microsoft.com/office/word/2010/wordprocessingShape" xmlns:wpg="http://schemas.microsoft.com/office/word/2010/wordprocessingGroup" xmlns:mc="http://schemas.openxmlformats.org/markup-compatibility/2006" xmlns:wp14="http://schemas.microsoft.com/office/word/2010/wordprocessingDrawing" xmlns:w14="http://schemas.microsoft.com/office/word/2010/wordml" xmlns:w15="http://schemas.microsoft.com/office/word/2012/wordml" w:before="287" w:after="0"/>
         <w:ind xmlns:wps="http://schemas.microsoft.com/office/word/2010/wordprocessingShape" xmlns:wpg="http://schemas.microsoft.com/office/word/2010/wordprocessingGroup" xmlns:mc="http://schemas.openxmlformats.org/markup-compatibility/2006" xmlns:wp14="http://schemas.microsoft.com/office/word/2010/wordprocessingDrawing" xmlns:w14="http://schemas.microsoft.com/office/word/2010/wordml" xmlns:w15="http://schemas.microsoft.com/office/word/2012/wordml" w:start="1252" w:end="0"/>
@@ -223,12 +255,12 @@
         <w:rPr xmlns:wps="http://schemas.microsoft.com/office/word/2010/wordprocessingShape" xmlns:wpg="http://schemas.microsoft.com/office/word/2010/wordprocessingGroup" xmlns:mc="http://schemas.openxmlformats.org/markup-compatibility/2006" xmlns:wp14="http://schemas.microsoft.com/office/word/2010/wordprocessingDrawing" xmlns:w14="http://schemas.microsoft.com/office/word/2010/wordml" xmlns:w15="http://schemas.microsoft.com/office/word/2012/wordml"/>
       </w:pPr>
       <w:r>
-        <w:t xml:space="preserve">Нам не нужны деньги сами по себе — нам нужны вещи, которые можно за них купить.</w:t>
+        <w:t xml:space="preserve">Нам не нужны деньги — нам нужны вещи, которые можно на них купить.</w:t>
       </w:r>
     </w:p>
     <w:p>
       <w:pPr>
-        <w:pStyle xmlns:wps="http://schemas.microsoft.com/office/word/2010/wordprocessingShape" xmlns:wpg="http://schemas.microsoft.com/office/word/2010/wordprocessingGroup" xmlns:mc="http://schemas.openxmlformats.org/markup-compatibility/2006" xmlns:wp14="http://schemas.microsoft.com/office/word/2010/wordprocessingDrawing" xmlns:w14="http://schemas.microsoft.com/office/word/2010/wordml" xmlns:w15="http://schemas.microsoft.com/office/word/2012/wordml" w:val="BodyText"/>
+        <w:pStyle w:val="BodyText"/>
         <w:bidi xmlns:wps="http://schemas.microsoft.com/office/word/2010/wordprocessingShape" xmlns:wpg="http://schemas.microsoft.com/office/word/2010/wordprocessingGroup" xmlns:mc="http://schemas.openxmlformats.org/markup-compatibility/2006" xmlns:wp14="http://schemas.microsoft.com/office/word/2010/wordprocessingDrawing" xmlns:w14="http://schemas.microsoft.com/office/word/2010/wordml" xmlns:w15="http://schemas.microsoft.com/office/word/2012/wordml" w:val="0"/>
         <w:spacing xmlns:wps="http://schemas.microsoft.com/office/word/2010/wordprocessingShape" xmlns:wpg="http://schemas.microsoft.com/office/word/2010/wordprocessingGroup" xmlns:mc="http://schemas.openxmlformats.org/markup-compatibility/2006" xmlns:wp14="http://schemas.microsoft.com/office/word/2010/wordprocessingDrawing" xmlns:w14="http://schemas.microsoft.com/office/word/2010/wordml" xmlns:w15="http://schemas.microsoft.com/office/word/2012/wordml" w:lineRule="auto" w:line="247"/>
         <w:ind xmlns:wps="http://schemas.microsoft.com/office/word/2010/wordprocessingShape" xmlns:wpg="http://schemas.microsoft.com/office/word/2010/wordprocessingGroup" xmlns:mc="http://schemas.openxmlformats.org/markup-compatibility/2006" xmlns:wp14="http://schemas.microsoft.com/office/word/2010/wordprocessingDrawing" xmlns:w14="http://schemas.microsoft.com/office/word/2010/wordml" xmlns:w15="http://schemas.microsoft.com/office/word/2012/wordml" w:firstLine="288" w:start="100" w:end="122"/>
@@ -236,12 +268,12 @@
         <w:rPr xmlns:wps="http://schemas.microsoft.com/office/word/2010/wordprocessingShape" xmlns:wpg="http://schemas.microsoft.com/office/word/2010/wordprocessingGroup" xmlns:mc="http://schemas.openxmlformats.org/markup-compatibility/2006" xmlns:wp14="http://schemas.microsoft.com/office/word/2010/wordprocessingDrawing" xmlns:w14="http://schemas.microsoft.com/office/word/2010/wordml" xmlns:w15="http://schemas.microsoft.com/office/word/2012/wordml"/>
       </w:pPr>
       <w:r>
-        <w:t xml:space="preserve">Избыточный вес? Купите диетический план и тренажёр. Чувствуете себя несчастным? Существует множество программ саморазвития, которые можно приобрести. Потеряли духовный ориентир? Купите книгу или видеокурс, присоединитесь к успешной мегацеркви или отправьтесь на курорт. Потребность в самовыражении всё чаще удовлетворяется одеждой и автомобилем. Искусство и музыка остаются делом профессионалов, предлагающих свои услуги на продажу. И всё же после всего этого мы обнаруживаем: потребительские решения не работают — кратковременное удовлетворение от новых покупок лишь усугубляет первоначальную потребность. Если счастье не купить, значит, должен быть другой путь.</w:t>
+        <w:t xml:space="preserve">Избыточный вес? Купите диетический план и абонемент в спортзал. Несчастны? Существует множество платных программ саморазвития. Духовно потеряны? Купите книгу или видеокурс, присоединитесь к успешной мегацеркви или отправьтесь на курорт. Наше самовыражение всё чаще сводится к одежде и автомобилям. Искусство и музыка превращены в товары профессионалов. Но всё это даёт лишь временное удовлетворение, которое в конечном счёте лишь усиливает нашу глубокую потребность. Если счастье не купить, значит, существует другой путь.</w:t>
       </w:r>
     </w:p>
     <w:p>
       <w:pPr>
-        <w:pStyle xmlns:wps="http://schemas.microsoft.com/office/word/2010/wordprocessingShape" xmlns:wpg="http://schemas.microsoft.com/office/word/2010/wordprocessingGroup" xmlns:mc="http://schemas.openxmlformats.org/markup-compatibility/2006" xmlns:wp14="http://schemas.microsoft.com/office/word/2010/wordprocessingDrawing" xmlns:w14="http://schemas.microsoft.com/office/word/2010/wordml" xmlns:w15="http://schemas.microsoft.com/office/word/2012/wordml" w:val="BodyText"/>
+        <w:pStyle w:val="BodyText"/>
         <w:bidi xmlns:wps="http://schemas.microsoft.com/office/word/2010/wordprocessingShape" xmlns:wpg="http://schemas.microsoft.com/office/word/2010/wordprocessingGroup" xmlns:mc="http://schemas.openxmlformats.org/markup-compatibility/2006" xmlns:wp14="http://schemas.microsoft.com/office/word/2010/wordprocessingDrawing" xmlns:w14="http://schemas.microsoft.com/office/word/2010/wordml" xmlns:w15="http://schemas.microsoft.com/office/word/2012/wordml" w:val="0"/>
         <w:spacing xmlns:wps="http://schemas.microsoft.com/office/word/2010/wordprocessingShape" xmlns:wpg="http://schemas.microsoft.com/office/word/2010/wordprocessingGroup" xmlns:mc="http://schemas.openxmlformats.org/markup-compatibility/2006" xmlns:wp14="http://schemas.microsoft.com/office/word/2010/wordprocessingDrawing" xmlns:w14="http://schemas.microsoft.com/office/word/2010/wordml" xmlns:w15="http://schemas.microsoft.com/office/word/2012/wordml" w:lineRule="auto" w:line="250"/>
         <w:ind xmlns:wps="http://schemas.microsoft.com/office/word/2010/wordprocessingShape" xmlns:wpg="http://schemas.microsoft.com/office/word/2010/wordprocessingGroup" xmlns:mc="http://schemas.openxmlformats.org/markup-compatibility/2006" xmlns:wp14="http://schemas.microsoft.com/office/word/2010/wordprocessingDrawing" xmlns:w14="http://schemas.microsoft.com/office/word/2010/wordml" xmlns:w15="http://schemas.microsoft.com/office/word/2012/wordml" w:firstLine="288" w:start="100" w:end="99"/>
@@ -249,23 +281,7 @@
         <w:rPr xmlns:wps="http://schemas.microsoft.com/office/word/2010/wordprocessingShape" xmlns:wpg="http://schemas.microsoft.com/office/word/2010/wordprocessingGroup" xmlns:mc="http://schemas.openxmlformats.org/markup-compatibility/2006" xmlns:wp14="http://schemas.microsoft.com/office/word/2010/wordprocessingDrawing" xmlns:w14="http://schemas.microsoft.com/office/word/2010/wordml" xmlns:w15="http://schemas.microsoft.com/office/word/2012/wordml"/>
       </w:pPr>
       <w:r>
-        <w:t xml:space="preserve">В качестве первого шага на пути к</w:t>
-      </w:r>
-      <w:r>
-        <w:t xml:space="preserve"> </w:t>
-      </w:r>
-      <w:r>
-        <w:rPr>
-          <w:i/>
-          <w:iCs/>
-        </w:rPr>
-        <w:t xml:space="preserve">устойчивому</w:t>
-      </w:r>
-      <w:r>
-        <w:t xml:space="preserve"> </w:t>
-      </w:r>
-      <w:r>
-        <w:t xml:space="preserve">богатству нам нужно переосмыслить само понятие богатства. Что это значит? Вспомните идею общественного благосостояния. Создание реального богатства подразумевает принятие решений, которые позволяют всем членам общества достичь благополучия. Устойчивое богатство проецирует это понятие в будущее — как сделала Всемирная комиссия по окружающей среде и развитию, определив устойчивое развитие как «удовлетворение потребностей настоящего времени без ущерба для способности будущих поколений удовлетворять свои собственные потребности»</w:t>
+        <w:t xml:space="preserve">В качестве первого шага к устойчивому богатству нужно переосмыслить само понятие богатства. Что это значит? Вспомните идею общественного благосостояния. Создание подлинного богатства требует принятия решений, позволяющих всем членам общества достичь благополучия. Устойчивое богатство — это перенос этой идеи в будущее: как сформулировала Всемирная комиссия по окружающей среде и развитию, устойчивое развитие — «удовлетворение потребностей настоящего без ущерба способности будущих поколений удовлетворять собственные потребности»</w:t>
       </w:r>
       <w:r>
         <w:t xml:space="preserve">2</w:t>
@@ -292,7 +308,7 @@
     </w:p>
     <w:p>
       <w:pPr>
-        <w:pStyle xmlns:wps="http://schemas.microsoft.com/office/word/2010/wordprocessingShape" xmlns:wpg="http://schemas.microsoft.com/office/word/2010/wordprocessingGroup" xmlns:mc="http://schemas.openxmlformats.org/markup-compatibility/2006" xmlns:wp14="http://schemas.microsoft.com/office/word/2010/wordprocessingDrawing" xmlns:w14="http://schemas.microsoft.com/office/word/2010/wordml" xmlns:w15="http://schemas.microsoft.com/office/word/2012/wordml" w:val="BodyText"/>
+        <w:pStyle w:val="BodyText"/>
         <w:bidi xmlns:wps="http://schemas.microsoft.com/office/word/2010/wordprocessingShape" xmlns:wpg="http://schemas.microsoft.com/office/word/2010/wordprocessingGroup" xmlns:mc="http://schemas.openxmlformats.org/markup-compatibility/2006" xmlns:wp14="http://schemas.microsoft.com/office/word/2010/wordprocessingDrawing" xmlns:w14="http://schemas.microsoft.com/office/word/2010/wordml" xmlns:w15="http://schemas.microsoft.com/office/word/2012/wordml" w:val="0"/>
         <w:spacing xmlns:wps="http://schemas.microsoft.com/office/word/2010/wordprocessingShape" xmlns:wpg="http://schemas.microsoft.com/office/word/2010/wordprocessingGroup" xmlns:mc="http://schemas.openxmlformats.org/markup-compatibility/2006" xmlns:wp14="http://schemas.microsoft.com/office/word/2010/wordprocessingDrawing" xmlns:w14="http://schemas.microsoft.com/office/word/2010/wordml" xmlns:w15="http://schemas.microsoft.com/office/word/2012/wordml" w:before="285" w:after="0"/>
         <w:ind xmlns:wps="http://schemas.microsoft.com/office/word/2010/wordprocessingShape" xmlns:wpg="http://schemas.microsoft.com/office/word/2010/wordprocessingGroup" xmlns:mc="http://schemas.openxmlformats.org/markup-compatibility/2006" xmlns:wp14="http://schemas.microsoft.com/office/word/2010/wordprocessingDrawing" xmlns:w14="http://schemas.microsoft.com/office/word/2010/wordml" xmlns:w15="http://schemas.microsoft.com/office/word/2012/wordml" w:start="4795" w:end="0"/>
@@ -305,7 +321,7 @@
     </w:p>
     <w:p>
       <w:pPr>
-        <w:pStyle xmlns:wps="http://schemas.microsoft.com/office/word/2010/wordprocessingShape" xmlns:wpg="http://schemas.microsoft.com/office/word/2010/wordprocessingGroup" xmlns:mc="http://schemas.openxmlformats.org/markup-compatibility/2006" xmlns:wp14="http://schemas.microsoft.com/office/word/2010/wordprocessingDrawing" xmlns:w14="http://schemas.microsoft.com/office/word/2010/wordml" xmlns:w15="http://schemas.microsoft.com/office/word/2012/wordml" w:val="BodyText"/>
+        <w:pStyle w:val="BodyText"/>
         <w:bidi xmlns:wps="http://schemas.microsoft.com/office/word/2010/wordprocessingShape" xmlns:wpg="http://schemas.microsoft.com/office/word/2010/wordprocessingGroup" xmlns:mc="http://schemas.openxmlformats.org/markup-compatibility/2006" xmlns:wp14="http://schemas.microsoft.com/office/word/2010/wordprocessingDrawing" xmlns:w14="http://schemas.microsoft.com/office/word/2010/wordml" xmlns:w15="http://schemas.microsoft.com/office/word/2012/wordml" w:val="0"/>
         <w:spacing xmlns:wps="http://schemas.microsoft.com/office/word/2010/wordprocessingShape" xmlns:wpg="http://schemas.microsoft.com/office/word/2010/wordprocessingGroup" xmlns:mc="http://schemas.openxmlformats.org/markup-compatibility/2006" xmlns:wp14="http://schemas.microsoft.com/office/word/2010/wordprocessingDrawing" xmlns:w14="http://schemas.microsoft.com/office/word/2010/wordml" xmlns:w15="http://schemas.microsoft.com/office/word/2012/wordml" w:lineRule="auto" w:line="247" w:before="9" w:after="0"/>
         <w:ind xmlns:wps="http://schemas.microsoft.com/office/word/2010/wordprocessingShape" xmlns:wpg="http://schemas.microsoft.com/office/word/2010/wordprocessingGroup" xmlns:mc="http://schemas.openxmlformats.org/markup-compatibility/2006" xmlns:wp14="http://schemas.microsoft.com/office/word/2010/wordprocessingDrawing" xmlns:w14="http://schemas.microsoft.com/office/word/2010/wordml" xmlns:w15="http://schemas.microsoft.com/office/word/2012/wordml" w:start="100" w:end="122"/>
@@ -313,12 +329,28 @@
         <w:rPr xmlns:wps="http://schemas.microsoft.com/office/word/2010/wordprocessingShape" xmlns:wpg="http://schemas.microsoft.com/office/word/2010/wordprocessingGroup" xmlns:mc="http://schemas.openxmlformats.org/markup-compatibility/2006" xmlns:wp14="http://schemas.microsoft.com/office/word/2010/wordprocessingDrawing" xmlns:w14="http://schemas.microsoft.com/office/word/2010/wordml" xmlns:w15="http://schemas.microsoft.com/office/word/2012/wordml"/>
       </w:pPr>
       <w:r>
-        <w:t xml:space="preserve">Каковы наши потребности и как они удовлетворяются? Эмпирическую оценку можно провести, просто оглядевшись на учреждения, программы, товары и услуги в обществе. Не все из них удовлетворяют реальные нужды — некоторые явно возникли из искусственно созданных желаний или потребностей. Тем не менее инвентаризация имеющихся активов (под активами понимаются средства удовлетворения потребностей) даёт хорошую отправную точку.</w:t>
+        <w:t xml:space="preserve">Каковы наши потребности и как они удовлетворяются? Практическую оценку можно получить, оглядев учреждения, программы, товары и услуги в обществе. Не всё из этого служит реальным потребностям — кое‑что возникло из искусственно созданного</w:t>
+      </w:r>
+      <w:r>
+        <w:t xml:space="preserve"> </w:t>
+      </w:r>
+      <w:r>
+        <w:rPr>
+          <w:i/>
+          <w:iCs/>
+        </w:rPr>
+        <w:t xml:space="preserve">желания</w:t>
+      </w:r>
+      <w:r>
+        <w:t xml:space="preserve"> </w:t>
+      </w:r>
+      <w:r>
+        <w:t xml:space="preserve">или потребности — но инвентаризация имеющихся активов (под активами понимаются средства удовлетворения потребностей) даёт хорошую отправную точку.</w:t>
       </w:r>
     </w:p>
     <w:p>
       <w:pPr>
-        <w:pStyle xmlns:wps="http://schemas.microsoft.com/office/word/2010/wordprocessingShape" xmlns:wpg="http://schemas.microsoft.com/office/word/2010/wordprocessingGroup" xmlns:mc="http://schemas.openxmlformats.org/markup-compatibility/2006" xmlns:wp14="http://schemas.microsoft.com/office/word/2010/wordprocessingDrawing" xmlns:w14="http://schemas.microsoft.com/office/word/2010/wordml" xmlns:w15="http://schemas.microsoft.com/office/word/2012/wordml" w:val="BodyText"/>
+        <w:pStyle w:val="BodyText"/>
         <w:bidi xmlns:wps="http://schemas.microsoft.com/office/word/2010/wordprocessingShape" xmlns:wpg="http://schemas.microsoft.com/office/word/2010/wordprocessingGroup" xmlns:mc="http://schemas.openxmlformats.org/markup-compatibility/2006" xmlns:wp14="http://schemas.microsoft.com/office/word/2010/wordprocessingDrawing" xmlns:w14="http://schemas.microsoft.com/office/word/2010/wordml" xmlns:w15="http://schemas.microsoft.com/office/word/2012/wordml" w:val="0"/>
         <w:spacing xmlns:wps="http://schemas.microsoft.com/office/word/2010/wordprocessingShape" xmlns:wpg="http://schemas.microsoft.com/office/word/2010/wordprocessingGroup" xmlns:mc="http://schemas.openxmlformats.org/markup-compatibility/2006" xmlns:wp14="http://schemas.microsoft.com/office/word/2010/wordprocessingDrawing" xmlns:w14="http://schemas.microsoft.com/office/word/2010/wordml" xmlns:w15="http://schemas.microsoft.com/office/word/2012/wordml" w:lineRule="auto" w:line="338" w:before="288" w:after="0"/>
         <w:ind xmlns:wps="http://schemas.microsoft.com/office/word/2010/wordprocessingShape" xmlns:wpg="http://schemas.microsoft.com/office/word/2010/wordprocessingGroup" xmlns:mc="http://schemas.openxmlformats.org/markup-compatibility/2006" xmlns:wp14="http://schemas.microsoft.com/office/word/2010/wordprocessingDrawing" xmlns:w14="http://schemas.microsoft.com/office/word/2010/wordml" xmlns:w15="http://schemas.microsoft.com/office/word/2012/wordml" w:hanging="0" w:start="676" w:end="2674"/>
@@ -375,7 +407,10 @@
         <w:t xml:space="preserve"> </w:t>
       </w:r>
       <w:r>
-        <w:t xml:space="preserve">здоровье и благополучие </w:t>
+        <w:t xml:space="preserve">здоровье и благополучие</w:t>
+      </w:r>
+      <w:r>
+        <w:t xml:space="preserve"> </w:t>
       </w:r>
       <w:r>
         <w:drawing>
@@ -425,7 +460,10 @@
         <w:t xml:space="preserve"> </w:t>
       </w:r>
       <w:r>
-        <w:t xml:space="preserve">равенство, урегулирование конфликтов, самоопределение </w:t>
+        <w:t xml:space="preserve">равенство, урегулирование конфликтов, самоопределение</w:t>
+      </w:r>
+      <w:r>
+        <w:t xml:space="preserve"> </w:t>
       </w:r>
       <w:r>
         <w:drawing>
@@ -480,7 +518,7 @@
     </w:p>
     <w:p>
       <w:pPr>
-        <w:pStyle xmlns:wps="http://schemas.microsoft.com/office/word/2010/wordprocessingShape" xmlns:wpg="http://schemas.microsoft.com/office/word/2010/wordprocessingGroup" xmlns:mc="http://schemas.openxmlformats.org/markup-compatibility/2006" xmlns:wp14="http://schemas.microsoft.com/office/word/2010/wordprocessingDrawing" xmlns:w14="http://schemas.microsoft.com/office/word/2010/wordml" xmlns:w15="http://schemas.microsoft.com/office/word/2012/wordml" w:val="BodyText"/>
+        <w:pStyle w:val="BodyText"/>
         <w:bidi xmlns:wps="http://schemas.microsoft.com/office/word/2010/wordprocessingShape" xmlns:wpg="http://schemas.microsoft.com/office/word/2010/wordprocessingGroup" xmlns:mc="http://schemas.openxmlformats.org/markup-compatibility/2006" xmlns:wp14="http://schemas.microsoft.com/office/word/2010/wordprocessingDrawing" xmlns:w14="http://schemas.microsoft.com/office/word/2010/wordml" xmlns:w15="http://schemas.microsoft.com/office/word/2012/wordml" w:val="0"/>
         <w:spacing xmlns:wps="http://schemas.microsoft.com/office/word/2010/wordprocessingShape" xmlns:wpg="http://schemas.microsoft.com/office/word/2010/wordprocessingGroup" xmlns:mc="http://schemas.openxmlformats.org/markup-compatibility/2006" xmlns:wp14="http://schemas.microsoft.com/office/word/2010/wordprocessingDrawing" xmlns:w14="http://schemas.microsoft.com/office/word/2010/wordml" xmlns:w15="http://schemas.microsoft.com/office/word/2012/wordml" w:lineRule="auto" w:line="242" w:before="72" w:after="0"/>
         <w:ind xmlns:wps="http://schemas.microsoft.com/office/word/2010/wordprocessingShape" xmlns:wpg="http://schemas.microsoft.com/office/word/2010/wordprocessingGroup" xmlns:mc="http://schemas.openxmlformats.org/markup-compatibility/2006" xmlns:wp14="http://schemas.microsoft.com/office/word/2010/wordprocessingDrawing" xmlns:w14="http://schemas.microsoft.com/office/word/2010/wordml" xmlns:w15="http://schemas.microsoft.com/office/word/2012/wordml" w:hanging="1153" w:start="1828" w:end="122"/>
@@ -535,12 +573,12 @@
         <w:t xml:space="preserve"> </w:t>
       </w:r>
       <w:r>
-        <w:t xml:space="preserve">жильё, связь, транспорт, энергия, системы обращения с отходами, продовольствие</w:t>
+        <w:t xml:space="preserve">жильё, связь, транспорт, энергия, обращение с отходами, продовольствие</w:t>
       </w:r>
     </w:p>
     <w:p>
       <w:pPr>
-        <w:pStyle xmlns:wps="http://schemas.microsoft.com/office/word/2010/wordprocessingShape" xmlns:wpg="http://schemas.microsoft.com/office/word/2010/wordprocessingGroup" xmlns:mc="http://schemas.openxmlformats.org/markup-compatibility/2006" xmlns:wp14="http://schemas.microsoft.com/office/word/2010/wordprocessingDrawing" xmlns:w14="http://schemas.microsoft.com/office/word/2010/wordml" xmlns:w15="http://schemas.microsoft.com/office/word/2012/wordml" w:val="BodyText"/>
+        <w:pStyle w:val="BodyText"/>
         <w:bidi xmlns:wps="http://schemas.microsoft.com/office/word/2010/wordprocessingShape" xmlns:wpg="http://schemas.microsoft.com/office/word/2010/wordprocessingGroup" xmlns:mc="http://schemas.openxmlformats.org/markup-compatibility/2006" xmlns:wp14="http://schemas.microsoft.com/office/word/2010/wordprocessingDrawing" xmlns:w14="http://schemas.microsoft.com/office/word/2010/wordml" xmlns:w15="http://schemas.microsoft.com/office/word/2012/wordml" w:val="0"/>
         <w:spacing xmlns:wps="http://schemas.microsoft.com/office/word/2010/wordprocessingShape" xmlns:wpg="http://schemas.microsoft.com/office/word/2010/wordprocessingGroup" xmlns:mc="http://schemas.openxmlformats.org/markup-compatibility/2006" xmlns:wp14="http://schemas.microsoft.com/office/word/2010/wordprocessingDrawing" xmlns:w14="http://schemas.microsoft.com/office/word/2010/wordml" xmlns:w15="http://schemas.microsoft.com/office/word/2012/wordml" w:before="298" w:after="0"/>
         <w:ind xmlns:wps="http://schemas.microsoft.com/office/word/2010/wordprocessingShape" xmlns:wpg="http://schemas.microsoft.com/office/word/2010/wordprocessingGroup" xmlns:mc="http://schemas.openxmlformats.org/markup-compatibility/2006" xmlns:wp14="http://schemas.microsoft.com/office/word/2010/wordprocessingDrawing" xmlns:w14="http://schemas.microsoft.com/office/word/2010/wordml" xmlns:w15="http://schemas.microsoft.com/office/word/2012/wordml" w:hanging="0" w:start="676" w:end="0"/>
@@ -602,7 +640,7 @@
     </w:p>
     <w:p>
       <w:pPr>
-        <w:pStyle xmlns:wps="http://schemas.microsoft.com/office/word/2010/wordprocessingShape" xmlns:wpg="http://schemas.microsoft.com/office/word/2010/wordprocessingGroup" xmlns:mc="http://schemas.openxmlformats.org/markup-compatibility/2006" xmlns:wp14="http://schemas.microsoft.com/office/word/2010/wordprocessingDrawing" xmlns:w14="http://schemas.microsoft.com/office/word/2010/wordml" xmlns:w15="http://schemas.microsoft.com/office/word/2012/wordml" w:val="BodyText"/>
+        <w:pStyle w:val="BodyText"/>
         <w:bidi xmlns:wps="http://schemas.microsoft.com/office/word/2010/wordprocessingShape" xmlns:wpg="http://schemas.microsoft.com/office/word/2010/wordprocessingGroup" xmlns:mc="http://schemas.openxmlformats.org/markup-compatibility/2006" xmlns:wp14="http://schemas.microsoft.com/office/word/2010/wordprocessingDrawing" xmlns:w14="http://schemas.microsoft.com/office/word/2010/wordml" xmlns:w15="http://schemas.microsoft.com/office/word/2012/wordml" w:val="0"/>
         <w:spacing xmlns:wps="http://schemas.microsoft.com/office/word/2010/wordprocessingShape" xmlns:wpg="http://schemas.microsoft.com/office/word/2010/wordprocessingGroup" xmlns:mc="http://schemas.openxmlformats.org/markup-compatibility/2006" xmlns:wp14="http://schemas.microsoft.com/office/word/2010/wordprocessingDrawing" xmlns:w14="http://schemas.microsoft.com/office/word/2010/wordml" xmlns:w15="http://schemas.microsoft.com/office/word/2012/wordml" w:before="291" w:after="0"/>
         <w:ind xmlns:wps="http://schemas.microsoft.com/office/word/2010/wordprocessingShape" xmlns:wpg="http://schemas.microsoft.com/office/word/2010/wordprocessingGroup" xmlns:mc="http://schemas.openxmlformats.org/markup-compatibility/2006" xmlns:wp14="http://schemas.microsoft.com/office/word/2010/wordprocessingDrawing" xmlns:w14="http://schemas.microsoft.com/office/word/2010/wordml" xmlns:w15="http://schemas.microsoft.com/office/word/2012/wordml" w:hanging="0" w:start="0" w:end="0"/>
@@ -617,7 +655,7 @@
     </w:p>
     <w:p>
       <w:pPr>
-        <w:pStyle xmlns:wps="http://schemas.microsoft.com/office/word/2010/wordprocessingShape" xmlns:wpg="http://schemas.microsoft.com/office/word/2010/wordprocessingGroup" xmlns:mc="http://schemas.openxmlformats.org/markup-compatibility/2006" xmlns:wp14="http://schemas.microsoft.com/office/word/2010/wordprocessingDrawing" xmlns:w14="http://schemas.microsoft.com/office/word/2010/wordml" xmlns:w15="http://schemas.microsoft.com/office/word/2012/wordml" w:val="BodyText"/>
+        <w:pStyle w:val="BodyText"/>
         <w:bidi xmlns:wps="http://schemas.microsoft.com/office/word/2010/wordprocessingShape" xmlns:wpg="http://schemas.microsoft.com/office/word/2010/wordprocessingGroup" xmlns:mc="http://schemas.openxmlformats.org/markup-compatibility/2006" xmlns:wp14="http://schemas.microsoft.com/office/word/2010/wordprocessingDrawing" xmlns:w14="http://schemas.microsoft.com/office/word/2010/wordml" xmlns:w15="http://schemas.microsoft.com/office/word/2012/wordml" w:val="0"/>
         <w:spacing xmlns:wps="http://schemas.microsoft.com/office/word/2010/wordprocessingShape" xmlns:wpg="http://schemas.microsoft.com/office/word/2010/wordprocessingGroup" xmlns:mc="http://schemas.openxmlformats.org/markup-compatibility/2006" xmlns:wp14="http://schemas.microsoft.com/office/word/2010/wordprocessingDrawing" xmlns:w14="http://schemas.microsoft.com/office/word/2010/wordml" xmlns:w15="http://schemas.microsoft.com/office/word/2012/wordml" w:lineRule="auto" w:line="247" w:before="84" w:after="0"/>
         <w:ind xmlns:wps="http://schemas.microsoft.com/office/word/2010/wordprocessingShape" xmlns:wpg="http://schemas.microsoft.com/office/word/2010/wordprocessingGroup" xmlns:mc="http://schemas.openxmlformats.org/markup-compatibility/2006" xmlns:wp14="http://schemas.microsoft.com/office/word/2010/wordprocessingDrawing" xmlns:w14="http://schemas.microsoft.com/office/word/2010/wordml" xmlns:w15="http://schemas.microsoft.com/office/word/2012/wordml" w:firstLine="288" w:start="100" w:end="280"/>
@@ -625,20 +663,7 @@
         <w:rPr xmlns:wps="http://schemas.microsoft.com/office/word/2010/wordprocessingShape" xmlns:wpg="http://schemas.microsoft.com/office/word/2010/wordprocessingGroup" xmlns:mc="http://schemas.openxmlformats.org/markup-compatibility/2006" xmlns:wp14="http://schemas.microsoft.com/office/word/2010/wordprocessingDrawing" xmlns:w14="http://schemas.microsoft.com/office/word/2010/wordml" xmlns:w15="http://schemas.microsoft.com/office/word/2012/wordml"/>
       </w:pPr>
       <w:r>
-        <w:t xml:space="preserve">Прежде чем стать полноценными членами сообщества, нам нужно</w:t>
-      </w:r>
-      <w:r>
-        <w:t xml:space="preserve"> </w:t>
-      </w:r>
-      <w:r>
-        <w:rPr>
-          <w:i/>
-          <w:iCs/>
-        </w:rPr>
-        <w:t xml:space="preserve">развиваться как личности</w:t>
-      </w:r>
-      <w:r>
-        <w:t xml:space="preserve">. Нам нужны образование и здравоохранение, самоуважение, навыки и возможности для отдыха. В сообществах существуют ресурсы, удовлетворяющие эти потребности — школы, университеты, программы по уходу за детьми, оздоровительные и медицинские услуги, больницы, объекты и программы для досуга. Когда действуют системы, обеспечивающие здоровье, продуктивность и благополучие людей, можно сказать, что сообщество обладает достаточным человеческим капиталом.</w:t>
+        <w:t xml:space="preserve">Прежде чем стать полноценными членами сообщества, нам нужно развиваться как личностям. Нужны образование, здравоохранение, самоуважение, навыки и возможности для досуга. В сообществах есть ресурсы, которые это обеспечивают — школы, университеты, программы по уходу за детьми, оздоровительные и медицинские услуги (включая больницы), а также программы и объекты для отдыха. Если в сообществе работают системы, которые помогают людям быть здоровыми, продуктивными и счастливыми, можно говорить о достаточном человеческом капитале.</w:t>
       </w:r>
       <w:r>
         <w:t xml:space="preserve"> </w:t>
@@ -654,12 +679,12 @@
         <w:t xml:space="preserve"> </w:t>
       </w:r>
       <w:r>
-        <w:t xml:space="preserve">— это способность сообществ способствовать нашему развитию как личностям, а также совокупность навыков, знаний и умений, которыми обладают люди и которые они могут поддерживать.</w:t>
+        <w:t xml:space="preserve">— способность сообщества способствовать нашему развитию как личности, а также совокупность навыков, знаний и умений его жителей, которые они могут поддерживать.</w:t>
       </w:r>
     </w:p>
     <w:p>
       <w:pPr>
-        <w:pStyle xmlns:wps="http://schemas.microsoft.com/office/word/2010/wordprocessingShape" xmlns:wpg="http://schemas.microsoft.com/office/word/2010/wordprocessingGroup" xmlns:mc="http://schemas.openxmlformats.org/markup-compatibility/2006" xmlns:wp14="http://schemas.microsoft.com/office/word/2010/wordprocessingDrawing" xmlns:w14="http://schemas.microsoft.com/office/word/2010/wordml" xmlns:w15="http://schemas.microsoft.com/office/word/2012/wordml" w:val="BodyText"/>
+        <w:pStyle w:val="BodyText"/>
         <w:bidi xmlns:wps="http://schemas.microsoft.com/office/word/2010/wordprocessingShape" xmlns:wpg="http://schemas.microsoft.com/office/word/2010/wordprocessingGroup" xmlns:mc="http://schemas.openxmlformats.org/markup-compatibility/2006" xmlns:wp14="http://schemas.microsoft.com/office/word/2010/wordprocessingDrawing" xmlns:w14="http://schemas.microsoft.com/office/word/2010/wordml" xmlns:w15="http://schemas.microsoft.com/office/word/2012/wordml" w:val="0"/>
         <w:spacing xmlns:wps="http://schemas.microsoft.com/office/word/2010/wordprocessingShape" xmlns:wpg="http://schemas.microsoft.com/office/word/2010/wordprocessingGroup" xmlns:mc="http://schemas.openxmlformats.org/markup-compatibility/2006" xmlns:wp14="http://schemas.microsoft.com/office/word/2010/wordprocessingDrawing" xmlns:w14="http://schemas.microsoft.com/office/word/2010/wordml" xmlns:w15="http://schemas.microsoft.com/office/word/2012/wordml" w:lineRule="auto" w:line="247"/>
         <w:ind xmlns:wps="http://schemas.microsoft.com/office/word/2010/wordprocessingShape" xmlns:wpg="http://schemas.microsoft.com/office/word/2010/wordprocessingGroup" xmlns:mc="http://schemas.openxmlformats.org/markup-compatibility/2006" xmlns:wp14="http://schemas.microsoft.com/office/word/2010/wordprocessingDrawing" xmlns:w14="http://schemas.microsoft.com/office/word/2010/wordml" xmlns:w15="http://schemas.microsoft.com/office/word/2012/wordml" w:firstLine="288" w:start="100" w:end="122"/>
@@ -683,7 +708,7 @@
         <w:t xml:space="preserve"> </w:t>
       </w:r>
       <w:r>
-        <w:t xml:space="preserve">— те, которые можно удовлетворить только в рамках сообщества. Нам нужно ощущение связи и общности, чувство безопасности, возможность самовыражения и наслаждение красотой окружающего мира. Нам нужен смысл и цель, которые неизменно возникают через отношения — с детьми, семьёй, страной или нашим представлением о божественном. Эти человеческие и социальные потребности на протяжении веков породили множество религий и духовных традиций. Нам нужны поддерживающие отношения, сети друзей и ощущение вклада в общество. Когда эти потребности удовлетворены, у нас есть значительные социальные активы. А когда существуют системы, гарантирующие длительное удовлетворение социальных и культурных потребностей, говорят о достаточном</w:t>
+        <w:t xml:space="preserve">— то, что удовлетворяется только в рамках сообщества: чувство связи и общности, безопасность, возможность выражать себя и наслаждаться красотой мира. Нам нужны смысл и цель, которые чаще всего рождаются через отношения — с детьми, семьёй, страной или через представления о духовном. Эти потребности породили многие религии и духовные традиции. Нам нужны поддерживающие отношения, сети друзей и ощущение вклада в общее. Если эти потребности обеспечены, говорят о наличии социальных активов. А когда существуют системы, гарантирующие долговременное удовлетворение социальных и культурных потребностей, можно говорить о достаточном</w:t>
       </w:r>
       <w:r>
         <w:t xml:space="preserve"> </w:t>
@@ -701,7 +726,7 @@
     </w:p>
     <w:p>
       <w:pPr>
-        <w:pStyle xmlns:wps="http://schemas.microsoft.com/office/word/2010/wordprocessingShape" xmlns:wpg="http://schemas.microsoft.com/office/word/2010/wordprocessingGroup" xmlns:mc="http://schemas.openxmlformats.org/markup-compatibility/2006" xmlns:wp14="http://schemas.microsoft.com/office/word/2010/wordprocessingDrawing" xmlns:w14="http://schemas.microsoft.com/office/word/2010/wordml" xmlns:w15="http://schemas.microsoft.com/office/word/2012/wordml" w:val="BodyText"/>
+        <w:pStyle w:val="BodyText"/>
         <w:bidi xmlns:wps="http://schemas.microsoft.com/office/word/2010/wordprocessingShape" xmlns:wpg="http://schemas.microsoft.com/office/word/2010/wordprocessingGroup" xmlns:mc="http://schemas.openxmlformats.org/markup-compatibility/2006" xmlns:wp14="http://schemas.microsoft.com/office/word/2010/wordprocessingDrawing" xmlns:w14="http://schemas.microsoft.com/office/word/2010/wordml" xmlns:w15="http://schemas.microsoft.com/office/word/2012/wordml" w:val="0"/>
         <w:spacing xmlns:wps="http://schemas.microsoft.com/office/word/2010/wordprocessingShape" xmlns:wpg="http://schemas.microsoft.com/office/word/2010/wordprocessingGroup" xmlns:mc="http://schemas.openxmlformats.org/markup-compatibility/2006" xmlns:wp14="http://schemas.microsoft.com/office/word/2010/wordprocessingDrawing" xmlns:w14="http://schemas.microsoft.com/office/word/2010/wordml" xmlns:w15="http://schemas.microsoft.com/office/word/2012/wordml" w:lineRule="auto" w:line="247"/>
         <w:ind xmlns:wps="http://schemas.microsoft.com/office/word/2010/wordprocessingShape" xmlns:wpg="http://schemas.microsoft.com/office/word/2010/wordprocessingGroup" xmlns:mc="http://schemas.openxmlformats.org/markup-compatibility/2006" xmlns:wp14="http://schemas.microsoft.com/office/word/2010/wordprocessingDrawing" xmlns:w14="http://schemas.microsoft.com/office/word/2010/wordml" xmlns:w15="http://schemas.microsoft.com/office/word/2012/wordml" w:firstLine="288" w:start="100" w:end="122"/>
@@ -709,7 +734,7 @@
         <w:rPr xmlns:wps="http://schemas.microsoft.com/office/word/2010/wordprocessingShape" xmlns:wpg="http://schemas.microsoft.com/office/word/2010/wordprocessingGroup" xmlns:mc="http://schemas.openxmlformats.org/markup-compatibility/2006" xmlns:wp14="http://schemas.microsoft.com/office/word/2010/wordprocessingDrawing" xmlns:w14="http://schemas.microsoft.com/office/word/2010/wordml" xmlns:w15="http://schemas.microsoft.com/office/word/2012/wordml"/>
       </w:pPr>
       <w:r>
-        <w:t xml:space="preserve">Чтобы принимать решения, разрешать конфликты и обеспечивать равенство, нам необходимо</w:t>
+        <w:t xml:space="preserve">Чтобы принимать решения, разрешать конфликты и обеспечивать равенство, всем нам требуется</w:t>
       </w:r>
       <w:r>
         <w:t xml:space="preserve"> </w:t>
@@ -722,7 +747,7 @@
         <w:t xml:space="preserve">расширение прав и возможностей</w:t>
       </w:r>
       <w:r>
-        <w:t xml:space="preserve">. Институты самоуправления, программы по урегулированию споров, а также законы и правила, направленные на справедливое и мирное общество, — всё это активы в этой области.</w:t>
+        <w:t xml:space="preserve">. Институты самоуправления, программы, помогающие разрешать споры, а также законы и правила, направленные на справедливость и мир — всё это активы в этой сфере.</w:t>
       </w:r>
       <w:r>
         <w:t xml:space="preserve"> </w:t>
@@ -738,12 +763,12 @@
         <w:t xml:space="preserve"> </w:t>
       </w:r>
       <w:r>
-        <w:t xml:space="preserve">сообщества — правовая база, традиции, структуры и другие опоры, позволяющие обществам постоянно воспроизводить необходимые институты.</w:t>
+        <w:t xml:space="preserve">сообщества — правовая база, традиции, структуры и другие основы, позволяющие обществу воспроизводить необходимые институции.</w:t>
       </w:r>
     </w:p>
     <w:p>
       <w:pPr>
-        <w:pStyle xmlns:wps="http://schemas.microsoft.com/office/word/2010/wordprocessingShape" xmlns:wpg="http://schemas.microsoft.com/office/word/2010/wordprocessingGroup" xmlns:mc="http://schemas.openxmlformats.org/markup-compatibility/2006" xmlns:wp14="http://schemas.microsoft.com/office/word/2010/wordprocessingDrawing" xmlns:w14="http://schemas.microsoft.com/office/word/2010/wordml" xmlns:w15="http://schemas.microsoft.com/office/word/2012/wordml" w:val="BodyText"/>
+        <w:pStyle w:val="BodyText"/>
         <w:bidi xmlns:wps="http://schemas.microsoft.com/office/word/2010/wordprocessingShape" xmlns:wpg="http://schemas.microsoft.com/office/word/2010/wordprocessingGroup" xmlns:mc="http://schemas.openxmlformats.org/markup-compatibility/2006" xmlns:wp14="http://schemas.microsoft.com/office/word/2010/wordprocessingDrawing" xmlns:w14="http://schemas.microsoft.com/office/word/2010/wordml" xmlns:w15="http://schemas.microsoft.com/office/word/2012/wordml" w:val="0"/>
         <w:spacing xmlns:wps="http://schemas.microsoft.com/office/word/2010/wordprocessingShape" xmlns:wpg="http://schemas.microsoft.com/office/word/2010/wordprocessingGroup" xmlns:mc="http://schemas.openxmlformats.org/markup-compatibility/2006" xmlns:wp14="http://schemas.microsoft.com/office/word/2010/wordprocessingDrawing" xmlns:w14="http://schemas.microsoft.com/office/word/2010/wordml" xmlns:w15="http://schemas.microsoft.com/office/word/2012/wordml" w:lineRule="auto" w:line="247"/>
         <w:ind xmlns:wps="http://schemas.microsoft.com/office/word/2010/wordprocessingShape" xmlns:wpg="http://schemas.microsoft.com/office/word/2010/wordprocessingGroup" xmlns:mc="http://schemas.openxmlformats.org/markup-compatibility/2006" xmlns:wp14="http://schemas.microsoft.com/office/word/2010/wordprocessingDrawing" xmlns:w14="http://schemas.microsoft.com/office/word/2010/wordml" xmlns:w15="http://schemas.microsoft.com/office/word/2012/wordml" w:firstLine="288" w:start="100" w:end="122"/>
@@ -751,7 +776,7 @@
         <w:rPr xmlns:wps="http://schemas.microsoft.com/office/word/2010/wordprocessingShape" xmlns:wpg="http://schemas.microsoft.com/office/word/2010/wordprocessingGroup" xmlns:mc="http://schemas.openxmlformats.org/markup-compatibility/2006" xmlns:wp14="http://schemas.microsoft.com/office/word/2010/wordprocessingDrawing" xmlns:w14="http://schemas.microsoft.com/office/word/2010/wordml" xmlns:w15="http://schemas.microsoft.com/office/word/2012/wordml"/>
       </w:pPr>
       <w:r>
-        <w:t xml:space="preserve">Когда люди думают о потребностях, чаще всего вспоминают еду, одежду и жильё. Эти</w:t>
+        <w:t xml:space="preserve">Когда говорят о потребностях, обычно вспоминают еду, одежду и жильё. Эти</w:t>
       </w:r>
       <w:r>
         <w:t xml:space="preserve"> </w:t>
@@ -767,7 +792,7 @@
         <w:t xml:space="preserve"> </w:t>
       </w:r>
       <w:r>
-        <w:t xml:space="preserve">бесспорно важны, а здания, промышленные товары, технологии и инфраструктура, которые мы создаём в сообществах, служат средствами их удовлетворения. Качественное доступное жильё, безопасная питьевая вода, эффективные системы переработки и повторного использования отходов, сети возобновляемой энергии, производство здоровой местной пищи, коммуникационные сети, связывающие нас между собой и с остальным миром — всё это составляет</w:t>
+        <w:t xml:space="preserve">действительно важны: здания, промышленные товары, технологии и инфраструктура, которые создаёт общество, помогают их удовлетворять. Хорошее доступное жильё, безопасная питьевая вода, эффективные системы переработки и повторного использования отходов, возобновляемые источники энергии, производство здоровой местной пищи и коммуникационные сети, связывающие нас с миром — всё это</w:t>
       </w:r>
       <w:r>
         <w:t xml:space="preserve"> </w:t>
@@ -785,7 +810,7 @@
     </w:p>
     <w:p>
       <w:pPr>
-        <w:pStyle xmlns:wps="http://schemas.microsoft.com/office/word/2010/wordprocessingShape" xmlns:wpg="http://schemas.microsoft.com/office/word/2010/wordprocessingGroup" xmlns:mc="http://schemas.openxmlformats.org/markup-compatibility/2006" xmlns:wp14="http://schemas.microsoft.com/office/word/2010/wordprocessingDrawing" xmlns:w14="http://schemas.microsoft.com/office/word/2010/wordml" xmlns:w15="http://schemas.microsoft.com/office/word/2012/wordml" w:val="BodyText"/>
+        <w:pStyle w:val="BodyText"/>
         <w:bidi xmlns:wps="http://schemas.microsoft.com/office/word/2010/wordprocessingShape" xmlns:wpg="http://schemas.microsoft.com/office/word/2010/wordprocessingGroup" xmlns:mc="http://schemas.openxmlformats.org/markup-compatibility/2006" xmlns:wp14="http://schemas.microsoft.com/office/word/2010/wordprocessingDrawing" xmlns:w14="http://schemas.microsoft.com/office/word/2010/wordml" xmlns:w15="http://schemas.microsoft.com/office/word/2012/wordml" w:val="0"/>
         <w:spacing xmlns:wps="http://schemas.microsoft.com/office/word/2010/wordprocessingShape" xmlns:wpg="http://schemas.microsoft.com/office/word/2010/wordprocessingGroup" xmlns:mc="http://schemas.openxmlformats.org/markup-compatibility/2006" xmlns:wp14="http://schemas.microsoft.com/office/word/2010/wordprocessingDrawing" xmlns:w14="http://schemas.microsoft.com/office/word/2010/wordml" xmlns:w15="http://schemas.microsoft.com/office/word/2012/wordml" w:lineRule="auto" w:line="247"/>
         <w:ind xmlns:wps="http://schemas.microsoft.com/office/word/2010/wordprocessingShape" xmlns:wpg="http://schemas.microsoft.com/office/word/2010/wordprocessingGroup" xmlns:mc="http://schemas.openxmlformats.org/markup-compatibility/2006" xmlns:wp14="http://schemas.microsoft.com/office/word/2010/wordprocessingDrawing" xmlns:w14="http://schemas.microsoft.com/office/word/2010/wordml" xmlns:w15="http://schemas.microsoft.com/office/word/2012/wordml" w:firstLine="288" w:start="100" w:end="122"/>
@@ -793,7 +818,7 @@
         <w:rPr xmlns:wps="http://schemas.microsoft.com/office/word/2010/wordprocessingShape" xmlns:wpg="http://schemas.microsoft.com/office/word/2010/wordprocessingGroup" xmlns:mc="http://schemas.openxmlformats.org/markup-compatibility/2006" xmlns:wp14="http://schemas.microsoft.com/office/word/2010/wordprocessingDrawing" xmlns:w14="http://schemas.microsoft.com/office/word/2010/wordml" xmlns:w15="http://schemas.microsoft.com/office/word/2012/wordml"/>
       </w:pPr>
       <w:r>
-        <w:t xml:space="preserve">Наши материальные потребности выходят за рамки того, что мы производим сами, поэтому существуют и</w:t>
+        <w:t xml:space="preserve">Наши материальные потребности выходят за пределы того, что мы сами производим, поэтому существуют и</w:t>
       </w:r>
       <w:r>
         <w:t xml:space="preserve"> </w:t>
@@ -806,7 +831,7 @@
         <w:t xml:space="preserve">экологические потребности</w:t>
       </w:r>
       <w:r>
-        <w:t xml:space="preserve">. Нам нужен чистый воздух, разнообразные экосистемы, поддерживающие множество видов, стабильный климат, способность экосистем усваивать наши отходы, вода для поддержания жизни, а также для питья, гигиены и досуга. Нам нужны здоровые почвы и опылители; всё это —</w:t>
+        <w:t xml:space="preserve">. Нам нужен чистый воздух, разнообразные экосистемы, поддерживающие растения и животных, стабильный климат, способность экосистем ассимилировать отходы, вода для жизни и гигиены. Нам нужны здоровые почвы и опылители — всё это</w:t>
       </w:r>
       <w:r>
         <w:t xml:space="preserve"> </w:t>
@@ -819,7 +844,7 @@
         <w:t xml:space="preserve">экологические активы</w:t>
       </w:r>
       <w:r>
-        <w:t xml:space="preserve">, служащие нашей системе жизнеобеспечения. Когда экосистема здорова и продуктивна, её регенеративные способности составляют</w:t>
+        <w:t xml:space="preserve">, основа нашей системы жизнеобеспечения. Когда экосистема здорова и продуктивна, её восстановительная способность — это</w:t>
       </w:r>
       <w:r>
         <w:t xml:space="preserve"> </w:t>
@@ -837,7 +862,7 @@
     </w:p>
     <w:p>
       <w:pPr>
-        <w:pStyle xmlns:wps="http://schemas.microsoft.com/office/word/2010/wordprocessingShape" xmlns:wpg="http://schemas.microsoft.com/office/word/2010/wordprocessingGroup" xmlns:mc="http://schemas.openxmlformats.org/markup-compatibility/2006" xmlns:wp14="http://schemas.microsoft.com/office/word/2010/wordprocessingDrawing" xmlns:w14="http://schemas.microsoft.com/office/word/2010/wordml" xmlns:w15="http://schemas.microsoft.com/office/word/2012/wordml" w:val="BodyText"/>
+        <w:pStyle w:val="BodyText"/>
         <w:bidi xmlns:wps="http://schemas.microsoft.com/office/word/2010/wordprocessingShape" xmlns:wpg="http://schemas.microsoft.com/office/word/2010/wordprocessingGroup" xmlns:mc="http://schemas.openxmlformats.org/markup-compatibility/2006" xmlns:wp14="http://schemas.microsoft.com/office/word/2010/wordprocessingDrawing" xmlns:w14="http://schemas.microsoft.com/office/word/2010/wordml" xmlns:w15="http://schemas.microsoft.com/office/word/2012/wordml" w:val="0"/>
         <w:spacing xmlns:wps="http://schemas.microsoft.com/office/word/2010/wordprocessingShape" xmlns:wpg="http://schemas.microsoft.com/office/word/2010/wordprocessingGroup" xmlns:mc="http://schemas.openxmlformats.org/markup-compatibility/2006" xmlns:wp14="http://schemas.microsoft.com/office/word/2010/wordprocessingDrawing" xmlns:w14="http://schemas.microsoft.com/office/word/2010/wordml" xmlns:w15="http://schemas.microsoft.com/office/word/2012/wordml" w:lineRule="auto" w:line="247"/>
         <w:ind xmlns:wps="http://schemas.microsoft.com/office/word/2010/wordprocessingShape" xmlns:wpg="http://schemas.microsoft.com/office/word/2010/wordprocessingGroup" xmlns:mc="http://schemas.openxmlformats.org/markup-compatibility/2006" xmlns:wp14="http://schemas.microsoft.com/office/word/2010/wordprocessingDrawing" xmlns:w14="http://schemas.microsoft.com/office/word/2010/wordml" xmlns:w15="http://schemas.microsoft.com/office/word/2012/wordml" w:firstLine="288" w:start="100" w:end="122"/>
@@ -845,7 +870,7 @@
         <w:rPr xmlns:wps="http://schemas.microsoft.com/office/word/2010/wordprocessingShape" xmlns:wpg="http://schemas.microsoft.com/office/word/2010/wordprocessingGroup" xmlns:mc="http://schemas.openxmlformats.org/markup-compatibility/2006" xmlns:wp14="http://schemas.microsoft.com/office/word/2010/wordprocessingDrawing" xmlns:w14="http://schemas.microsoft.com/office/word/2010/wordml" xmlns:w15="http://schemas.microsoft.com/office/word/2012/wordml"/>
       </w:pPr>
       <w:r>
-        <w:t xml:space="preserve">Мы перечислили несколько видов активов и капитала, которые удовлетворяют наши потребности, но ещё не говорили о финансовых активах и капитале, которые обычно ассоциируют с</w:t>
+        <w:t xml:space="preserve">Мы перечислили несколько видов активов и капитала, но ещё не говорили о финансовых активах — том самом капитале, что обычно ассоциируют с</w:t>
       </w:r>
       <w:r>
         <w:t xml:space="preserve"> </w:t>
@@ -874,12 +899,12 @@
         <w:t xml:space="preserve">«инвестициями»</w:t>
       </w:r>
       <w:r>
-        <w:t xml:space="preserve">. Отчасти это потому, что деньги — скорее средство для достижения цели, чем сама по себе потребность. Деньги сами по себе нам не нужны; нужны вещи, которые за них покупают. Финансовый капитал не обязателен сам по себе, если можно получить необходимые блага и услуги иными способами. Способность денег облегчать обмен — сейчас и, надеюсь, в будущем — одна из главных причин их необходимости. Деньги помогают обменивать то, что ценно для нас (например, наше время и труд), на то, что ценно для других.</w:t>
+        <w:t xml:space="preserve">. Частично это потому, что деньги — средство, а не цель. Нам не нужны деньги как таковые, а вещи, которые можно за них приобрести. Финансовый капитал сам по себе лишён смысла, если он не обеспечивает нам необходимые блага. Обменная способность денег — сегодня и, надеюсь, в будущем — одна из ключевых причин их значимости: деньги позволяют обменивать то, что ценно для одних (время, труд), на то, что ценно для других.</w:t>
       </w:r>
     </w:p>
     <w:p>
       <w:pPr>
-        <w:pStyle xmlns:wps="http://schemas.microsoft.com/office/word/2010/wordprocessingShape" xmlns:wpg="http://schemas.microsoft.com/office/word/2010/wordprocessingGroup" xmlns:mc="http://schemas.openxmlformats.org/markup-compatibility/2006" xmlns:wp14="http://schemas.microsoft.com/office/word/2010/wordprocessingDrawing" xmlns:w14="http://schemas.microsoft.com/office/word/2010/wordml" xmlns:w15="http://schemas.microsoft.com/office/word/2012/wordml" w:val="BodyText"/>
+        <w:pStyle w:val="BodyText"/>
         <w:bidi xmlns:wps="http://schemas.microsoft.com/office/word/2010/wordprocessingShape" xmlns:wpg="http://schemas.microsoft.com/office/word/2010/wordprocessingGroup" xmlns:mc="http://schemas.openxmlformats.org/markup-compatibility/2006" xmlns:wp14="http://schemas.microsoft.com/office/word/2010/wordprocessingDrawing" xmlns:w14="http://schemas.microsoft.com/office/word/2010/wordml" xmlns:w15="http://schemas.microsoft.com/office/word/2012/wordml" w:val="0"/>
         <w:spacing xmlns:wps="http://schemas.microsoft.com/office/word/2010/wordprocessingShape" xmlns:wpg="http://schemas.microsoft.com/office/word/2010/wordprocessingGroup" xmlns:mc="http://schemas.openxmlformats.org/markup-compatibility/2006" xmlns:wp14="http://schemas.microsoft.com/office/word/2010/wordprocessingDrawing" xmlns:w14="http://schemas.microsoft.com/office/word/2010/wordml" xmlns:w15="http://schemas.microsoft.com/office/word/2012/wordml" w:lineRule="auto" w:line="247" w:before="0" w:after="0"/>
         <w:ind xmlns:wps="http://schemas.microsoft.com/office/word/2010/wordprocessingShape" xmlns:wpg="http://schemas.microsoft.com/office/word/2010/wordprocessingGroup" xmlns:mc="http://schemas.openxmlformats.org/markup-compatibility/2006" xmlns:wp14="http://schemas.microsoft.com/office/word/2010/wordprocessingDrawing" xmlns:w14="http://schemas.microsoft.com/office/word/2010/wordml" xmlns:w15="http://schemas.microsoft.com/office/word/2012/wordml" w:firstLine="288" w:start="100" w:end="194"/>
@@ -887,12 +912,12 @@
         <w:rPr xmlns:wps="http://schemas.microsoft.com/office/word/2010/wordprocessingShape" xmlns:wpg="http://schemas.microsoft.com/office/word/2010/wordprocessingGroup" xmlns:mc="http://schemas.openxmlformats.org/markup-compatibility/2006" xmlns:wp14="http://schemas.microsoft.com/office/word/2010/wordprocessingDrawing" xmlns:w14="http://schemas.microsoft.com/office/word/2010/wordml" xmlns:w15="http://schemas.microsoft.com/office/word/2012/wordml"/>
       </w:pPr>
       <w:r>
-        <w:t xml:space="preserve">Однако деньги — не единственное средство обмена. Люди тысячелетиями обменивались товарами и услугами без денег. Вы помогаете соседу установить</w:t>
+        <w:t xml:space="preserve">Однако деньги — не единственное средство обмена. Веками люди обменивались товарами и услугами без денег. Вы помогаете соседу</w:t>
       </w:r>
     </w:p>
     <w:p>
       <w:pPr>
-        <w:pStyle xmlns:wps="http://schemas.microsoft.com/office/word/2010/wordprocessingShape" xmlns:wpg="http://schemas.microsoft.com/office/word/2010/wordprocessingGroup" xmlns:mc="http://schemas.openxmlformats.org/markup-compatibility/2006" xmlns:wp14="http://schemas.microsoft.com/office/word/2010/wordprocessingDrawing" xmlns:w14="http://schemas.microsoft.com/office/word/2010/wordml" xmlns:w15="http://schemas.microsoft.com/office/word/2012/wordml" w:val="BodyText"/>
+        <w:pStyle w:val="BodyText"/>
         <w:bidi xmlns:wps="http://schemas.microsoft.com/office/word/2010/wordprocessingShape" xmlns:wpg="http://schemas.microsoft.com/office/word/2010/wordprocessingGroup" xmlns:mc="http://schemas.openxmlformats.org/markup-compatibility/2006" xmlns:wp14="http://schemas.microsoft.com/office/word/2010/wordprocessingDrawing" xmlns:w14="http://schemas.microsoft.com/office/word/2010/wordml" xmlns:w15="http://schemas.microsoft.com/office/word/2012/wordml" w:val="0"/>
         <w:spacing xmlns:wps="http://schemas.microsoft.com/office/word/2010/wordprocessingShape" xmlns:wpg="http://schemas.microsoft.com/office/word/2010/wordprocessingGroup" xmlns:mc="http://schemas.openxmlformats.org/markup-compatibility/2006" xmlns:wp14="http://schemas.microsoft.com/office/word/2010/wordprocessingDrawing" xmlns:w14="http://schemas.microsoft.com/office/word/2010/wordml" xmlns:w15="http://schemas.microsoft.com/office/word/2012/wordml" w:lineRule="auto" w:line="247" w:before="84" w:after="0"/>
         <w:ind xmlns:wps="http://schemas.microsoft.com/office/word/2010/wordprocessingShape" xmlns:wpg="http://schemas.microsoft.com/office/word/2010/wordprocessingGroup" xmlns:mc="http://schemas.openxmlformats.org/markup-compatibility/2006" xmlns:wp14="http://schemas.microsoft.com/office/word/2010/wordprocessingDrawing" xmlns:w14="http://schemas.microsoft.com/office/word/2010/wordml" xmlns:w15="http://schemas.microsoft.com/office/word/2012/wordml" w:start="100" w:end="709"/>
@@ -900,7 +925,7 @@
         <w:rPr xmlns:wps="http://schemas.microsoft.com/office/word/2010/wordprocessingShape" xmlns:wpg="http://schemas.microsoft.com/office/word/2010/wordprocessingGroup" xmlns:mc="http://schemas.openxmlformats.org/markup-compatibility/2006" xmlns:wp14="http://schemas.microsoft.com/office/word/2010/wordprocessingDrawing" xmlns:w14="http://schemas.microsoft.com/office/word/2010/wordml" xmlns:w15="http://schemas.microsoft.com/office/word/2012/wordml"/>
       </w:pPr>
       <w:r>
-        <w:t xml:space="preserve">новую крышу. Он лечит вам зубы и ставит коронку. Вы отвозите детей своей подруги в школу — она приглядывает за вашими детьми. В обоих случаях деньги не меняют владельца, но обмен товарами и услугами происходит. Ценность такого обмена — ещё один актив и форма капитала —</w:t>
+        <w:t xml:space="preserve">установить новую крышу. Он лечит вам зубы и ставит коронку. Вы отвозите в школу детей подруги; она присматривает за вашими. В обоих случаях деньги не меняют владельца, но обмен товарами и услугами происходит. Ценность такого обмена — ещё один актив и форма капитала —</w:t>
       </w:r>
       <w:r>
         <w:t xml:space="preserve"> </w:t>
@@ -918,7 +943,7 @@
     </w:p>
     <w:p>
       <w:pPr>
-        <w:pStyle xmlns:wps="http://schemas.microsoft.com/office/word/2010/wordprocessingShape" xmlns:wpg="http://schemas.microsoft.com/office/word/2010/wordprocessingGroup" xmlns:mc="http://schemas.openxmlformats.org/markup-compatibility/2006" xmlns:wp14="http://schemas.microsoft.com/office/word/2010/wordprocessingDrawing" xmlns:w14="http://schemas.microsoft.com/office/word/2010/wordml" xmlns:w15="http://schemas.microsoft.com/office/word/2012/wordml" w:val="BodyText"/>
+        <w:pStyle w:val="BodyText"/>
         <w:bidi xmlns:wps="http://schemas.microsoft.com/office/word/2010/wordprocessingShape" xmlns:wpg="http://schemas.microsoft.com/office/word/2010/wordprocessingGroup" xmlns:mc="http://schemas.openxmlformats.org/markup-compatibility/2006" xmlns:wp14="http://schemas.microsoft.com/office/word/2010/wordprocessingDrawing" xmlns:w14="http://schemas.microsoft.com/office/word/2010/wordml" xmlns:w15="http://schemas.microsoft.com/office/word/2012/wordml" w:val="0"/>
         <w:spacing xmlns:wps="http://schemas.microsoft.com/office/word/2010/wordprocessingShape" xmlns:wpg="http://schemas.microsoft.com/office/word/2010/wordprocessingGroup" xmlns:mc="http://schemas.openxmlformats.org/markup-compatibility/2006" xmlns:wp14="http://schemas.microsoft.com/office/word/2010/wordprocessingDrawing" xmlns:w14="http://schemas.microsoft.com/office/word/2010/wordml" xmlns:w15="http://schemas.microsoft.com/office/word/2012/wordml" w:lineRule="auto" w:line="247"/>
         <w:ind xmlns:wps="http://schemas.microsoft.com/office/word/2010/wordprocessingShape" xmlns:wpg="http://schemas.microsoft.com/office/word/2010/wordprocessingGroup" xmlns:mc="http://schemas.openxmlformats.org/markup-compatibility/2006" xmlns:wp14="http://schemas.microsoft.com/office/word/2010/wordprocessingDrawing" xmlns:w14="http://schemas.microsoft.com/office/word/2010/wordml" xmlns:w15="http://schemas.microsoft.com/office/word/2012/wordml" w:firstLine="288" w:start="100" w:end="122"/>
@@ -926,7 +951,7 @@
         <w:rPr xmlns:wps="http://schemas.microsoft.com/office/word/2010/wordprocessingShape" xmlns:wpg="http://schemas.microsoft.com/office/word/2010/wordprocessingGroup" xmlns:mc="http://schemas.openxmlformats.org/markup-compatibility/2006" xmlns:wp14="http://schemas.microsoft.com/office/word/2010/wordprocessingDrawing" xmlns:w14="http://schemas.microsoft.com/office/word/2010/wordml" xmlns:w15="http://schemas.microsoft.com/office/word/2012/wordml"/>
       </w:pPr>
       <w:r>
-        <w:t xml:space="preserve">Наши общественные системы формировались веками в ответ на потребности людей и необходимость их удовлетворения. Под богатым сообществом мы понимаем такое, которое способно удовлетворить широкий спектр человеческих потребностей и инвестировало во все формы капитала: социальный, культурный, человеческий, институциональный, материальный, технологический, природный, финансовый и потенциальный обменный капитал. Создание и поддержание этих разнообразных форм капитала с течением времени — одна из задач устойчивого развития.</w:t>
+        <w:t xml:space="preserve">Наши общественные системы формировались веками под влиянием потребностей и стремления их удовлетворить. Под «богатым сообществом» мы понимаем такое, которое способно удовлетворить широкий спектр человеческих потребностей — общество, инвестировавшее в разные формы капитала: социальный, культурный, человеческий, институциональный, материальный, технологический, природный, финансовый и потенциальный обменный капитал. Создание и поддержание всех этих форм капитала в долгосрочной перспективе — ключевая задача устойчивого развития.</w:t>
       </w:r>
     </w:p>
     <w:p>
@@ -934,7 +959,7 @@
         <w:bidi xmlns:wps="http://schemas.microsoft.com/office/word/2010/wordprocessingShape" xmlns:wpg="http://schemas.microsoft.com/office/word/2010/wordprocessingGroup" xmlns:mc="http://schemas.openxmlformats.org/markup-compatibility/2006" xmlns:wp14="http://schemas.microsoft.com/office/word/2010/wordprocessingDrawing" xmlns:w14="http://schemas.microsoft.com/office/word/2010/wordml" xmlns:w15="http://schemas.microsoft.com/office/word/2012/wordml" w:val="0"/>
         <w:spacing xmlns:wps="http://schemas.microsoft.com/office/word/2010/wordprocessingShape" xmlns:wpg="http://schemas.microsoft.com/office/word/2010/wordprocessingGroup" xmlns:mc="http://schemas.openxmlformats.org/markup-compatibility/2006" xmlns:wp14="http://schemas.microsoft.com/office/word/2010/wordprocessingDrawing" xmlns:w14="http://schemas.microsoft.com/office/word/2010/wordml" xmlns:w15="http://schemas.microsoft.com/office/word/2012/wordml" w:lineRule="auto" w:line="240"/>
         <w:ind xmlns:wps="http://schemas.microsoft.com/office/word/2010/wordprocessingShape" xmlns:wpg="http://schemas.microsoft.com/office/word/2010/wordprocessingGroup" xmlns:mc="http://schemas.openxmlformats.org/markup-compatibility/2006" xmlns:wp14="http://schemas.microsoft.com/office/word/2010/wordprocessingDrawing" xmlns:w14="http://schemas.microsoft.com/office/word/2010/wordml" xmlns:w15="http://schemas.microsoft.com/office/word/2012/wordml" w:hanging="0" w:start="3196" w:end="0"/>
-        <w:jc xmlns:wps="http://schemas.microsoft.com/office/word/2010/wordprocessingShape" xmlns:wpg="http://schemas.microsoft.com/office/word/2010/wordprocessingGroup" xmlns:mc="http://schemas.openxmlformats.org/markup-compatibility/2006" xmlns:wp14="http://schemas.microsoft.com/office/word/2010/wordprocessingDrawing" xmlns:w14="http://schemas.microsoft.com/office/word/2010/wordml" xmlns:w15="http://schemas.microsoft.com/office/word/2012/wordml" w:val="center"/>
+        <w:jc xmlns:wps="http://schemas.microsoft.com/office/word/2010/wordprocessingShape" xmlns:wpg="http://schemas.microsoft.com/office/word/2010/wordprocessingGroup" xmlns:mc="http://schemas.openxmlformats.org/markup-compatibility/2006" xmlns:wp14="http://schemas.microsoft.com/office/word/2010/wordprocessingDrawing" xmlns:w14="http://schemas.microsoft.com/office/word/2010/wordml" xmlns:w15="http://schemas.microsoft.com/office/word/2012/wordml" w:val="start"/>
         <w:rPr xmlns:wps="http://schemas.microsoft.com/office/word/2010/wordprocessingShape" xmlns:wpg="http://schemas.microsoft.com/office/word/2010/wordprocessingGroup" xmlns:mc="http://schemas.openxmlformats.org/markup-compatibility/2006" xmlns:wp14="http://schemas.microsoft.com/office/word/2010/wordprocessingDrawing" xmlns:w14="http://schemas.microsoft.com/office/word/2010/wordml" xmlns:w15="http://schemas.microsoft.com/office/word/2012/wordml">
           <w:sz w:val="20"/>
         </w:rPr>
@@ -976,7 +1001,7 @@
     </w:p>
     <w:p>
       <w:pPr>
-        <w:pStyle xmlns:wps="http://schemas.microsoft.com/office/word/2010/wordprocessingShape" xmlns:wpg="http://schemas.microsoft.com/office/word/2010/wordprocessingGroup" xmlns:mc="http://schemas.openxmlformats.org/markup-compatibility/2006" xmlns:wp14="http://schemas.microsoft.com/office/word/2010/wordprocessingDrawing" xmlns:w14="http://schemas.microsoft.com/office/word/2010/wordml" xmlns:w15="http://schemas.microsoft.com/office/word/2012/wordml" w:val="Caption"/>
+        <w:pStyle w:val="Caption"/>
         <w:bidi xmlns:wps="http://schemas.microsoft.com/office/word/2010/wordprocessingShape" xmlns:wpg="http://schemas.microsoft.com/office/word/2010/wordprocessingGroup" xmlns:mc="http://schemas.openxmlformats.org/markup-compatibility/2006" xmlns:wp14="http://schemas.microsoft.com/office/word/2010/wordprocessingDrawing" xmlns:w14="http://schemas.microsoft.com/office/word/2010/wordml" xmlns:w15="http://schemas.microsoft.com/office/word/2012/wordml" w:val="0"/>
         <w:spacing xmlns:wps="http://schemas.microsoft.com/office/word/2010/wordprocessingShape" xmlns:wpg="http://schemas.microsoft.com/office/word/2010/wordprocessingGroup" xmlns:mc="http://schemas.openxmlformats.org/markup-compatibility/2006" xmlns:wp14="http://schemas.microsoft.com/office/word/2010/wordprocessingDrawing" xmlns:w14="http://schemas.microsoft.com/office/word/2010/wordml" xmlns:w15="http://schemas.microsoft.com/office/word/2012/wordml" w:before="277" w:after="0"/>
         <w:ind xmlns:wps="http://schemas.microsoft.com/office/word/2010/wordprocessingShape" xmlns:wpg="http://schemas.microsoft.com/office/word/2010/wordprocessingGroup" xmlns:mc="http://schemas.openxmlformats.org/markup-compatibility/2006" xmlns:wp14="http://schemas.microsoft.com/office/word/2010/wordprocessingDrawing" xmlns:w14="http://schemas.microsoft.com/office/word/2010/wordml" xmlns:w15="http://schemas.microsoft.com/office/word/2012/wordml" w:hanging="0" w:start="0" w:end="0"/>
@@ -991,7 +1016,7 @@
     </w:p>
     <w:p>
       <w:pPr>
-        <w:pStyle xmlns:wps="http://schemas.microsoft.com/office/word/2010/wordprocessingShape" xmlns:wpg="http://schemas.microsoft.com/office/word/2010/wordprocessingGroup" xmlns:mc="http://schemas.openxmlformats.org/markup-compatibility/2006" xmlns:wp14="http://schemas.microsoft.com/office/word/2010/wordprocessingDrawing" xmlns:w14="http://schemas.microsoft.com/office/word/2010/wordml" xmlns:w15="http://schemas.microsoft.com/office/word/2012/wordml" w:val="BodyText"/>
+        <w:pStyle w:val="BodyText"/>
         <w:bidi xmlns:wps="http://schemas.microsoft.com/office/word/2010/wordprocessingShape" xmlns:wpg="http://schemas.microsoft.com/office/word/2010/wordprocessingGroup" xmlns:mc="http://schemas.openxmlformats.org/markup-compatibility/2006" xmlns:wp14="http://schemas.microsoft.com/office/word/2010/wordprocessingDrawing" xmlns:w14="http://schemas.microsoft.com/office/word/2010/wordml" xmlns:w15="http://schemas.microsoft.com/office/word/2012/wordml" w:val="0"/>
         <w:spacing xmlns:wps="http://schemas.microsoft.com/office/word/2010/wordprocessingShape" xmlns:wpg="http://schemas.microsoft.com/office/word/2010/wordprocessingGroup" xmlns:mc="http://schemas.openxmlformats.org/markup-compatibility/2006" xmlns:wp14="http://schemas.microsoft.com/office/word/2010/wordprocessingDrawing" xmlns:w14="http://schemas.microsoft.com/office/word/2010/wordml" xmlns:w15="http://schemas.microsoft.com/office/word/2012/wordml" w:lineRule="auto" w:line="247" w:before="1" w:after="0"/>
         <w:ind xmlns:wps="http://schemas.microsoft.com/office/word/2010/wordprocessingShape" xmlns:wpg="http://schemas.microsoft.com/office/word/2010/wordprocessingGroup" xmlns:mc="http://schemas.openxmlformats.org/markup-compatibility/2006" xmlns:wp14="http://schemas.microsoft.com/office/word/2010/wordprocessingDrawing" xmlns:w14="http://schemas.microsoft.com/office/word/2010/wordml" xmlns:w15="http://schemas.microsoft.com/office/word/2012/wordml" w:firstLine="288" w:start="100" w:end="122"/>
@@ -999,14 +1024,14 @@
         <w:rPr xmlns:wps="http://schemas.microsoft.com/office/word/2010/wordprocessingShape" xmlns:wpg="http://schemas.microsoft.com/office/word/2010/wordprocessingGroup" xmlns:mc="http://schemas.openxmlformats.org/markup-compatibility/2006" xmlns:wp14="http://schemas.microsoft.com/office/word/2010/wordprocessingDrawing" xmlns:w14="http://schemas.microsoft.com/office/word/2010/wordml" xmlns:w15="http://schemas.microsoft.com/office/word/2012/wordml"/>
       </w:pPr>
       <w:r>
-        <w:t xml:space="preserve">Более половины человечества уже живут в городах, и эта тенденция, как ожидается, сохранится по крайней мере ещё в ближайшее десятилетие. Значительная часть богатства нашего общества сосредоточена именно в городах. Города — памятники коллективных усилий человечества на протяжении веков. Они формируют физические, пространственные и когнитивные структуры, которые удовлетворяют многие наши потребности. Учитывая это, в большинстве конкретных примеров создания богатства, которые мы рассматриваем, внимание будет уделено городам.</w:t>
+        <w:t xml:space="preserve">Более половины человечества ныне живёт в городах, и эта тенденция, по прогнозам, сохранится как минимум ещё одно десятилетие. Потому богатство общества часто сосредоточено в городах. Города — памятники коллективного труда человечества на протяжении тысячелетий; они формируют физические, пространственные и когнитивные структуры, которые удовлетворяют многие наши потребности. Учитывая это, в подавляющем большинстве конкретных примеров создания богатства, которые мы приводим, мы сосредоточимся на городах.</w:t>
       </w:r>
     </w:p>
-    <w:bookmarkEnd w:id="11"/>
-    <w:bookmarkStart w:id="13" w:name="богатство-городов"/>
+    <w:bookmarkEnd w:id="22"/>
+    <w:bookmarkStart w:id="24" w:name="богатство-городов"/>
     <w:p>
       <w:pPr>
-        <w:pStyle xmlns:wps="http://schemas.microsoft.com/office/word/2010/wordprocessingShape" xmlns:wpg="http://schemas.microsoft.com/office/word/2010/wordprocessingGroup" xmlns:mc="http://schemas.openxmlformats.org/markup-compatibility/2006" xmlns:wp14="http://schemas.microsoft.com/office/word/2010/wordprocessingDrawing" xmlns:w14="http://schemas.microsoft.com/office/word/2010/wordml" xmlns:w15="http://schemas.microsoft.com/office/word/2012/wordml" w:val="BodyText"/>
+        <w:pStyle w:val="BodyText"/>
         <w:bidi xmlns:wps="http://schemas.microsoft.com/office/word/2010/wordprocessingShape" xmlns:wpg="http://schemas.microsoft.com/office/word/2010/wordprocessingGroup" xmlns:mc="http://schemas.openxmlformats.org/markup-compatibility/2006" xmlns:wp14="http://schemas.microsoft.com/office/word/2010/wordprocessingDrawing" xmlns:w14="http://schemas.microsoft.com/office/word/2010/wordml" xmlns:w15="http://schemas.microsoft.com/office/word/2012/wordml" w:val="0"/>
         <w:spacing xmlns:wps="http://schemas.microsoft.com/office/word/2010/wordprocessingShape" xmlns:wpg="http://schemas.microsoft.com/office/word/2010/wordprocessingGroup" xmlns:mc="http://schemas.openxmlformats.org/markup-compatibility/2006" xmlns:wp14="http://schemas.microsoft.com/office/word/2010/wordprocessingDrawing" xmlns:w14="http://schemas.microsoft.com/office/word/2010/wordml" xmlns:w15="http://schemas.microsoft.com/office/word/2012/wordml" w:before="285" w:after="0"/>
         <w:ind xmlns:wps="http://schemas.microsoft.com/office/word/2010/wordprocessingShape" xmlns:wpg="http://schemas.microsoft.com/office/word/2010/wordprocessingGroup" xmlns:mc="http://schemas.openxmlformats.org/markup-compatibility/2006" xmlns:wp14="http://schemas.microsoft.com/office/word/2010/wordprocessingDrawing" xmlns:w14="http://schemas.microsoft.com/office/word/2010/wordml" xmlns:w15="http://schemas.microsoft.com/office/word/2012/wordml" w:start="4910" w:end="0"/>
@@ -1019,7 +1044,7 @@
     </w:p>
     <w:p>
       <w:pPr>
-        <w:pStyle xmlns:wps="http://schemas.microsoft.com/office/word/2010/wordprocessingShape" xmlns:wpg="http://schemas.microsoft.com/office/word/2010/wordprocessingGroup" xmlns:mc="http://schemas.openxmlformats.org/markup-compatibility/2006" xmlns:wp14="http://schemas.microsoft.com/office/word/2010/wordprocessingDrawing" xmlns:w14="http://schemas.microsoft.com/office/word/2010/wordml" xmlns:w15="http://schemas.microsoft.com/office/word/2012/wordml" w:val="BodyText"/>
+        <w:pStyle w:val="BodyText"/>
         <w:bidi xmlns:wps="http://schemas.microsoft.com/office/word/2010/wordprocessingShape" xmlns:wpg="http://schemas.microsoft.com/office/word/2010/wordprocessingGroup" xmlns:mc="http://schemas.openxmlformats.org/markup-compatibility/2006" xmlns:wp14="http://schemas.microsoft.com/office/word/2010/wordprocessingDrawing" xmlns:w14="http://schemas.microsoft.com/office/word/2010/wordml" xmlns:w15="http://schemas.microsoft.com/office/word/2012/wordml" w:val="0"/>
         <w:spacing xmlns:wps="http://schemas.microsoft.com/office/word/2010/wordprocessingShape" xmlns:wpg="http://schemas.microsoft.com/office/word/2010/wordprocessingGroup" xmlns:mc="http://schemas.openxmlformats.org/markup-compatibility/2006" xmlns:wp14="http://schemas.microsoft.com/office/word/2010/wordprocessingDrawing" xmlns:w14="http://schemas.microsoft.com/office/word/2010/wordml" xmlns:w15="http://schemas.microsoft.com/office/word/2012/wordml" w:lineRule="auto" w:line="250" w:before="10" w:after="0"/>
         <w:ind xmlns:wps="http://schemas.microsoft.com/office/word/2010/wordprocessingShape" xmlns:wpg="http://schemas.microsoft.com/office/word/2010/wordprocessingGroup" xmlns:mc="http://schemas.openxmlformats.org/markup-compatibility/2006" xmlns:wp14="http://schemas.microsoft.com/office/word/2010/wordprocessingDrawing" xmlns:w14="http://schemas.microsoft.com/office/word/2010/wordml" xmlns:w15="http://schemas.microsoft.com/office/word/2012/wordml" w:start="100" w:end="122"/>
@@ -1027,23 +1052,7 @@
         <w:rPr xmlns:wps="http://schemas.microsoft.com/office/word/2010/wordprocessingShape" xmlns:wpg="http://schemas.microsoft.com/office/word/2010/wordprocessingGroup" xmlns:mc="http://schemas.openxmlformats.org/markup-compatibility/2006" xmlns:wp14="http://schemas.microsoft.com/office/word/2010/wordprocessingDrawing" xmlns:w14="http://schemas.microsoft.com/office/word/2010/wordml" xmlns:w15="http://schemas.microsoft.com/office/word/2012/wordml"/>
       </w:pPr>
       <w:r>
-        <w:t xml:space="preserve">Чтобы понять альтернативные пути достижения индивидуального, общественного и экономического благополучия в городском контексте, нужно изучить, как функционируют города, и обеспечить, чтобы городское руководство занималось решением ключевых вопросов устойчивой экономики. Джейн Джейкобс в книге</w:t>
-      </w:r>
-      <w:r>
-        <w:t xml:space="preserve"> </w:t>
-      </w:r>
-      <w:r>
-        <w:rPr>
-          <w:i/>
-          <w:iCs/>
-        </w:rPr>
-        <w:t xml:space="preserve">«Города и богатство наций»</w:t>
-      </w:r>
-      <w:r>
-        <w:t xml:space="preserve"> </w:t>
-      </w:r>
-      <w:r>
-        <w:t xml:space="preserve">назвала городские регионы главным двигателем экономического роста на протяжении всей истории. Она показала, что города и регионы обладали экономической мощью: могли импортировать товары из других мест и со временем разрабатывать местные аналоги — товары и услуги, заменяющие импорт. Замещение импорта стало ключевым источником экономического роста городов</w:t>
+        <w:t xml:space="preserve">Чтобы понять альтернативные пути к индивидуальному, общественному и экономическому благополучию в городском контексте, нужно изучить, как функционируют города, и добиться участия городского руководства в решении ключевых вопросов устойчивой экономики. В книге «Города и богатство наций» Джейн Джейкобс городские регионы названы основным двигателем экономического роста на протяжении истории. Она показала, что города и регионы обладали экономической мощью: могли импортировать товары из других регионов и одновременно заменять эти импорты товарами и услугами местного производства. Такая импортозамена стала ключевым источником экономического роста городов</w:t>
       </w:r>
       <w:r>
         <w:t xml:space="preserve"> </w:t>
@@ -1057,7 +1066,7 @@
     </w:p>
     <w:p>
       <w:pPr>
-        <w:pStyle xmlns:wps="http://schemas.microsoft.com/office/word/2010/wordprocessingShape" xmlns:wpg="http://schemas.microsoft.com/office/word/2010/wordprocessingGroup" xmlns:mc="http://schemas.openxmlformats.org/markup-compatibility/2006" xmlns:wp14="http://schemas.microsoft.com/office/word/2010/wordprocessingDrawing" xmlns:w14="http://schemas.microsoft.com/office/word/2010/wordml" xmlns:w15="http://schemas.microsoft.com/office/word/2012/wordml" w:val="BodyText"/>
+        <w:pStyle w:val="BodyText"/>
         <w:bidi xmlns:wps="http://schemas.microsoft.com/office/word/2010/wordprocessingShape" xmlns:wpg="http://schemas.microsoft.com/office/word/2010/wordprocessingGroup" xmlns:mc="http://schemas.openxmlformats.org/markup-compatibility/2006" xmlns:wp14="http://schemas.microsoft.com/office/word/2010/wordprocessingDrawing" xmlns:w14="http://schemas.microsoft.com/office/word/2010/wordml" xmlns:w15="http://schemas.microsoft.com/office/word/2012/wordml" w:val="0"/>
         <w:spacing xmlns:wps="http://schemas.microsoft.com/office/word/2010/wordprocessingShape" xmlns:wpg="http://schemas.microsoft.com/office/word/2010/wordprocessingGroup" xmlns:mc="http://schemas.openxmlformats.org/markup-compatibility/2006" xmlns:wp14="http://schemas.microsoft.com/office/word/2010/wordprocessingDrawing" xmlns:w14="http://schemas.microsoft.com/office/word/2010/wordml" xmlns:w15="http://schemas.microsoft.com/office/word/2012/wordml" w:lineRule="auto" w:line="252" w:before="3" w:after="0"/>
         <w:ind xmlns:wps="http://schemas.microsoft.com/office/word/2010/wordprocessingShape" xmlns:wpg="http://schemas.microsoft.com/office/word/2010/wordprocessingGroup" xmlns:mc="http://schemas.openxmlformats.org/markup-compatibility/2006" xmlns:wp14="http://schemas.microsoft.com/office/word/2010/wordprocessingDrawing" xmlns:w14="http://schemas.microsoft.com/office/word/2010/wordml" xmlns:w15="http://schemas.microsoft.com/office/word/2012/wordml" w:firstLine="288" w:start="100" w:end="280"/>
@@ -1065,7 +1074,7 @@
         <w:rPr xmlns:wps="http://schemas.microsoft.com/office/word/2010/wordprocessingShape" xmlns:wpg="http://schemas.microsoft.com/office/word/2010/wordprocessingGroup" xmlns:mc="http://schemas.openxmlformats.org/markup-compatibility/2006" xmlns:wp14="http://schemas.microsoft.com/office/word/2010/wordprocessingDrawing" xmlns:w14="http://schemas.microsoft.com/office/word/2010/wordml" xmlns:w15="http://schemas.microsoft.com/office/word/2012/wordml"/>
       </w:pPr>
       <w:r>
-        <w:t xml:space="preserve">Со времени Всемирного саммита по окружающей среде в Рио‑де‑Жанейро в 1992 году города по всему миру играют ведущую роль в усилиях по стабилизации климата и защите окружающей среды. Появилились разные движения — «здоровые города», «экологичные города», «переходные города» и другие — а также новые организации, поддерживающие городские инициативы. Одной из первых стала ICLEI: изначально Международный совет по местным экологическим инициативам, позже переименованный в ICLEI — «Местные власти за устойчивое развитие»</w:t>
+        <w:t xml:space="preserve">С момента Всемирного саммита по окружающей среде в Рио‑де‑Жанейро в 1992 году города по всему миру стали играть ведущую роль в усилиях по стабилизации климата и борьбе с разрушением окружающей среды. Появили разные движения — «устойчивые города», «здоровые города», «экологичные города», а совсем недавно — «переходные города» — и множество организаций, созданных для поддержки городских инициатив. ICLEI была одной из первых: изначально это был Международный совет по местным экологическим инициативам, позднее организация переименовалась в ICLEI: Местные власти за устойчивое развитие</w:t>
       </w:r>
       <w:r>
         <w:t xml:space="preserve"> </w:t>
@@ -1079,7 +1088,7 @@
     </w:p>
     <w:p>
       <w:pPr>
-        <w:pStyle xmlns:wps="http://schemas.microsoft.com/office/word/2010/wordprocessingShape" xmlns:wpg="http://schemas.microsoft.com/office/word/2010/wordprocessingGroup" xmlns:mc="http://schemas.openxmlformats.org/markup-compatibility/2006" xmlns:wp14="http://schemas.microsoft.com/office/word/2010/wordprocessingDrawing" xmlns:w14="http://schemas.microsoft.com/office/word/2010/wordml" xmlns:w15="http://schemas.microsoft.com/office/word/2012/wordml" w:val="BodyText"/>
+        <w:pStyle w:val="BodyText"/>
         <w:bidi xmlns:wps="http://schemas.microsoft.com/office/word/2010/wordprocessingShape" xmlns:wpg="http://schemas.microsoft.com/office/word/2010/wordprocessingGroup" xmlns:mc="http://schemas.openxmlformats.org/markup-compatibility/2006" xmlns:wp14="http://schemas.microsoft.com/office/word/2010/wordprocessingDrawing" xmlns:w14="http://schemas.microsoft.com/office/word/2010/wordml" xmlns:w15="http://schemas.microsoft.com/office/word/2012/wordml" w:val="0"/>
         <w:spacing xmlns:wps="http://schemas.microsoft.com/office/word/2010/wordprocessingShape" xmlns:wpg="http://schemas.microsoft.com/office/word/2010/wordprocessingGroup" xmlns:mc="http://schemas.openxmlformats.org/markup-compatibility/2006" xmlns:wp14="http://schemas.microsoft.com/office/word/2010/wordprocessingDrawing" xmlns:w14="http://schemas.microsoft.com/office/word/2010/wordml" xmlns:w15="http://schemas.microsoft.com/office/word/2012/wordml" w:lineRule="auto" w:line="247" w:before="0" w:after="0"/>
         <w:ind xmlns:wps="http://schemas.microsoft.com/office/word/2010/wordprocessingShape" xmlns:wpg="http://schemas.microsoft.com/office/word/2010/wordprocessingGroup" xmlns:mc="http://schemas.openxmlformats.org/markup-compatibility/2006" xmlns:wp14="http://schemas.microsoft.com/office/word/2010/wordprocessingDrawing" xmlns:w14="http://schemas.microsoft.com/office/word/2010/wordml" xmlns:w15="http://schemas.microsoft.com/office/word/2012/wordml" w:firstLine="288" w:start="100" w:end="122"/>
@@ -1087,12 +1096,12 @@
         <w:rPr xmlns:wps="http://schemas.microsoft.com/office/word/2010/wordprocessingShape" xmlns:wpg="http://schemas.microsoft.com/office/word/2010/wordprocessingGroup" xmlns:mc="http://schemas.openxmlformats.org/markup-compatibility/2006" xmlns:wp14="http://schemas.microsoft.com/office/word/2010/wordprocessingDrawing" xmlns:w14="http://schemas.microsoft.com/office/word/2010/wordml" xmlns:w15="http://schemas.microsoft.com/office/word/2012/wordml"/>
       </w:pPr>
       <w:r>
-        <w:t xml:space="preserve">Масштаб и глубину этого движения подтверждает появление за последние два десятилетия множества организаций: Института устойчивых сообществ, программы «Здоровые города» Всемирной организации здравоохранения, Международной организации «Здоровые города», международной организации «Экополисы», Центра устойчивых городов, сети Cities PLUS, Глобальных инициатив сообществ и, крупнейшей из всех — Организации «Объединённые города и местные власти» (ОУМВ) — новая</w:t>
+        <w:t xml:space="preserve">Масштаб и глубина этого движения подтверждаются появлением других организаций за последние два десятилетия. К ним относятся, например, Институт устойчивых сообществ, программа «Здоровые города» Всемирной организации здравоохранения, Международная организация «Здоровые города», Международная организация «Экополисы», Центр устойчивых городов, сеть Cities PLUS, Глобальные инициативы сообществ и, крупнейшая из них — новая Организация «Объединённые города и местные власти» (ОГМВ).</w:t>
       </w:r>
     </w:p>
     <w:p>
       <w:pPr>
-        <w:pStyle xmlns:wps="http://schemas.microsoft.com/office/word/2010/wordprocessingShape" xmlns:wpg="http://schemas.microsoft.com/office/word/2010/wordprocessingGroup" xmlns:mc="http://schemas.openxmlformats.org/markup-compatibility/2006" xmlns:wp14="http://schemas.microsoft.com/office/word/2010/wordprocessingDrawing" xmlns:w14="http://schemas.microsoft.com/office/word/2010/wordml" xmlns:w15="http://schemas.microsoft.com/office/word/2012/wordml" w:val="BodyText"/>
+        <w:pStyle w:val="BodyText"/>
         <w:bidi xmlns:wps="http://schemas.microsoft.com/office/word/2010/wordprocessingShape" xmlns:wpg="http://schemas.microsoft.com/office/word/2010/wordprocessingGroup" xmlns:mc="http://schemas.openxmlformats.org/markup-compatibility/2006" xmlns:wp14="http://schemas.microsoft.com/office/word/2010/wordprocessingDrawing" xmlns:w14="http://schemas.microsoft.com/office/word/2010/wordml" xmlns:w15="http://schemas.microsoft.com/office/word/2012/wordml" w:val="0"/>
         <w:spacing xmlns:wps="http://schemas.microsoft.com/office/word/2010/wordprocessingShape" xmlns:wpg="http://schemas.microsoft.com/office/word/2010/wordprocessingGroup" xmlns:mc="http://schemas.openxmlformats.org/markup-compatibility/2006" xmlns:wp14="http://schemas.microsoft.com/office/word/2010/wordprocessingDrawing" xmlns:w14="http://schemas.microsoft.com/office/word/2010/wordml" xmlns:w15="http://schemas.microsoft.com/office/word/2012/wordml" w:lineRule="auto" w:line="250" w:before="84" w:after="0"/>
         <w:ind xmlns:wps="http://schemas.microsoft.com/office/word/2010/wordprocessingShape" xmlns:wpg="http://schemas.microsoft.com/office/word/2010/wordprocessingGroup" xmlns:mc="http://schemas.openxmlformats.org/markup-compatibility/2006" xmlns:wp14="http://schemas.microsoft.com/office/word/2010/wordprocessingDrawing" xmlns:w14="http://schemas.microsoft.com/office/word/2010/wordml" xmlns:w15="http://schemas.microsoft.com/office/word/2012/wordml" w:start="100" w:end="280"/>
@@ -1109,12 +1118,12 @@
         <w:t xml:space="preserve"> </w:t>
       </w:r>
       <w:r>
-        <w:t xml:space="preserve">Кампания «Города тысячелетия» ОУМВ поддерживает Цели развития тысячелетия ООН, ориентированные на устойчивую окружающую среду и устойчивую местную экономику. Города всё больше осознают, что решения проблем изменения климата и деградации окружающей среды во многом зависят от структуры нашей экономики. Такие города могут стать ключевыми катализаторами масштабных изменений.</w:t>
+        <w:t xml:space="preserve">Кампания «Города тысячелетия» ОГМВ поддерживает Цели развития тысячелетия ООН, которые ставят во главу угла устойчивую окружающую среду и устойчивую местную экономику. Города всё яснее видят, что решения проблем изменения климата и деградации экосистем заложены в той экономике, которую мы создали. Эти города могут стать ключевыми катализаторами масштабных изменений.</w:t>
       </w:r>
     </w:p>
     <w:p>
       <w:pPr>
-        <w:pStyle xmlns:wps="http://schemas.microsoft.com/office/word/2010/wordprocessingShape" xmlns:wpg="http://schemas.microsoft.com/office/word/2010/wordprocessingGroup" xmlns:mc="http://schemas.openxmlformats.org/markup-compatibility/2006" xmlns:wp14="http://schemas.microsoft.com/office/word/2010/wordprocessingDrawing" xmlns:w14="http://schemas.microsoft.com/office/word/2010/wordml" xmlns:w15="http://schemas.microsoft.com/office/word/2012/wordml" w:val="BodyText"/>
+        <w:pStyle w:val="BodyText"/>
         <w:bidi xmlns:wps="http://schemas.microsoft.com/office/word/2010/wordprocessingShape" xmlns:wpg="http://schemas.microsoft.com/office/word/2010/wordprocessingGroup" xmlns:mc="http://schemas.openxmlformats.org/markup-compatibility/2006" xmlns:wp14="http://schemas.microsoft.com/office/word/2010/wordprocessingDrawing" xmlns:w14="http://schemas.microsoft.com/office/word/2010/wordml" xmlns:w15="http://schemas.microsoft.com/office/word/2012/wordml" w:val="0"/>
         <w:spacing xmlns:wps="http://schemas.microsoft.com/office/word/2010/wordprocessingShape" xmlns:wpg="http://schemas.microsoft.com/office/word/2010/wordprocessingGroup" xmlns:mc="http://schemas.openxmlformats.org/markup-compatibility/2006" xmlns:wp14="http://schemas.microsoft.com/office/word/2010/wordprocessingDrawing" xmlns:w14="http://schemas.microsoft.com/office/word/2010/wordml" xmlns:w15="http://schemas.microsoft.com/office/word/2012/wordml" w:lineRule="auto" w:line="247" w:before="3" w:after="0"/>
         <w:ind xmlns:wps="http://schemas.microsoft.com/office/word/2010/wordprocessingShape" xmlns:wpg="http://schemas.microsoft.com/office/word/2010/wordprocessingGroup" xmlns:mc="http://schemas.openxmlformats.org/markup-compatibility/2006" xmlns:wp14="http://schemas.microsoft.com/office/word/2010/wordprocessingDrawing" xmlns:w14="http://schemas.microsoft.com/office/word/2010/wordml" xmlns:w15="http://schemas.microsoft.com/office/word/2012/wordml" w:firstLine="288" w:start="100" w:end="198"/>
@@ -1122,12 +1131,12 @@
         <w:rPr xmlns:wps="http://schemas.microsoft.com/office/word/2010/wordprocessingShape" xmlns:wpg="http://schemas.microsoft.com/office/word/2010/wordprocessingGroup" xmlns:mc="http://schemas.openxmlformats.org/markup-compatibility/2006" xmlns:wp14="http://schemas.microsoft.com/office/word/2010/wordprocessingDrawing" xmlns:w14="http://schemas.microsoft.com/office/word/2010/wordml" xmlns:w15="http://schemas.microsoft.com/office/word/2012/wordml"/>
       </w:pPr>
       <w:r>
-        <w:t xml:space="preserve">Города действуют на нескольких уровнях: от масштабных политических изменений — например, переквалификации района с коммерческого на промышленный — до мелких решений вроде покупки бумажных полотенец для общественных туалетов. Политика принимает разные формы: документы долгосрочного планирования с видением, целями и стратегиями; операционные бюджеты и планы капиталовложений; постановления и регламенты; годовые цели и правила, определяющие повседневную деятельность — кадровая и закупочная политика, например. Долгосрочные планы задают направление для изменений в нормативной базе и бюджетах; бюджеты, планы капиталовложений и годовые цели определяют конкретные мероприятия, которые осуществляются ежегодно. Другие политики направляют повседневную работу.</w:t>
+        <w:t xml:space="preserve">Города действуют на нескольких уровнях: от масштабных политических решений, например перепрофилирования районов с коммерческих в промышленные, до мелких шагов, вроде закупки бумажных полотенец для общественных туалетов. Политика принимает разные формы — долгосрочные планы с изложением видения, целей и стратегий; операционные бюджеты и планы капиталовложений; постановления и правила; годовые цели и политика, определяющая повседневную деятельность, например кадровая и закупочная политика. Долгосрочные планы задают направления для изменений в постановлениях и бюджетах, а бюджеты, планы капиталовложений и годовые цели определяют ежегодные мероприятия по реализации. Другие политики регулируют повседневную работу.</w:t>
       </w:r>
     </w:p>
     <w:p>
       <w:pPr>
-        <w:pStyle xmlns:wps="http://schemas.microsoft.com/office/word/2010/wordprocessingShape" xmlns:wpg="http://schemas.microsoft.com/office/word/2010/wordprocessingGroup" xmlns:mc="http://schemas.openxmlformats.org/markup-compatibility/2006" xmlns:wp14="http://schemas.microsoft.com/office/word/2010/wordprocessingDrawing" xmlns:w14="http://schemas.microsoft.com/office/word/2010/wordml" xmlns:w15="http://schemas.microsoft.com/office/word/2012/wordml" w:val="BodyText"/>
+        <w:pStyle w:val="BodyText"/>
         <w:bidi xmlns:wps="http://schemas.microsoft.com/office/word/2010/wordprocessingShape" xmlns:wpg="http://schemas.microsoft.com/office/word/2010/wordprocessingGroup" xmlns:mc="http://schemas.openxmlformats.org/markup-compatibility/2006" xmlns:wp14="http://schemas.microsoft.com/office/word/2010/wordprocessingDrawing" xmlns:w14="http://schemas.microsoft.com/office/word/2010/wordml" xmlns:w15="http://schemas.microsoft.com/office/word/2012/wordml" w:val="0"/>
         <w:spacing xmlns:wps="http://schemas.microsoft.com/office/word/2010/wordprocessingShape" xmlns:wpg="http://schemas.microsoft.com/office/word/2010/wordprocessingGroup" xmlns:mc="http://schemas.openxmlformats.org/markup-compatibility/2006" xmlns:wp14="http://schemas.microsoft.com/office/word/2010/wordprocessingDrawing" xmlns:w14="http://schemas.microsoft.com/office/word/2010/wordml" xmlns:w15="http://schemas.microsoft.com/office/word/2012/wordml" w:lineRule="auto" w:line="247"/>
         <w:ind xmlns:wps="http://schemas.microsoft.com/office/word/2010/wordprocessingShape" xmlns:wpg="http://schemas.microsoft.com/office/word/2010/wordprocessingGroup" xmlns:mc="http://schemas.openxmlformats.org/markup-compatibility/2006" xmlns:wp14="http://schemas.microsoft.com/office/word/2010/wordprocessingDrawing" xmlns:w14="http://schemas.microsoft.com/office/word/2010/wordml" xmlns:w15="http://schemas.microsoft.com/office/word/2012/wordml" w:firstLine="288" w:start="100" w:end="122"/>
@@ -1135,12 +1144,12 @@
         <w:rPr xmlns:wps="http://schemas.microsoft.com/office/word/2010/wordprocessingShape" xmlns:wpg="http://schemas.microsoft.com/office/word/2010/wordprocessingGroup" xmlns:mc="http://schemas.openxmlformats.org/markup-compatibility/2006" xmlns:wp14="http://schemas.microsoft.com/office/word/2010/wordprocessingDrawing" xmlns:w14="http://schemas.microsoft.com/office/word/2010/wordml" xmlns:w15="http://schemas.microsoft.com/office/word/2012/wordml"/>
       </w:pPr>
       <w:r>
-        <w:t xml:space="preserve">Например, в городской совет избрали нового члена, который в предвыборной кампании обещал сократить выбросы углерода и уменьшить потребление ископаемого топлива. В первый же рабочий день ему докладывают о закупке для полицейского управления автомобиля с большим расходом топлива для обновления автопарка. Если он попытается остановить эту покупку, он столкнётся с сопротивлением начальника полиции и городского управляющего: тот объяснит, что автомобиль включён в капитальный план как часть долгосрочной замены и возможно связан с контрактами с местными дилерами, которые нельзя разорвать. Возражения новичка, скорее всего, будут отклонены опытными членами совета, и покупка состоится. Новичок может сказать: «Но избиратели на этих выборах показали, что хотят сокращения выбросов углерода и использования ископаемого топлива». Терпеливые улыбки и многозначительные взгляды ветеранов среди сотрудников и членов совета дадут понять, что идеализм встретят с пониманием, но изменения на уровне повседневной реализации не так просты.</w:t>
+        <w:t xml:space="preserve">Допустим, в городской совет избрали нового члена, который в предвыборной кампании обещал сократить выбросы углерода и уменьшить использование ископаемого топлива. В первый день на новой должности ему докладывают о плановой покупке полицейским управлением автомобиля с высоким расходом топлива для обновления автопарка. Если он попытается остановить эту покупку, то столкнётся с сопротивлением начальника полиции и городского управляющего: автомобиль включён в капитальный план и является частью долгосрочной политики замены, возможно, с контрактами с местными автодилерами, которые нельзя расторгнуть. Возражения нового члена совета, вероятно, будут отклонены ветеранами — сотрудниками и членами совета, работающими здесь много лет — и покупка состоится. Он может возразить: «…но граждане на выборах показали, что хотят сократить выбросы углерода и использование ископаемого топлива». Терпеливые улыбки и многозначительные взгляды ветеранов дадут понять, что идеализм приветствуется, но изменения на уровне повседневной реализации не так просты.</w:t>
       </w:r>
     </w:p>
     <w:p>
       <w:pPr>
-        <w:pStyle xmlns:wps="http://schemas.microsoft.com/office/word/2010/wordprocessingShape" xmlns:wpg="http://schemas.microsoft.com/office/word/2010/wordprocessingGroup" xmlns:mc="http://schemas.openxmlformats.org/markup-compatibility/2006" xmlns:wp14="http://schemas.microsoft.com/office/word/2010/wordprocessingDrawing" xmlns:w14="http://schemas.microsoft.com/office/word/2010/wordml" xmlns:w15="http://schemas.microsoft.com/office/word/2012/wordml" w:val="BodyText"/>
+        <w:pStyle w:val="BodyText"/>
         <w:bidi xmlns:wps="http://schemas.microsoft.com/office/word/2010/wordprocessingShape" xmlns:wpg="http://schemas.microsoft.com/office/word/2010/wordprocessingGroup" xmlns:mc="http://schemas.openxmlformats.org/markup-compatibility/2006" xmlns:wp14="http://schemas.microsoft.com/office/word/2010/wordprocessingDrawing" xmlns:w14="http://schemas.microsoft.com/office/word/2010/wordml" xmlns:w15="http://schemas.microsoft.com/office/word/2012/wordml" w:val="0"/>
         <w:spacing xmlns:wps="http://schemas.microsoft.com/office/word/2010/wordprocessingShape" xmlns:wpg="http://schemas.microsoft.com/office/word/2010/wordprocessingGroup" xmlns:mc="http://schemas.openxmlformats.org/markup-compatibility/2006" xmlns:wp14="http://schemas.microsoft.com/office/word/2010/wordprocessingDrawing" xmlns:w14="http://schemas.microsoft.com/office/word/2010/wordml" xmlns:w15="http://schemas.microsoft.com/office/word/2012/wordml" w:lineRule="auto" w:line="247"/>
         <w:ind xmlns:wps="http://schemas.microsoft.com/office/word/2010/wordprocessingShape" xmlns:wpg="http://schemas.microsoft.com/office/word/2010/wordprocessingGroup" xmlns:mc="http://schemas.openxmlformats.org/markup-compatibility/2006" xmlns:wp14="http://schemas.microsoft.com/office/word/2010/wordprocessingDrawing" xmlns:w14="http://schemas.microsoft.com/office/word/2010/wordml" xmlns:w15="http://schemas.microsoft.com/office/word/2012/wordml" w:firstLine="288" w:start="100" w:end="122"/>
@@ -1148,12 +1157,12 @@
         <w:rPr xmlns:wps="http://schemas.microsoft.com/office/word/2010/wordprocessingShape" xmlns:wpg="http://schemas.microsoft.com/office/word/2010/wordprocessingGroup" xmlns:mc="http://schemas.openxmlformats.org/markup-compatibility/2006" xmlns:wp14="http://schemas.microsoft.com/office/word/2010/wordprocessingDrawing" xmlns:w14="http://schemas.microsoft.com/office/word/2010/wordml" xmlns:w15="http://schemas.microsoft.com/office/word/2012/wordml"/>
       </w:pPr>
       <w:r>
-        <w:t xml:space="preserve">Предвыборные обещания, регулярные местные выборы, референдумы и голосования по облигациям обеспечивают постоянный приток информации и мнений граждан органам местного самоуправления, но для реальных сдвигов в политике нужны согласованные усилия. Новые члены городских советов часто не представляют себе процессов, определяющих масштабную реализацию, и их легко втянуть в устоявшийся уклад — особенно с учётом системных сил, стремящихся сохранить статус‑кво.</w:t>
+        <w:t xml:space="preserve">Предвыборные обещания, регулярные местные выборы, референдумы и голосования по облигациям дают городским властям постоянный поток новой информации и мнений граждан, но для существенных сдвигов в направлении деятельности требуются согласованные усилия. Новоиспечённые члены городского совета часто не понимают процессов, определяющих крупномасштабную реализацию, и их легко втянуть в привычный уклад работы, особенно учитывая системные силы, стремящиеся сохранить статус‑кво.</w:t>
       </w:r>
     </w:p>
     <w:p>
       <w:pPr>
-        <w:pStyle xmlns:wps="http://schemas.microsoft.com/office/word/2010/wordprocessingShape" xmlns:wpg="http://schemas.microsoft.com/office/word/2010/wordprocessingGroup" xmlns:mc="http://schemas.openxmlformats.org/markup-compatibility/2006" xmlns:wp14="http://schemas.microsoft.com/office/word/2010/wordprocessingDrawing" xmlns:w14="http://schemas.microsoft.com/office/word/2010/wordml" xmlns:w15="http://schemas.microsoft.com/office/word/2012/wordml" w:val="BodyText"/>
+        <w:pStyle w:val="BodyText"/>
         <w:bidi xmlns:wps="http://schemas.microsoft.com/office/word/2010/wordprocessingShape" xmlns:wpg="http://schemas.microsoft.com/office/word/2010/wordprocessingGroup" xmlns:mc="http://schemas.openxmlformats.org/markup-compatibility/2006" xmlns:wp14="http://schemas.microsoft.com/office/word/2010/wordprocessingDrawing" xmlns:w14="http://schemas.microsoft.com/office/word/2010/wordml" xmlns:w15="http://schemas.microsoft.com/office/word/2012/wordml" w:val="0"/>
         <w:spacing xmlns:wps="http://schemas.microsoft.com/office/word/2010/wordprocessingShape" xmlns:wpg="http://schemas.microsoft.com/office/word/2010/wordprocessingGroup" xmlns:mc="http://schemas.openxmlformats.org/markup-compatibility/2006" xmlns:wp14="http://schemas.microsoft.com/office/word/2010/wordprocessingDrawing" xmlns:w14="http://schemas.microsoft.com/office/word/2010/wordml" xmlns:w15="http://schemas.microsoft.com/office/word/2012/wordml" w:lineRule="auto" w:line="247"/>
         <w:ind xmlns:wps="http://schemas.microsoft.com/office/word/2010/wordprocessingShape" xmlns:wpg="http://schemas.microsoft.com/office/word/2010/wordprocessingGroup" xmlns:mc="http://schemas.openxmlformats.org/markup-compatibility/2006" xmlns:wp14="http://schemas.microsoft.com/office/word/2010/wordprocessingDrawing" xmlns:w14="http://schemas.microsoft.com/office/word/2010/wordml" xmlns:w15="http://schemas.microsoft.com/office/word/2012/wordml" w:firstLine="288" w:start="100" w:end="122"/>
@@ -1161,12 +1170,12 @@
         <w:rPr xmlns:wps="http://schemas.microsoft.com/office/word/2010/wordprocessingShape" xmlns:wpg="http://schemas.microsoft.com/office/word/2010/wordprocessingGroup" xmlns:mc="http://schemas.openxmlformats.org/markup-compatibility/2006" xmlns:wp14="http://schemas.microsoft.com/office/word/2010/wordprocessingDrawing" xmlns:w14="http://schemas.microsoft.com/office/word/2010/wordml" xmlns:w15="http://schemas.microsoft.com/office/word/2012/wordml"/>
       </w:pPr>
       <w:r>
-        <w:t xml:space="preserve">Города — сложные механизмы: профсоюзные соглашения, долгосрочные контракты с поставщиками, опытный персонал и потоки материалов и энергии опираются на видимую и скрытую инфраструктуру. Серьёзные изменения инфраструктуры требуют тщательного планирования — нельзя просто перерезать канализационную трубу, чтобы прекратить подачу стоков на очистные сооружения; подобный шаг, каким бы простым ни казался, принесёт больше вреда, чем пользы. Непреднамеренные последствия таких действий, как правило, перевешивают предполагаемые краткосрочные выгоды. В других сферах это менее заметно, но не менее верно — например, когда полицейское управление собирается закупить автомобили с большим расходом топлива.</w:t>
+        <w:t xml:space="preserve">Города — сложные механизмы, опирающиеся на профсоюзные соглашения, долгосрочные контракты с поставщиками, опытный профессиональный персонал и на видимую и невидимую инфраструктуру, обеспечивающую потоки материалов и энергии. Радикальные изменения в этой инфраструктуре требуют тщательного планирования — нельзя, скажем, перерезать канализационные трубы, чтобы прекратить подачу стоков на очистные сооружения, если цель — снизить вред от этих стоков, каким бы простым это ни казалось. Непреднамеренные последствия таких шагов обычно перевесят краткосрочные выгоды. В других областях это менее очевидно, но не менее верно — например, когда полицейский участок собирается купить автомобиль с высоким расходом топлива.</w:t>
       </w:r>
     </w:p>
     <w:p>
       <w:pPr>
-        <w:pStyle xmlns:wps="http://schemas.microsoft.com/office/word/2010/wordprocessingShape" xmlns:wpg="http://schemas.microsoft.com/office/word/2010/wordprocessingGroup" xmlns:mc="http://schemas.openxmlformats.org/markup-compatibility/2006" xmlns:wp14="http://schemas.microsoft.com/office/word/2010/wordprocessingDrawing" xmlns:w14="http://schemas.microsoft.com/office/word/2010/wordml" xmlns:w15="http://schemas.microsoft.com/office/word/2012/wordml" w:val="BodyText"/>
+        <w:pStyle w:val="BodyText"/>
         <w:bidi xmlns:wps="http://schemas.microsoft.com/office/word/2010/wordprocessingShape" xmlns:wpg="http://schemas.microsoft.com/office/word/2010/wordprocessingGroup" xmlns:mc="http://schemas.openxmlformats.org/markup-compatibility/2006" xmlns:wp14="http://schemas.microsoft.com/office/word/2010/wordprocessingDrawing" xmlns:w14="http://schemas.microsoft.com/office/word/2010/wordml" xmlns:w15="http://schemas.microsoft.com/office/word/2012/wordml" w:val="0"/>
         <w:spacing xmlns:wps="http://schemas.microsoft.com/office/word/2010/wordprocessingShape" xmlns:wpg="http://schemas.microsoft.com/office/word/2010/wordprocessingGroup" xmlns:mc="http://schemas.openxmlformats.org/markup-compatibility/2006" xmlns:wp14="http://schemas.microsoft.com/office/word/2010/wordprocessingDrawing" xmlns:w14="http://schemas.microsoft.com/office/word/2010/wordml" xmlns:w15="http://schemas.microsoft.com/office/word/2012/wordml" w:lineRule="auto" w:line="247"/>
         <w:ind xmlns:wps="http://schemas.microsoft.com/office/word/2010/wordprocessingShape" xmlns:wpg="http://schemas.microsoft.com/office/word/2010/wordprocessingGroup" xmlns:mc="http://schemas.openxmlformats.org/markup-compatibility/2006" xmlns:wp14="http://schemas.microsoft.com/office/word/2010/wordprocessingDrawing" xmlns:w14="http://schemas.microsoft.com/office/word/2010/wordml" xmlns:w15="http://schemas.microsoft.com/office/word/2012/wordml" w:firstLine="288" w:start="100" w:end="443"/>
@@ -1174,12 +1183,12 @@
         <w:rPr xmlns:wps="http://schemas.microsoft.com/office/word/2010/wordprocessingShape" xmlns:wpg="http://schemas.microsoft.com/office/word/2010/wordprocessingGroup" xmlns:mc="http://schemas.openxmlformats.org/markup-compatibility/2006" xmlns:wp14="http://schemas.microsoft.com/office/word/2010/wordprocessingDrawing" xmlns:w14="http://schemas.microsoft.com/office/word/2010/wordml" xmlns:w15="http://schemas.microsoft.com/office/word/2012/wordml"/>
       </w:pPr>
       <w:r>
-        <w:t xml:space="preserve">Долгосрочная перспектива, вытекающая из ценностей людей — того, что для них действительно важно, — необходима для мобилизации коллективных действий. Но даже когда город сформулирует такую перспективу, перемены не произойдут сами собой. По‑прежнему будет трудно переориентировать закупки автопарка, если только</w:t>
+        <w:t xml:space="preserve">Долгосрочная перспектива, основанная на ценностях людей — на том, что им действительно важно, — необходима для мобилизации коллективных действий. Но даже появление такой перспективы не изменит ситуацию само собой. По‑прежнему будет трудно перенастроить закупки автомобилей для служебного автопарка, если только</w:t>
       </w:r>
     </w:p>
     <w:p>
       <w:pPr>
-        <w:pStyle xmlns:wps="http://schemas.microsoft.com/office/word/2010/wordprocessingShape" xmlns:wpg="http://schemas.microsoft.com/office/word/2010/wordprocessingGroup" xmlns:mc="http://schemas.openxmlformats.org/markup-compatibility/2006" xmlns:wp14="http://schemas.microsoft.com/office/word/2010/wordprocessingDrawing" xmlns:w14="http://schemas.microsoft.com/office/word/2010/wordml" xmlns:w15="http://schemas.microsoft.com/office/word/2012/wordml" w:val="BodyText"/>
+        <w:pStyle w:val="BodyText"/>
         <w:bidi xmlns:wps="http://schemas.microsoft.com/office/word/2010/wordprocessingShape" xmlns:wpg="http://schemas.microsoft.com/office/word/2010/wordprocessingGroup" xmlns:mc="http://schemas.openxmlformats.org/markup-compatibility/2006" xmlns:wp14="http://schemas.microsoft.com/office/word/2010/wordprocessingDrawing" xmlns:w14="http://schemas.microsoft.com/office/word/2010/wordml" xmlns:w15="http://schemas.microsoft.com/office/word/2012/wordml" w:val="0"/>
         <w:spacing xmlns:wps="http://schemas.microsoft.com/office/word/2010/wordprocessingShape" xmlns:wpg="http://schemas.microsoft.com/office/word/2010/wordprocessingGroup" xmlns:mc="http://schemas.openxmlformats.org/markup-compatibility/2006" xmlns:wp14="http://schemas.microsoft.com/office/word/2010/wordprocessingDrawing" xmlns:w14="http://schemas.microsoft.com/office/word/2010/wordml" xmlns:w15="http://schemas.microsoft.com/office/word/2012/wordml" w:lineRule="auto" w:line="247" w:before="0" w:after="0"/>
         <w:ind xmlns:wps="http://schemas.microsoft.com/office/word/2010/wordprocessingShape" xmlns:wpg="http://schemas.microsoft.com/office/word/2010/wordprocessingGroup" xmlns:mc="http://schemas.openxmlformats.org/markup-compatibility/2006" xmlns:wp14="http://schemas.microsoft.com/office/word/2010/wordprocessingDrawing" xmlns:w14="http://schemas.microsoft.com/office/word/2010/wordml" xmlns:w15="http://schemas.microsoft.com/office/word/2012/wordml" w:start="100" w:end="194"/>
@@ -1187,12 +1196,12 @@
         <w:rPr xmlns:wps="http://schemas.microsoft.com/office/word/2010/wordprocessingShape" xmlns:wpg="http://schemas.microsoft.com/office/word/2010/wordprocessingGroup" xmlns:mc="http://schemas.openxmlformats.org/markup-compatibility/2006" xmlns:wp14="http://schemas.microsoft.com/office/word/2010/wordprocessingDrawing" xmlns:w14="http://schemas.microsoft.com/office/word/2010/wordml" xmlns:w15="http://schemas.microsoft.com/office/word/2012/wordml"/>
       </w:pPr>
       <w:r>
-        <w:t xml:space="preserve">Долгосрочная перспектива воплощается через краткосрочные политики и программы, которые задают направление реализации. Создание города, удобного для пешеходов, с дружелюбными микрорайонами и сдерживанием разрастания пригородов всё равно требует изменений в правилах землепользования, прежде чем появятся заметные изменения в плотности застройки. Концепция чистого воздуха и снижения климатического воздействия должна найти отражение в ряде политик — от политики закупок, требующей альтернатив энергоёмким товарам, до капитального планирования производства возобновляемой энергии.</w:t>
+        <w:t xml:space="preserve">Долгосрочные цели должны воплощаться в краткосрочных политиках и программах, задающих вектор реализации. Идея создать город, удобный для пешеходов, с дружелюбными кварталами и меньшим разрастанием пригородов потребует изменений в правилах землепользования, прежде чем заметно возрастёт плотность застройки. Аналогично, стратегия чистого воздуха и снижения климатического воздействия должна претворяться в систему мер — от закупочной политики, стимулирующей замену энергоёмких товаров, до капитального планирования возобновляемой энергетики.</w:t>
       </w:r>
     </w:p>
     <w:p>
       <w:pPr>
-        <w:pStyle xmlns:wps="http://schemas.microsoft.com/office/word/2010/wordprocessingShape" xmlns:wpg="http://schemas.microsoft.com/office/word/2010/wordprocessingGroup" xmlns:mc="http://schemas.openxmlformats.org/markup-compatibility/2006" xmlns:wp14="http://schemas.microsoft.com/office/word/2010/wordprocessingDrawing" xmlns:w14="http://schemas.microsoft.com/office/word/2010/wordml" xmlns:w15="http://schemas.microsoft.com/office/word/2012/wordml" w:val="BodyText"/>
+        <w:pStyle w:val="BodyText"/>
         <w:bidi xmlns:wps="http://schemas.microsoft.com/office/word/2010/wordprocessingShape" xmlns:wpg="http://schemas.microsoft.com/office/word/2010/wordprocessingGroup" xmlns:mc="http://schemas.openxmlformats.org/markup-compatibility/2006" xmlns:wp14="http://schemas.microsoft.com/office/word/2010/wordprocessingDrawing" xmlns:w14="http://schemas.microsoft.com/office/word/2010/wordml" xmlns:w15="http://schemas.microsoft.com/office/word/2012/wordml" w:val="0"/>
         <w:spacing xmlns:wps="http://schemas.microsoft.com/office/word/2010/wordprocessingShape" xmlns:wpg="http://schemas.microsoft.com/office/word/2010/wordprocessingGroup" xmlns:mc="http://schemas.openxmlformats.org/markup-compatibility/2006" xmlns:wp14="http://schemas.microsoft.com/office/word/2010/wordprocessingDrawing" xmlns:w14="http://schemas.microsoft.com/office/word/2010/wordml" xmlns:w15="http://schemas.microsoft.com/office/word/2012/wordml" w:lineRule="auto" w:line="247" w:before="84" w:after="0"/>
         <w:ind xmlns:wps="http://schemas.microsoft.com/office/word/2010/wordprocessingShape" xmlns:wpg="http://schemas.microsoft.com/office/word/2010/wordprocessingGroup" xmlns:mc="http://schemas.openxmlformats.org/markup-compatibility/2006" xmlns:wp14="http://schemas.microsoft.com/office/word/2010/wordprocessingDrawing" xmlns:w14="http://schemas.microsoft.com/office/word/2010/wordml" xmlns:w15="http://schemas.microsoft.com/office/word/2012/wordml" w:firstLine="288" w:start="100" w:end="158"/>
@@ -1200,12 +1209,12 @@
         <w:rPr xmlns:wps="http://schemas.microsoft.com/office/word/2010/wordprocessingShape" xmlns:wpg="http://schemas.microsoft.com/office/word/2010/wordprocessingGroup" xmlns:mc="http://schemas.openxmlformats.org/markup-compatibility/2006" xmlns:wp14="http://schemas.microsoft.com/office/word/2010/wordprocessingDrawing" xmlns:w14="http://schemas.microsoft.com/office/word/2010/wordml" xmlns:w15="http://schemas.microsoft.com/office/word/2012/wordml"/>
       </w:pPr>
       <w:r>
-        <w:t xml:space="preserve">Сегодня немногие города располагают комплексными долгосрочными планами и политиками, нужными для перехода к устойчивому развитию. Часто политический контекст фрагментирован, краткосрочен и внутренне противоречив. Город может иметь генеральный или комплексный план, охватывающий инфраструктуру, землепользование и экономическое развитие на ближайшие три–пять лет. Если сотрудники администрации и/или совет ориентированы на интеграцию, капитальный план может отражать цели генерального плана. Но чаще капитальный план — это длинный список проектов, составленный по запросам отдельных департаментов или членов совета, не связанных между собой и не учитывающих, как они соотносятся с долгосрочными целями, такими как стабилизация климата или искоренение бедности. Города почти не принимают во внимание такие фундаментальные факторы, как общее чувство ценностей, вопросы социального и человеческого развития и структура управления.</w:t>
+        <w:t xml:space="preserve">Сегодня немногие города располагают комплексными долгосрочными планами и политикой, необходимыми для перехода к устойчивому развитию. Политический контекст часто фрагментирован, краткосрочен и противоречив. У города может быть генеральный план, охватывающий инфраструктуру, землепользование и экономическое развитие на ближайшие три–пять лет. Если сотрудники администрации и/или совет стремятся к интеграции, капитальный план может соответствовать целям генерального плана. Но слишком часто капитальный план представляет собой длинный список проектов, отражающих требования отдельных департаментов или членов совета, не связанных между собой и не учитывающих, как они вписываются в общие долгосрочные цели вроде стабилизации климата или сокращения бедности. Города почти не обращают внимания на ряд ключевых факторов политического контекста — общие ценности, вопросы социального и человеческого развития и управленческие структуры.</w:t>
       </w:r>
     </w:p>
     <w:p>
       <w:pPr>
-        <w:pStyle xmlns:wps="http://schemas.microsoft.com/office/word/2010/wordprocessingShape" xmlns:wpg="http://schemas.microsoft.com/office/word/2010/wordprocessingGroup" xmlns:mc="http://schemas.openxmlformats.org/markup-compatibility/2006" xmlns:wp14="http://schemas.microsoft.com/office/word/2010/wordprocessingDrawing" xmlns:w14="http://schemas.microsoft.com/office/word/2010/wordml" xmlns:w15="http://schemas.microsoft.com/office/word/2012/wordml" w:val="BodyText"/>
+        <w:pStyle w:val="BodyText"/>
         <w:bidi xmlns:wps="http://schemas.microsoft.com/office/word/2010/wordprocessingShape" xmlns:wpg="http://schemas.microsoft.com/office/word/2010/wordprocessingGroup" xmlns:mc="http://schemas.openxmlformats.org/markup-compatibility/2006" xmlns:wp14="http://schemas.microsoft.com/office/word/2010/wordprocessingDrawing" xmlns:w14="http://schemas.microsoft.com/office/word/2010/wordml" xmlns:w15="http://schemas.microsoft.com/office/word/2012/wordml" w:val="0"/>
         <w:spacing xmlns:wps="http://schemas.microsoft.com/office/word/2010/wordprocessingShape" xmlns:wpg="http://schemas.microsoft.com/office/word/2010/wordprocessingGroup" xmlns:mc="http://schemas.openxmlformats.org/markup-compatibility/2006" xmlns:wp14="http://schemas.microsoft.com/office/word/2010/wordprocessingDrawing" xmlns:w14="http://schemas.microsoft.com/office/word/2010/wordml" xmlns:w15="http://schemas.microsoft.com/office/word/2012/wordml" w:lineRule="auto" w:line="247"/>
         <w:ind xmlns:wps="http://schemas.microsoft.com/office/word/2010/wordprocessingShape" xmlns:wpg="http://schemas.microsoft.com/office/word/2010/wordprocessingGroup" xmlns:mc="http://schemas.openxmlformats.org/markup-compatibility/2006" xmlns:wp14="http://schemas.microsoft.com/office/word/2010/wordprocessingDrawing" xmlns:w14="http://schemas.microsoft.com/office/word/2010/wordml" xmlns:w15="http://schemas.microsoft.com/office/word/2012/wordml" w:firstLine="288" w:start="100" w:end="194"/>
@@ -1213,12 +1222,12 @@
         <w:rPr xmlns:wps="http://schemas.microsoft.com/office/word/2010/wordprocessingShape" xmlns:wpg="http://schemas.microsoft.com/office/word/2010/wordprocessingGroup" xmlns:mc="http://schemas.openxmlformats.org/markup-compatibility/2006" xmlns:wp14="http://schemas.microsoft.com/office/word/2010/wordprocessingDrawing" xmlns:w14="http://schemas.microsoft.com/office/word/2010/wordml" xmlns:w15="http://schemas.microsoft.com/office/word/2012/wordml"/>
       </w:pPr>
       <w:r>
-        <w:t xml:space="preserve">Действия для достижения долгосрочной устойчивости выходят за рамки мер одних городских властей и окажутся бесполезными, если в широком сообществе не произойдут сопутствующие и соразмерные изменения. Процесс с участием множества заинтересованных сторон даёт людям, организациям и крупным учреждениям города возможность участвовать в подготовке плана и высказывать своё мнение, а затем работать в своём контексте над путями его реализации. Так город и его самостоятельные движущие силы начнут действовать согласованно ради общих целей. Но и тогда синхронные действия не появятся сами по себе — они нуждаются в руководстве и организации со стороны города и заинтересованных сторон.</w:t>
+        <w:t xml:space="preserve">Действия для долгосрочной устойчивости выходят за пределы полномочий городской власти; меры муниципалитета будут малоэффективны, если в широком сообществе не произойдут сопутствующие, соразмерные изменения. Процесс с участием множества заинтересованных сторон даёт людям, организациям и крупным институтам возможность участвовать в разработке плана и высказать своё мнение, а значит, позже они смогут искать пути его реализации в своём контексте. Тогда город и все его независимые силы начнут двигаться к общим целям. Но синхронные действия не возникают сами по себе — им требуется руководство и координация со стороны города и участников.</w:t>
       </w:r>
     </w:p>
     <w:p>
       <w:pPr>
-        <w:pStyle xmlns:wps="http://schemas.microsoft.com/office/word/2010/wordprocessingShape" xmlns:wpg="http://schemas.microsoft.com/office/word/2010/wordprocessingGroup" xmlns:mc="http://schemas.openxmlformats.org/markup-compatibility/2006" xmlns:wp14="http://schemas.microsoft.com/office/word/2010/wordprocessingDrawing" xmlns:w14="http://schemas.microsoft.com/office/word/2010/wordml" xmlns:w15="http://schemas.microsoft.com/office/word/2012/wordml" w:val="BodyText"/>
+        <w:pStyle w:val="BodyText"/>
         <w:bidi xmlns:wps="http://schemas.microsoft.com/office/word/2010/wordprocessingShape" xmlns:wpg="http://schemas.microsoft.com/office/word/2010/wordprocessingGroup" xmlns:mc="http://schemas.openxmlformats.org/markup-compatibility/2006" xmlns:wp14="http://schemas.microsoft.com/office/word/2010/wordprocessingDrawing" xmlns:w14="http://schemas.microsoft.com/office/word/2010/wordml" xmlns:w15="http://schemas.microsoft.com/office/word/2012/wordml" w:val="0"/>
         <w:spacing xmlns:wps="http://schemas.microsoft.com/office/word/2010/wordprocessingShape" xmlns:wpg="http://schemas.microsoft.com/office/word/2010/wordprocessingGroup" xmlns:mc="http://schemas.openxmlformats.org/markup-compatibility/2006" xmlns:wp14="http://schemas.microsoft.com/office/word/2010/wordprocessingDrawing" xmlns:w14="http://schemas.microsoft.com/office/word/2010/wordml" xmlns:w15="http://schemas.microsoft.com/office/word/2012/wordml" w:lineRule="auto" w:line="247"/>
         <w:ind xmlns:wps="http://schemas.microsoft.com/office/word/2010/wordprocessingShape" xmlns:wpg="http://schemas.microsoft.com/office/word/2010/wordprocessingGroup" xmlns:mc="http://schemas.openxmlformats.org/markup-compatibility/2006" xmlns:wp14="http://schemas.microsoft.com/office/word/2010/wordprocessingDrawing" xmlns:w14="http://schemas.microsoft.com/office/word/2010/wordml" xmlns:w15="http://schemas.microsoft.com/office/word/2012/wordml" w:firstLine="288" w:start="100" w:end="122"/>
@@ -1226,12 +1235,12 @@
         <w:rPr xmlns:wps="http://schemas.microsoft.com/office/word/2010/wordprocessingShape" xmlns:wpg="http://schemas.microsoft.com/office/word/2010/wordprocessingGroup" xmlns:mc="http://schemas.openxmlformats.org/markup-compatibility/2006" xmlns:wp14="http://schemas.microsoft.com/office/word/2010/wordprocessingDrawing" xmlns:w14="http://schemas.microsoft.com/office/word/2010/wordml" xmlns:w15="http://schemas.microsoft.com/office/word/2012/wordml"/>
       </w:pPr>
       <w:r>
-        <w:t xml:space="preserve">Интеграция и долгосрочный горизонт планирования важнее для достижения городских целей, чем отдельный фокус на таких вопросах, как изменение климата, здравоохранение или развитие местной экономики. Эти вопросы важны, но любые меры окажутся неэффективны, если их принимать поодиночке. Интегрированный подход связывает разные сферы, социально‑экономические границы и городские ведомства.</w:t>
+        <w:t xml:space="preserve">Интеграция и долгосрочные горизонты важнее отдельно взятых вопросов — изменения климата, здравоохранения или местной экономики — для достижения целей города. Эти темы значимы, но меры против них не будут успешными в изоляции. Интегрированный подход устанавливает связи между разными сферами, социально‑экономическими границами и городскими службами.</w:t>
       </w:r>
     </w:p>
     <w:p>
       <w:pPr>
-        <w:pStyle xmlns:wps="http://schemas.microsoft.com/office/word/2010/wordprocessingShape" xmlns:wpg="http://schemas.microsoft.com/office/word/2010/wordprocessingGroup" xmlns:mc="http://schemas.openxmlformats.org/markup-compatibility/2006" xmlns:wp14="http://schemas.microsoft.com/office/word/2010/wordprocessingDrawing" xmlns:w14="http://schemas.microsoft.com/office/word/2010/wordml" xmlns:w15="http://schemas.microsoft.com/office/word/2012/wordml" w:val="BodyText"/>
+        <w:pStyle w:val="BodyText"/>
         <w:bidi xmlns:wps="http://schemas.microsoft.com/office/word/2010/wordprocessingShape" xmlns:wpg="http://schemas.microsoft.com/office/word/2010/wordprocessingGroup" xmlns:mc="http://schemas.openxmlformats.org/markup-compatibility/2006" xmlns:wp14="http://schemas.microsoft.com/office/word/2010/wordprocessingDrawing" xmlns:w14="http://schemas.microsoft.com/office/word/2010/wordml" xmlns:w15="http://schemas.microsoft.com/office/word/2012/wordml" w:val="0"/>
         <w:spacing xmlns:wps="http://schemas.microsoft.com/office/word/2010/wordprocessingShape" xmlns:wpg="http://schemas.microsoft.com/office/word/2010/wordprocessingGroup" xmlns:mc="http://schemas.openxmlformats.org/markup-compatibility/2006" xmlns:wp14="http://schemas.microsoft.com/office/word/2010/wordprocessingDrawing" xmlns:w14="http://schemas.microsoft.com/office/word/2010/wordml" xmlns:w15="http://schemas.microsoft.com/office/word/2012/wordml" w:lineRule="exact" w:line="320"/>
         <w:ind xmlns:wps="http://schemas.microsoft.com/office/word/2010/wordprocessingShape" xmlns:wpg="http://schemas.microsoft.com/office/word/2010/wordprocessingGroup" xmlns:mc="http://schemas.openxmlformats.org/markup-compatibility/2006" xmlns:wp14="http://schemas.microsoft.com/office/word/2010/wordprocessingDrawing" xmlns:w14="http://schemas.microsoft.com/office/word/2010/wordml" xmlns:w15="http://schemas.microsoft.com/office/word/2012/wordml" w:start="388" w:end="0"/>
@@ -1239,12 +1248,12 @@
         <w:rPr xmlns:wps="http://schemas.microsoft.com/office/word/2010/wordprocessingShape" xmlns:wpg="http://schemas.microsoft.com/office/word/2010/wordprocessingGroup" xmlns:mc="http://schemas.openxmlformats.org/markup-compatibility/2006" xmlns:wp14="http://schemas.microsoft.com/office/word/2010/wordprocessingDrawing" xmlns:w14="http://schemas.microsoft.com/office/word/2010/wordml" xmlns:w15="http://schemas.microsoft.com/office/word/2012/wordml"/>
       </w:pPr>
       <w:r>
-        <w:t xml:space="preserve">Это также помогает гарантировать, что достижение одной цели не будет происходить за счёт другой.</w:t>
+        <w:t xml:space="preserve">Это также помогает избежать ситуации, когда достижение одной цели происходит за счёт другой.</w:t>
       </w:r>
     </w:p>
     <w:p>
       <w:pPr>
-        <w:pStyle xmlns:wps="http://schemas.microsoft.com/office/word/2010/wordprocessingShape" xmlns:wpg="http://schemas.microsoft.com/office/word/2010/wordprocessingGroup" xmlns:mc="http://schemas.openxmlformats.org/markup-compatibility/2006" xmlns:wp14="http://schemas.microsoft.com/office/word/2010/wordprocessingDrawing" xmlns:w14="http://schemas.microsoft.com/office/word/2010/wordml" xmlns:w15="http://schemas.microsoft.com/office/word/2012/wordml" w:val="BodyText"/>
+        <w:pStyle w:val="BodyText"/>
         <w:bidi xmlns:wps="http://schemas.microsoft.com/office/word/2010/wordprocessingShape" xmlns:wpg="http://schemas.microsoft.com/office/word/2010/wordprocessingGroup" xmlns:mc="http://schemas.openxmlformats.org/markup-compatibility/2006" xmlns:wp14="http://schemas.microsoft.com/office/word/2010/wordprocessingDrawing" xmlns:w14="http://schemas.microsoft.com/office/word/2010/wordml" xmlns:w15="http://schemas.microsoft.com/office/word/2012/wordml" w:val="0"/>
         <w:spacing xmlns:wps="http://schemas.microsoft.com/office/word/2010/wordprocessingShape" xmlns:wpg="http://schemas.microsoft.com/office/word/2010/wordprocessingGroup" xmlns:mc="http://schemas.openxmlformats.org/markup-compatibility/2006" xmlns:wp14="http://schemas.microsoft.com/office/word/2010/wordprocessingDrawing" xmlns:w14="http://schemas.microsoft.com/office/word/2010/wordml" xmlns:w15="http://schemas.microsoft.com/office/word/2012/wordml" w:lineRule="auto" w:line="247" w:before="1" w:after="0"/>
         <w:ind xmlns:wps="http://schemas.microsoft.com/office/word/2010/wordprocessingShape" xmlns:wpg="http://schemas.microsoft.com/office/word/2010/wordprocessingGroup" xmlns:mc="http://schemas.openxmlformats.org/markup-compatibility/2006" xmlns:wp14="http://schemas.microsoft.com/office/word/2010/wordprocessingDrawing" xmlns:w14="http://schemas.microsoft.com/office/word/2010/wordml" xmlns:w15="http://schemas.microsoft.com/office/word/2012/wordml" w:start="100" w:end="122"/>
@@ -1252,12 +1261,12 @@
         <w:rPr xmlns:wps="http://schemas.microsoft.com/office/word/2010/wordprocessingShape" xmlns:wpg="http://schemas.microsoft.com/office/word/2010/wordprocessingGroup" xmlns:mc="http://schemas.openxmlformats.org/markup-compatibility/2006" xmlns:wp14="http://schemas.microsoft.com/office/word/2010/wordprocessingDrawing" xmlns:w14="http://schemas.microsoft.com/office/word/2010/wordml" xmlns:w15="http://schemas.microsoft.com/office/word/2012/wordml"/>
       </w:pPr>
       <w:r>
-        <w:t xml:space="preserve">Экологическая политика, маргинализирующая или обедняющая группы людей или районы — будь то в городе или в других частях мира — в долгосрочной перспективе не даст результата. Планы жилищного строительства, игнорирующие влияние на ценные открытые пространства, водно‑болотные угодья и сельскохозяйственные земли, в перспективе повредят городу. Меры экономического развития, основанные на неустойчивой эксплуатации природных ресурсов или трудового потенциала, в итоге дадут обратный эффект — усилят бедность вместо создания реального благосостояния.</w:t>
+        <w:t xml:space="preserve">Экологическая политика, маргинализирующая или обнищающая группы людей или районы — локально или в других частях мира — в долгосрочной перспективе не выдержит. Жилищные планы, игнорирующие влияние на важные открытые пространства, водно‑болотные угодья и сельскохозяйственные земли, в итоге повредят городу. Экономическое развитие, основанное на истощении природных ресурсов или эксплуатации человеческого потенциала, тоже обернётся эффектом бумеранга — оно ещё больше обеднит сообщество, вместо того чтобы создать настоящее благосостояние.</w:t>
       </w:r>
     </w:p>
     <w:p>
       <w:pPr>
-        <w:pStyle xmlns:wps="http://schemas.microsoft.com/office/word/2010/wordprocessingShape" xmlns:wpg="http://schemas.microsoft.com/office/word/2010/wordprocessingGroup" xmlns:mc="http://schemas.openxmlformats.org/markup-compatibility/2006" xmlns:wp14="http://schemas.microsoft.com/office/word/2010/wordprocessingDrawing" xmlns:w14="http://schemas.microsoft.com/office/word/2010/wordml" xmlns:w15="http://schemas.microsoft.com/office/word/2012/wordml" w:val="BodyText"/>
+        <w:pStyle w:val="BodyText"/>
         <w:bidi xmlns:wps="http://schemas.microsoft.com/office/word/2010/wordprocessingShape" xmlns:wpg="http://schemas.microsoft.com/office/word/2010/wordprocessingGroup" xmlns:mc="http://schemas.openxmlformats.org/markup-compatibility/2006" xmlns:wp14="http://schemas.microsoft.com/office/word/2010/wordprocessingDrawing" xmlns:w14="http://schemas.microsoft.com/office/word/2010/wordml" xmlns:w15="http://schemas.microsoft.com/office/word/2012/wordml" w:val="0"/>
         <w:spacing xmlns:wps="http://schemas.microsoft.com/office/word/2010/wordprocessingShape" xmlns:wpg="http://schemas.microsoft.com/office/word/2010/wordprocessingGroup" xmlns:mc="http://schemas.openxmlformats.org/markup-compatibility/2006" xmlns:wp14="http://schemas.microsoft.com/office/word/2010/wordprocessingDrawing" xmlns:w14="http://schemas.microsoft.com/office/word/2010/wordml" xmlns:w15="http://schemas.microsoft.com/office/word/2012/wordml" w:lineRule="auto" w:line="247"/>
         <w:ind xmlns:wps="http://schemas.microsoft.com/office/word/2010/wordprocessingShape" xmlns:wpg="http://schemas.microsoft.com/office/word/2010/wordprocessingGroup" xmlns:mc="http://schemas.openxmlformats.org/markup-compatibility/2006" xmlns:wp14="http://schemas.microsoft.com/office/word/2010/wordprocessingDrawing" xmlns:w14="http://schemas.microsoft.com/office/word/2010/wordml" xmlns:w15="http://schemas.microsoft.com/office/word/2012/wordml" w:firstLine="288" w:start="100" w:end="122"/>
@@ -1265,12 +1274,12 @@
         <w:rPr xmlns:wps="http://schemas.microsoft.com/office/word/2010/wordprocessingShape" xmlns:wpg="http://schemas.microsoft.com/office/word/2010/wordprocessingGroup" xmlns:mc="http://schemas.openxmlformats.org/markup-compatibility/2006" xmlns:wp14="http://schemas.microsoft.com/office/word/2010/wordprocessingDrawing" xmlns:w14="http://schemas.microsoft.com/office/word/2010/wordml" xmlns:w15="http://schemas.microsoft.com/office/word/2012/wordml"/>
       </w:pPr>
       <w:r>
-        <w:t xml:space="preserve">Однако если спросить некоторых мэров или членов городских советов, какое влияние они оказывают на экономику, они, скорее всего, посмотрят с недоумением. Некоторые даже строили промышленную инфраструктуру в надежде привлечь производственные предприятия с высокооплачиваемыми рабочими местами XIX–XX веков, не замечая глобальных тенденций, по которым большая часть производства ушла в другие регионы.</w:t>
+        <w:t xml:space="preserve">Если спросить некоторых мэров или членов советов, какое влияние они оказывают на экономику, они, вероятно, посмотрят с недоумением. Некоторые зашли так далеко, что вложились в промышленную инфраструктуру в надежде привлечь производство с высокооплачиваемыми рабочими местами XIX–XX веков, игнорируя глобальные тренды, когда большая часть производства уехала в другие части мира.</w:t>
       </w:r>
     </w:p>
     <w:p>
       <w:pPr>
-        <w:pStyle xmlns:wps="http://schemas.microsoft.com/office/word/2010/wordprocessingShape" xmlns:wpg="http://schemas.microsoft.com/office/word/2010/wordprocessingGroup" xmlns:mc="http://schemas.openxmlformats.org/markup-compatibility/2006" xmlns:wp14="http://schemas.microsoft.com/office/word/2010/wordprocessingDrawing" xmlns:w14="http://schemas.microsoft.com/office/word/2010/wordml" xmlns:w15="http://schemas.microsoft.com/office/word/2012/wordml" w:val="BodyText"/>
+        <w:pStyle w:val="BodyText"/>
         <w:bidi xmlns:wps="http://schemas.microsoft.com/office/word/2010/wordprocessingShape" xmlns:wpg="http://schemas.microsoft.com/office/word/2010/wordprocessingGroup" xmlns:mc="http://schemas.openxmlformats.org/markup-compatibility/2006" xmlns:wp14="http://schemas.microsoft.com/office/word/2010/wordprocessingDrawing" xmlns:w14="http://schemas.microsoft.com/office/word/2010/wordml" xmlns:w15="http://schemas.microsoft.com/office/word/2012/wordml" w:val="0"/>
         <w:spacing xmlns:wps="http://schemas.microsoft.com/office/word/2010/wordprocessingShape" xmlns:wpg="http://schemas.microsoft.com/office/word/2010/wordprocessingGroup" xmlns:mc="http://schemas.openxmlformats.org/markup-compatibility/2006" xmlns:wp14="http://schemas.microsoft.com/office/word/2010/wordprocessingDrawing" xmlns:w14="http://schemas.microsoft.com/office/word/2010/wordml" xmlns:w15="http://schemas.microsoft.com/office/word/2012/wordml" w:lineRule="auto" w:line="247"/>
         <w:ind xmlns:wps="http://schemas.microsoft.com/office/word/2010/wordprocessingShape" xmlns:wpg="http://schemas.microsoft.com/office/word/2010/wordprocessingGroup" xmlns:mc="http://schemas.openxmlformats.org/markup-compatibility/2006" xmlns:wp14="http://schemas.microsoft.com/office/word/2010/wordprocessingDrawing" xmlns:w14="http://schemas.microsoft.com/office/word/2010/wordml" xmlns:w15="http://schemas.microsoft.com/office/word/2012/wordml" w:start="100" w:end="122"/>
@@ -1278,12 +1287,12 @@
         <w:rPr xmlns:wps="http://schemas.microsoft.com/office/word/2010/wordprocessingShape" xmlns:wpg="http://schemas.microsoft.com/office/word/2010/wordprocessingGroup" xmlns:mc="http://schemas.openxmlformats.org/markup-compatibility/2006" xmlns:wp14="http://schemas.microsoft.com/office/word/2010/wordprocessingDrawing" xmlns:w14="http://schemas.microsoft.com/office/word/2010/wordml" xmlns:w15="http://schemas.microsoft.com/office/word/2012/wordml"/>
       </w:pPr>
       <w:r>
-        <w:t xml:space="preserve">Другие надеются на маркетинговые усилия местной торговой палаты: она активно участвует в выставках и размещает рекламу, продвигая регион как благоприятный для бизнеса.</w:t>
+        <w:t xml:space="preserve">Другие надеются на усилия местной торговой палаты: она активно участвует в выставках и размещает рекламу, продвигая район как благоприятный для ведения бизнеса.</w:t>
       </w:r>
     </w:p>
     <w:p>
       <w:pPr>
-        <w:pStyle xmlns:wps="http://schemas.microsoft.com/office/word/2010/wordprocessingShape" xmlns:wpg="http://schemas.microsoft.com/office/word/2010/wordprocessingGroup" xmlns:mc="http://schemas.openxmlformats.org/markup-compatibility/2006" xmlns:wp14="http://schemas.microsoft.com/office/word/2010/wordprocessingDrawing" xmlns:w14="http://schemas.microsoft.com/office/word/2010/wordml" xmlns:w15="http://schemas.microsoft.com/office/word/2012/wordml" w:val="BodyText"/>
+        <w:pStyle w:val="BodyText"/>
         <w:bidi xmlns:wps="http://schemas.microsoft.com/office/word/2010/wordprocessingShape" xmlns:wpg="http://schemas.microsoft.com/office/word/2010/wordprocessingGroup" xmlns:mc="http://schemas.openxmlformats.org/markup-compatibility/2006" xmlns:wp14="http://schemas.microsoft.com/office/word/2010/wordprocessingDrawing" xmlns:w14="http://schemas.microsoft.com/office/word/2010/wordml" xmlns:w15="http://schemas.microsoft.com/office/word/2012/wordml" w:val="0"/>
         <w:spacing xmlns:wps="http://schemas.microsoft.com/office/word/2010/wordprocessingShape" xmlns:wpg="http://schemas.microsoft.com/office/word/2010/wordprocessingGroup" xmlns:mc="http://schemas.openxmlformats.org/markup-compatibility/2006" xmlns:wp14="http://schemas.microsoft.com/office/word/2010/wordprocessingDrawing" xmlns:w14="http://schemas.microsoft.com/office/word/2010/wordml" xmlns:w15="http://schemas.microsoft.com/office/word/2012/wordml" w:lineRule="auto" w:line="247"/>
         <w:ind xmlns:wps="http://schemas.microsoft.com/office/word/2010/wordprocessingShape" xmlns:wpg="http://schemas.microsoft.com/office/word/2010/wordprocessingGroup" xmlns:mc="http://schemas.openxmlformats.org/markup-compatibility/2006" xmlns:wp14="http://schemas.microsoft.com/office/word/2010/wordprocessingDrawing" xmlns:w14="http://schemas.microsoft.com/office/word/2010/wordml" xmlns:w15="http://schemas.microsoft.com/office/word/2012/wordml" w:firstLine="288" w:start="100" w:end="122"/>
@@ -1291,12 +1300,12 @@
         <w:rPr xmlns:wps="http://schemas.microsoft.com/office/word/2010/wordprocessingShape" xmlns:wpg="http://schemas.microsoft.com/office/word/2010/wordprocessingGroup" xmlns:mc="http://schemas.openxmlformats.org/markup-compatibility/2006" xmlns:wp14="http://schemas.microsoft.com/office/word/2010/wordprocessingDrawing" xmlns:w14="http://schemas.microsoft.com/office/word/2010/wordml" xmlns:w15="http://schemas.microsoft.com/office/word/2012/wordml"/>
       </w:pPr>
       <w:r>
-        <w:t xml:space="preserve">Некоторые из самых прогрессивных муниципалитетов создали фонды возобновляемых кредитов — кредиторов последней инстанции для местных предприятий с проблемами денежного потока или роста. Они создают бизнес-инкубаторы, помогают с бизнес-планированием и порой находят источники венчурного капитала для стартапов. Многие власти понимают важность локального бизнеса, но по-прежнему боятся занять твердую позицию, когда крупные компании угрожают вытеснить с рынка мелкие предприятия.</w:t>
+        <w:t xml:space="preserve">Некоторые прогрессивные муниципалитеты создали фонды ротационного кредитования, выступающие кредитором последней инстанции для местных предприятий с проблемами ликвидности или роста. Они создают инкубаторы, помогают с бизнес‑планированием и иногда привлекают венчурный капитал для стартапов. Многие власти понимают значение местных предприятий, но по‑прежнему боятся занять решительную позицию, когда крупные корпорации угрожают прийти и вытеснить мелкие фирмы.</w:t>
       </w:r>
     </w:p>
     <w:p>
       <w:pPr>
-        <w:pStyle xmlns:wps="http://schemas.microsoft.com/office/word/2010/wordprocessingShape" xmlns:wpg="http://schemas.microsoft.com/office/word/2010/wordprocessingGroup" xmlns:mc="http://schemas.openxmlformats.org/markup-compatibility/2006" xmlns:wp14="http://schemas.microsoft.com/office/word/2010/wordprocessingDrawing" xmlns:w14="http://schemas.microsoft.com/office/word/2010/wordml" xmlns:w15="http://schemas.microsoft.com/office/word/2012/wordml" w:val="BodyText"/>
+        <w:pStyle w:val="BodyText"/>
         <w:bidi xmlns:wps="http://schemas.microsoft.com/office/word/2010/wordprocessingShape" xmlns:wpg="http://schemas.microsoft.com/office/word/2010/wordprocessingGroup" xmlns:mc="http://schemas.openxmlformats.org/markup-compatibility/2006" xmlns:wp14="http://schemas.microsoft.com/office/word/2010/wordprocessingDrawing" xmlns:w14="http://schemas.microsoft.com/office/word/2010/wordml" xmlns:w15="http://schemas.microsoft.com/office/word/2012/wordml" w:val="0"/>
         <w:spacing xmlns:wps="http://schemas.microsoft.com/office/word/2010/wordprocessingShape" xmlns:wpg="http://schemas.microsoft.com/office/word/2010/wordprocessingGroup" xmlns:mc="http://schemas.openxmlformats.org/markup-compatibility/2006" xmlns:wp14="http://schemas.microsoft.com/office/word/2010/wordprocessingDrawing" xmlns:w14="http://schemas.microsoft.com/office/word/2010/wordml" xmlns:w15="http://schemas.microsoft.com/office/word/2012/wordml" w:lineRule="auto" w:line="247"/>
         <w:ind xmlns:wps="http://schemas.microsoft.com/office/word/2010/wordprocessingShape" xmlns:wpg="http://schemas.microsoft.com/office/word/2010/wordprocessingGroup" xmlns:mc="http://schemas.openxmlformats.org/markup-compatibility/2006" xmlns:wp14="http://schemas.microsoft.com/office/word/2010/wordprocessingDrawing" xmlns:w14="http://schemas.microsoft.com/office/word/2010/wordml" xmlns:w15="http://schemas.microsoft.com/office/word/2012/wordml" w:start="100" w:end="122"/>
@@ -1304,12 +1313,12 @@
         <w:rPr xmlns:wps="http://schemas.microsoft.com/office/word/2010/wordprocessingShape" xmlns:wpg="http://schemas.microsoft.com/office/word/2010/wordprocessingGroup" xmlns:mc="http://schemas.openxmlformats.org/markup-compatibility/2006" xmlns:wp14="http://schemas.microsoft.com/office/word/2010/wordprocessingDrawing" xmlns:w14="http://schemas.microsoft.com/office/word/2010/wordml" xmlns:w15="http://schemas.microsoft.com/office/word/2012/wordml"/>
       </w:pPr>
       <w:r>
-        <w:t xml:space="preserve">Многие муниципальные органы считают, что все рабочие места одинаково ценны, а новые налоговые базы — священны. Экономика — хозяин, а сообщества — слуги, готовые на всё ради инвесторов, даже если деловые практики последних вызывают сомнения.</w:t>
+        <w:t xml:space="preserve">Большинство местных органов власти полагают, что все рабочие места равны и что любые новые налоговые поступления священны. Экономика — хозяин, а местные сообщества — слуги, готовые на всё, чтобы угодить инвесторам, даже если деловые практики тех вызывают сомнения.</w:t>
       </w:r>
     </w:p>
     <w:p>
       <w:pPr>
-        <w:pStyle xmlns:wps="http://schemas.microsoft.com/office/word/2010/wordprocessingShape" xmlns:wpg="http://schemas.microsoft.com/office/word/2010/wordprocessingGroup" xmlns:mc="http://schemas.openxmlformats.org/markup-compatibility/2006" xmlns:wp14="http://schemas.microsoft.com/office/word/2010/wordprocessingDrawing" xmlns:w14="http://schemas.microsoft.com/office/word/2010/wordml" xmlns:w15="http://schemas.microsoft.com/office/word/2012/wordml" w:val="BodyText"/>
+        <w:pStyle w:val="BodyText"/>
         <w:bidi xmlns:wps="http://schemas.microsoft.com/office/word/2010/wordprocessingShape" xmlns:wpg="http://schemas.microsoft.com/office/word/2010/wordprocessingGroup" xmlns:mc="http://schemas.openxmlformats.org/markup-compatibility/2006" xmlns:wp14="http://schemas.microsoft.com/office/word/2010/wordprocessingDrawing" xmlns:w14="http://schemas.microsoft.com/office/word/2010/wordml" xmlns:w15="http://schemas.microsoft.com/office/word/2012/wordml" w:val="0"/>
         <w:spacing xmlns:wps="http://schemas.microsoft.com/office/word/2010/wordprocessingShape" xmlns:wpg="http://schemas.microsoft.com/office/word/2010/wordprocessingGroup" xmlns:mc="http://schemas.openxmlformats.org/markup-compatibility/2006" xmlns:wp14="http://schemas.microsoft.com/office/word/2010/wordprocessingDrawing" xmlns:w14="http://schemas.microsoft.com/office/word/2010/wordml" xmlns:w15="http://schemas.microsoft.com/office/word/2012/wordml" w:lineRule="auto" w:line="247" w:before="0" w:after="0"/>
         <w:ind xmlns:wps="http://schemas.microsoft.com/office/word/2010/wordprocessingShape" xmlns:wpg="http://schemas.microsoft.com/office/word/2010/wordprocessingGroup" xmlns:mc="http://schemas.openxmlformats.org/markup-compatibility/2006" xmlns:wp14="http://schemas.microsoft.com/office/word/2010/wordprocessingDrawing" xmlns:w14="http://schemas.microsoft.com/office/word/2010/wordml" xmlns:w15="http://schemas.microsoft.com/office/word/2012/wordml" w:firstLine="288" w:start="100" w:end="122"/>
@@ -1322,7 +1331,7 @@
     </w:p>
     <w:p>
       <w:pPr>
-        <w:pStyle xmlns:wps="http://schemas.microsoft.com/office/word/2010/wordprocessingShape" xmlns:wpg="http://schemas.microsoft.com/office/word/2010/wordprocessingGroup" xmlns:mc="http://schemas.openxmlformats.org/markup-compatibility/2006" xmlns:wp14="http://schemas.microsoft.com/office/word/2010/wordprocessingDrawing" xmlns:w14="http://schemas.microsoft.com/office/word/2010/wordml" xmlns:w15="http://schemas.microsoft.com/office/word/2012/wordml" w:val="BodyText"/>
+        <w:pStyle w:val="BodyText"/>
         <w:bidi xmlns:wps="http://schemas.microsoft.com/office/word/2010/wordprocessingShape" xmlns:wpg="http://schemas.microsoft.com/office/word/2010/wordprocessingGroup" xmlns:mc="http://schemas.openxmlformats.org/markup-compatibility/2006" xmlns:wp14="http://schemas.microsoft.com/office/word/2010/wordprocessingDrawing" xmlns:w14="http://schemas.microsoft.com/office/word/2010/wordml" xmlns:w15="http://schemas.microsoft.com/office/word/2012/wordml" w:val="0"/>
         <w:spacing xmlns:wps="http://schemas.microsoft.com/office/word/2010/wordprocessingShape" xmlns:wpg="http://schemas.microsoft.com/office/word/2010/wordprocessingGroup" xmlns:mc="http://schemas.openxmlformats.org/markup-compatibility/2006" xmlns:wp14="http://schemas.microsoft.com/office/word/2010/wordprocessingDrawing" xmlns:w14="http://schemas.microsoft.com/office/word/2010/wordml" xmlns:w15="http://schemas.microsoft.com/office/word/2012/wordml" w:lineRule="auto" w:line="247" w:before="84" w:after="0"/>
         <w:ind xmlns:wps="http://schemas.microsoft.com/office/word/2010/wordprocessingShape" xmlns:wpg="http://schemas.microsoft.com/office/word/2010/wordprocessingGroup" xmlns:mc="http://schemas.openxmlformats.org/markup-compatibility/2006" xmlns:wp14="http://schemas.microsoft.com/office/word/2010/wordprocessingDrawing" xmlns:w14="http://schemas.microsoft.com/office/word/2010/wordml" xmlns:w15="http://schemas.microsoft.com/office/word/2012/wordml" w:start="100" w:end="122"/>
@@ -1330,12 +1339,12 @@
         <w:rPr xmlns:wps="http://schemas.microsoft.com/office/word/2010/wordprocessingShape" xmlns:wpg="http://schemas.microsoft.com/office/word/2010/wordprocessingGroup" xmlns:mc="http://schemas.openxmlformats.org/markup-compatibility/2006" xmlns:wp14="http://schemas.microsoft.com/office/word/2010/wordprocessingDrawing" xmlns:w14="http://schemas.microsoft.com/office/word/2010/wordml" xmlns:w15="http://schemas.microsoft.com/office/word/2012/wordml"/>
       </w:pPr>
       <w:r>
-        <w:t xml:space="preserve">многие формы капитала, требующие инвестиций для процветания местного сообщества, а не только финансовый капитал. Социальный, человеческий, природный, институциональный, технологический, потенциальный обменный, построенный и культурный — все они должны быть поняты и укреплены.</w:t>
+        <w:t xml:space="preserve">Многие формы капитала требуют инвестиций, чтобы местное сообщество могло процветать, а не только финансовый капитал. Социальный капитал, человеческий капитал, природный капитал, институциональный капитал, технологический капитал, потенциальный обменный капитал, построенный капитал и культурный капитал — все эти виды капитала нужно понимать и укреплять.</w:t>
       </w:r>
     </w:p>
     <w:p>
       <w:pPr>
-        <w:pStyle xmlns:wps="http://schemas.microsoft.com/office/word/2010/wordprocessingShape" xmlns:wpg="http://schemas.microsoft.com/office/word/2010/wordprocessingGroup" xmlns:mc="http://schemas.openxmlformats.org/markup-compatibility/2006" xmlns:wp14="http://schemas.microsoft.com/office/word/2010/wordprocessingDrawing" xmlns:w14="http://schemas.microsoft.com/office/word/2010/wordml" xmlns:w15="http://schemas.microsoft.com/office/word/2012/wordml" w:val="ListParagraph"/>
+        <w:pStyle w:val="ListParagraph"/>
         <w:tabs xmlns:wps="http://schemas.microsoft.com/office/word/2010/wordprocessingShape" xmlns:wpg="http://schemas.microsoft.com/office/word/2010/wordprocessingGroup" xmlns:mc="http://schemas.openxmlformats.org/markup-compatibility/2006" xmlns:wp14="http://schemas.microsoft.com/office/word/2010/wordprocessingDrawing" xmlns:w14="http://schemas.microsoft.com/office/word/2010/wordml" xmlns:w15="http://schemas.microsoft.com/office/word/2012/wordml">
           <w:tab w:val="clear" w:pos="709"/>
           <w:tab w:val="left" w:pos="920" w:leader="none"/>
@@ -1356,7 +1365,7 @@
         <w:t xml:space="preserve">И эти многоплановые усилия — исключительная прерогатива местных сообществ.</w:t>
       </w:r>
     </w:p>
-    <w:bookmarkStart w:id="12" w:name="X13e97629671b86903ae5110e61ebaefa82d689e"/>
+    <w:bookmarkStart w:id="23" w:name="X13e97629671b86903ae5110e61ebaefa82d689e"/>
     <w:p>
       <w:pPr>
         <w:pStyle w:val="Heading3"/>
@@ -1367,7 +1376,7 @@
     </w:p>
     <w:p>
       <w:pPr>
-        <w:pStyle xmlns:wps="http://schemas.microsoft.com/office/word/2010/wordprocessingShape" xmlns:wpg="http://schemas.microsoft.com/office/word/2010/wordprocessingGroup" xmlns:mc="http://schemas.openxmlformats.org/markup-compatibility/2006" xmlns:wp14="http://schemas.microsoft.com/office/word/2010/wordprocessingDrawing" xmlns:w14="http://schemas.microsoft.com/office/word/2010/wordml" xmlns:w15="http://schemas.microsoft.com/office/word/2012/wordml" w:val="BodyText"/>
+        <w:pStyle w:val="BodyText"/>
         <w:bidi xmlns:wps="http://schemas.microsoft.com/office/word/2010/wordprocessingShape" xmlns:wpg="http://schemas.microsoft.com/office/word/2010/wordprocessingGroup" xmlns:mc="http://schemas.openxmlformats.org/markup-compatibility/2006" xmlns:wp14="http://schemas.microsoft.com/office/word/2010/wordprocessingDrawing" xmlns:w14="http://schemas.microsoft.com/office/word/2010/wordml" xmlns:w15="http://schemas.microsoft.com/office/word/2012/wordml" w:val="0"/>
         <w:spacing xmlns:wps="http://schemas.microsoft.com/office/word/2010/wordprocessingShape" xmlns:wpg="http://schemas.microsoft.com/office/word/2010/wordprocessingGroup" xmlns:mc="http://schemas.openxmlformats.org/markup-compatibility/2006" xmlns:wp14="http://schemas.microsoft.com/office/word/2010/wordprocessingDrawing" xmlns:w14="http://schemas.microsoft.com/office/word/2010/wordml" xmlns:w15="http://schemas.microsoft.com/office/word/2012/wordml" w:lineRule="auto" w:line="247" w:before="297" w:after="0"/>
         <w:ind xmlns:wps="http://schemas.microsoft.com/office/word/2010/wordprocessingShape" xmlns:wpg="http://schemas.microsoft.com/office/word/2010/wordprocessingGroup" xmlns:mc="http://schemas.openxmlformats.org/markup-compatibility/2006" xmlns:wp14="http://schemas.microsoft.com/office/word/2010/wordprocessingDrawing" xmlns:w14="http://schemas.microsoft.com/office/word/2010/wordml" xmlns:w15="http://schemas.microsoft.com/office/word/2012/wordml" w:firstLine="3312" w:start="100" w:end="3311"/>
@@ -1380,7 +1389,7 @@
     </w:p>
     <w:p>
       <w:pPr>
-        <w:pStyle xmlns:wps="http://schemas.microsoft.com/office/word/2010/wordprocessingShape" xmlns:wpg="http://schemas.microsoft.com/office/word/2010/wordprocessingGroup" xmlns:mc="http://schemas.openxmlformats.org/markup-compatibility/2006" xmlns:wp14="http://schemas.microsoft.com/office/word/2010/wordprocessingDrawing" xmlns:w14="http://schemas.microsoft.com/office/word/2010/wordml" xmlns:w15="http://schemas.microsoft.com/office/word/2012/wordml" w:val="ListParagraph"/>
+        <w:pStyle w:val="ListParagraph"/>
         <w:tabs xmlns:wps="http://schemas.microsoft.com/office/word/2010/wordprocessingShape" xmlns:wpg="http://schemas.microsoft.com/office/word/2010/wordprocessingGroup" xmlns:mc="http://schemas.openxmlformats.org/markup-compatibility/2006" xmlns:wp14="http://schemas.microsoft.com/office/word/2010/wordprocessingDrawing" xmlns:w14="http://schemas.microsoft.com/office/word/2010/wordml" xmlns:w15="http://schemas.microsoft.com/office/word/2012/wordml">
           <w:tab w:val="clear" w:pos="709"/>
           <w:tab w:val="left" w:pos="1898" w:leader="none"/>
@@ -1398,12 +1407,12 @@
         </w:numPr>
       </w:pPr>
       <w:r>
-        <w:t xml:space="preserve">Очевидная идея: обладание большим количеством денег</w:t>
+        <w:t xml:space="preserve">Очевидная идея — наличие большого количества денег</w:t>
       </w:r>
     </w:p>
     <w:p>
       <w:pPr>
-        <w:pStyle xmlns:wps="http://schemas.microsoft.com/office/word/2010/wordprocessingShape" xmlns:wpg="http://schemas.microsoft.com/office/word/2010/wordprocessingGroup" xmlns:mc="http://schemas.openxmlformats.org/markup-compatibility/2006" xmlns:wp14="http://schemas.microsoft.com/office/word/2010/wordprocessingDrawing" xmlns:w14="http://schemas.microsoft.com/office/word/2010/wordml" xmlns:w15="http://schemas.microsoft.com/office/word/2012/wordml" w:val="ListParagraph"/>
+        <w:pStyle w:val="ListParagraph"/>
         <w:tabs xmlns:wps="http://schemas.microsoft.com/office/word/2010/wordprocessingShape" xmlns:wpg="http://schemas.microsoft.com/office/word/2010/wordprocessingGroup" xmlns:mc="http://schemas.openxmlformats.org/markup-compatibility/2006" xmlns:wp14="http://schemas.microsoft.com/office/word/2010/wordprocessingDrawing" xmlns:w14="http://schemas.microsoft.com/office/word/2010/wordml" xmlns:w15="http://schemas.microsoft.com/office/word/2012/wordml">
           <w:tab w:val="clear" w:pos="709"/>
           <w:tab w:val="left" w:pos="1898" w:leader="none"/>
@@ -1421,12 +1430,12 @@
         </w:numPr>
       </w:pPr>
       <w:r>
-        <w:t xml:space="preserve">Благополучие, достигаемое удовлетворением широкого спектра человеческих потребностей</w:t>
+        <w:t xml:space="preserve">Благополучие, достигаемое через удовлетворение широкого спектра человеческих потребностей</w:t>
       </w:r>
     </w:p>
     <w:p>
       <w:pPr>
-        <w:pStyle xmlns:wps="http://schemas.microsoft.com/office/word/2010/wordprocessingShape" xmlns:wpg="http://schemas.microsoft.com/office/word/2010/wordprocessingGroup" xmlns:mc="http://schemas.openxmlformats.org/markup-compatibility/2006" xmlns:wp14="http://schemas.microsoft.com/office/word/2010/wordprocessingDrawing" xmlns:w14="http://schemas.microsoft.com/office/word/2010/wordml" xmlns:w15="http://schemas.microsoft.com/office/word/2012/wordml" w:val="ListParagraph"/>
+        <w:pStyle w:val="ListParagraph"/>
         <w:tabs xmlns:wps="http://schemas.microsoft.com/office/word/2010/wordprocessingShape" xmlns:wpg="http://schemas.microsoft.com/office/word/2010/wordprocessingGroup" xmlns:mc="http://schemas.openxmlformats.org/markup-compatibility/2006" xmlns:wp14="http://schemas.microsoft.com/office/word/2010/wordprocessingDrawing" xmlns:w14="http://schemas.microsoft.com/office/word/2010/wordml" xmlns:w15="http://schemas.microsoft.com/office/word/2012/wordml">
           <w:tab w:val="clear" w:pos="709"/>
           <w:tab w:val="left" w:pos="1898" w:leader="none"/>
@@ -1444,12 +1453,12 @@
         </w:numPr>
       </w:pPr>
       <w:r>
-        <w:t xml:space="preserve">Социальные системы, созданные для удовлетворения наших потребностей</w:t>
+        <w:t xml:space="preserve">Социальные системы, которые мы создали для удовлетворения наших потребностей</w:t>
       </w:r>
     </w:p>
     <w:p>
       <w:pPr>
-        <w:pStyle xmlns:wps="http://schemas.microsoft.com/office/word/2010/wordprocessingShape" xmlns:wpg="http://schemas.microsoft.com/office/word/2010/wordprocessingGroup" xmlns:mc="http://schemas.openxmlformats.org/markup-compatibility/2006" xmlns:wp14="http://schemas.microsoft.com/office/word/2010/wordprocessingDrawing" xmlns:w14="http://schemas.microsoft.com/office/word/2010/wordml" xmlns:w15="http://schemas.microsoft.com/office/word/2012/wordml" w:val="BodyText"/>
+        <w:pStyle w:val="BodyText"/>
         <w:bidi xmlns:wps="http://schemas.microsoft.com/office/word/2010/wordprocessingShape" xmlns:wpg="http://schemas.microsoft.com/office/word/2010/wordprocessingGroup" xmlns:mc="http://schemas.openxmlformats.org/markup-compatibility/2006" xmlns:wp14="http://schemas.microsoft.com/office/word/2010/wordprocessingDrawing" xmlns:w14="http://schemas.microsoft.com/office/word/2010/wordml" xmlns:w15="http://schemas.microsoft.com/office/word/2012/wordml" w:val="0"/>
         <w:spacing xmlns:wps="http://schemas.microsoft.com/office/word/2010/wordprocessingShape" xmlns:wpg="http://schemas.microsoft.com/office/word/2010/wordprocessingGroup" xmlns:mc="http://schemas.openxmlformats.org/markup-compatibility/2006" xmlns:wp14="http://schemas.microsoft.com/office/word/2010/wordprocessingDrawing" xmlns:w14="http://schemas.microsoft.com/office/word/2010/wordml" xmlns:w15="http://schemas.microsoft.com/office/word/2012/wordml" w:lineRule="auto" w:line="247"/>
         <w:ind xmlns:wps="http://schemas.microsoft.com/office/word/2010/wordprocessingShape" xmlns:wpg="http://schemas.microsoft.com/office/word/2010/wordprocessingGroup" xmlns:mc="http://schemas.openxmlformats.org/markup-compatibility/2006" xmlns:wp14="http://schemas.microsoft.com/office/word/2010/wordprocessingDrawing" xmlns:w14="http://schemas.microsoft.com/office/word/2010/wordml" xmlns:w15="http://schemas.microsoft.com/office/word/2012/wordml" w:start="100" w:end="122"/>
@@ -1457,12 +1466,12 @@
         <w:rPr xmlns:wps="http://schemas.microsoft.com/office/word/2010/wordprocessingShape" xmlns:wpg="http://schemas.microsoft.com/office/word/2010/wordprocessingGroup" xmlns:mc="http://schemas.openxmlformats.org/markup-compatibility/2006" xmlns:wp14="http://schemas.microsoft.com/office/word/2010/wordprocessingDrawing" xmlns:w14="http://schemas.microsoft.com/office/word/2010/wordml" xmlns:w15="http://schemas.microsoft.com/office/word/2012/wordml"/>
       </w:pPr>
       <w:r>
-        <w:t xml:space="preserve">Истинное богатство — сумма всех трёх составляющих. При этом человек может чувствовать себя богатым, обладая только двумя последними, и оставаться бедным, имея много денег, но не удовлетворяя важнейших потребностей и лишён поддержки сообщества.</w:t>
+        <w:t xml:space="preserve">Истинное богатство — сумма этих трёх составляющих. Можно чувствовать себя богатым, обладая лишь двумя последними; и можно быть бедным, имея много денег, но не в силах удовлетворить основные потребности и не имея поддержки сообщества.</w:t>
       </w:r>
     </w:p>
     <w:p>
       <w:pPr>
-        <w:pStyle xmlns:wps="http://schemas.microsoft.com/office/word/2010/wordprocessingShape" xmlns:wpg="http://schemas.microsoft.com/office/word/2010/wordprocessingGroup" xmlns:mc="http://schemas.openxmlformats.org/markup-compatibility/2006" xmlns:wp14="http://schemas.microsoft.com/office/word/2010/wordprocessingDrawing" xmlns:w14="http://schemas.microsoft.com/office/word/2010/wordml" xmlns:w15="http://schemas.microsoft.com/office/word/2012/wordml" w:val="BodyText"/>
+        <w:pStyle w:val="BodyText"/>
         <w:bidi xmlns:wps="http://schemas.microsoft.com/office/word/2010/wordprocessingShape" xmlns:wpg="http://schemas.microsoft.com/office/word/2010/wordprocessingGroup" xmlns:mc="http://schemas.openxmlformats.org/markup-compatibility/2006" xmlns:wp14="http://schemas.microsoft.com/office/word/2010/wordprocessingDrawing" xmlns:w14="http://schemas.microsoft.com/office/word/2010/wordml" xmlns:w15="http://schemas.microsoft.com/office/word/2012/wordml" w:val="0"/>
         <w:spacing xmlns:wps="http://schemas.microsoft.com/office/word/2010/wordprocessingShape" xmlns:wpg="http://schemas.microsoft.com/office/word/2010/wordprocessingGroup" xmlns:mc="http://schemas.openxmlformats.org/markup-compatibility/2006" xmlns:wp14="http://schemas.microsoft.com/office/word/2010/wordprocessingDrawing" xmlns:w14="http://schemas.microsoft.com/office/word/2010/wordml" xmlns:w15="http://schemas.microsoft.com/office/word/2012/wordml" w:lineRule="auto" w:line="247"/>
         <w:ind xmlns:wps="http://schemas.microsoft.com/office/word/2010/wordprocessingShape" xmlns:wpg="http://schemas.microsoft.com/office/word/2010/wordprocessingGroup" xmlns:mc="http://schemas.openxmlformats.org/markup-compatibility/2006" xmlns:wp14="http://schemas.microsoft.com/office/word/2010/wordprocessingDrawing" xmlns:w14="http://schemas.microsoft.com/office/word/2010/wordml" xmlns:w15="http://schemas.microsoft.com/office/word/2012/wordml" w:firstLine="288" w:start="100" w:end="122"/>
@@ -1470,12 +1479,12 @@
         <w:rPr xmlns:wps="http://schemas.microsoft.com/office/word/2010/wordprocessingShape" xmlns:wpg="http://schemas.microsoft.com/office/word/2010/wordprocessingGroup" xmlns:mc="http://schemas.openxmlformats.org/markup-compatibility/2006" xmlns:wp14="http://schemas.microsoft.com/office/word/2010/wordprocessingDrawing" xmlns:w14="http://schemas.microsoft.com/office/word/2010/wordml" xmlns:w15="http://schemas.microsoft.com/office/word/2012/wordml"/>
       </w:pPr>
       <w:r>
-        <w:t xml:space="preserve">Миф североамериканского индивидуализма заставляет забывать, что настоящее богатство возможно только в обществе. «Миллионеры, сделавшие себя сами», порой охотно забывают, что их богатство стало возможным благодаря государственной инфраструктуре, институциональным механизмам и участию многих людей в их делах. Первым делом они требуют снижения налогов.</w:t>
+        <w:t xml:space="preserve">Североамериканская мифология сурового индивидуализма заставляет забывать, что настоящее богатство возможно только в обществе. «Самостоятельные миллионеры» с лёгкостью упускают из виду, что их состояние стало возможным благодаря государственной инфраструктуре, институциональным механизмам и участию многих людей. И именно они первыми требуют снижения налогов.</w:t>
       </w:r>
     </w:p>
     <w:p>
       <w:pPr>
-        <w:pStyle xmlns:wps="http://schemas.microsoft.com/office/word/2010/wordprocessingShape" xmlns:wpg="http://schemas.microsoft.com/office/word/2010/wordprocessingGroup" xmlns:mc="http://schemas.openxmlformats.org/markup-compatibility/2006" xmlns:wp14="http://schemas.microsoft.com/office/word/2010/wordprocessingDrawing" xmlns:w14="http://schemas.microsoft.com/office/word/2010/wordml" xmlns:w15="http://schemas.microsoft.com/office/word/2012/wordml" w:val="ListParagraph"/>
+        <w:pStyle w:val="ListParagraph"/>
         <w:tabs xmlns:wps="http://schemas.microsoft.com/office/word/2010/wordprocessingShape" xmlns:wpg="http://schemas.microsoft.com/office/word/2010/wordprocessingGroup" xmlns:mc="http://schemas.openxmlformats.org/markup-compatibility/2006" xmlns:wp14="http://schemas.microsoft.com/office/word/2010/wordprocessingDrawing" xmlns:w14="http://schemas.microsoft.com/office/word/2010/wordml" xmlns:w15="http://schemas.microsoft.com/office/word/2012/wordml">
           <w:tab w:val="clear" w:pos="709"/>
           <w:tab w:val="left" w:pos="560" w:leader="none"/>
@@ -1493,12 +1502,12 @@
         </w:numPr>
       </w:pPr>
       <w:r>
-        <w:t xml:space="preserve">Американская торговая палата тратит на лоббизм больше, чем какая-либо другая группа в Вашингтоне. Часто кажется, что они не понимают: без верховенства закона, водоснабжения и канализации на промышленных территориях, без политик, позволяющих предприятиям работать, им не выжить, не говоря уже о получении прибыли.</w:t>
+        <w:t xml:space="preserve">Американская торговая палата тратит на лоббирование больше, чем любая другая группа в Вашингтоне. Часто они не понимают, что без верховенства права, без водоснабжения и канализации в промышленных зонах, без политик, позволяющих их предприятиям функционировать, они не смогли бы выжить, не говоря уже о получении прибыли.</w:t>
       </w:r>
     </w:p>
     <w:p>
       <w:pPr>
-        <w:pStyle xmlns:wps="http://schemas.microsoft.com/office/word/2010/wordprocessingShape" xmlns:wpg="http://schemas.microsoft.com/office/word/2010/wordprocessingGroup" xmlns:mc="http://schemas.openxmlformats.org/markup-compatibility/2006" xmlns:wp14="http://schemas.microsoft.com/office/word/2010/wordprocessingDrawing" xmlns:w14="http://schemas.microsoft.com/office/word/2010/wordml" xmlns:w15="http://schemas.microsoft.com/office/word/2012/wordml" w:val="BodyText"/>
+        <w:pStyle w:val="BodyText"/>
         <w:bidi xmlns:wps="http://schemas.microsoft.com/office/word/2010/wordprocessingShape" xmlns:wpg="http://schemas.microsoft.com/office/word/2010/wordprocessingGroup" xmlns:mc="http://schemas.openxmlformats.org/markup-compatibility/2006" xmlns:wp14="http://schemas.microsoft.com/office/word/2010/wordprocessingDrawing" xmlns:w14="http://schemas.microsoft.com/office/word/2010/wordml" xmlns:w15="http://schemas.microsoft.com/office/word/2012/wordml" w:val="0"/>
         <w:spacing xmlns:wps="http://schemas.microsoft.com/office/word/2010/wordprocessingShape" xmlns:wpg="http://schemas.microsoft.com/office/word/2010/wordprocessingGroup" xmlns:mc="http://schemas.openxmlformats.org/markup-compatibility/2006" xmlns:wp14="http://schemas.microsoft.com/office/word/2010/wordprocessingDrawing" xmlns:w14="http://schemas.microsoft.com/office/word/2010/wordml" xmlns:w15="http://schemas.microsoft.com/office/word/2012/wordml" w:lineRule="auto" w:line="247"/>
         <w:ind xmlns:wps="http://schemas.microsoft.com/office/word/2010/wordprocessingShape" xmlns:wpg="http://schemas.microsoft.com/office/word/2010/wordprocessingGroup" xmlns:mc="http://schemas.openxmlformats.org/markup-compatibility/2006" xmlns:wp14="http://schemas.microsoft.com/office/word/2010/wordprocessingDrawing" xmlns:w14="http://schemas.microsoft.com/office/word/2010/wordml" xmlns:w15="http://schemas.microsoft.com/office/word/2012/wordml" w:firstLine="288" w:start="100" w:end="443"/>
@@ -1506,12 +1515,12 @@
         <w:rPr xmlns:wps="http://schemas.microsoft.com/office/word/2010/wordprocessingShape" xmlns:wpg="http://schemas.microsoft.com/office/word/2010/wordprocessingGroup" xmlns:mc="http://schemas.openxmlformats.org/markup-compatibility/2006" xmlns:wp14="http://schemas.microsoft.com/office/word/2010/wordprocessingDrawing" xmlns:w14="http://schemas.microsoft.com/office/word/2010/wordml" xmlns:w15="http://schemas.microsoft.com/office/word/2012/wordml"/>
       </w:pPr>
       <w:r>
-        <w:t xml:space="preserve">Если большинство людей не замечает структуры городов и сообществ, которые позволяют предприятиям функционировать, то мы также не видим устройство другого важного компонента индивидуального богатства — денег. Современная денежная система скрыта от публики, и многие её не понимают. Если бы понимали, возможно, дважды бы подумали, прежде чем слепо доверять своей финансовой безопасности исключительно этой системе.</w:t>
+        <w:t xml:space="preserve">Если большинство людей не замечают структуры городов и сообществ, обеспечивающей работу предприятий и организаций, то они также не видят другой важный компонент индивидуального богатства — деньги. Современную денежную систему большинство не понимает: она скрыта от глаз общественности. Если бы люди понимали её, возможно, дважды подумали бы, стоит ли полностью полагаться на эту систему в вопросах своей финансовой безопасности.</w:t>
       </w:r>
     </w:p>
     <w:p>
       <w:pPr>
-        <w:pStyle xmlns:wps="http://schemas.microsoft.com/office/word/2010/wordprocessingShape" xmlns:wpg="http://schemas.microsoft.com/office/word/2010/wordprocessingGroup" xmlns:mc="http://schemas.openxmlformats.org/markup-compatibility/2006" xmlns:wp14="http://schemas.microsoft.com/office/word/2010/wordprocessingDrawing" xmlns:w14="http://schemas.microsoft.com/office/word/2010/wordml" xmlns:w15="http://schemas.microsoft.com/office/word/2012/wordml" w:val="BodyText"/>
+        <w:pStyle w:val="BodyText"/>
         <w:bidi xmlns:wps="http://schemas.microsoft.com/office/word/2010/wordprocessingShape" xmlns:wpg="http://schemas.microsoft.com/office/word/2010/wordprocessingGroup" xmlns:mc="http://schemas.openxmlformats.org/markup-compatibility/2006" xmlns:wp14="http://schemas.microsoft.com/office/word/2010/wordprocessingDrawing" xmlns:w14="http://schemas.microsoft.com/office/word/2010/wordml" xmlns:w15="http://schemas.microsoft.com/office/word/2012/wordml" w:val="0"/>
         <w:spacing xmlns:wps="http://schemas.microsoft.com/office/word/2010/wordprocessingShape" xmlns:wpg="http://schemas.microsoft.com/office/word/2010/wordprocessingGroup" xmlns:mc="http://schemas.openxmlformats.org/markup-compatibility/2006" xmlns:wp14="http://schemas.microsoft.com/office/word/2010/wordprocessingDrawing" xmlns:w14="http://schemas.microsoft.com/office/word/2010/wordml" xmlns:w15="http://schemas.microsoft.com/office/word/2012/wordml" w:lineRule="auto" w:line="247" w:before="0" w:after="0"/>
         <w:ind xmlns:wps="http://schemas.microsoft.com/office/word/2010/wordprocessingShape" xmlns:wpg="http://schemas.microsoft.com/office/word/2010/wordprocessingGroup" xmlns:mc="http://schemas.openxmlformats.org/markup-compatibility/2006" xmlns:wp14="http://schemas.microsoft.com/office/word/2010/wordprocessingDrawing" xmlns:w14="http://schemas.microsoft.com/office/word/2010/wordml" xmlns:w15="http://schemas.microsoft.com/office/word/2012/wordml" w:firstLine="288" w:start="100" w:end="194"/>
@@ -1519,11 +1528,11 @@
         <w:rPr xmlns:wps="http://schemas.microsoft.com/office/word/2010/wordprocessingShape" xmlns:wpg="http://schemas.microsoft.com/office/word/2010/wordprocessingGroup" xmlns:mc="http://schemas.openxmlformats.org/markup-compatibility/2006" xmlns:wp14="http://schemas.microsoft.com/office/word/2010/wordprocessingDrawing" xmlns:w14="http://schemas.microsoft.com/office/word/2010/wordml" xmlns:w15="http://schemas.microsoft.com/office/word/2012/wordml"/>
       </w:pPr>
       <w:r>
-        <w:t xml:space="preserve">Мы надеемся, что эта книга прояснит вам и роль сообщества в создании богатства, и роль денег и других средств обмена. Для этого нужно снять повязку с глаз — денежная система была завуалирована силами, которые извлекают из неё выгоду. В конце концов, прежде чем приступать к созданию богатства и формированию устойчивой местной экономики, важно понять, что такое богатство и на чём оно основано. Хорошая новость — у вас тоже есть шанс создать настоящее богатство для себя, своих детей и своего сообщества. Но прежде чем покупать ещё лотерейные билеты, прочтите эту книгу — вы узнаете, как эффективные местные действия могут помочь достичь этой цели с гораздо меньшими рисками.</w:t>
+        <w:t xml:space="preserve">Мы надеемся, что эта книга откроет вам глаза и на роль сообщества в создании богатства, и на роль денег и других средств обмена. Для этого нам нужно помочь вам снять повязку с глаз (не по вашей вине): денежная система была завуалирована силами, извлекающими из неё прибыль. Прежде чем вы начнёте создавать богатство и строить устойчивую местную экономику, важно понять, что такое богатство и на чём оно основано. Хорошая новость в том, что у вас тоже есть шанс создать настоящее богатство для себя, своих детей и своего сообщества. Только не спешите покупать очередные лотерейные билеты — сначала прочтите эту книгу, чтобы узнать, как эффективные местные действия помогут вам достигнуть этой цели с гораздо меньшим риском.</w:t>
       </w:r>
     </w:p>
-    <w:bookmarkEnd w:id="12"/>
-    <w:bookmarkEnd w:id="13"/>
+    <w:bookmarkEnd w:id="23"/>
+    <w:bookmarkEnd w:id="24"/>
     <w:sectPr>
       <w:headerReference w:type="default" r:id="rId16"/>
       <w:headerReference w:type="first" r:id="rId17"/>
@@ -1804,7 +1813,7 @@
       <w:lvlText w:val=" "/>
       <w:lvlJc w:val="left"/>
       <w:pPr>
-        <w:ind w:left="720" w:hanging="360"/>
+        <w:ind w:left="720" w:hanging="480"/>
       </w:pPr>
     </w:lvl>
     <w:lvl w:ilvl="1">
@@ -1812,7 +1821,7 @@
       <w:lvlText w:val=" "/>
       <w:lvlJc w:val="left"/>
       <w:pPr>
-        <w:ind w:left="1440" w:hanging="360"/>
+        <w:ind w:left="1440" w:hanging="480"/>
       </w:pPr>
     </w:lvl>
     <w:lvl w:ilvl="2">
@@ -1820,7 +1829,7 @@
       <w:lvlText w:val=" "/>
       <w:lvlJc w:val="left"/>
       <w:pPr>
-        <w:ind w:left="2160" w:hanging="360"/>
+        <w:ind w:left="2160" w:hanging="480"/>
       </w:pPr>
     </w:lvl>
     <w:lvl w:ilvl="3">
@@ -1828,7 +1837,7 @@
       <w:lvlText w:val=" "/>
       <w:lvlJc w:val="left"/>
       <w:pPr>
-        <w:ind w:left="2880" w:hanging="360"/>
+        <w:ind w:left="2880" w:hanging="480"/>
       </w:pPr>
     </w:lvl>
     <w:lvl w:ilvl="4">
@@ -1836,7 +1845,7 @@
       <w:lvlText w:val=" "/>
       <w:lvlJc w:val="left"/>
       <w:pPr>
-        <w:ind w:left="3600" w:hanging="360"/>
+        <w:ind w:left="3600" w:hanging="480"/>
       </w:pPr>
     </w:lvl>
     <w:lvl w:ilvl="5">
@@ -1844,7 +1853,7 @@
       <w:lvlText w:val=" "/>
       <w:lvlJc w:val="left"/>
       <w:pPr>
-        <w:ind w:left="4320" w:hanging="360"/>
+        <w:ind w:left="4320" w:hanging="480"/>
       </w:pPr>
     </w:lvl>
     <w:lvl w:ilvl="6">
@@ -1852,7 +1861,7 @@
       <w:lvlText w:val=" "/>
       <w:lvlJc w:val="left"/>
       <w:pPr>
-        <w:ind w:left="5040" w:hanging="360"/>
+        <w:ind w:left="5040" w:hanging="480"/>
       </w:pPr>
     </w:lvl>
     <w:lvl w:ilvl="7">
@@ -1860,7 +1869,7 @@
       <w:lvlText w:val=" "/>
       <w:lvlJc w:val="left"/>
       <w:pPr>
-        <w:ind w:left="5760" w:hanging="360"/>
+        <w:ind w:left="5760" w:hanging="480"/>
       </w:pPr>
     </w:lvl>
     <w:lvl w:ilvl="8">
@@ -1868,7 +1877,7 @@
       <w:lvlText w:val=" "/>
       <w:lvlJc w:val="left"/>
       <w:pPr>
-        <w:ind w:left="6480" w:hanging="360"/>
+        <w:ind w:left="6480" w:hanging="480"/>
       </w:pPr>
     </w:lvl>
   </w:abstractNum>
@@ -1881,7 +1890,7 @@
       <w:lvlText w:val="%1."/>
       <w:lvlJc w:val="left"/>
       <w:pPr>
-        <w:ind w:left="720" w:hanging="360"/>
+        <w:ind w:left="720" w:hanging="480"/>
       </w:pPr>
     </w:lvl>
     <w:lvl w:ilvl="1">
@@ -1890,7 +1899,7 @@
       <w:lvlText w:val="%2."/>
       <w:lvlJc w:val="left"/>
       <w:pPr>
-        <w:ind w:left="1440" w:hanging="360"/>
+        <w:ind w:left="1440" w:hanging="480"/>
       </w:pPr>
     </w:lvl>
     <w:lvl w:ilvl="2">
@@ -1899,7 +1908,7 @@
       <w:lvlText w:val="%3."/>
       <w:lvlJc w:val="left"/>
       <w:pPr>
-        <w:ind w:left="2160" w:hanging="360"/>
+        <w:ind w:left="2160" w:hanging="480"/>
       </w:pPr>
     </w:lvl>
     <w:lvl w:ilvl="3">
@@ -1908,7 +1917,7 @@
       <w:lvlText w:val="%4."/>
       <w:lvlJc w:val="left"/>
       <w:pPr>
-        <w:ind w:left="2880" w:hanging="360"/>
+        <w:ind w:left="2880" w:hanging="480"/>
       </w:pPr>
     </w:lvl>
     <w:lvl w:ilvl="4">
@@ -1917,7 +1926,7 @@
       <w:lvlText w:val="%5."/>
       <w:lvlJc w:val="left"/>
       <w:pPr>
-        <w:ind w:left="3600" w:hanging="360"/>
+        <w:ind w:left="3600" w:hanging="480"/>
       </w:pPr>
     </w:lvl>
     <w:lvl w:ilvl="5">
@@ -1926,7 +1935,7 @@
       <w:lvlText w:val="%6."/>
       <w:lvlJc w:val="left"/>
       <w:pPr>
-        <w:ind w:left="4320" w:hanging="360"/>
+        <w:ind w:left="4320" w:hanging="480"/>
       </w:pPr>
     </w:lvl>
     <w:lvl w:ilvl="6">
@@ -1935,7 +1944,7 @@
       <w:lvlText w:val="%7."/>
       <w:lvlJc w:val="left"/>
       <w:pPr>
-        <w:ind w:left="5040" w:hanging="360"/>
+        <w:ind w:left="5040" w:hanging="480"/>
       </w:pPr>
     </w:lvl>
     <w:lvl w:ilvl="7">
@@ -1944,7 +1953,7 @@
       <w:lvlText w:val="%8."/>
       <w:lvlJc w:val="left"/>
       <w:pPr>
-        <w:ind w:left="5760" w:hanging="360"/>
+        <w:ind w:left="5760" w:hanging="480"/>
       </w:pPr>
     </w:lvl>
     <w:lvl w:ilvl="8">
@@ -1953,7 +1962,7 @@
       <w:lvlText w:val="%9."/>
       <w:lvlJc w:val="left"/>
       <w:pPr>
-        <w:ind w:left="6480" w:hanging="360"/>
+        <w:ind w:left="6480" w:hanging="480"/>
       </w:pPr>
     </w:lvl>
   </w:abstractNum>

</xml_diff>